<commit_message>
106-new - Memory -Finished the Users Guide & remover Reset All.
</commit_message>
<xml_diff>
--- a/docs/pending.docx
+++ b/docs/pending.docx
@@ -24,7 +24,7 @@
           <w:rFonts w:ascii="Arial" w:hAnsi="Arial"/>
           <w:sz w:val="28"/>
         </w:rPr>
-        <w:t xml:space="preserve">Last updated: 2026-09-11 (#105-new)</w:t>
+        <w:t xml:space="preserve">Last updated: 2026-09-11 (#106-new)</w:t>
       </w:r>
     </w:p>
     <w:p>
@@ -325,19 +325,19 @@
           <w:rFonts w:ascii="Arial" w:hAnsi="Arial"/>
           <w:sz w:val="28"/>
         </w:rPr>
-        <w:t xml:space="preserve">1. USER'S GUIDE HEADINGS for Options, Delete, Save, Done, Snooze,</w:t>
-      </w:r>
-    </w:p>
-    <w:p>
-      <w:pPr>
-        <w:spacing w:line="276" w:lineRule="auto"/>
-      </w:pPr>
-      <w:r>
-        <w:rPr>
-          <w:rFonts w:ascii="Arial" w:hAnsi="Arial"/>
-          <w:sz w:val="28"/>
-        </w:rPr>
-        <w:t xml:space="preserve">   and Banners. All six together, next session (Patrick, #105-new).</w:t>
+        <w:t xml:space="preserve">1. DAY AFTER THE SET DAY on Weekly's Options is in the project, not</w:t>
+      </w:r>
+    </w:p>
+    <w:p>
+      <w:pPr>
+        <w:spacing w:line="276" w:lineRule="auto"/>
+      </w:pPr>
+      <w:r>
+        <w:rPr>
+          <w:rFonts w:ascii="Arial" w:hAnsi="Arial"/>
+          <w:sz w:val="28"/>
+        </w:rPr>
+        <w:t xml:space="preserve">   on 80 (Patrick, #105-new).</w:t>
       </w:r>
     </w:p>
     <w:p>
@@ -1577,6 +1577,366 @@
           <w:sz w:val="28"/>
         </w:rPr>
         <w:t xml:space="preserve">docs/handoff-history.md.</w:t>
+      </w:r>
+    </w:p>
+    <w:p>
+      <w:pPr>
+        <w:spacing w:line="276" w:lineRule="auto"/>
+      </w:pPr>
+      <w:r>
+        <w:rPr>
+          <w:rFonts w:ascii="Arial" w:hAnsi="Arial"/>
+          <w:sz w:val="28"/>
+        </w:rPr>
+        <w:t xml:space="preserve"/>
+      </w:r>
+    </w:p>
+    <w:p>
+      <w:pPr>
+        <w:spacing w:line="276" w:lineRule="auto"/>
+      </w:pPr>
+      <w:r>
+        <w:rPr>
+          <w:rFonts w:ascii="Arial" w:hAnsi="Arial"/>
+          <w:sz w:val="28"/>
+        </w:rPr>
+        <w:t xml:space="preserve">123. #106-new — Reset All Data taken out. To start clean, delete the</w:t>
+      </w:r>
+    </w:p>
+    <w:p>
+      <w:pPr>
+        <w:spacing w:line="276" w:lineRule="auto"/>
+      </w:pPr>
+      <w:r>
+        <w:rPr>
+          <w:rFonts w:ascii="Arial" w:hAnsi="Arial"/>
+          <w:sz w:val="28"/>
+        </w:rPr>
+        <w:t xml:space="preserve">    app from the phone. Not on 80.</w:t>
+      </w:r>
+    </w:p>
+    <w:p>
+      <w:pPr>
+        <w:spacing w:line="276" w:lineRule="auto"/>
+      </w:pPr>
+      <w:r>
+        <w:rPr>
+          <w:rFonts w:ascii="Arial" w:hAnsi="Arial"/>
+          <w:sz w:val="28"/>
+        </w:rPr>
+        <w:t xml:space="preserve"/>
+      </w:r>
+    </w:p>
+    <w:p>
+      <w:pPr>
+        <w:spacing w:line="276" w:lineRule="auto"/>
+      </w:pPr>
+      <w:r>
+        <w:rPr>
+          <w:rFonts w:ascii="Arial" w:hAnsi="Arial"/>
+          <w:sz w:val="28"/>
+        </w:rPr>
+        <w:t xml:space="preserve">122. #106-new — Help in the Guide: from Help, Cancel comes back to the</w:t>
+      </w:r>
+    </w:p>
+    <w:p>
+      <w:pPr>
+        <w:spacing w:line="276" w:lineRule="auto"/>
+      </w:pPr>
+      <w:r>
+        <w:rPr>
+          <w:rFonts w:ascii="Arial" w:hAnsi="Arial"/>
+          <w:sz w:val="28"/>
+        </w:rPr>
+        <w:t xml:space="preserve">    questions; Save puts Help away and opens the item's page. Not on 80.</w:t>
+      </w:r>
+    </w:p>
+    <w:p>
+      <w:pPr>
+        <w:spacing w:line="276" w:lineRule="auto"/>
+      </w:pPr>
+      <w:r>
+        <w:rPr>
+          <w:rFonts w:ascii="Arial" w:hAnsi="Arial"/>
+          <w:sz w:val="28"/>
+        </w:rPr>
+        <w:t xml:space="preserve"/>
+      </w:r>
+    </w:p>
+    <w:p>
+      <w:pPr>
+        <w:spacing w:line="276" w:lineRule="auto"/>
+      </w:pPr>
+      <w:r>
+        <w:rPr>
+          <w:rFonts w:ascii="Arial" w:hAnsi="Arial"/>
+          <w:sz w:val="28"/>
+        </w:rPr>
+        <w:t xml:space="preserve">121. #106-new — A visitor marked Done on Daily writes on Daily's log</w:t>
+      </w:r>
+    </w:p>
+    <w:p>
+      <w:pPr>
+        <w:spacing w:line="276" w:lineRule="auto"/>
+      </w:pPr>
+      <w:r>
+        <w:rPr>
+          <w:rFonts w:ascii="Arial" w:hAnsi="Arial"/>
+          <w:sz w:val="28"/>
+        </w:rPr>
+        <w:t xml:space="preserve">    and on that other page's log.</w:t>
+      </w:r>
+    </w:p>
+    <w:p>
+      <w:pPr>
+        <w:spacing w:line="276" w:lineRule="auto"/>
+      </w:pPr>
+      <w:r>
+        <w:rPr>
+          <w:rFonts w:ascii="Arial" w:hAnsi="Arial"/>
+          <w:sz w:val="28"/>
+        </w:rPr>
+        <w:t xml:space="preserve"/>
+      </w:r>
+    </w:p>
+    <w:p>
+      <w:pPr>
+        <w:spacing w:line="276" w:lineRule="auto"/>
+      </w:pPr>
+      <w:r>
+        <w:rPr>
+          <w:rFonts w:ascii="Arial" w:hAnsi="Arial"/>
+          <w:sz w:val="28"/>
+        </w:rPr>
+        <w:t xml:space="preserve">120. #106-new — Log heading in the User's Guide, docs and app file.</w:t>
+      </w:r>
+    </w:p>
+    <w:p>
+      <w:pPr>
+        <w:spacing w:line="276" w:lineRule="auto"/>
+      </w:pPr>
+      <w:r>
+        <w:rPr>
+          <w:rFonts w:ascii="Arial" w:hAnsi="Arial"/>
+          <w:sz w:val="28"/>
+        </w:rPr>
+        <w:t xml:space="preserve">    Not on 80.</w:t>
+      </w:r>
+    </w:p>
+    <w:p>
+      <w:pPr>
+        <w:spacing w:line="276" w:lineRule="auto"/>
+      </w:pPr>
+      <w:r>
+        <w:rPr>
+          <w:rFonts w:ascii="Arial" w:hAnsi="Arial"/>
+          <w:sz w:val="28"/>
+        </w:rPr>
+        <w:t xml:space="preserve"/>
+      </w:r>
+    </w:p>
+    <w:p>
+      <w:pPr>
+        <w:spacing w:line="276" w:lineRule="auto"/>
+      </w:pPr>
+      <w:r>
+        <w:rPr>
+          <w:rFonts w:ascii="Arial" w:hAnsi="Arial"/>
+          <w:sz w:val="28"/>
+        </w:rPr>
+        <w:t xml:space="preserve">119. #106-new — Banners heading in the User's Guide, docs and app file.</w:t>
+      </w:r>
+    </w:p>
+    <w:p>
+      <w:pPr>
+        <w:spacing w:line="276" w:lineRule="auto"/>
+      </w:pPr>
+      <w:r>
+        <w:rPr>
+          <w:rFonts w:ascii="Arial" w:hAnsi="Arial"/>
+          <w:sz w:val="28"/>
+        </w:rPr>
+        <w:t xml:space="preserve">    OK drops the notice. Not on 80.</w:t>
+      </w:r>
+    </w:p>
+    <w:p>
+      <w:pPr>
+        <w:spacing w:line="276" w:lineRule="auto"/>
+      </w:pPr>
+      <w:r>
+        <w:rPr>
+          <w:rFonts w:ascii="Arial" w:hAnsi="Arial"/>
+          <w:sz w:val="28"/>
+        </w:rPr>
+        <w:t xml:space="preserve"/>
+      </w:r>
+    </w:p>
+    <w:p>
+      <w:pPr>
+        <w:spacing w:line="276" w:lineRule="auto"/>
+      </w:pPr>
+      <w:r>
+        <w:rPr>
+          <w:rFonts w:ascii="Arial" w:hAnsi="Arial"/>
+          <w:sz w:val="28"/>
+        </w:rPr>
+        <w:t xml:space="preserve">118. #106-new — Snooze heading in the User's Guide, docs and app file.</w:t>
+      </w:r>
+    </w:p>
+    <w:p>
+      <w:pPr>
+        <w:spacing w:line="276" w:lineRule="auto"/>
+      </w:pPr>
+      <w:r>
+        <w:rPr>
+          <w:rFonts w:ascii="Arial" w:hAnsi="Arial"/>
+          <w:sz w:val="28"/>
+        </w:rPr>
+        <w:t xml:space="preserve">    Not on 80.</w:t>
+      </w:r>
+    </w:p>
+    <w:p>
+      <w:pPr>
+        <w:spacing w:line="276" w:lineRule="auto"/>
+      </w:pPr>
+      <w:r>
+        <w:rPr>
+          <w:rFonts w:ascii="Arial" w:hAnsi="Arial"/>
+          <w:sz w:val="28"/>
+        </w:rPr>
+        <w:t xml:space="preserve"/>
+      </w:r>
+    </w:p>
+    <w:p>
+      <w:pPr>
+        <w:spacing w:line="276" w:lineRule="auto"/>
+      </w:pPr>
+      <w:r>
+        <w:rPr>
+          <w:rFonts w:ascii="Arial" w:hAnsi="Arial"/>
+          <w:sz w:val="28"/>
+        </w:rPr>
+        <w:t xml:space="preserve">117. #106-new — Done heading in the User's Guide, docs and app file.</w:t>
+      </w:r>
+    </w:p>
+    <w:p>
+      <w:pPr>
+        <w:spacing w:line="276" w:lineRule="auto"/>
+      </w:pPr>
+      <w:r>
+        <w:rPr>
+          <w:rFonts w:ascii="Arial" w:hAnsi="Arial"/>
+          <w:sz w:val="28"/>
+        </w:rPr>
+        <w:t xml:space="preserve">    Not on 80.</w:t>
+      </w:r>
+    </w:p>
+    <w:p>
+      <w:pPr>
+        <w:spacing w:line="276" w:lineRule="auto"/>
+      </w:pPr>
+      <w:r>
+        <w:rPr>
+          <w:rFonts w:ascii="Arial" w:hAnsi="Arial"/>
+          <w:sz w:val="28"/>
+        </w:rPr>
+        <w:t xml:space="preserve"/>
+      </w:r>
+    </w:p>
+    <w:p>
+      <w:pPr>
+        <w:spacing w:line="276" w:lineRule="auto"/>
+      </w:pPr>
+      <w:r>
+        <w:rPr>
+          <w:rFonts w:ascii="Arial" w:hAnsi="Arial"/>
+          <w:sz w:val="28"/>
+        </w:rPr>
+        <w:t xml:space="preserve">116. #106-new — Bucket List's keep button on New and Edit says Save,</w:t>
+      </w:r>
+    </w:p>
+    <w:p>
+      <w:pPr>
+        <w:spacing w:line="276" w:lineRule="auto"/>
+      </w:pPr>
+      <w:r>
+        <w:rPr>
+          <w:rFonts w:ascii="Arial" w:hAnsi="Arial"/>
+          <w:sz w:val="28"/>
+        </w:rPr>
+        <w:t xml:space="preserve">    same as the other pages. Not on 80.</w:t>
+      </w:r>
+    </w:p>
+    <w:p>
+      <w:pPr>
+        <w:spacing w:line="276" w:lineRule="auto"/>
+      </w:pPr>
+      <w:r>
+        <w:rPr>
+          <w:rFonts w:ascii="Arial" w:hAnsi="Arial"/>
+          <w:sz w:val="28"/>
+        </w:rPr>
+        <w:t xml:space="preserve"/>
+      </w:r>
+    </w:p>
+    <w:p>
+      <w:pPr>
+        <w:spacing w:line="276" w:lineRule="auto"/>
+      </w:pPr>
+      <w:r>
+        <w:rPr>
+          <w:rFonts w:ascii="Arial" w:hAnsi="Arial"/>
+          <w:sz w:val="28"/>
+        </w:rPr>
+        <w:t xml:space="preserve">115. #106-new — Save heading in the User's Guide, docs and app file.</w:t>
+      </w:r>
+    </w:p>
+    <w:p>
+      <w:pPr>
+        <w:spacing w:line="276" w:lineRule="auto"/>
+      </w:pPr>
+      <w:r>
+        <w:rPr>
+          <w:rFonts w:ascii="Arial" w:hAnsi="Arial"/>
+          <w:sz w:val="28"/>
+        </w:rPr>
+        <w:t xml:space="preserve">    Not on 80.</w:t>
+      </w:r>
+    </w:p>
+    <w:p>
+      <w:pPr>
+        <w:spacing w:line="276" w:lineRule="auto"/>
+      </w:pPr>
+      <w:r>
+        <w:rPr>
+          <w:rFonts w:ascii="Arial" w:hAnsi="Arial"/>
+          <w:sz w:val="28"/>
+        </w:rPr>
+        <w:t xml:space="preserve"/>
+      </w:r>
+    </w:p>
+    <w:p>
+      <w:pPr>
+        <w:spacing w:line="276" w:lineRule="auto"/>
+      </w:pPr>
+      <w:r>
+        <w:rPr>
+          <w:rFonts w:ascii="Arial" w:hAnsi="Arial"/>
+          <w:sz w:val="28"/>
+        </w:rPr>
+        <w:t xml:space="preserve">114. #106-new — Delete heading in the User's Guide, docs and app file.</w:t>
+      </w:r>
+    </w:p>
+    <w:p>
+      <w:pPr>
+        <w:spacing w:line="276" w:lineRule="auto"/>
+      </w:pPr>
+      <w:r>
+        <w:rPr>
+          <w:rFonts w:ascii="Arial" w:hAnsi="Arial"/>
+          <w:sz w:val="28"/>
+        </w:rPr>
+        <w:t xml:space="preserve">    Not on 80.</w:t>
       </w:r>
     </w:p>
     <w:p>

</xml_diff>

<commit_message>
109-new - Memory - Evaluation build-sheet Job 3 fixed.
</commit_message>
<xml_diff>
--- a/docs/pending.docx
+++ b/docs/pending.docx
@@ -24,7 +24,7 @@
           <w:rFonts w:ascii="Arial" w:hAnsi="Arial"/>
           <w:sz w:val="28"/>
         </w:rPr>
-        <w:t xml:space="preserve">Last updated: 2026-09-11 (#106-new)</w:t>
+        <w:t xml:space="preserve">Last updated: 2026-09-13 (#109-new)</w:t>
       </w:r>
     </w:p>
     <w:p>
@@ -325,19 +325,55 @@
           <w:rFonts w:ascii="Arial" w:hAnsi="Arial"/>
           <w:sz w:val="28"/>
         </w:rPr>
-        <w:t xml:space="preserve">1. DAY AFTER THE SET DAY on Weekly's Options is in the project, not</w:t>
-      </w:r>
-    </w:p>
-    <w:p>
-      <w:pPr>
-        <w:spacing w:line="276" w:lineRule="auto"/>
-      </w:pPr>
-      <w:r>
-        <w:rPr>
-          <w:rFonts w:ascii="Arial" w:hAnsi="Arial"/>
-          <w:sz w:val="28"/>
-        </w:rPr>
-        <w:t xml:space="preserve">   on 80 (Patrick, #105-new).</w:t>
+        <w:t xml:space="preserve">1. PHONE PROOF FOR JOBS 1 AND 2. On a native build, check Job 1's</w:t>
+      </w:r>
+    </w:p>
+    <w:p>
+      <w:pPr>
+        <w:spacing w:line="276" w:lineRule="auto"/>
+      </w:pPr>
+      <w:r>
+        <w:rPr>
+          <w:rFonts w:ascii="Arial" w:hAnsi="Arial"/>
+          <w:sz w:val="28"/>
+        </w:rPr>
+        <w:t xml:space="preserve">   banner and list-popup choices. For Job 2, leave a timed Daily item</w:t>
+      </w:r>
+    </w:p>
+    <w:p>
+      <w:pPr>
+        <w:spacing w:line="276" w:lineRule="auto"/>
+      </w:pPr>
+      <w:r>
+        <w:rPr>
+          <w:rFonts w:ascii="Arial" w:hAnsi="Arial"/>
+          <w:sz w:val="28"/>
+        </w:rPr>
+        <w:t xml:space="preserve">   undone, cross the day boundary, and make the first opening a banner</w:t>
+      </w:r>
+    </w:p>
+    <w:p>
+      <w:pPr>
+        <w:spacing w:line="276" w:lineRule="auto"/>
+      </w:pPr>
+      <w:r>
+        <w:rPr>
+          <w:rFonts w:ascii="Arial" w:hAnsi="Arial"/>
+          <w:sz w:val="28"/>
+        </w:rPr>
+        <w:t xml:space="preserve">   body tap. The missed-reminder popup comes first; after OK, the</w:t>
+      </w:r>
+    </w:p>
+    <w:p>
+      <w:pPr>
+        <w:spacing w:line="276" w:lineRule="auto"/>
+      </w:pPr>
+      <w:r>
+        <w:rPr>
+          <w:rFonts w:ascii="Arial" w:hAnsi="Arial"/>
+          <w:sz w:val="28"/>
+        </w:rPr>
+        <w:t xml:space="preserve">   correct item is highlighted; a later return does not repeat it.</w:t>
       </w:r>
     </w:p>
     <w:p>
@@ -1491,6 +1527,78 @@
           <w:rFonts w:ascii="Arial" w:hAnsi="Arial"/>
           <w:sz w:val="28"/>
         </w:rPr>
+        <w:t xml:space="preserve">19. ONE TIME DOES NOT SKIP (Patrick, #107-new; built #108-new). It has</w:t>
+      </w:r>
+    </w:p>
+    <w:p>
+      <w:pPr>
+        <w:spacing w:line="276" w:lineRule="auto"/>
+      </w:pPr>
+      <w:r>
+        <w:rPr>
+          <w:rFonts w:ascii="Arial" w:hAnsi="Arial"/>
+          <w:sz w:val="28"/>
+        </w:rPr>
+        <w:t xml:space="preserve">    no next cycle. Its own banner set has Done, OK, and Delay 15 / 30 /</w:t>
+      </w:r>
+    </w:p>
+    <w:p>
+      <w:pPr>
+        <w:spacing w:line="276" w:lineRule="auto"/>
+      </w:pPr>
+      <w:r>
+        <w:rPr>
+          <w:rFonts w:ascii="Arial" w:hAnsi="Arial"/>
+          <w:sz w:val="28"/>
+        </w:rPr>
+        <w:t xml:space="preserve">    60 min. A delay has its own source and reaches the phone road.</w:t>
+      </w:r>
+    </w:p>
+    <w:p>
+      <w:pPr>
+        <w:spacing w:line="276" w:lineRule="auto"/>
+      </w:pPr>
+      <w:r>
+        <w:rPr>
+          <w:rFonts w:ascii="Arial" w:hAnsi="Arial"/>
+          <w:sz w:val="28"/>
+        </w:rPr>
+        <w:t xml:space="preserve">20. OPENING THROUGH A BANNER IS STILL AN OPENING (#107-new; built</w:t>
+      </w:r>
+    </w:p>
+    <w:p>
+      <w:pPr>
+        <w:spacing w:line="276" w:lineRule="auto"/>
+      </w:pPr>
+      <w:r>
+        <w:rPr>
+          <w:rFonts w:ascii="Arial" w:hAnsi="Arial"/>
+          <w:sz w:val="28"/>
+        </w:rPr>
+        <w:t xml:space="preserve">    #108-new). The day roll, scheduling, and missed-reminder telling</w:t>
+      </w:r>
+    </w:p>
+    <w:p>
+      <w:pPr>
+        <w:spacing w:line="276" w:lineRule="auto"/>
+      </w:pPr>
+      <w:r>
+        <w:rPr>
+          <w:rFonts w:ascii="Arial" w:hAnsi="Arial"/>
+          <w:sz w:val="28"/>
+        </w:rPr>
+        <w:t xml:space="preserve">    finish before the item's page is handed over.</w:t>
+      </w:r>
+    </w:p>
+    <w:p>
+      <w:pPr>
+        <w:spacing w:line="276" w:lineRule="auto"/>
+      </w:pPr>
+      <w:r>
+        <w:rPr>
+          <w:rFonts w:ascii="Arial" w:hAnsi="Arial"/>
+          <w:sz w:val="28"/>
+        </w:rPr>
         <w:t xml:space="preserve"/>
       </w:r>
     </w:p>
@@ -1577,6 +1685,342 @@
           <w:sz w:val="28"/>
         </w:rPr>
         <w:t xml:space="preserve">docs/handoff-history.md.</w:t>
+      </w:r>
+    </w:p>
+    <w:p>
+      <w:pPr>
+        <w:spacing w:line="276" w:lineRule="auto"/>
+      </w:pPr>
+      <w:r>
+        <w:rPr>
+          <w:rFonts w:ascii="Arial" w:hAnsi="Arial"/>
+          <w:sz w:val="28"/>
+        </w:rPr>
+        <w:t xml:space="preserve"/>
+      </w:r>
+    </w:p>
+    <w:p>
+      <w:pPr>
+        <w:spacing w:line="276" w:lineRule="auto"/>
+      </w:pPr>
+      <w:r>
+        <w:rPr>
+          <w:rFonts w:ascii="Arial" w:hAnsi="Arial"/>
+          <w:sz w:val="28"/>
+        </w:rPr>
+        <w:t xml:space="preserve">130. #109-new — The User's Guide now correctly says One Time for</w:t>
+      </w:r>
+    </w:p>
+    <w:p>
+      <w:pPr>
+        <w:spacing w:line="276" w:lineRule="auto"/>
+      </w:pPr>
+      <w:r>
+        <w:rPr>
+          <w:rFonts w:ascii="Arial" w:hAnsi="Arial"/>
+          <w:sz w:val="28"/>
+        </w:rPr>
+        <w:t xml:space="preserve">    today has Done, OK, and the three delays, but no Skip. The app</w:t>
+      </w:r>
+    </w:p>
+    <w:p>
+      <w:pPr>
+        <w:spacing w:line="276" w:lineRule="auto"/>
+      </w:pPr>
+      <w:r>
+        <w:rPr>
+          <w:rFonts w:ascii="Arial" w:hAnsi="Arial"/>
+          <w:sz w:val="28"/>
+        </w:rPr>
+        <w:t xml:space="preserve">    copy and working document agree. Not on the phone.</w:t>
+      </w:r>
+    </w:p>
+    <w:p>
+      <w:pPr>
+        <w:spacing w:line="276" w:lineRule="auto"/>
+      </w:pPr>
+      <w:r>
+        <w:rPr>
+          <w:rFonts w:ascii="Arial" w:hAnsi="Arial"/>
+          <w:sz w:val="28"/>
+        </w:rPr>
+        <w:t xml:space="preserve"/>
+      </w:r>
+    </w:p>
+    <w:p>
+      <w:pPr>
+        <w:spacing w:line="276" w:lineRule="auto"/>
+      </w:pPr>
+      <w:r>
+        <w:rPr>
+          <w:rFonts w:ascii="Arial" w:hAnsi="Arial"/>
+          <w:sz w:val="28"/>
+        </w:rPr>
+        <w:t xml:space="preserve">129. #109-new — Job 3 checkpoint 3C. One physical transaction now</w:t>
+      </w:r>
+    </w:p>
+    <w:p>
+      <w:pPr>
+        <w:spacing w:line="276" w:lineRule="auto"/>
+      </w:pPr>
+      <w:r>
+        <w:rPr>
+          <w:rFonts w:ascii="Arial" w:hAnsi="Arial"/>
+          <w:sz w:val="28"/>
+        </w:rPr>
+        <w:t xml:space="preserve">    protects every saved-list change, and Backup Export waits for an</w:t>
+      </w:r>
+    </w:p>
+    <w:p>
+      <w:pPr>
+        <w:spacing w:line="276" w:lineRule="auto"/>
+      </w:pPr>
+      <w:r>
+        <w:rPr>
+          <w:rFonts w:ascii="Arial" w:hAnsi="Arial"/>
+          <w:sz w:val="28"/>
+        </w:rPr>
+        <w:t xml:space="preserve">    active change before reading. 402 Mac checks. TypeScript clean.</w:t>
+      </w:r>
+    </w:p>
+    <w:p>
+      <w:pPr>
+        <w:spacing w:line="276" w:lineRule="auto"/>
+      </w:pPr>
+      <w:r>
+        <w:rPr>
+          <w:rFonts w:ascii="Arial" w:hAnsi="Arial"/>
+          <w:sz w:val="28"/>
+        </w:rPr>
+        <w:t xml:space="preserve">    The designed-machine sheet is complete. Not on the phone.</w:t>
+      </w:r>
+    </w:p>
+    <w:p>
+      <w:pPr>
+        <w:spacing w:line="276" w:lineRule="auto"/>
+      </w:pPr>
+      <w:r>
+        <w:rPr>
+          <w:rFonts w:ascii="Arial" w:hAnsi="Arial"/>
+          <w:sz w:val="28"/>
+        </w:rPr>
+        <w:t xml:space="preserve"/>
+      </w:r>
+    </w:p>
+    <w:p>
+      <w:pPr>
+        <w:spacing w:line="276" w:lineRule="auto"/>
+      </w:pPr>
+      <w:r>
+        <w:rPr>
+          <w:rFonts w:ascii="Arial" w:hAnsi="Arial"/>
+          <w:sz w:val="28"/>
+        </w:rPr>
+        <w:t xml:space="preserve">128. #109-new — Job 3 checkpoint 3B. Weekly Done writes and clears</w:t>
+      </w:r>
+    </w:p>
+    <w:p>
+      <w:pPr>
+        <w:spacing w:line="276" w:lineRule="auto"/>
+      </w:pPr>
+      <w:r>
+        <w:rPr>
+          <w:rFonts w:ascii="Arial" w:hAnsi="Arial"/>
+          <w:sz w:val="28"/>
+        </w:rPr>
+        <w:t xml:space="preserve">    its cycle time from the table facts “this cycle” and “week.”</w:t>
+      </w:r>
+    </w:p>
+    <w:p>
+      <w:pPr>
+        <w:spacing w:line="276" w:lineRule="auto"/>
+      </w:pPr>
+      <w:r>
+        <w:rPr>
+          <w:rFonts w:ascii="Arial" w:hAnsi="Arial"/>
+          <w:sz w:val="28"/>
+        </w:rPr>
+        <w:t xml:space="preserve">    Daily does not gain that time, and the three meanings of Done</w:t>
+      </w:r>
+    </w:p>
+    <w:p>
+      <w:pPr>
+        <w:spacing w:line="276" w:lineRule="auto"/>
+      </w:pPr>
+      <w:r>
+        <w:rPr>
+          <w:rFonts w:ascii="Arial" w:hAnsi="Arial"/>
+          <w:sz w:val="28"/>
+        </w:rPr>
+        <w:t xml:space="preserve">    stay unchanged. 398 Mac checks. TypeScript clean. Not on the phone.</w:t>
+      </w:r>
+    </w:p>
+    <w:p>
+      <w:pPr>
+        <w:spacing w:line="276" w:lineRule="auto"/>
+      </w:pPr>
+      <w:r>
+        <w:rPr>
+          <w:rFonts w:ascii="Arial" w:hAnsi="Arial"/>
+          <w:sz w:val="28"/>
+        </w:rPr>
+        <w:t xml:space="preserve"/>
+      </w:r>
+    </w:p>
+    <w:p>
+      <w:pPr>
+        <w:spacing w:line="276" w:lineRule="auto"/>
+      </w:pPr>
+      <w:r>
+        <w:rPr>
+          <w:rFonts w:ascii="Arial" w:hAnsi="Arial"/>
+          <w:sz w:val="28"/>
+        </w:rPr>
+        <w:t xml:space="preserve">127. #109-new — Job 3 checkpoint 3A. Each reminder kind now carries</w:t>
+      </w:r>
+    </w:p>
+    <w:p>
+      <w:pPr>
+        <w:spacing w:line="276" w:lineRule="auto"/>
+      </w:pPr>
+      <w:r>
+        <w:rPr>
+          <w:rFonts w:ascii="Arial" w:hAnsi="Arial"/>
+          <w:sz w:val="28"/>
+        </w:rPr>
+        <w:t xml:space="preserve">    its allowed Options on the one table. Save and Restore strip</w:t>
+      </w:r>
+    </w:p>
+    <w:p>
+      <w:pPr>
+        <w:spacing w:line="276" w:lineRule="auto"/>
+      </w:pPr>
+      <w:r>
+        <w:rPr>
+          <w:rFonts w:ascii="Arial" w:hAnsi="Arial"/>
+          <w:sz w:val="28"/>
+        </w:rPr>
+        <w:t xml:space="preserve">    Options that do not belong; an unknown backup kind changes</w:t>
+      </w:r>
+    </w:p>
+    <w:p>
+      <w:pPr>
+        <w:spacing w:line="276" w:lineRule="auto"/>
+      </w:pPr>
+      <w:r>
+        <w:rPr>
+          <w:rFonts w:ascii="Arial" w:hAnsi="Arial"/>
+          <w:sz w:val="28"/>
+        </w:rPr>
+        <w:t xml:space="preserve">    nothing. 397 Mac checks. TypeScript clean. Not on the phone.</w:t>
+      </w:r>
+    </w:p>
+    <w:p>
+      <w:pPr>
+        <w:spacing w:line="276" w:lineRule="auto"/>
+      </w:pPr>
+      <w:r>
+        <w:rPr>
+          <w:rFonts w:ascii="Arial" w:hAnsi="Arial"/>
+          <w:sz w:val="28"/>
+        </w:rPr>
+        <w:t xml:space="preserve"/>
+      </w:r>
+    </w:p>
+    <w:p>
+      <w:pPr>
+        <w:spacing w:line="276" w:lineRule="auto"/>
+      </w:pPr>
+      <w:r>
+        <w:rPr>
+          <w:rFonts w:ascii="Arial" w:hAnsi="Arial"/>
+          <w:sz w:val="28"/>
+        </w:rPr>
+        <w:t xml:space="preserve">126. #108-new — Jobs 1 and 2: 391 Mac checks, TypeScript clean, and</w:t>
+      </w:r>
+    </w:p>
+    <w:p>
+      <w:pPr>
+        <w:spacing w:line="276" w:lineRule="auto"/>
+      </w:pPr>
+      <w:r>
+        <w:rPr>
+          <w:rFonts w:ascii="Arial" w:hAnsi="Arial"/>
+          <w:sz w:val="28"/>
+        </w:rPr>
+        <w:t xml:space="preserve">    the iOS bundle complete. Native phone proof remains.</w:t>
+      </w:r>
+    </w:p>
+    <w:p>
+      <w:pPr>
+        <w:spacing w:line="276" w:lineRule="auto"/>
+      </w:pPr>
+      <w:r>
+        <w:rPr>
+          <w:rFonts w:ascii="Arial" w:hAnsi="Arial"/>
+          <w:sz w:val="28"/>
+        </w:rPr>
+        <w:t xml:space="preserve"/>
+      </w:r>
+    </w:p>
+    <w:p>
+      <w:pPr>
+        <w:spacing w:line="276" w:lineRule="auto"/>
+      </w:pPr>
+      <w:r>
+        <w:rPr>
+          <w:rFonts w:ascii="Arial" w:hAnsi="Arial"/>
+          <w:sz w:val="28"/>
+        </w:rPr>
+        <w:t xml:space="preserve">125. #108-new — one awaited opening through rollover, scheduling, the</w:t>
+      </w:r>
+    </w:p>
+    <w:p>
+      <w:pPr>
+        <w:spacing w:line="276" w:lineRule="auto"/>
+      </w:pPr>
+      <w:r>
+        <w:rPr>
+          <w:rFonts w:ascii="Arial" w:hAnsi="Arial"/>
+          <w:sz w:val="28"/>
+        </w:rPr>
+        <w:t xml:space="preserve">    health notice, and then a banner body destination.</w:t>
+      </w:r>
+    </w:p>
+    <w:p>
+      <w:pPr>
+        <w:spacing w:line="276" w:lineRule="auto"/>
+      </w:pPr>
+      <w:r>
+        <w:rPr>
+          <w:rFonts w:ascii="Arial" w:hAnsi="Arial"/>
+          <w:sz w:val="28"/>
+        </w:rPr>
+        <w:t xml:space="preserve"/>
+      </w:r>
+    </w:p>
+    <w:p>
+      <w:pPr>
+        <w:spacing w:line="276" w:lineRule="auto"/>
+      </w:pPr>
+      <w:r>
+        <w:rPr>
+          <w:rFonts w:ascii="Arial" w:hAnsi="Arial"/>
+          <w:sz w:val="28"/>
+        </w:rPr>
+        <w:t xml:space="preserve">124. #108-new — one typed banner-action catalog. One Time has no Skip,</w:t>
+      </w:r>
+    </w:p>
+    <w:p>
+      <w:pPr>
+        <w:spacing w:line="276" w:lineRule="auto"/>
+      </w:pPr>
+      <w:r>
+        <w:rPr>
+          <w:rFonts w:ascii="Arial" w:hAnsi="Arial"/>
+          <w:sz w:val="28"/>
+        </w:rPr>
+        <w:t xml:space="preserve">    and its delayed reminder now reaches the phone road.</w:t>
       </w:r>
     </w:p>
     <w:p>

</xml_diff>

<commit_message>
112-new - Memory - Add contrast settings.
</commit_message>
<xml_diff>
--- a/docs/pending.docx
+++ b/docs/pending.docx
@@ -24,7 +24,7 @@
           <w:rFonts w:ascii="Arial" w:hAnsi="Arial"/>
           <w:sz w:val="28"/>
         </w:rPr>
-        <w:t xml:space="preserve">Last updated: 2026-09-13 (#109-new)</w:t>
+        <w:t xml:space="preserve">Last updated: 2026-09-14 (#112-new)</w:t>
       </w:r>
     </w:p>
     <w:p>
@@ -421,6 +421,198 @@
           <w:rFonts w:ascii="Arial" w:hAnsi="Arial"/>
           <w:sz w:val="28"/>
         </w:rPr>
+        <w:t xml:space="preserve">3. JOB 3 ON BUILD 82. Options by kind, Weekly Done, and an export</w:t>
+      </w:r>
+    </w:p>
+    <w:p>
+      <w:pPr>
+        <w:spacing w:line="276" w:lineRule="auto"/>
+      </w:pPr>
+      <w:r>
+        <w:rPr>
+          <w:rFonts w:ascii="Arial" w:hAnsi="Arial"/>
+          <w:sz w:val="28"/>
+        </w:rPr>
+        <w:t xml:space="preserve">   after a change. This load has that work; it has not been checked</w:t>
+      </w:r>
+    </w:p>
+    <w:p>
+      <w:pPr>
+        <w:spacing w:line="276" w:lineRule="auto"/>
+      </w:pPr>
+      <w:r>
+        <w:rPr>
+          <w:rFonts w:ascii="Arial" w:hAnsi="Arial"/>
+          <w:sz w:val="28"/>
+        </w:rPr>
+        <w:t xml:space="preserve">   on the phone.</w:t>
+      </w:r>
+    </w:p>
+    <w:p>
+      <w:pPr>
+        <w:spacing w:line="276" w:lineRule="auto"/>
+      </w:pPr>
+      <w:r>
+        <w:rPr>
+          <w:rFonts w:ascii="Arial" w:hAnsi="Arial"/>
+          <w:sz w:val="28"/>
+        </w:rPr>
+        <w:t xml:space="preserve">4. BIRTHDAY ROW AND REMINDER (Patrick, #110-new). In the project, not</w:t>
+      </w:r>
+    </w:p>
+    <w:p>
+      <w:pPr>
+        <w:spacing w:line="276" w:lineRule="auto"/>
+      </w:pPr>
+      <w:r>
+        <w:rPr>
+          <w:rFonts w:ascii="Arial" w:hAnsi="Arial"/>
+          <w:sz w:val="28"/>
+        </w:rPr>
+        <w:t xml:space="preserve">   on 82. The row shows the name and the birthdate. The reminder says</w:t>
+      </w:r>
+    </w:p>
+    <w:p>
+      <w:pPr>
+        <w:spacing w:line="276" w:lineRule="auto"/>
+      </w:pPr>
+      <w:r>
+        <w:rPr>
+          <w:rFonts w:ascii="Arial" w:hAnsi="Arial"/>
+          <w:sz w:val="28"/>
+        </w:rPr>
+        <w:t xml:space="preserve">   the age. The next fire is derived from the birthdate. Restore writes</w:t>
+      </w:r>
+    </w:p>
+    <w:p>
+      <w:pPr>
+        <w:spacing w:line="276" w:lineRule="auto"/>
+      </w:pPr>
+      <w:r>
+        <w:rPr>
+          <w:rFonts w:ascii="Arial" w:hAnsi="Arial"/>
+          <w:sz w:val="28"/>
+        </w:rPr>
+        <w:t xml:space="preserve">   the year of birth onto an older backup. Needs a phone check on the</w:t>
+      </w:r>
+    </w:p>
+    <w:p>
+      <w:pPr>
+        <w:spacing w:line="276" w:lineRule="auto"/>
+      </w:pPr>
+      <w:r>
+        <w:rPr>
+          <w:rFonts w:ascii="Arial" w:hAnsi="Arial"/>
+          <w:sz w:val="28"/>
+        </w:rPr>
+        <w:t xml:space="preserve">   next load. Replace brings the backup copy back; Merge keeps what is</w:t>
+      </w:r>
+    </w:p>
+    <w:p>
+      <w:pPr>
+        <w:spacing w:line="276" w:lineRule="auto"/>
+      </w:pPr>
+      <w:r>
+        <w:rPr>
+          <w:rFonts w:ascii="Arial" w:hAnsi="Arial"/>
+          <w:sz w:val="28"/>
+        </w:rPr>
+        <w:t xml:space="preserve">   already in the app.</w:t>
+      </w:r>
+    </w:p>
+    <w:p>
+      <w:pPr>
+        <w:spacing w:line="276" w:lineRule="auto"/>
+      </w:pPr>
+      <w:r>
+        <w:rPr>
+          <w:rFonts w:ascii="Arial" w:hAnsi="Arial"/>
+          <w:sz w:val="28"/>
+        </w:rPr>
+        <w:t xml:space="preserve"/>
+      </w:r>
+    </w:p>
+    <w:p>
+      <w:pPr>
+        <w:spacing w:line="276" w:lineRule="auto"/>
+      </w:pPr>
+      <w:r>
+        <w:rPr>
+          <w:rFonts w:ascii="Arial" w:hAnsi="Arial"/>
+          <w:sz w:val="28"/>
+        </w:rPr>
+        <w:t xml:space="preserve"/>
+      </w:r>
+    </w:p>
+    <w:p>
+      <w:pPr>
+        <w:spacing w:line="276" w:lineRule="auto"/>
+      </w:pPr>
+      <w:r>
+        <w:rPr>
+          <w:rFonts w:ascii="Arial" w:hAnsi="Arial"/>
+          <w:sz w:val="28"/>
+        </w:rPr>
+        <w:t xml:space="preserve">5. HOME BADGES (Patrick, #112-new). In the project, not on 86. Five</w:t>
+      </w:r>
+    </w:p>
+    <w:p>
+      <w:pPr>
+        <w:spacing w:line="276" w:lineRule="auto"/>
+      </w:pPr>
+      <w:r>
+        <w:rPr>
+          <w:rFonts w:ascii="Arial" w:hAnsi="Arial"/>
+          <w:sz w:val="28"/>
+        </w:rPr>
+        <w:t xml:space="preserve">   rows of two, and that group turns with the phone. Bucket List is a</w:t>
+      </w:r>
+    </w:p>
+    <w:p>
+      <w:pPr>
+        <w:spacing w:line="276" w:lineRule="auto"/>
+      </w:pPr>
+      <w:r>
+        <w:rPr>
+          <w:rFonts w:ascii="Arial" w:hAnsi="Arial"/>
+          <w:sz w:val="28"/>
+        </w:rPr>
+        <w:t xml:space="preserve">   smiling face. Quarterly is a maple leaf. The Help tile is named</w:t>
+      </w:r>
+    </w:p>
+    <w:p>
+      <w:pPr>
+        <w:spacing w:line="276" w:lineRule="auto"/>
+      </w:pPr>
+      <w:r>
+        <w:rPr>
+          <w:rFonts w:ascii="Arial" w:hAnsi="Arial"/>
+          <w:sz w:val="28"/>
+        </w:rPr>
+        <w:t xml:space="preserve">   Helper. The person's name is in the backup. Needs a look on the next</w:t>
+      </w:r>
+    </w:p>
+    <w:p>
+      <w:pPr>
+        <w:spacing w:line="276" w:lineRule="auto"/>
+      </w:pPr>
+      <w:r>
+        <w:rPr>
+          <w:rFonts w:ascii="Arial" w:hAnsi="Arial"/>
+          <w:sz w:val="28"/>
+        </w:rPr>
+        <w:t xml:space="preserve">   load, upright and turned.</w:t>
+      </w:r>
+    </w:p>
+    <w:p>
+      <w:pPr>
+        <w:spacing w:line="276" w:lineRule="auto"/>
+      </w:pPr>
+      <w:r>
+        <w:rPr>
+          <w:rFonts w:ascii="Arial" w:hAnsi="Arial"/>
+          <w:sz w:val="28"/>
+        </w:rPr>
         <w:t xml:space="preserve"/>
       </w:r>
     </w:p>
@@ -1371,7 +1563,7 @@
           <w:rFonts w:ascii="Arial" w:hAnsi="Arial"/>
           <w:sz w:val="28"/>
         </w:rPr>
-        <w:t xml:space="preserve">    Patrick a design question. Home, Help, Calendar, Settings, Backup,</w:t>
+        <w:t xml:space="preserve">    Patrick a design question. Home, Helper, Calendar, Settings, Backup,</w:t>
       </w:r>
     </w:p>
     <w:p>
@@ -1599,6 +1791,102 @@
           <w:rFonts w:ascii="Arial" w:hAnsi="Arial"/>
           <w:sz w:val="28"/>
         </w:rPr>
+        <w:t xml:space="preserve">21. LETTERS AND PAGE ON SETTINGS (Patrick, #111-new). Under Appearance.</w:t>
+      </w:r>
+    </w:p>
+    <w:p>
+      <w:pPr>
+        <w:spacing w:line="276" w:lineRule="auto"/>
+      </w:pPr>
+      <w:r>
+        <w:rPr>
+          <w:rFonts w:ascii="Arial" w:hAnsi="Arial"/>
+          <w:sz w:val="28"/>
+        </w:rPr>
+        <w:t xml:space="preserve">    Middle is the look the app ships with. Plus is more — darker.</w:t>
+      </w:r>
+    </w:p>
+    <w:p>
+      <w:pPr>
+        <w:spacing w:line="276" w:lineRule="auto"/>
+      </w:pPr>
+      <w:r>
+        <w:rPr>
+          <w:rFonts w:ascii="Arial" w:hAnsi="Arial"/>
+          <w:sz w:val="28"/>
+        </w:rPr>
+        <w:t xml:space="preserve">    Minus is less — lighter. They stay on the phone.</w:t>
+      </w:r>
+    </w:p>
+    <w:p>
+      <w:pPr>
+        <w:spacing w:line="276" w:lineRule="auto"/>
+      </w:pPr>
+      <w:r>
+        <w:rPr>
+          <w:rFonts w:ascii="Arial" w:hAnsi="Arial"/>
+          <w:sz w:val="28"/>
+        </w:rPr>
+        <w:t xml:space="preserve">22. HOME BADGES, HELPER, AND THE NAME ON BACKUP (Patrick, #112-new).</w:t>
+      </w:r>
+    </w:p>
+    <w:p>
+      <w:pPr>
+        <w:spacing w:line="276" w:lineRule="auto"/>
+      </w:pPr>
+      <w:r>
+        <w:rPr>
+          <w:rFonts w:ascii="Arial" w:hAnsi="Arial"/>
+          <w:sz w:val="28"/>
+        </w:rPr>
+        <w:t xml:space="preserve">    Five rows of two; that group turns with the phone. Bucket List is</w:t>
+      </w:r>
+    </w:p>
+    <w:p>
+      <w:pPr>
+        <w:spacing w:line="276" w:lineRule="auto"/>
+      </w:pPr>
+      <w:r>
+        <w:rPr>
+          <w:rFonts w:ascii="Arial" w:hAnsi="Arial"/>
+          <w:sz w:val="28"/>
+        </w:rPr>
+        <w:t xml:space="preserve">    a smiling face. Quarterly is a maple leaf. The visible name is</w:t>
+      </w:r>
+    </w:p>
+    <w:p>
+      <w:pPr>
+        <w:spacing w:line="276" w:lineRule="auto"/>
+      </w:pPr>
+      <w:r>
+        <w:rPr>
+          <w:rFonts w:ascii="Arial" w:hAnsi="Arial"/>
+          <w:sz w:val="28"/>
+        </w:rPr>
+        <w:t xml:space="preserve">    Helper. The person's name is saved and restored. The rest of</w:t>
+      </w:r>
+    </w:p>
+    <w:p>
+      <w:pPr>
+        <w:spacing w:line="276" w:lineRule="auto"/>
+      </w:pPr>
+      <w:r>
+        <w:rPr>
+          <w:rFonts w:ascii="Arial" w:hAnsi="Arial"/>
+          <w:sz w:val="28"/>
+        </w:rPr>
+        <w:t xml:space="preserve">    Settings stay on the phone.</w:t>
+      </w:r>
+    </w:p>
+    <w:p>
+      <w:pPr>
+        <w:spacing w:line="276" w:lineRule="auto"/>
+      </w:pPr>
+      <w:r>
+        <w:rPr>
+          <w:rFonts w:ascii="Arial" w:hAnsi="Arial"/>
+          <w:sz w:val="28"/>
+        </w:rPr>
         <w:t xml:space="preserve"/>
       </w:r>
     </w:p>
@@ -1708,6 +1996,162 @@
           <w:rFonts w:ascii="Arial" w:hAnsi="Arial"/>
           <w:sz w:val="28"/>
         </w:rPr>
+        <w:t xml:space="preserve">134. #112-new — The person's name is saved and restored. The rest of</w:t>
+      </w:r>
+    </w:p>
+    <w:p>
+      <w:pPr>
+        <w:spacing w:line="276" w:lineRule="auto"/>
+      </w:pPr>
+      <w:r>
+        <w:rPr>
+          <w:rFonts w:ascii="Arial" w:hAnsi="Arial"/>
+          <w:sz w:val="28"/>
+        </w:rPr>
+        <w:t xml:space="preserve">    Settings stay on the phone. Not on 86.</w:t>
+      </w:r>
+    </w:p>
+    <w:p>
+      <w:pPr>
+        <w:spacing w:line="276" w:lineRule="auto"/>
+      </w:pPr>
+      <w:r>
+        <w:rPr>
+          <w:rFonts w:ascii="Arial" w:hAnsi="Arial"/>
+          <w:sz w:val="28"/>
+        </w:rPr>
+        <w:t xml:space="preserve"/>
+      </w:r>
+    </w:p>
+    <w:p>
+      <w:pPr>
+        <w:spacing w:line="276" w:lineRule="auto"/>
+      </w:pPr>
+      <w:r>
+        <w:rPr>
+          <w:rFonts w:ascii="Arial" w:hAnsi="Arial"/>
+          <w:sz w:val="28"/>
+        </w:rPr>
+        <w:t xml:space="preserve">133. #112-new — Bucket List is a smiling face. Quarterly is a maple</w:t>
+      </w:r>
+    </w:p>
+    <w:p>
+      <w:pPr>
+        <w:spacing w:line="276" w:lineRule="auto"/>
+      </w:pPr>
+      <w:r>
+        <w:rPr>
+          <w:rFonts w:ascii="Arial" w:hAnsi="Arial"/>
+          <w:sz w:val="28"/>
+        </w:rPr>
+        <w:t xml:space="preserve">    leaf. Help is named Helper. Not on 86.</w:t>
+      </w:r>
+    </w:p>
+    <w:p>
+      <w:pPr>
+        <w:spacing w:line="276" w:lineRule="auto"/>
+      </w:pPr>
+      <w:r>
+        <w:rPr>
+          <w:rFonts w:ascii="Arial" w:hAnsi="Arial"/>
+          <w:sz w:val="28"/>
+        </w:rPr>
+        <w:t xml:space="preserve"/>
+      </w:r>
+    </w:p>
+    <w:p>
+      <w:pPr>
+        <w:spacing w:line="276" w:lineRule="auto"/>
+      </w:pPr>
+      <w:r>
+        <w:rPr>
+          <w:rFonts w:ascii="Arial" w:hAnsi="Arial"/>
+          <w:sz w:val="28"/>
+        </w:rPr>
+        <w:t xml:space="preserve">132. #112-new — Home badges keep five rows of two and turn with the</w:t>
+      </w:r>
+    </w:p>
+    <w:p>
+      <w:pPr>
+        <w:spacing w:line="276" w:lineRule="auto"/>
+      </w:pPr>
+      <w:r>
+        <w:rPr>
+          <w:rFonts w:ascii="Arial" w:hAnsi="Arial"/>
+          <w:sz w:val="28"/>
+        </w:rPr>
+        <w:t xml:space="preserve">    phone. Pictures a comfortable size after two 5% cuts. Not on 86.</w:t>
+      </w:r>
+    </w:p>
+    <w:p>
+      <w:pPr>
+        <w:spacing w:line="276" w:lineRule="auto"/>
+      </w:pPr>
+      <w:r>
+        <w:rPr>
+          <w:rFonts w:ascii="Arial" w:hAnsi="Arial"/>
+          <w:sz w:val="28"/>
+        </w:rPr>
+        <w:t xml:space="preserve"/>
+      </w:r>
+    </w:p>
+    <w:p>
+      <w:pPr>
+        <w:spacing w:line="276" w:lineRule="auto"/>
+      </w:pPr>
+      <w:r>
+        <w:rPr>
+          <w:rFonts w:ascii="Arial" w:hAnsi="Arial"/>
+          <w:sz w:val="28"/>
+        </w:rPr>
+        <w:t xml:space="preserve">131. #111-new — Letters and Page on Settings Appearance. Middle is</w:t>
+      </w:r>
+    </w:p>
+    <w:p>
+      <w:pPr>
+        <w:spacing w:line="276" w:lineRule="auto"/>
+      </w:pPr>
+      <w:r>
+        <w:rPr>
+          <w:rFonts w:ascii="Arial" w:hAnsi="Arial"/>
+          <w:sz w:val="28"/>
+        </w:rPr>
+        <w:t xml:space="preserve">    the original look. Plus is more (darker). Minus is less (lighter).</w:t>
+      </w:r>
+    </w:p>
+    <w:p>
+      <w:pPr>
+        <w:spacing w:line="276" w:lineRule="auto"/>
+      </w:pPr>
+      <w:r>
+        <w:rPr>
+          <w:rFonts w:ascii="Arial" w:hAnsi="Arial"/>
+          <w:sz w:val="28"/>
+        </w:rPr>
+        <w:t xml:space="preserve">    On the phone, being tried.</w:t>
+      </w:r>
+    </w:p>
+    <w:p>
+      <w:pPr>
+        <w:spacing w:line="276" w:lineRule="auto"/>
+      </w:pPr>
+      <w:r>
+        <w:rPr>
+          <w:rFonts w:ascii="Arial" w:hAnsi="Arial"/>
+          <w:sz w:val="28"/>
+        </w:rPr>
+        <w:t xml:space="preserve"/>
+      </w:r>
+    </w:p>
+    <w:p>
+      <w:pPr>
+        <w:spacing w:line="276" w:lineRule="auto"/>
+      </w:pPr>
+      <w:r>
+        <w:rPr>
+          <w:rFonts w:ascii="Arial" w:hAnsi="Arial"/>
+          <w:sz w:val="28"/>
+        </w:rPr>
         <w:t xml:space="preserve">130. #109-new — The User's Guide now correctly says One Time for</w:t>
       </w:r>
     </w:p>
@@ -8276,19 +8720,55 @@
           <w:rFonts w:ascii="Arial" w:hAnsi="Arial"/>
           <w:sz w:val="28"/>
         </w:rPr>
-        <w:t xml:space="preserve">7. Settings and page logs do not need to be saved or restored. The</w:t>
-      </w:r>
-    </w:p>
-    <w:p>
-      <w:pPr>
-        <w:spacing w:line="276" w:lineRule="auto"/>
-      </w:pPr>
-      <w:r>
-        <w:rPr>
-          <w:rFonts w:ascii="Arial" w:hAnsi="Arial"/>
-          <w:sz w:val="28"/>
-        </w:rPr>
-        <w:t xml:space="preserve">   backup does not carry them.</w:t>
+        <w:t xml:space="preserve">7. The person's name is saved and restored (Patrick, #112-new). Replace</w:t>
+      </w:r>
+    </w:p>
+    <w:p>
+      <w:pPr>
+        <w:spacing w:line="276" w:lineRule="auto"/>
+      </w:pPr>
+      <w:r>
+        <w:rPr>
+          <w:rFonts w:ascii="Arial" w:hAnsi="Arial"/>
+          <w:sz w:val="28"/>
+        </w:rPr>
+        <w:t xml:space="preserve">   writes the name from the file when the file has one. Merge keeps the</w:t>
+      </w:r>
+    </w:p>
+    <w:p>
+      <w:pPr>
+        <w:spacing w:line="276" w:lineRule="auto"/>
+      </w:pPr>
+      <w:r>
+        <w:rPr>
+          <w:rFonts w:ascii="Arial" w:hAnsi="Arial"/>
+          <w:sz w:val="28"/>
+        </w:rPr>
+        <w:t xml:space="preserve">   name already on the phone, and takes the backup's only when the phone</w:t>
+      </w:r>
+    </w:p>
+    <w:p>
+      <w:pPr>
+        <w:spacing w:line="276" w:lineRule="auto"/>
+      </w:pPr>
+      <w:r>
+        <w:rPr>
+          <w:rFonts w:ascii="Arial" w:hAnsi="Arial"/>
+          <w:sz w:val="28"/>
+        </w:rPr>
+        <w:t xml:space="preserve">   has none. The rest of Settings and page logs stay on the phone. The</w:t>
+      </w:r>
+    </w:p>
+    <w:p>
+      <w:pPr>
+        <w:spacing w:line="276" w:lineRule="auto"/>
+      </w:pPr>
+      <w:r>
+        <w:rPr>
+          <w:rFonts w:ascii="Arial" w:hAnsi="Arial"/>
+          <w:sz w:val="28"/>
+        </w:rPr>
+        <w:t xml:space="preserve">   backup does not carry those.</w:t>
       </w:r>
     </w:p>
     <w:p>

</xml_diff>

<commit_message>
116—new - Memory - Fixed bugs found in Evaluations 7 that remain.
</commit_message>
<xml_diff>
--- a/docs/pending.docx
+++ b/docs/pending.docx
@@ -24,7 +24,7 @@
           <w:rFonts w:ascii="Arial" w:hAnsi="Arial"/>
           <w:sz w:val="28"/>
         </w:rPr>
-        <w:t xml:space="preserve">Last updated: 2026-09-14 (#112-new)</w:t>
+        <w:t xml:space="preserve">Last updated: 2026-09-15 (#116-new)</w:t>
       </w:r>
     </w:p>
     <w:p>
@@ -1191,43 +1191,43 @@
           <w:rFonts w:ascii="Arial" w:hAnsi="Arial"/>
           <w:sz w:val="28"/>
         </w:rPr>
-        <w:t xml:space="preserve">8. AN EXTENDED ITEM AND A DAILY TICK ARE OPPOSITES. A Bucket List</w:t>
-      </w:r>
-    </w:p>
-    <w:p>
-      <w:pPr>
-        <w:spacing w:line="276" w:lineRule="auto"/>
-      </w:pPr>
-      <w:r>
-        <w:rPr>
-          <w:rFonts w:ascii="Arial" w:hAnsi="Arial"/>
-          <w:sz w:val="28"/>
-        </w:rPr>
-        <w:t xml:space="preserve">   item (saved kind bucketlist) says a thing is not yet done and must</w:t>
-      </w:r>
-    </w:p>
-    <w:p>
-      <w:pPr>
-        <w:spacing w:line="276" w:lineRule="auto"/>
-      </w:pPr>
-      <w:r>
-        <w:rPr>
-          <w:rFonts w:ascii="Arial" w:hAnsi="Arial"/>
-          <w:sz w:val="28"/>
-        </w:rPr>
-        <w:t xml:space="preserve">   survive the night. The coffee-and-water sort says a thing was</w:t>
-      </w:r>
-    </w:p>
-    <w:p>
-      <w:pPr>
-        <w:spacing w:line="276" w:lineRule="auto"/>
-      </w:pPr>
-      <w:r>
-        <w:rPr>
-          <w:rFonts w:ascii="Arial" w:hAnsi="Arial"/>
-          <w:sz w:val="28"/>
-        </w:rPr>
-        <w:t xml:space="preserve">   done today and is meaningless the morning after. They must never</w:t>
+        <w:t xml:space="preserve">8. A BUCKET LIST ITEM AND A DAILY DONE TICK ARE OPPOSITES. A Bucket</w:t>
+      </w:r>
+    </w:p>
+    <w:p>
+      <w:pPr>
+        <w:spacing w:line="276" w:lineRule="auto"/>
+      </w:pPr>
+      <w:r>
+        <w:rPr>
+          <w:rFonts w:ascii="Arial" w:hAnsi="Arial"/>
+          <w:sz w:val="28"/>
+        </w:rPr>
+        <w:t xml:space="preserve">   List item (saved kind bucketlist) says a thing is not yet done and</w:t>
+      </w:r>
+    </w:p>
+    <w:p>
+      <w:pPr>
+        <w:spacing w:line="276" w:lineRule="auto"/>
+      </w:pPr>
+      <w:r>
+        <w:rPr>
+          <w:rFonts w:ascii="Arial" w:hAnsi="Arial"/>
+          <w:sz w:val="28"/>
+        </w:rPr>
+        <w:t xml:space="preserve">   must survive the night. A Daily Done tick says today's occurrence</w:t>
+      </w:r>
+    </w:p>
+    <w:p>
+      <w:pPr>
+        <w:spacing w:line="276" w:lineRule="auto"/>
+      </w:pPr>
+      <w:r>
+        <w:rPr>
+          <w:rFonts w:ascii="Arial" w:hAnsi="Arial"/>
+          <w:sz w:val="28"/>
+        </w:rPr>
+        <w:t xml:space="preserve">   was done and is cleared when the day rolls over. They must never</w:t>
       </w:r>
     </w:p>
     <w:p>
@@ -1996,6 +1996,558 @@
           <w:rFonts w:ascii="Arial" w:hAnsi="Arial"/>
           <w:sz w:val="28"/>
         </w:rPr>
+        <w:t xml:space="preserve">144. #116-new — The User's Guide marks page names in Reminders that</w:t>
+      </w:r>
+    </w:p>
+    <w:p>
+      <w:pPr>
+        <w:spacing w:line="276" w:lineRule="auto"/>
+      </w:pPr>
+      <w:r>
+        <w:rPr>
+          <w:rFonts w:ascii="Arial" w:hAnsi="Arial"/>
+          <w:sz w:val="28"/>
+        </w:rPr>
+        <w:t xml:space="preserve">    repeat and Reminders that do not repeat. The working document and</w:t>
+      </w:r>
+    </w:p>
+    <w:p>
+      <w:pPr>
+        <w:spacing w:line="276" w:lineRule="auto"/>
+      </w:pPr>
+      <w:r>
+        <w:rPr>
+          <w:rFonts w:ascii="Arial" w:hAnsi="Arial"/>
+          <w:sz w:val="28"/>
+        </w:rPr>
+        <w:t xml:space="preserve">    the in-app copy agree. Not on the phone.</w:t>
+      </w:r>
+    </w:p>
+    <w:p>
+      <w:pPr>
+        <w:spacing w:line="276" w:lineRule="auto"/>
+      </w:pPr>
+      <w:r>
+        <w:rPr>
+          <w:rFonts w:ascii="Arial" w:hAnsi="Arial"/>
+          <w:sz w:val="28"/>
+        </w:rPr>
+        <w:t xml:space="preserve"/>
+      </w:r>
+    </w:p>
+    <w:p>
+      <w:pPr>
+        <w:spacing w:line="276" w:lineRule="auto"/>
+      </w:pPr>
+      <w:r>
+        <w:rPr>
+          <w:rFonts w:ascii="Arial" w:hAnsi="Arial"/>
+          <w:sz w:val="28"/>
+        </w:rPr>
+        <w:t xml:space="preserve">143. #116-new — Reminder lists no longer slide left for a back-swipe.</w:t>
+      </w:r>
+    </w:p>
+    <w:p>
+      <w:pPr>
+        <w:spacing w:line="276" w:lineRule="auto"/>
+      </w:pPr>
+      <w:r>
+        <w:rPr>
+          <w:rFonts w:ascii="Arial" w:hAnsi="Arial"/>
+          <w:sz w:val="28"/>
+        </w:rPr>
+        <w:t xml:space="preserve">    The last row has room above the bottom of the phone. Not on the</w:t>
+      </w:r>
+    </w:p>
+    <w:p>
+      <w:pPr>
+        <w:spacing w:line="276" w:lineRule="auto"/>
+      </w:pPr>
+      <w:r>
+        <w:rPr>
+          <w:rFonts w:ascii="Arial" w:hAnsi="Arial"/>
+          <w:sz w:val="28"/>
+        </w:rPr>
+        <w:t xml:space="preserve">    phone.</w:t>
+      </w:r>
+    </w:p>
+    <w:p>
+      <w:pPr>
+        <w:spacing w:line="276" w:lineRule="auto"/>
+      </w:pPr>
+      <w:r>
+        <w:rPr>
+          <w:rFonts w:ascii="Arial" w:hAnsi="Arial"/>
+          <w:sz w:val="28"/>
+        </w:rPr>
+        <w:t xml:space="preserve"/>
+      </w:r>
+    </w:p>
+    <w:p>
+      <w:pPr>
+        <w:spacing w:line="276" w:lineRule="auto"/>
+      </w:pPr>
+      <w:r>
+        <w:rPr>
+          <w:rFonts w:ascii="Arial" w:hAnsi="Arial"/>
+          <w:sz w:val="28"/>
+        </w:rPr>
+        <w:t xml:space="preserve">142. #116-new — One Time with no clock does not fire and does not</w:t>
+      </w:r>
+    </w:p>
+    <w:p>
+      <w:pPr>
+        <w:spacing w:line="276" w:lineRule="auto"/>
+      </w:pPr>
+      <w:r>
+        <w:rPr>
+          <w:rFonts w:ascii="Arial" w:hAnsi="Arial"/>
+          <w:sz w:val="28"/>
+        </w:rPr>
+        <w:t xml:space="preserve">    offer Snooze. No clock means no reminder. 418 Mac checks.</w:t>
+      </w:r>
+    </w:p>
+    <w:p>
+      <w:pPr>
+        <w:spacing w:line="276" w:lineRule="auto"/>
+      </w:pPr>
+      <w:r>
+        <w:rPr>
+          <w:rFonts w:ascii="Arial" w:hAnsi="Arial"/>
+          <w:sz w:val="28"/>
+        </w:rPr>
+        <w:t xml:space="preserve">    TypeScript clean. Not on the phone.</w:t>
+      </w:r>
+    </w:p>
+    <w:p>
+      <w:pPr>
+        <w:spacing w:line="276" w:lineRule="auto"/>
+      </w:pPr>
+      <w:r>
+        <w:rPr>
+          <w:rFonts w:ascii="Arial" w:hAnsi="Arial"/>
+          <w:sz w:val="28"/>
+        </w:rPr>
+        <w:t xml:space="preserve"/>
+      </w:r>
+    </w:p>
+    <w:p>
+      <w:pPr>
+        <w:spacing w:line="276" w:lineRule="auto"/>
+      </w:pPr>
+      <w:r>
+        <w:rPr>
+          <w:rFonts w:ascii="Arial" w:hAnsi="Arial"/>
+          <w:sz w:val="28"/>
+        </w:rPr>
+        <w:t xml:space="preserve">141. #116-new — Scheduled Reminders no longer names the Timer. The</w:t>
+      </w:r>
+    </w:p>
+    <w:p>
+      <w:pPr>
+        <w:spacing w:line="276" w:lineRule="auto"/>
+      </w:pPr>
+      <w:r>
+        <w:rPr>
+          <w:rFonts w:ascii="Arial" w:hAnsi="Arial"/>
+          <w:sz w:val="28"/>
+        </w:rPr>
+        <w:t xml:space="preserve">    foot says how many more reminders on the phone are not shown</w:t>
+      </w:r>
+    </w:p>
+    <w:p>
+      <w:pPr>
+        <w:spacing w:line="276" w:lineRule="auto"/>
+      </w:pPr>
+      <w:r>
+        <w:rPr>
+          <w:rFonts w:ascii="Arial" w:hAnsi="Arial"/>
+          <w:sz w:val="28"/>
+        </w:rPr>
+        <w:t xml:space="preserve">    here. 416 Mac checks. TypeScript clean. Not on the phone.</w:t>
+      </w:r>
+    </w:p>
+    <w:p>
+      <w:pPr>
+        <w:spacing w:line="276" w:lineRule="auto"/>
+      </w:pPr>
+      <w:r>
+        <w:rPr>
+          <w:rFonts w:ascii="Arial" w:hAnsi="Arial"/>
+          <w:sz w:val="28"/>
+        </w:rPr>
+        <w:t xml:space="preserve"/>
+      </w:r>
+    </w:p>
+    <w:p>
+      <w:pPr>
+        <w:spacing w:line="276" w:lineRule="auto"/>
+      </w:pPr>
+      <w:r>
+        <w:rPr>
+          <w:rFonts w:ascii="Arial" w:hAnsi="Arial"/>
+          <w:sz w:val="28"/>
+        </w:rPr>
+        <w:t xml:space="preserve">140. #116-new — The User's Guide now names Letters and Page on</w:t>
+      </w:r>
+    </w:p>
+    <w:p>
+      <w:pPr>
+        <w:spacing w:line="276" w:lineRule="auto"/>
+      </w:pPr>
+      <w:r>
+        <w:rPr>
+          <w:rFonts w:ascii="Arial" w:hAnsi="Arial"/>
+          <w:sz w:val="28"/>
+        </w:rPr>
+        <w:t xml:space="preserve">    Settings. Middle is the look the app ships with. Plus is darker.</w:t>
+      </w:r>
+    </w:p>
+    <w:p>
+      <w:pPr>
+        <w:spacing w:line="276" w:lineRule="auto"/>
+      </w:pPr>
+      <w:r>
+        <w:rPr>
+          <w:rFonts w:ascii="Arial" w:hAnsi="Arial"/>
+          <w:sz w:val="28"/>
+        </w:rPr>
+        <w:t xml:space="preserve">    Minus is lighter. Light and Dark both use them. The working</w:t>
+      </w:r>
+    </w:p>
+    <w:p>
+      <w:pPr>
+        <w:spacing w:line="276" w:lineRule="auto"/>
+      </w:pPr>
+      <w:r>
+        <w:rPr>
+          <w:rFonts w:ascii="Arial" w:hAnsi="Arial"/>
+          <w:sz w:val="28"/>
+        </w:rPr>
+        <w:t xml:space="preserve">    document and the in-app copy agree. Not on the phone.</w:t>
+      </w:r>
+    </w:p>
+    <w:p>
+      <w:pPr>
+        <w:spacing w:line="276" w:lineRule="auto"/>
+      </w:pPr>
+      <w:r>
+        <w:rPr>
+          <w:rFonts w:ascii="Arial" w:hAnsi="Arial"/>
+          <w:sz w:val="28"/>
+        </w:rPr>
+        <w:t xml:space="preserve"/>
+      </w:r>
+    </w:p>
+    <w:p>
+      <w:pPr>
+        <w:spacing w:line="276" w:lineRule="auto"/>
+      </w:pPr>
+      <w:r>
+        <w:rPr>
+          <w:rFonts w:ascii="Arial" w:hAnsi="Arial"/>
+          <w:sz w:val="28"/>
+        </w:rPr>
+        <w:t xml:space="preserve">139. #116-new — A Quarterly 30, 60, or 90 day item gets Holidays and</w:t>
+      </w:r>
+    </w:p>
+    <w:p>
+      <w:pPr>
+        <w:spacing w:line="276" w:lineRule="auto"/>
+      </w:pPr>
+      <w:r>
+        <w:rPr>
+          <w:rFonts w:ascii="Arial" w:hAnsi="Arial"/>
+          <w:sz w:val="28"/>
+        </w:rPr>
+        <w:t xml:space="preserve">    Time zone only. A second Thursday and a Wednesday after are not</w:t>
+      </w:r>
+    </w:p>
+    <w:p>
+      <w:pPr>
+        <w:spacing w:line="276" w:lineRule="auto"/>
+      </w:pPr>
+      <w:r>
+        <w:rPr>
+          <w:rFonts w:ascii="Arial" w:hAnsi="Arial"/>
+          <w:sz w:val="28"/>
+        </w:rPr>
+        <w:t xml:space="preserve">    offered. Every three months still has those weekday choices.</w:t>
+      </w:r>
+    </w:p>
+    <w:p>
+      <w:pPr>
+        <w:spacing w:line="276" w:lineRule="auto"/>
+      </w:pPr>
+      <w:r>
+        <w:rPr>
+          <w:rFonts w:ascii="Arial" w:hAnsi="Arial"/>
+          <w:sz w:val="28"/>
+        </w:rPr>
+        <w:t xml:space="preserve">    416 Mac checks. TypeScript clean. Not on the phone.</w:t>
+      </w:r>
+    </w:p>
+    <w:p>
+      <w:pPr>
+        <w:spacing w:line="276" w:lineRule="auto"/>
+      </w:pPr>
+      <w:r>
+        <w:rPr>
+          <w:rFonts w:ascii="Arial" w:hAnsi="Arial"/>
+          <w:sz w:val="28"/>
+        </w:rPr>
+        <w:t xml:space="preserve"/>
+      </w:r>
+    </w:p>
+    <w:p>
+      <w:pPr>
+        <w:spacing w:line="276" w:lineRule="auto"/>
+      </w:pPr>
+      <w:r>
+        <w:rPr>
+          <w:rFonts w:ascii="Arial" w:hAnsi="Arial"/>
+          <w:sz w:val="28"/>
+        </w:rPr>
+        <w:t xml:space="preserve">138. #115-new — Weekly visitors on Daily now follow the occurrence</w:t>
+      </w:r>
+    </w:p>
+    <w:p>
+      <w:pPr>
+        <w:spacing w:line="276" w:lineRule="auto"/>
+      </w:pPr>
+      <w:r>
+        <w:rPr>
+          <w:rFonts w:ascii="Arial" w:hAnsi="Arial"/>
+          <w:sz w:val="28"/>
+        </w:rPr>
+        <w:t xml:space="preserve">    the engine moved, including a holiday move and Day after the set</w:t>
+      </w:r>
+    </w:p>
+    <w:p>
+      <w:pPr>
+        <w:spacing w:line="276" w:lineRule="auto"/>
+      </w:pPr>
+      <w:r>
+        <w:rPr>
+          <w:rFonts w:ascii="Arial" w:hAnsi="Arial"/>
+          <w:sz w:val="28"/>
+        </w:rPr>
+        <w:t xml:space="preserve">    day. Miss-telling shares that date answer. 412 Mac checks.</w:t>
+      </w:r>
+    </w:p>
+    <w:p>
+      <w:pPr>
+        <w:spacing w:line="276" w:lineRule="auto"/>
+      </w:pPr>
+      <w:r>
+        <w:rPr>
+          <w:rFonts w:ascii="Arial" w:hAnsi="Arial"/>
+          <w:sz w:val="28"/>
+        </w:rPr>
+        <w:t xml:space="preserve">    TypeScript clean. Not on the phone.</w:t>
+      </w:r>
+    </w:p>
+    <w:p>
+      <w:pPr>
+        <w:spacing w:line="276" w:lineRule="auto"/>
+      </w:pPr>
+      <w:r>
+        <w:rPr>
+          <w:rFonts w:ascii="Arial" w:hAnsi="Arial"/>
+          <w:sz w:val="28"/>
+        </w:rPr>
+        <w:t xml:space="preserve"/>
+      </w:r>
+    </w:p>
+    <w:p>
+      <w:pPr>
+        <w:spacing w:line="276" w:lineRule="auto"/>
+      </w:pPr>
+      <w:r>
+        <w:rPr>
+          <w:rFonts w:ascii="Arial" w:hAnsi="Arial"/>
+          <w:sz w:val="28"/>
+        </w:rPr>
+        <w:t xml:space="preserve">137. #115-new — Retired restore cleanups and unused counter theme</w:t>
+      </w:r>
+    </w:p>
+    <w:p>
+      <w:pPr>
+        <w:spacing w:line="276" w:lineRule="auto"/>
+      </w:pPr>
+      <w:r>
+        <w:rPr>
+          <w:rFonts w:ascii="Arial" w:hAnsi="Arial"/>
+          <w:sz w:val="28"/>
+        </w:rPr>
+        <w:t xml:space="preserve">    colours are gone. Live source and current documents say Bucket</w:t>
+      </w:r>
+    </w:p>
+    <w:p>
+      <w:pPr>
+        <w:spacing w:line="276" w:lineRule="auto"/>
+      </w:pPr>
+      <w:r>
+        <w:rPr>
+          <w:rFonts w:ascii="Arial" w:hAnsi="Arial"/>
+          <w:sz w:val="28"/>
+        </w:rPr>
+        <w:t xml:space="preserve">    List and Daily Done tick instead of the retired names. 410 Mac</w:t>
+      </w:r>
+    </w:p>
+    <w:p>
+      <w:pPr>
+        <w:spacing w:line="276" w:lineRule="auto"/>
+      </w:pPr>
+      <w:r>
+        <w:rPr>
+          <w:rFonts w:ascii="Arial" w:hAnsi="Arial"/>
+          <w:sz w:val="28"/>
+        </w:rPr>
+        <w:t xml:space="preserve">    checks. TypeScript clean. Not on the phone.</w:t>
+      </w:r>
+    </w:p>
+    <w:p>
+      <w:pPr>
+        <w:spacing w:line="276" w:lineRule="auto"/>
+      </w:pPr>
+      <w:r>
+        <w:rPr>
+          <w:rFonts w:ascii="Arial" w:hAnsi="Arial"/>
+          <w:sz w:val="28"/>
+        </w:rPr>
+        <w:t xml:space="preserve"/>
+      </w:r>
+    </w:p>
+    <w:p>
+      <w:pPr>
+        <w:spacing w:line="276" w:lineRule="auto"/>
+      </w:pPr>
+      <w:r>
+        <w:rPr>
+          <w:rFonts w:ascii="Arial" w:hAnsi="Arial"/>
+          <w:sz w:val="28"/>
+        </w:rPr>
+        <w:t xml:space="preserve">136. #115-new — The User's Guide now matches the current second</w:t>
+      </w:r>
+    </w:p>
+    <w:p>
+      <w:pPr>
+        <w:spacing w:line="276" w:lineRule="auto"/>
+      </w:pPr>
+      <w:r>
+        <w:rPr>
+          <w:rFonts w:ascii="Arial" w:hAnsi="Arial"/>
+          <w:sz w:val="28"/>
+        </w:rPr>
+        <w:t xml:space="preserve">    Done tap. Daily and Weekly ask before taking the tick off. The</w:t>
+      </w:r>
+    </w:p>
+    <w:p>
+      <w:pPr>
+        <w:spacing w:line="276" w:lineRule="auto"/>
+      </w:pPr>
+      <w:r>
+        <w:rPr>
+          <w:rFonts w:ascii="Arial" w:hAnsi="Arial"/>
+          <w:sz w:val="28"/>
+        </w:rPr>
+        <w:t xml:space="preserve">    working document and the in-app copy agree. TypeScript clean.</w:t>
+      </w:r>
+    </w:p>
+    <w:p>
+      <w:pPr>
+        <w:spacing w:line="276" w:lineRule="auto"/>
+      </w:pPr>
+      <w:r>
+        <w:rPr>
+          <w:rFonts w:ascii="Arial" w:hAnsi="Arial"/>
+          <w:sz w:val="28"/>
+        </w:rPr>
+        <w:t xml:space="preserve">    Not on the phone.</w:t>
+      </w:r>
+    </w:p>
+    <w:p>
+      <w:pPr>
+        <w:spacing w:line="276" w:lineRule="auto"/>
+      </w:pPr>
+      <w:r>
+        <w:rPr>
+          <w:rFonts w:ascii="Arial" w:hAnsi="Arial"/>
+          <w:sz w:val="28"/>
+        </w:rPr>
+        <w:t xml:space="preserve"/>
+      </w:r>
+    </w:p>
+    <w:p>
+      <w:pPr>
+        <w:spacing w:line="276" w:lineRule="auto"/>
+      </w:pPr>
+      <w:r>
+        <w:rPr>
+          <w:rFonts w:ascii="Arial" w:hAnsi="Arial"/>
+          <w:sz w:val="28"/>
+        </w:rPr>
+        <w:t xml:space="preserve">135. #115-new — Weekday Save and Done were fixed through the shared</w:t>
+      </w:r>
+    </w:p>
+    <w:p>
+      <w:pPr>
+        <w:spacing w:line="276" w:lineRule="auto"/>
+      </w:pPr>
+      <w:r>
+        <w:rPr>
+          <w:rFonts w:ascii="Arial" w:hAnsi="Arial"/>
+          <w:sz w:val="28"/>
+        </w:rPr>
+        <w:t xml:space="preserve">    machinery. Monthly, Quarterly, and Yearly keep the saved calendar</w:t>
+      </w:r>
+    </w:p>
+    <w:p>
+      <w:pPr>
+        <w:spacing w:line="276" w:lineRule="auto"/>
+      </w:pPr>
+      <w:r>
+        <w:rPr>
+          <w:rFonts w:ascii="Arial" w:hAnsi="Arial"/>
+          <w:sz w:val="28"/>
+        </w:rPr>
+        <w:t xml:space="preserve">    anchor under either weekday pattern, and Done advances from it.</w:t>
+      </w:r>
+    </w:p>
+    <w:p>
+      <w:pPr>
+        <w:spacing w:line="276" w:lineRule="auto"/>
+      </w:pPr>
+      <w:r>
+        <w:rPr>
+          <w:rFonts w:ascii="Arial" w:hAnsi="Arial"/>
+          <w:sz w:val="28"/>
+        </w:rPr>
+        <w:t xml:space="preserve">    410 Mac checks. TypeScript clean. Not on the phone.</w:t>
+      </w:r>
+    </w:p>
+    <w:p>
+      <w:pPr>
+        <w:spacing w:line="276" w:lineRule="auto"/>
+      </w:pPr>
+      <w:r>
+        <w:rPr>
+          <w:rFonts w:ascii="Arial" w:hAnsi="Arial"/>
+          <w:sz w:val="28"/>
+        </w:rPr>
+        <w:t xml:space="preserve"/>
+      </w:r>
+    </w:p>
+    <w:p>
+      <w:pPr>
+        <w:spacing w:line="276" w:lineRule="auto"/>
+      </w:pPr>
+      <w:r>
+        <w:rPr>
+          <w:rFonts w:ascii="Arial" w:hAnsi="Arial"/>
+          <w:sz w:val="28"/>
+        </w:rPr>
         <w:t xml:space="preserve">134. #112-new — The person's name is saved and restored. The rest of</w:t>
       </w:r>
     </w:p>
@@ -7890,6 +8442,42 @@
           <w:sz w:val="28"/>
         </w:rPr>
         <w:t xml:space="preserve">1. The dark startup flash (moved here from Parked, #1-new).</w:t>
+      </w:r>
+    </w:p>
+    <w:p>
+      <w:pPr>
+        <w:spacing w:line="276" w:lineRule="auto"/>
+      </w:pPr>
+      <w:r>
+        <w:rPr>
+          <w:rFonts w:ascii="Arial" w:hAnsi="Arial"/>
+          <w:sz w:val="28"/>
+        </w:rPr>
+        <w:t xml:space="preserve">2. HOME BADGE MAKE-ROOM (Patrick, #113-new). While you slide a badge,</w:t>
+      </w:r>
+    </w:p>
+    <w:p>
+      <w:pPr>
+        <w:spacing w:line="276" w:lineRule="auto"/>
+      </w:pPr>
+      <w:r>
+        <w:rPr>
+          <w:rFonts w:ascii="Arial" w:hAnsi="Arial"/>
+          <w:sz w:val="28"/>
+        </w:rPr>
+        <w:t xml:space="preserve">   the others do not make room. They only move when you drop it. The</w:t>
+      </w:r>
+    </w:p>
+    <w:p>
+      <w:pPr>
+        <w:spacing w:line="276" w:lineRule="auto"/>
+      </w:pPr>
+      <w:r>
+        <w:rPr>
+          <w:rFonts w:ascii="Arial" w:hAnsi="Arial"/>
+          <w:sz w:val="28"/>
+        </w:rPr>
+        <w:t xml:space="preserve">   design is that they make room as you slide. To be decided.</w:t>
       </w:r>
     </w:p>
     <w:p>

</xml_diff>

<commit_message>
118-new - Memory reminder Done & fire settings cleaned.
</commit_message>
<xml_diff>
--- a/docs/pending.docx
+++ b/docs/pending.docx
@@ -24,7 +24,7 @@
           <w:rFonts w:ascii="Arial" w:hAnsi="Arial"/>
           <w:sz w:val="28"/>
         </w:rPr>
-        <w:t xml:space="preserve">Last updated: 2026-09-15 (#116-new)</w:t>
+        <w:t xml:space="preserve">Last updated: 2026-09-22 (#118-new)</w:t>
       </w:r>
     </w:p>
     <w:p>
@@ -325,7 +325,55 @@
           <w:rFonts w:ascii="Arial" w:hAnsi="Arial"/>
           <w:sz w:val="28"/>
         </w:rPr>
-        <w:t xml:space="preserve">1. PHONE PROOF FOR JOBS 1 AND 2. On a native build, check Job 1's</w:t>
+        <w:t xml:space="preserve">1. DONE ALERT CLEANUP (#118-new). On a native load, let an alert</w:t>
+      </w:r>
+    </w:p>
+    <w:p>
+      <w:pPr>
+        <w:spacing w:line="276" w:lineRule="auto"/>
+      </w:pPr>
+      <w:r>
+        <w:rPr>
+          <w:rFonts w:ascii="Arial" w:hAnsi="Arial"/>
+          <w:sz w:val="28"/>
+        </w:rPr>
+        <w:t xml:space="preserve">   arrive and mark its item Done. Every old base, delayed, duplicate,</w:t>
+      </w:r>
+    </w:p>
+    <w:p>
+      <w:pPr>
+        <w:spacing w:line="276" w:lineRule="auto"/>
+      </w:pPr>
+      <w:r>
+        <w:rPr>
+          <w:rFonts w:ascii="Arial" w:hAnsi="Arial"/>
+          <w:sz w:val="28"/>
+        </w:rPr>
+        <w:t xml:space="preserve">   and already-delivered alert copy for that item should stay gone.</w:t>
+      </w:r>
+    </w:p>
+    <w:p>
+      <w:pPr>
+        <w:spacing w:line="276" w:lineRule="auto"/>
+      </w:pPr>
+      <w:r>
+        <w:rPr>
+          <w:rFonts w:ascii="Arial" w:hAnsi="Arial"/>
+          <w:sz w:val="28"/>
+        </w:rPr>
+        <w:t xml:space="preserve">   A repeating item's next real cycle should remain.</w:t>
+      </w:r>
+    </w:p>
+    <w:p>
+      <w:pPr>
+        <w:spacing w:line="276" w:lineRule="auto"/>
+      </w:pPr>
+      <w:r>
+        <w:rPr>
+          <w:rFonts w:ascii="Arial" w:hAnsi="Arial"/>
+          <w:sz w:val="28"/>
+        </w:rPr>
+        <w:t xml:space="preserve">2. PHONE PROOF FOR JOBS 1 AND 2. On a native build, check Job 1's</w:t>
       </w:r>
     </w:p>
     <w:p>
@@ -385,7 +433,7 @@
           <w:rFonts w:ascii="Arial" w:hAnsi="Arial"/>
           <w:sz w:val="28"/>
         </w:rPr>
-        <w:t xml:space="preserve">2. DAY-ROLL LOCK still wants a night of all-green Daily on this</w:t>
+        <w:t xml:space="preserve">3. DAY-ROLL LOCK still wants a night of all-green Daily on this</w:t>
       </w:r>
     </w:p>
     <w:p>
@@ -421,187 +469,79 @@
           <w:rFonts w:ascii="Arial" w:hAnsi="Arial"/>
           <w:sz w:val="28"/>
         </w:rPr>
-        <w:t xml:space="preserve">3. JOB 3 ON BUILD 82. Options by kind, Weekly Done, and an export</w:t>
-      </w:r>
-    </w:p>
-    <w:p>
-      <w:pPr>
-        <w:spacing w:line="276" w:lineRule="auto"/>
-      </w:pPr>
-      <w:r>
-        <w:rPr>
-          <w:rFonts w:ascii="Arial" w:hAnsi="Arial"/>
-          <w:sz w:val="28"/>
-        </w:rPr>
-        <w:t xml:space="preserve">   after a change. This load has that work; it has not been checked</w:t>
-      </w:r>
-    </w:p>
-    <w:p>
-      <w:pPr>
-        <w:spacing w:line="276" w:lineRule="auto"/>
-      </w:pPr>
-      <w:r>
-        <w:rPr>
-          <w:rFonts w:ascii="Arial" w:hAnsi="Arial"/>
-          <w:sz w:val="28"/>
-        </w:rPr>
-        <w:t xml:space="preserve">   on the phone.</w:t>
-      </w:r>
-    </w:p>
-    <w:p>
-      <w:pPr>
-        <w:spacing w:line="276" w:lineRule="auto"/>
-      </w:pPr>
-      <w:r>
-        <w:rPr>
-          <w:rFonts w:ascii="Arial" w:hAnsi="Arial"/>
-          <w:sz w:val="28"/>
-        </w:rPr>
-        <w:t xml:space="preserve">4. BIRTHDAY ROW AND REMINDER (Patrick, #110-new). In the project, not</w:t>
-      </w:r>
-    </w:p>
-    <w:p>
-      <w:pPr>
-        <w:spacing w:line="276" w:lineRule="auto"/>
-      </w:pPr>
-      <w:r>
-        <w:rPr>
-          <w:rFonts w:ascii="Arial" w:hAnsi="Arial"/>
-          <w:sz w:val="28"/>
-        </w:rPr>
-        <w:t xml:space="preserve">   on 82. The row shows the name and the birthdate. The reminder says</w:t>
-      </w:r>
-    </w:p>
-    <w:p>
-      <w:pPr>
-        <w:spacing w:line="276" w:lineRule="auto"/>
-      </w:pPr>
-      <w:r>
-        <w:rPr>
-          <w:rFonts w:ascii="Arial" w:hAnsi="Arial"/>
-          <w:sz w:val="28"/>
-        </w:rPr>
-        <w:t xml:space="preserve">   the age. The next fire is derived from the birthdate. Restore writes</w:t>
-      </w:r>
-    </w:p>
-    <w:p>
-      <w:pPr>
-        <w:spacing w:line="276" w:lineRule="auto"/>
-      </w:pPr>
-      <w:r>
-        <w:rPr>
-          <w:rFonts w:ascii="Arial" w:hAnsi="Arial"/>
-          <w:sz w:val="28"/>
-        </w:rPr>
-        <w:t xml:space="preserve">   the year of birth onto an older backup. Needs a phone check on the</w:t>
-      </w:r>
-    </w:p>
-    <w:p>
-      <w:pPr>
-        <w:spacing w:line="276" w:lineRule="auto"/>
-      </w:pPr>
-      <w:r>
-        <w:rPr>
-          <w:rFonts w:ascii="Arial" w:hAnsi="Arial"/>
-          <w:sz w:val="28"/>
-        </w:rPr>
-        <w:t xml:space="preserve">   next load. Replace brings the backup copy back; Merge keeps what is</w:t>
-      </w:r>
-    </w:p>
-    <w:p>
-      <w:pPr>
-        <w:spacing w:line="276" w:lineRule="auto"/>
-      </w:pPr>
-      <w:r>
-        <w:rPr>
-          <w:rFonts w:ascii="Arial" w:hAnsi="Arial"/>
-          <w:sz w:val="28"/>
-        </w:rPr>
-        <w:t xml:space="preserve">   already in the app.</w:t>
-      </w:r>
-    </w:p>
-    <w:p>
-      <w:pPr>
-        <w:spacing w:line="276" w:lineRule="auto"/>
-      </w:pPr>
-      <w:r>
-        <w:rPr>
-          <w:rFonts w:ascii="Arial" w:hAnsi="Arial"/>
-          <w:sz w:val="28"/>
-        </w:rPr>
-        <w:t xml:space="preserve"/>
-      </w:r>
-    </w:p>
-    <w:p>
-      <w:pPr>
-        <w:spacing w:line="276" w:lineRule="auto"/>
-      </w:pPr>
-      <w:r>
-        <w:rPr>
-          <w:rFonts w:ascii="Arial" w:hAnsi="Arial"/>
-          <w:sz w:val="28"/>
-        </w:rPr>
-        <w:t xml:space="preserve"/>
-      </w:r>
-    </w:p>
-    <w:p>
-      <w:pPr>
-        <w:spacing w:line="276" w:lineRule="auto"/>
-      </w:pPr>
-      <w:r>
-        <w:rPr>
-          <w:rFonts w:ascii="Arial" w:hAnsi="Arial"/>
-          <w:sz w:val="28"/>
-        </w:rPr>
-        <w:t xml:space="preserve">5. HOME BADGES (Patrick, #112-new). In the project, not on 86. Five</w:t>
-      </w:r>
-    </w:p>
-    <w:p>
-      <w:pPr>
-        <w:spacing w:line="276" w:lineRule="auto"/>
-      </w:pPr>
-      <w:r>
-        <w:rPr>
-          <w:rFonts w:ascii="Arial" w:hAnsi="Arial"/>
-          <w:sz w:val="28"/>
-        </w:rPr>
-        <w:t xml:space="preserve">   rows of two, and that group turns with the phone. Bucket List is a</w:t>
-      </w:r>
-    </w:p>
-    <w:p>
-      <w:pPr>
-        <w:spacing w:line="276" w:lineRule="auto"/>
-      </w:pPr>
-      <w:r>
-        <w:rPr>
-          <w:rFonts w:ascii="Arial" w:hAnsi="Arial"/>
-          <w:sz w:val="28"/>
-        </w:rPr>
-        <w:t xml:space="preserve">   smiling face. Quarterly is a maple leaf. The Help tile is named</w:t>
-      </w:r>
-    </w:p>
-    <w:p>
-      <w:pPr>
-        <w:spacing w:line="276" w:lineRule="auto"/>
-      </w:pPr>
-      <w:r>
-        <w:rPr>
-          <w:rFonts w:ascii="Arial" w:hAnsi="Arial"/>
-          <w:sz w:val="28"/>
-        </w:rPr>
-        <w:t xml:space="preserve">   Helper. The person's name is in the backup. Needs a look on the next</w:t>
-      </w:r>
-    </w:p>
-    <w:p>
-      <w:pPr>
-        <w:spacing w:line="276" w:lineRule="auto"/>
-      </w:pPr>
-      <w:r>
-        <w:rPr>
-          <w:rFonts w:ascii="Arial" w:hAnsi="Arial"/>
-          <w:sz w:val="28"/>
-        </w:rPr>
-        <w:t xml:space="preserve">   load, upright and turned.</w:t>
+        <w:t xml:space="preserve">4. JOB 3 ON THE CURRENT NATIVE LOAD. Options by kind, Weekly Done,</w:t>
+      </w:r>
+    </w:p>
+    <w:p>
+      <w:pPr>
+        <w:spacing w:line="276" w:lineRule="auto"/>
+      </w:pPr>
+      <w:r>
+        <w:rPr>
+          <w:rFonts w:ascii="Arial" w:hAnsi="Arial"/>
+          <w:sz w:val="28"/>
+        </w:rPr>
+        <w:t xml:space="preserve">   and an export after a change have not been checked on the phone.</w:t>
+      </w:r>
+    </w:p>
+    <w:p>
+      <w:pPr>
+        <w:spacing w:line="276" w:lineRule="auto"/>
+      </w:pPr>
+      <w:r>
+        <w:rPr>
+          <w:rFonts w:ascii="Arial" w:hAnsi="Arial"/>
+          <w:sz w:val="28"/>
+        </w:rPr>
+        <w:t xml:space="preserve">5. BIRTHDAY ROW AND REMINDER (Patrick, #110-new). The row shows the</w:t>
+      </w:r>
+    </w:p>
+    <w:p>
+      <w:pPr>
+        <w:spacing w:line="276" w:lineRule="auto"/>
+      </w:pPr>
+      <w:r>
+        <w:rPr>
+          <w:rFonts w:ascii="Arial" w:hAnsi="Arial"/>
+          <w:sz w:val="28"/>
+        </w:rPr>
+        <w:t xml:space="preserve">   name and the birthdate. The reminder says the age. The next fire is</w:t>
+      </w:r>
+    </w:p>
+    <w:p>
+      <w:pPr>
+        <w:spacing w:line="276" w:lineRule="auto"/>
+      </w:pPr>
+      <w:r>
+        <w:rPr>
+          <w:rFonts w:ascii="Arial" w:hAnsi="Arial"/>
+          <w:sz w:val="28"/>
+        </w:rPr>
+        <w:t xml:space="preserve">   derived from the birthdate. Restore writes the year of birth onto</w:t>
+      </w:r>
+    </w:p>
+    <w:p>
+      <w:pPr>
+        <w:spacing w:line="276" w:lineRule="auto"/>
+      </w:pPr>
+      <w:r>
+        <w:rPr>
+          <w:rFonts w:ascii="Arial" w:hAnsi="Arial"/>
+          <w:sz w:val="28"/>
+        </w:rPr>
+        <w:t xml:space="preserve">   an older backup. It needs a phone check. Replace brings the backup</w:t>
+      </w:r>
+    </w:p>
+    <w:p>
+      <w:pPr>
+        <w:spacing w:line="276" w:lineRule="auto"/>
+      </w:pPr>
+      <w:r>
+        <w:rPr>
+          <w:rFonts w:ascii="Arial" w:hAnsi="Arial"/>
+          <w:sz w:val="28"/>
+        </w:rPr>
+        <w:t xml:space="preserve">   copy back; Merge keeps what is already in the app.</w:t>
       </w:r>
     </w:p>
     <w:p>
@@ -807,55 +747,7 @@
           <w:rFonts w:ascii="Arial" w:hAnsi="Arial"/>
           <w:sz w:val="28"/>
         </w:rPr>
-        <w:t xml:space="preserve">1. THE PAGES ARE NOT A REPLACEMENT FOR THE INPUT PAGE. The Input</w:t>
-      </w:r>
-    </w:p>
-    <w:p>
-      <w:pPr>
-        <w:spacing w:line="276" w:lineRule="auto"/>
-      </w:pPr>
-      <w:r>
-        <w:rPr>
-          <w:rFonts w:ascii="Arial" w:hAnsi="Arial"/>
-          <w:sz w:val="28"/>
-        </w:rPr>
-        <w:t xml:space="preserve">   page goes away and nothing replaces it — and the + Add popup in</w:t>
-      </w:r>
-    </w:p>
-    <w:p>
-      <w:pPr>
-        <w:spacing w:line="276" w:lineRule="auto"/>
-      </w:pPr>
-      <w:r>
-        <w:rPr>
-          <w:rFonts w:ascii="Arial" w:hAnsi="Arial"/>
-          <w:sz w:val="28"/>
-        </w:rPr>
-        <w:t xml:space="preserve">   particular is not its replacement. This is your own reminder</w:t>
-      </w:r>
-    </w:p>
-    <w:p>
-      <w:pPr>
-        <w:spacing w:line="276" w:lineRule="auto"/>
-      </w:pPr>
-      <w:r>
-        <w:rPr>
-          <w:rFonts w:ascii="Arial" w:hAnsi="Arial"/>
-          <w:sz w:val="28"/>
-        </w:rPr>
-        <w:t xml:space="preserve">   pages being reshaped by how often a thing comes round.</w:t>
-      </w:r>
-    </w:p>
-    <w:p>
-      <w:pPr>
-        <w:spacing w:line="276" w:lineRule="auto"/>
-      </w:pPr>
-      <w:r>
-        <w:rPr>
-          <w:rFonts w:ascii="Arial" w:hAnsi="Arial"/>
-          <w:sz w:val="28"/>
-        </w:rPr>
-        <w:t xml:space="preserve">2. + ADD ON A PAGE GOES TO THAT PAGE'S OWN NEW. Where does it</w:t>
+        <w:t xml:space="preserve">1. + ADD ON A PAGE GOES TO THAT PAGE'S OWN NEW. Where does it</w:t>
       </w:r>
     </w:p>
     <w:p>
@@ -891,79 +783,7 @@
           <w:rFonts w:ascii="Arial" w:hAnsi="Arial"/>
           <w:sz w:val="28"/>
         </w:rPr>
-        <w:t xml:space="preserve">3. APPOINTMENTS CARRIES THE REMINDERS BEFORE CHIPS — 30 min., 1</w:t>
-      </w:r>
-    </w:p>
-    <w:p>
-      <w:pPr>
-        <w:spacing w:line="276" w:lineRule="auto"/>
-      </w:pPr>
-      <w:r>
-        <w:rPr>
-          <w:rFonts w:ascii="Arial" w:hAnsi="Arial"/>
-          <w:sz w:val="28"/>
-        </w:rPr>
-        <w:t xml:space="preserve">   hour, 2 hours, Morning of, Day Before, Night Before, 2 Days</w:t>
-      </w:r>
-    </w:p>
-    <w:p>
-      <w:pPr>
-        <w:spacing w:line="276" w:lineRule="auto"/>
-      </w:pPr>
-      <w:r>
-        <w:rPr>
-          <w:rFonts w:ascii="Arial" w:hAnsi="Arial"/>
-          <w:sz w:val="28"/>
-        </w:rPr>
-        <w:t xml:space="preserve">   Before, Week, Month — and any and all of them can be on at once.</w:t>
-      </w:r>
-    </w:p>
-    <w:p>
-      <w:pPr>
-        <w:spacing w:line="276" w:lineRule="auto"/>
-      </w:pPr>
-      <w:r>
-        <w:rPr>
-          <w:rFonts w:ascii="Arial" w:hAnsi="Arial"/>
-          <w:sz w:val="28"/>
-        </w:rPr>
-        <w:t xml:space="preserve">   They also remind at the set time, like the rest of the app</w:t>
-      </w:r>
-    </w:p>
-    <w:p>
-      <w:pPr>
-        <w:spacing w:line="276" w:lineRule="auto"/>
-      </w:pPr>
-      <w:r>
-        <w:rPr>
-          <w:rFonts w:ascii="Arial" w:hAnsi="Arial"/>
-          <w:sz w:val="28"/>
-        </w:rPr>
-        <w:t xml:space="preserve">   (Patrick, #74-new; reverses #52-new). The page</w:t>
-      </w:r>
-    </w:p>
-    <w:p>
-      <w:pPr>
-        <w:spacing w:line="276" w:lineRule="auto"/>
-      </w:pPr>
-      <w:r>
-        <w:rPr>
-          <w:rFonts w:ascii="Arial" w:hAnsi="Arial"/>
-          <w:sz w:val="28"/>
-        </w:rPr>
-        <w:t xml:space="preserve">   is called Appointments (#56-new; saved kind appointments, #65-new).</w:t>
-      </w:r>
-    </w:p>
-    <w:p>
-      <w:pPr>
-        <w:spacing w:line="276" w:lineRule="auto"/>
-      </w:pPr>
-      <w:r>
-        <w:rPr>
-          <w:rFonts w:ascii="Arial" w:hAnsi="Arial"/>
-          <w:sz w:val="28"/>
-        </w:rPr>
-        <w:t xml:space="preserve">4. DAILY'S OWN ADD IS ONLY ABOUT TODAY. Two kinds: an every-day</w:t>
+        <w:t xml:space="preserve">2. DAILY'S OWN ADD IS ONLY ABOUT TODAY. Two kinds: an every-day</w:t>
       </w:r>
     </w:p>
     <w:p>
@@ -1071,7 +891,7 @@
           <w:rFonts w:ascii="Arial" w:hAnsi="Arial"/>
           <w:sz w:val="28"/>
         </w:rPr>
-        <w:t xml:space="preserve">5. ONE REMINDER PER ITEM, NOT TWO, and the app puts itself right</w:t>
+        <w:t xml:space="preserve">3. ONE REMINDER PER ITEM, NOT TWO, and the app puts itself right</w:t>
       </w:r>
     </w:p>
     <w:p>
@@ -1131,7 +951,7 @@
           <w:rFonts w:ascii="Arial" w:hAnsi="Arial"/>
           <w:sz w:val="28"/>
         </w:rPr>
-        <w:t xml:space="preserve">6. ROCK SOLID IS THE TOP GOAL BUT NOT THE ONLY ONE. Consistency</w:t>
+        <w:t xml:space="preserve">4. ROCK SOLID IS THE TOP GOAL BUT NOT THE ONLY ONE. Consistency</w:t>
       </w:r>
     </w:p>
     <w:p>
@@ -1155,7 +975,7 @@
           <w:rFonts w:ascii="Arial" w:hAnsi="Arial"/>
           <w:sz w:val="28"/>
         </w:rPr>
-        <w:t xml:space="preserve">7. ROCK SOLID IS FOR WHEN YOU USE IT. An app that is not being</w:t>
+        <w:t xml:space="preserve">5. ROCK SOLID IS FOR WHEN YOU USE IT. An app that is not being</w:t>
       </w:r>
     </w:p>
     <w:p>
@@ -1191,91 +1011,7 @@
           <w:rFonts w:ascii="Arial" w:hAnsi="Arial"/>
           <w:sz w:val="28"/>
         </w:rPr>
-        <w:t xml:space="preserve">8. A BUCKET LIST ITEM AND A DAILY DONE TICK ARE OPPOSITES. A Bucket</w:t>
-      </w:r>
-    </w:p>
-    <w:p>
-      <w:pPr>
-        <w:spacing w:line="276" w:lineRule="auto"/>
-      </w:pPr>
-      <w:r>
-        <w:rPr>
-          <w:rFonts w:ascii="Arial" w:hAnsi="Arial"/>
-          <w:sz w:val="28"/>
-        </w:rPr>
-        <w:t xml:space="preserve">   List item (saved kind bucketlist) says a thing is not yet done and</w:t>
-      </w:r>
-    </w:p>
-    <w:p>
-      <w:pPr>
-        <w:spacing w:line="276" w:lineRule="auto"/>
-      </w:pPr>
-      <w:r>
-        <w:rPr>
-          <w:rFonts w:ascii="Arial" w:hAnsi="Arial"/>
-          <w:sz w:val="28"/>
-        </w:rPr>
-        <w:t xml:space="preserve">   must survive the night. A Daily Done tick says today's occurrence</w:t>
-      </w:r>
-    </w:p>
-    <w:p>
-      <w:pPr>
-        <w:spacing w:line="276" w:lineRule="auto"/>
-      </w:pPr>
-      <w:r>
-        <w:rPr>
-          <w:rFonts w:ascii="Arial" w:hAnsi="Arial"/>
-          <w:sz w:val="28"/>
-        </w:rPr>
-        <w:t xml:space="preserve">   was done and is cleared when the day rolls over. They must never</w:t>
-      </w:r>
-    </w:p>
-    <w:p>
-      <w:pPr>
-        <w:spacing w:line="276" w:lineRule="auto"/>
-      </w:pPr>
-      <w:r>
-        <w:rPr>
-          <w:rFonts w:ascii="Arial" w:hAnsi="Arial"/>
-          <w:sz w:val="28"/>
-        </w:rPr>
-        <w:t xml:space="preserve">   be merged.</w:t>
-      </w:r>
-    </w:p>
-    <w:p>
-      <w:pPr>
-        <w:spacing w:line="276" w:lineRule="auto"/>
-      </w:pPr>
-      <w:r>
-        <w:rPr>
-          <w:rFonts w:ascii="Arial" w:hAnsi="Arial"/>
-          <w:sz w:val="28"/>
-        </w:rPr>
-        <w:t xml:space="preserve">9. TIMES SET BY SPINNING THROUGH NOON OR MIDNIGHT BEFORE #27-new</w:t>
-      </w:r>
-    </w:p>
-    <w:p>
-      <w:pPr>
-        <w:spacing w:line="276" w:lineRule="auto"/>
-      </w:pPr>
-      <w:r>
-        <w:rPr>
-          <w:rFonts w:ascii="Arial" w:hAnsi="Arial"/>
-          <w:sz w:val="28"/>
-        </w:rPr>
-        <w:t xml:space="preserve">    are stored in the wrong half of the day and want re-setting.</w:t>
-      </w:r>
-    </w:p>
-    <w:p>
-      <w:pPr>
-        <w:spacing w:line="276" w:lineRule="auto"/>
-      </w:pPr>
-      <w:r>
-        <w:rPr>
-          <w:rFonts w:ascii="Arial" w:hAnsi="Arial"/>
-          <w:sz w:val="28"/>
-        </w:rPr>
-        <w:t xml:space="preserve">10. TASKS SAVED BEFORE THE DATE FIX carry a date they were given</w:t>
+        <w:t xml:space="preserve">6. TASKS SAVED BEFORE THE DATE FIX carry a date they were given</w:t>
       </w:r>
     </w:p>
     <w:p>
@@ -1299,7 +1035,7 @@
           <w:rFonts w:ascii="Arial" w:hAnsi="Arial"/>
           <w:sz w:val="28"/>
         </w:rPr>
-        <w:t xml:space="preserve">11. A BIG PIECE GETS A BUILD SHEET FIRST — self-contained, carrying</w:t>
+        <w:t xml:space="preserve">7. A BIG PIECE GETS A BUILD SHEET FIRST — self-contained, carrying</w:t>
       </w:r>
     </w:p>
     <w:p>
@@ -1335,7 +1071,7 @@
           <w:rFonts w:ascii="Arial" w:hAnsi="Arial"/>
           <w:sz w:val="28"/>
         </w:rPr>
-        <w:t xml:space="preserve">12. BARE SESSION NUMBERS mean the old shared chain. This project's</w:t>
+        <w:t xml:space="preserve">8. BARE SESSION NUMBERS mean the old shared chain. This project's</w:t>
       </w:r>
     </w:p>
     <w:p>
@@ -1359,7 +1095,7 @@
           <w:rFonts w:ascii="Arial" w:hAnsi="Arial"/>
           <w:sz w:val="28"/>
         </w:rPr>
-        <w:t xml:space="preserve">13. WORKING DOCUMENTS LIVE IN docs. History lives in docs-ref, and</w:t>
+        <w:t xml:space="preserve">9. WORKING DOCUMENTS LIVE IN docs. History lives in docs-ref, and</w:t>
       </w:r>
     </w:p>
     <w:p>
@@ -1407,7 +1143,7 @@
           <w:rFonts w:ascii="Arial" w:hAnsi="Arial"/>
           <w:sz w:val="28"/>
         </w:rPr>
-        <w:t xml:space="preserve">14. THE CALENDAR PAGE SHOWS DATED ITEMS. No every-day Daily items,</w:t>
+        <w:t xml:space="preserve">10. THE CALENDAR PAGE SHOWS DATED ITEMS. No every-day Daily items,</w:t>
       </w:r>
     </w:p>
     <w:p>
@@ -1491,7 +1227,7 @@
           <w:rFonts w:ascii="Arial" w:hAnsi="Arial"/>
           <w:sz w:val="28"/>
         </w:rPr>
-        <w:t xml:space="preserve">15. HAVING A GOOD IDEA LEADS TO OVERREACHING (Patrick, #52-new).</w:t>
+        <w:t xml:space="preserve">11. HAVING A GOOD IDEA LEADS TO OVERREACHING (Patrick, #52-new).</w:t>
       </w:r>
     </w:p>
     <w:p>
@@ -1527,7 +1263,7 @@
           <w:rFonts w:ascii="Arial" w:hAnsi="Arial"/>
           <w:sz w:val="28"/>
         </w:rPr>
-        <w:t xml:space="preserve">16. THE DESIGN DESCRIPTION IS THE DESIGNED IMPLEMENTATION</w:t>
+        <w:t xml:space="preserve">12. THE DESIGN DESCRIPTION IS THE DESIGNED IMPLEMENTATION</w:t>
       </w:r>
     </w:p>
     <w:p>
@@ -1587,7 +1323,7 @@
           <w:rFonts w:ascii="Arial" w:hAnsi="Arial"/>
           <w:sz w:val="28"/>
         </w:rPr>
-        <w:t xml:space="preserve">17. DATED ITEMS WAIT ABOUT A MONTH (Patrick, 2026-09-09). That wait is</w:t>
+        <w:t xml:space="preserve">13. DATED ITEMS WAIT ABOUT A MONTH (Patrick, 2026-09-09). That wait is</w:t>
       </w:r>
     </w:p>
     <w:p>
@@ -1671,7 +1407,7 @@
           <w:rFonts w:ascii="Arial" w:hAnsi="Arial"/>
           <w:sz w:val="28"/>
         </w:rPr>
-        <w:t xml:space="preserve">18. EACH CLOSED-APP NOTICE HAS ITS OWN THREAD NAME (Patrick, #105-new).</w:t>
+        <w:t xml:space="preserve">14. EACH CLOSED-APP NOTICE HAS ITS OWN THREAD NAME (Patrick, #105-new).</w:t>
       </w:r>
     </w:p>
     <w:p>
@@ -1719,7 +1455,7 @@
           <w:rFonts w:ascii="Arial" w:hAnsi="Arial"/>
           <w:sz w:val="28"/>
         </w:rPr>
-        <w:t xml:space="preserve">19. ONE TIME DOES NOT SKIP (Patrick, #107-new; built #108-new). It has</w:t>
+        <w:t xml:space="preserve">15. ONE TIME DOES NOT SKIP (Patrick, #107-new; built #108-new). It has</w:t>
       </w:r>
     </w:p>
     <w:p>
@@ -1755,7 +1491,7 @@
           <w:rFonts w:ascii="Arial" w:hAnsi="Arial"/>
           <w:sz w:val="28"/>
         </w:rPr>
-        <w:t xml:space="preserve">20. OPENING THROUGH A BANNER IS STILL AN OPENING (#107-new; built</w:t>
+        <w:t xml:space="preserve">16. OPENING THROUGH A BANNER IS STILL AN OPENING (#107-new; built</w:t>
       </w:r>
     </w:p>
     <w:p>
@@ -1791,91 +1527,115 @@
           <w:rFonts w:ascii="Arial" w:hAnsi="Arial"/>
           <w:sz w:val="28"/>
         </w:rPr>
-        <w:t xml:space="preserve">21. LETTERS AND PAGE ON SETTINGS (Patrick, #111-new). Under Appearance.</w:t>
-      </w:r>
-    </w:p>
-    <w:p>
-      <w:pPr>
-        <w:spacing w:line="276" w:lineRule="auto"/>
-      </w:pPr>
-      <w:r>
-        <w:rPr>
-          <w:rFonts w:ascii="Arial" w:hAnsi="Arial"/>
-          <w:sz w:val="28"/>
-        </w:rPr>
-        <w:t xml:space="preserve">    Middle is the look the app ships with. Plus is more — darker.</w:t>
-      </w:r>
-    </w:p>
-    <w:p>
-      <w:pPr>
-        <w:spacing w:line="276" w:lineRule="auto"/>
-      </w:pPr>
-      <w:r>
-        <w:rPr>
-          <w:rFonts w:ascii="Arial" w:hAnsi="Arial"/>
-          <w:sz w:val="28"/>
-        </w:rPr>
-        <w:t xml:space="preserve">    Minus is less — lighter. They stay on the phone.</w:t>
-      </w:r>
-    </w:p>
-    <w:p>
-      <w:pPr>
-        <w:spacing w:line="276" w:lineRule="auto"/>
-      </w:pPr>
-      <w:r>
-        <w:rPr>
-          <w:rFonts w:ascii="Arial" w:hAnsi="Arial"/>
-          <w:sz w:val="28"/>
-        </w:rPr>
-        <w:t xml:space="preserve">22. HOME BADGES, HELPER, AND THE NAME ON BACKUP (Patrick, #112-new).</w:t>
-      </w:r>
-    </w:p>
-    <w:p>
-      <w:pPr>
-        <w:spacing w:line="276" w:lineRule="auto"/>
-      </w:pPr>
-      <w:r>
-        <w:rPr>
-          <w:rFonts w:ascii="Arial" w:hAnsi="Arial"/>
-          <w:sz w:val="28"/>
-        </w:rPr>
-        <w:t xml:space="preserve">    Five rows of two; that group turns with the phone. Bucket List is</w:t>
-      </w:r>
-    </w:p>
-    <w:p>
-      <w:pPr>
-        <w:spacing w:line="276" w:lineRule="auto"/>
-      </w:pPr>
-      <w:r>
-        <w:rPr>
-          <w:rFonts w:ascii="Arial" w:hAnsi="Arial"/>
-          <w:sz w:val="28"/>
-        </w:rPr>
-        <w:t xml:space="preserve">    a smiling face. Quarterly is a maple leaf. The visible name is</w:t>
-      </w:r>
-    </w:p>
-    <w:p>
-      <w:pPr>
-        <w:spacing w:line="276" w:lineRule="auto"/>
-      </w:pPr>
-      <w:r>
-        <w:rPr>
-          <w:rFonts w:ascii="Arial" w:hAnsi="Arial"/>
-          <w:sz w:val="28"/>
-        </w:rPr>
-        <w:t xml:space="preserve">    Helper. The person's name is saved and restored. The rest of</w:t>
-      </w:r>
-    </w:p>
-    <w:p>
-      <w:pPr>
-        <w:spacing w:line="276" w:lineRule="auto"/>
-      </w:pPr>
-      <w:r>
-        <w:rPr>
-          <w:rFonts w:ascii="Arial" w:hAnsi="Arial"/>
-          <w:sz w:val="28"/>
-        </w:rPr>
-        <w:t xml:space="preserve">    Settings stay on the phone.</w:t>
+        <w:t xml:space="preserve">17. DONE'S SAVED STATE STOPS ITS OLD ALERT COPIES (#118-new). The</w:t>
+      </w:r>
+    </w:p>
+    <w:p>
+      <w:pPr>
+        <w:spacing w:line="276" w:lineRule="auto"/>
+      </w:pPr>
+      <w:r>
+        <w:rPr>
+          <w:rFonts w:ascii="Arial" w:hAnsi="Arial"/>
+          <w:sz w:val="28"/>
+        </w:rPr>
+        <w:t xml:space="preserve">    engine removes every queued base, delay, duplicate, or</w:t>
+      </w:r>
+    </w:p>
+    <w:p>
+      <w:pPr>
+        <w:spacing w:line="276" w:lineRule="auto"/>
+      </w:pPr>
+      <w:r>
+        <w:rPr>
+          <w:rFonts w:ascii="Arial" w:hAnsi="Arial"/>
+          <w:sz w:val="28"/>
+        </w:rPr>
+        <w:t xml:space="preserve">    retired-source copy carrying that item id, and dismisses banners</w:t>
+      </w:r>
+    </w:p>
+    <w:p>
+      <w:pPr>
+        <w:spacing w:line="276" w:lineRule="auto"/>
+      </w:pPr>
+      <w:r>
+        <w:rPr>
+          <w:rFonts w:ascii="Arial" w:hAnsi="Arial"/>
+          <w:sz w:val="28"/>
+        </w:rPr>
+        <w:t xml:space="preserve">    already delivered. It keeps the next legitimate cycle. The phone</w:t>
+      </w:r>
+    </w:p>
+    <w:p>
+      <w:pPr>
+        <w:spacing w:line="276" w:lineRule="auto"/>
+      </w:pPr>
+      <w:r>
+        <w:rPr>
+          <w:rFonts w:ascii="Arial" w:hAnsi="Arial"/>
+          <w:sz w:val="28"/>
+        </w:rPr>
+        <w:t xml:space="preserve">    is read back and a failed removal speaks instead of disappearing</w:t>
+      </w:r>
+    </w:p>
+    <w:p>
+      <w:pPr>
+        <w:spacing w:line="276" w:lineRule="auto"/>
+      </w:pPr>
+      <w:r>
+        <w:rPr>
+          <w:rFonts w:ascii="Arial" w:hAnsi="Arial"/>
+          <w:sz w:val="28"/>
+        </w:rPr>
+        <w:t xml:space="preserve">    silently.</w:t>
+      </w:r>
+    </w:p>
+    <w:p>
+      <w:pPr>
+        <w:spacing w:line="276" w:lineRule="auto"/>
+      </w:pPr>
+      <w:r>
+        <w:rPr>
+          <w:rFonts w:ascii="Arial" w:hAnsi="Arial"/>
+          <w:sz w:val="28"/>
+        </w:rPr>
+        <w:t xml:space="preserve">18. MEMORY'S OWN DOCUMENTS ARE THE LIVE ENGINE DESIGN. The separate</w:t>
+      </w:r>
+    </w:p>
+    <w:p>
+      <w:pPr>
+        <w:spacing w:line="276" w:lineRule="auto"/>
+      </w:pPr>
+      <w:r>
+        <w:rPr>
+          <w:rFonts w:ascii="Arial" w:hAnsi="Arial"/>
+          <w:sz w:val="28"/>
+        </w:rPr>
+        <w:t xml:space="preserve">    Reminder Engine folder remains the historical shared baseline at</w:t>
+      </w:r>
+    </w:p>
+    <w:p>
+      <w:pPr>
+        <w:spacing w:line="276" w:lineRule="auto"/>
+      </w:pPr>
+      <w:r>
+        <w:rPr>
+          <w:rFonts w:ascii="Arial" w:hAnsi="Arial"/>
+          <w:sz w:val="28"/>
+        </w:rPr>
+        <w:t xml:space="preserve">    Reminder Engine 4. Students-Assistant is going away, so that folder</w:t>
+      </w:r>
+    </w:p>
+    <w:p>
+      <w:pPr>
+        <w:spacing w:line="276" w:lineRule="auto"/>
+      </w:pPr>
+      <w:r>
+        <w:rPr>
+          <w:rFonts w:ascii="Arial" w:hAnsi="Arial"/>
+          <w:sz w:val="28"/>
+        </w:rPr>
+        <w:t xml:space="preserve">    is not brought current as a second copy (#118-new).</w:t>
       </w:r>
     </w:p>
     <w:p>
@@ -1996,6 +1756,786 @@
           <w:rFonts w:ascii="Arial" w:hAnsi="Arial"/>
           <w:sz w:val="28"/>
         </w:rPr>
+        <w:t xml:space="preserve">159. #118-new — The separate Reminder Engine folder is retired as the</w:t>
+      </w:r>
+    </w:p>
+    <w:p>
+      <w:pPr>
+        <w:spacing w:line="276" w:lineRule="auto"/>
+      </w:pPr>
+      <w:r>
+        <w:rPr>
+          <w:rFonts w:ascii="Arial" w:hAnsi="Arial"/>
+          <w:sz w:val="28"/>
+        </w:rPr>
+        <w:t xml:space="preserve">    historical shared baseline at Reminder Engine 4. Memory's own</w:t>
+      </w:r>
+    </w:p>
+    <w:p>
+      <w:pPr>
+        <w:spacing w:line="276" w:lineRule="auto"/>
+      </w:pPr>
+      <w:r>
+        <w:rPr>
+          <w:rFonts w:ascii="Arial" w:hAnsi="Arial"/>
+          <w:sz w:val="28"/>
+        </w:rPr>
+        <w:t xml:space="preserve">    documents are the live truth; the stale folder is not brought</w:t>
+      </w:r>
+    </w:p>
+    <w:p>
+      <w:pPr>
+        <w:spacing w:line="276" w:lineRule="auto"/>
+      </w:pPr>
+      <w:r>
+        <w:rPr>
+          <w:rFonts w:ascii="Arial" w:hAnsi="Arial"/>
+          <w:sz w:val="28"/>
+        </w:rPr>
+        <w:t xml:space="preserve">    current before retirement.</w:t>
+      </w:r>
+    </w:p>
+    <w:p>
+      <w:pPr>
+        <w:spacing w:line="276" w:lineRule="auto"/>
+      </w:pPr>
+      <w:r>
+        <w:rPr>
+          <w:rFonts w:ascii="Arial" w:hAnsi="Arial"/>
+          <w:sz w:val="28"/>
+        </w:rPr>
+        <w:t xml:space="preserve"/>
+      </w:r>
+    </w:p>
+    <w:p>
+      <w:pPr>
+        <w:spacing w:line="276" w:lineRule="auto"/>
+      </w:pPr>
+      <w:r>
+        <w:rPr>
+          <w:rFonts w:ascii="Arial" w:hAnsi="Arial"/>
+          <w:sz w:val="28"/>
+        </w:rPr>
+        <w:t xml:space="preserve">158. #118-new — Saved Done state now removes every old queued and</w:t>
+      </w:r>
+    </w:p>
+    <w:p>
+      <w:pPr>
+        <w:spacing w:line="276" w:lineRule="auto"/>
+      </w:pPr>
+      <w:r>
+        <w:rPr>
+          <w:rFonts w:ascii="Arial" w:hAnsi="Arial"/>
+          <w:sz w:val="28"/>
+        </w:rPr>
+        <w:t xml:space="preserve">    delivered alert copy for that item, while keeping the next</w:t>
+      </w:r>
+    </w:p>
+    <w:p>
+      <w:pPr>
+        <w:spacing w:line="276" w:lineRule="auto"/>
+      </w:pPr>
+      <w:r>
+        <w:rPr>
+          <w:rFonts w:ascii="Arial" w:hAnsi="Arial"/>
+          <w:sz w:val="28"/>
+        </w:rPr>
+        <w:t xml:space="preserve">    legitimate cycle. Removal is read back, retried, and reported if</w:t>
+      </w:r>
+    </w:p>
+    <w:p>
+      <w:pPr>
+        <w:spacing w:line="276" w:lineRule="auto"/>
+      </w:pPr>
+      <w:r>
+        <w:rPr>
+          <w:rFonts w:ascii="Arial" w:hAnsi="Arial"/>
+          <w:sz w:val="28"/>
+        </w:rPr>
+        <w:t xml:space="preserve">    the phone still holds it. 432 Mac checks. TypeScript clean. Not on</w:t>
+      </w:r>
+    </w:p>
+    <w:p>
+      <w:pPr>
+        <w:spacing w:line="276" w:lineRule="auto"/>
+      </w:pPr>
+      <w:r>
+        <w:rPr>
+          <w:rFonts w:ascii="Arial" w:hAnsi="Arial"/>
+          <w:sz w:val="28"/>
+        </w:rPr>
+        <w:t xml:space="preserve">    the phone.</w:t>
+      </w:r>
+    </w:p>
+    <w:p>
+      <w:pPr>
+        <w:spacing w:line="276" w:lineRule="auto"/>
+      </w:pPr>
+      <w:r>
+        <w:rPr>
+          <w:rFonts w:ascii="Arial" w:hAnsi="Arial"/>
+          <w:sz w:val="28"/>
+        </w:rPr>
+        <w:t xml:space="preserve"/>
+      </w:r>
+    </w:p>
+    <w:p>
+      <w:pPr>
+        <w:spacing w:line="276" w:lineRule="auto"/>
+      </w:pPr>
+      <w:r>
+        <w:rPr>
+          <w:rFonts w:ascii="Arial" w:hAnsi="Arial"/>
+          <w:sz w:val="28"/>
+        </w:rPr>
+        <w:t xml:space="preserve">157. #117-new — Split Letters and Page are on the phone and working.</w:t>
+      </w:r>
+    </w:p>
+    <w:p>
+      <w:pPr>
+        <w:spacing w:line="276" w:lineRule="auto"/>
+      </w:pPr>
+      <w:r>
+        <w:rPr>
+          <w:rFonts w:ascii="Arial" w:hAnsi="Arial"/>
+          <w:sz w:val="28"/>
+        </w:rPr>
+        <w:t xml:space="preserve">    He likes how they are now.</w:t>
+      </w:r>
+    </w:p>
+    <w:p>
+      <w:pPr>
+        <w:spacing w:line="276" w:lineRule="auto"/>
+      </w:pPr>
+      <w:r>
+        <w:rPr>
+          <w:rFonts w:ascii="Arial" w:hAnsi="Arial"/>
+          <w:sz w:val="28"/>
+        </w:rPr>
+        <w:t xml:space="preserve"/>
+      </w:r>
+    </w:p>
+    <w:p>
+      <w:pPr>
+        <w:spacing w:line="276" w:lineRule="auto"/>
+      </w:pPr>
+      <w:r>
+        <w:rPr>
+          <w:rFonts w:ascii="Arial" w:hAnsi="Arial"/>
+          <w:sz w:val="28"/>
+        </w:rPr>
+        <w:t xml:space="preserve">156. #112-new — Home badges sit in five rows of two and turn with the</w:t>
+      </w:r>
+    </w:p>
+    <w:p>
+      <w:pPr>
+        <w:spacing w:line="276" w:lineRule="auto"/>
+      </w:pPr>
+      <w:r>
+        <w:rPr>
+          <w:rFonts w:ascii="Arial" w:hAnsi="Arial"/>
+          <w:sz w:val="28"/>
+        </w:rPr>
+        <w:t xml:space="preserve">    phone. Bucket List is a smiling face. Quarterly is a maple leaf.</w:t>
+      </w:r>
+    </w:p>
+    <w:p>
+      <w:pPr>
+        <w:spacing w:line="276" w:lineRule="auto"/>
+      </w:pPr>
+      <w:r>
+        <w:rPr>
+          <w:rFonts w:ascii="Arial" w:hAnsi="Arial"/>
+          <w:sz w:val="28"/>
+        </w:rPr>
+        <w:t xml:space="preserve">    The visible name is Helper. The person's name is saved and</w:t>
+      </w:r>
+    </w:p>
+    <w:p>
+      <w:pPr>
+        <w:spacing w:line="276" w:lineRule="auto"/>
+      </w:pPr>
+      <w:r>
+        <w:rPr>
+          <w:rFonts w:ascii="Arial" w:hAnsi="Arial"/>
+          <w:sz w:val="28"/>
+        </w:rPr>
+        <w:t xml:space="preserve">    restored.</w:t>
+      </w:r>
+    </w:p>
+    <w:p>
+      <w:pPr>
+        <w:spacing w:line="276" w:lineRule="auto"/>
+      </w:pPr>
+      <w:r>
+        <w:rPr>
+          <w:rFonts w:ascii="Arial" w:hAnsi="Arial"/>
+          <w:sz w:val="28"/>
+        </w:rPr>
+        <w:t xml:space="preserve"/>
+      </w:r>
+    </w:p>
+    <w:p>
+      <w:pPr>
+        <w:spacing w:line="276" w:lineRule="auto"/>
+      </w:pPr>
+      <w:r>
+        <w:rPr>
+          <w:rFonts w:ascii="Arial" w:hAnsi="Arial"/>
+          <w:sz w:val="28"/>
+        </w:rPr>
+        <w:t xml:space="preserve">155. #111-new, #117-new — Letters and Page on Settings. Each of Light</w:t>
+      </w:r>
+    </w:p>
+    <w:p>
+      <w:pPr>
+        <w:spacing w:line="276" w:lineRule="auto"/>
+      </w:pPr>
+      <w:r>
+        <w:rPr>
+          <w:rFonts w:ascii="Arial" w:hAnsi="Arial"/>
+          <w:sz w:val="28"/>
+        </w:rPr>
+        <w:t xml:space="preserve">    and Dark keeps its own. Middle sits far enough from white and</w:t>
+      </w:r>
+    </w:p>
+    <w:p>
+      <w:pPr>
+        <w:spacing w:line="276" w:lineRule="auto"/>
+      </w:pPr>
+      <w:r>
+        <w:rPr>
+          <w:rFonts w:ascii="Arial" w:hAnsi="Arial"/>
+          <w:sz w:val="28"/>
+        </w:rPr>
+        <w:t xml:space="preserve">    black that every tap still moves. Backup saves both pairs.</w:t>
+      </w:r>
+    </w:p>
+    <w:p>
+      <w:pPr>
+        <w:spacing w:line="276" w:lineRule="auto"/>
+      </w:pPr>
+      <w:r>
+        <w:rPr>
+          <w:rFonts w:ascii="Arial" w:hAnsi="Arial"/>
+          <w:sz w:val="28"/>
+        </w:rPr>
+        <w:t xml:space="preserve"/>
+      </w:r>
+    </w:p>
+    <w:p>
+      <w:pPr>
+        <w:spacing w:line="276" w:lineRule="auto"/>
+      </w:pPr>
+      <w:r>
+        <w:rPr>
+          <w:rFonts w:ascii="Arial" w:hAnsi="Arial"/>
+          <w:sz w:val="28"/>
+        </w:rPr>
+        <w:t xml:space="preserve">154. #27-new — Times set by spinning through noon or midnight before</w:t>
+      </w:r>
+    </w:p>
+    <w:p>
+      <w:pPr>
+        <w:spacing w:line="276" w:lineRule="auto"/>
+      </w:pPr>
+      <w:r>
+        <w:rPr>
+          <w:rFonts w:ascii="Arial" w:hAnsi="Arial"/>
+          <w:sz w:val="28"/>
+        </w:rPr>
+        <w:t xml:space="preserve">    that sitting are stored in the wrong half of the day and want</w:t>
+      </w:r>
+    </w:p>
+    <w:p>
+      <w:pPr>
+        <w:spacing w:line="276" w:lineRule="auto"/>
+      </w:pPr>
+      <w:r>
+        <w:rPr>
+          <w:rFonts w:ascii="Arial" w:hAnsi="Arial"/>
+          <w:sz w:val="28"/>
+        </w:rPr>
+        <w:t xml:space="preserve">    re-setting.</w:t>
+      </w:r>
+    </w:p>
+    <w:p>
+      <w:pPr>
+        <w:spacing w:line="276" w:lineRule="auto"/>
+      </w:pPr>
+      <w:r>
+        <w:rPr>
+          <w:rFonts w:ascii="Arial" w:hAnsi="Arial"/>
+          <w:sz w:val="28"/>
+        </w:rPr>
+        <w:t xml:space="preserve"/>
+      </w:r>
+    </w:p>
+    <w:p>
+      <w:pPr>
+        <w:spacing w:line="276" w:lineRule="auto"/>
+      </w:pPr>
+      <w:r>
+        <w:rPr>
+          <w:rFonts w:ascii="Arial" w:hAnsi="Arial"/>
+          <w:sz w:val="28"/>
+        </w:rPr>
+        <w:t xml:space="preserve">153. A Bucket List item and a Daily Done tick are opposites and must</w:t>
+      </w:r>
+    </w:p>
+    <w:p>
+      <w:pPr>
+        <w:spacing w:line="276" w:lineRule="auto"/>
+      </w:pPr>
+      <w:r>
+        <w:rPr>
+          <w:rFonts w:ascii="Arial" w:hAnsi="Arial"/>
+          <w:sz w:val="28"/>
+        </w:rPr>
+        <w:t xml:space="preserve">    never be merged. Bucket List must survive the night. A Daily tick</w:t>
+      </w:r>
+    </w:p>
+    <w:p>
+      <w:pPr>
+        <w:spacing w:line="276" w:lineRule="auto"/>
+      </w:pPr>
+      <w:r>
+        <w:rPr>
+          <w:rFonts w:ascii="Arial" w:hAnsi="Arial"/>
+          <w:sz w:val="28"/>
+        </w:rPr>
+        <w:t xml:space="preserve">    is cleared when the day rolls over.</w:t>
+      </w:r>
+    </w:p>
+    <w:p>
+      <w:pPr>
+        <w:spacing w:line="276" w:lineRule="auto"/>
+      </w:pPr>
+      <w:r>
+        <w:rPr>
+          <w:rFonts w:ascii="Arial" w:hAnsi="Arial"/>
+          <w:sz w:val="28"/>
+        </w:rPr>
+        <w:t xml:space="preserve"/>
+      </w:r>
+    </w:p>
+    <w:p>
+      <w:pPr>
+        <w:spacing w:line="276" w:lineRule="auto"/>
+      </w:pPr>
+      <w:r>
+        <w:rPr>
+          <w:rFonts w:ascii="Arial" w:hAnsi="Arial"/>
+          <w:sz w:val="28"/>
+        </w:rPr>
+        <w:t xml:space="preserve">152. #74-new — Appointments carries the Reminders before chips, any</w:t>
+      </w:r>
+    </w:p>
+    <w:p>
+      <w:pPr>
+        <w:spacing w:line="276" w:lineRule="auto"/>
+      </w:pPr>
+      <w:r>
+        <w:rPr>
+          <w:rFonts w:ascii="Arial" w:hAnsi="Arial"/>
+          <w:sz w:val="28"/>
+        </w:rPr>
+        <w:t xml:space="preserve">    and all on at once, and they also remind at the set time. The</w:t>
+      </w:r>
+    </w:p>
+    <w:p>
+      <w:pPr>
+        <w:spacing w:line="276" w:lineRule="auto"/>
+      </w:pPr>
+      <w:r>
+        <w:rPr>
+          <w:rFonts w:ascii="Arial" w:hAnsi="Arial"/>
+          <w:sz w:val="28"/>
+        </w:rPr>
+        <w:t xml:space="preserve">    page is called Appointments (#56-new; saved kind appointments,</w:t>
+      </w:r>
+    </w:p>
+    <w:p>
+      <w:pPr>
+        <w:spacing w:line="276" w:lineRule="auto"/>
+      </w:pPr>
+      <w:r>
+        <w:rPr>
+          <w:rFonts w:ascii="Arial" w:hAnsi="Arial"/>
+          <w:sz w:val="28"/>
+        </w:rPr>
+        <w:t xml:space="preserve">    #65-new).</w:t>
+      </w:r>
+    </w:p>
+    <w:p>
+      <w:pPr>
+        <w:spacing w:line="276" w:lineRule="auto"/>
+      </w:pPr>
+      <w:r>
+        <w:rPr>
+          <w:rFonts w:ascii="Arial" w:hAnsi="Arial"/>
+          <w:sz w:val="28"/>
+        </w:rPr>
+        <w:t xml:space="preserve"/>
+      </w:r>
+    </w:p>
+    <w:p>
+      <w:pPr>
+        <w:spacing w:line="276" w:lineRule="auto"/>
+      </w:pPr>
+      <w:r>
+        <w:rPr>
+          <w:rFonts w:ascii="Arial" w:hAnsi="Arial"/>
+          <w:sz w:val="28"/>
+        </w:rPr>
+        <w:t xml:space="preserve">151. The reminder pages are not a replacement for the Input page.</w:t>
+      </w:r>
+    </w:p>
+    <w:p>
+      <w:pPr>
+        <w:spacing w:line="276" w:lineRule="auto"/>
+      </w:pPr>
+      <w:r>
+        <w:rPr>
+          <w:rFonts w:ascii="Arial" w:hAnsi="Arial"/>
+          <w:sz w:val="28"/>
+        </w:rPr>
+        <w:t xml:space="preserve">    The Input page goes away. The + Add popup is not its replacement.</w:t>
+      </w:r>
+    </w:p>
+    <w:p>
+      <w:pPr>
+        <w:spacing w:line="276" w:lineRule="auto"/>
+      </w:pPr>
+      <w:r>
+        <w:rPr>
+          <w:rFonts w:ascii="Arial" w:hAnsi="Arial"/>
+          <w:sz w:val="28"/>
+        </w:rPr>
+        <w:t xml:space="preserve"/>
+      </w:r>
+    </w:p>
+    <w:p>
+      <w:pPr>
+        <w:spacing w:line="276" w:lineRule="auto"/>
+      </w:pPr>
+      <w:r>
+        <w:rPr>
+          <w:rFonts w:ascii="Arial" w:hAnsi="Arial"/>
+          <w:sz w:val="28"/>
+        </w:rPr>
+        <w:t xml:space="preserve">150. #117-new — Settings Guide tile names in the explanations below</w:t>
+      </w:r>
+    </w:p>
+    <w:p>
+      <w:pPr>
+        <w:spacing w:line="276" w:lineRule="auto"/>
+      </w:pPr>
+      <w:r>
+        <w:rPr>
+          <w:rFonts w:ascii="Arial" w:hAnsi="Arial"/>
+          <w:sz w:val="28"/>
+        </w:rPr>
+        <w:t xml:space="preserve">    are marked bold, the same way the page names are. The working</w:t>
+      </w:r>
+    </w:p>
+    <w:p>
+      <w:pPr>
+        <w:spacing w:line="276" w:lineRule="auto"/>
+      </w:pPr>
+      <w:r>
+        <w:rPr>
+          <w:rFonts w:ascii="Arial" w:hAnsi="Arial"/>
+          <w:sz w:val="28"/>
+        </w:rPr>
+        <w:t xml:space="preserve">    document and the in-app copy agree. Not checked on the phone.</w:t>
+      </w:r>
+    </w:p>
+    <w:p>
+      <w:pPr>
+        <w:spacing w:line="276" w:lineRule="auto"/>
+      </w:pPr>
+      <w:r>
+        <w:rPr>
+          <w:rFonts w:ascii="Arial" w:hAnsi="Arial"/>
+          <w:sz w:val="28"/>
+        </w:rPr>
+        <w:t xml:space="preserve"/>
+      </w:r>
+    </w:p>
+    <w:p>
+      <w:pPr>
+        <w:spacing w:line="276" w:lineRule="auto"/>
+      </w:pPr>
+      <w:r>
+        <w:rPr>
+          <w:rFonts w:ascii="Arial" w:hAnsi="Arial"/>
+          <w:sz w:val="28"/>
+        </w:rPr>
+        <w:t xml:space="preserve">149. #117-new — Dark's cream writing Middle was lowered three steps,</w:t>
+      </w:r>
+    </w:p>
+    <w:p>
+      <w:pPr>
+        <w:spacing w:line="276" w:lineRule="auto"/>
+      </w:pPr>
+      <w:r>
+        <w:rPr>
+          <w:rFonts w:ascii="Arial" w:hAnsi="Arial"/>
+          <w:sz w:val="28"/>
+        </w:rPr>
+        <w:t xml:space="preserve">    and the quieter cream one step, so every Letters tap still moves.</w:t>
+      </w:r>
+    </w:p>
+    <w:p>
+      <w:pPr>
+        <w:spacing w:line="276" w:lineRule="auto"/>
+      </w:pPr>
+      <w:r>
+        <w:rPr>
+          <w:rFonts w:ascii="Arial" w:hAnsi="Arial"/>
+          <w:sz w:val="28"/>
+        </w:rPr>
+        <w:t xml:space="preserve">    The lightest setting is the old cream. Not checked on the phone.</w:t>
+      </w:r>
+    </w:p>
+    <w:p>
+      <w:pPr>
+        <w:spacing w:line="276" w:lineRule="auto"/>
+      </w:pPr>
+      <w:r>
+        <w:rPr>
+          <w:rFonts w:ascii="Arial" w:hAnsi="Arial"/>
+          <w:sz w:val="28"/>
+        </w:rPr>
+        <w:t xml:space="preserve"/>
+      </w:r>
+    </w:p>
+    <w:p>
+      <w:pPr>
+        <w:spacing w:line="276" w:lineRule="auto"/>
+      </w:pPr>
+      <w:r>
+        <w:rPr>
+          <w:rFonts w:ascii="Arial" w:hAnsi="Arial"/>
+          <w:sz w:val="28"/>
+        </w:rPr>
+        <w:t xml:space="preserve">148. #117-new — Light's page Middle was lowered three steps so every</w:t>
+      </w:r>
+    </w:p>
+    <w:p>
+      <w:pPr>
+        <w:spacing w:line="276" w:lineRule="auto"/>
+      </w:pPr>
+      <w:r>
+        <w:rPr>
+          <w:rFonts w:ascii="Arial" w:hAnsi="Arial"/>
+          <w:sz w:val="28"/>
+        </w:rPr>
+        <w:t xml:space="preserve">    Page tap still moves. The lightest setting is the old page. Dark's</w:t>
+      </w:r>
+    </w:p>
+    <w:p>
+      <w:pPr>
+        <w:spacing w:line="276" w:lineRule="auto"/>
+      </w:pPr>
+      <w:r>
+        <w:rPr>
+          <w:rFonts w:ascii="Arial" w:hAnsi="Arial"/>
+          <w:sz w:val="28"/>
+        </w:rPr>
+        <w:t xml:space="preserve">    page already moved on every tap. Not checked on the phone.</w:t>
+      </w:r>
+    </w:p>
+    <w:p>
+      <w:pPr>
+        <w:spacing w:line="276" w:lineRule="auto"/>
+      </w:pPr>
+      <w:r>
+        <w:rPr>
+          <w:rFonts w:ascii="Arial" w:hAnsi="Arial"/>
+          <w:sz w:val="28"/>
+        </w:rPr>
+        <w:t xml:space="preserve"/>
+      </w:r>
+    </w:p>
+    <w:p>
+      <w:pPr>
+        <w:spacing w:line="276" w:lineRule="auto"/>
+      </w:pPr>
+      <w:r>
+        <w:rPr>
+          <w:rFonts w:ascii="Arial" w:hAnsi="Arial"/>
+          <w:sz w:val="28"/>
+        </w:rPr>
+        <w:t xml:space="preserve">147. #117-new — Each Letters and Page tap is an even step in how light</w:t>
+      </w:r>
+    </w:p>
+    <w:p>
+      <w:pPr>
+        <w:spacing w:line="276" w:lineRule="auto"/>
+      </w:pPr>
+      <w:r>
+        <w:rPr>
+          <w:rFonts w:ascii="Arial" w:hAnsi="Arial"/>
+          <w:sz w:val="28"/>
+        </w:rPr>
+        <w:t xml:space="preserve">    or dark it looks, the same size toward lighter and toward darker.</w:t>
+      </w:r>
+    </w:p>
+    <w:p>
+      <w:pPr>
+        <w:spacing w:line="276" w:lineRule="auto"/>
+      </w:pPr>
+      <w:r>
+        <w:rPr>
+          <w:rFonts w:ascii="Arial" w:hAnsi="Arial"/>
+          <w:sz w:val="28"/>
+        </w:rPr>
+        <w:t xml:space="preserve">    Letters use that same mix. Not checked on the phone.</w:t>
+      </w:r>
+    </w:p>
+    <w:p>
+      <w:pPr>
+        <w:spacing w:line="276" w:lineRule="auto"/>
+      </w:pPr>
+      <w:r>
+        <w:rPr>
+          <w:rFonts w:ascii="Arial" w:hAnsi="Arial"/>
+          <w:sz w:val="28"/>
+        </w:rPr>
+        <w:t xml:space="preserve"/>
+      </w:r>
+    </w:p>
+    <w:p>
+      <w:pPr>
+        <w:spacing w:line="276" w:lineRule="auto"/>
+      </w:pPr>
+      <w:r>
+        <w:rPr>
+          <w:rFonts w:ascii="Arial" w:hAnsi="Arial"/>
+          <w:sz w:val="28"/>
+        </w:rPr>
+        <w:t xml:space="preserve">146. #117-new — Letters and Page are kept separately for Light and for</w:t>
+      </w:r>
+    </w:p>
+    <w:p>
+      <w:pPr>
+        <w:spacing w:line="276" w:lineRule="auto"/>
+      </w:pPr>
+      <w:r>
+        <w:rPr>
+          <w:rFonts w:ascii="Arial" w:hAnsi="Arial"/>
+          <w:sz w:val="28"/>
+        </w:rPr>
+        <w:t xml:space="preserve">    Dark. Settings changes the theme that is on. Backup Export and</w:t>
+      </w:r>
+    </w:p>
+    <w:p>
+      <w:pPr>
+        <w:spacing w:line="276" w:lineRule="auto"/>
+      </w:pPr>
+      <w:r>
+        <w:rPr>
+          <w:rFonts w:ascii="Arial" w:hAnsi="Arial"/>
+          <w:sz w:val="28"/>
+        </w:rPr>
+        <w:t xml:space="preserve">    Replace carry both pairs. Merge leaves them. Not checked on the</w:t>
+      </w:r>
+    </w:p>
+    <w:p>
+      <w:pPr>
+        <w:spacing w:line="276" w:lineRule="auto"/>
+      </w:pPr>
+      <w:r>
+        <w:rPr>
+          <w:rFonts w:ascii="Arial" w:hAnsi="Arial"/>
+          <w:sz w:val="28"/>
+        </w:rPr>
+        <w:t xml:space="preserve">    phone.</w:t>
+      </w:r>
+    </w:p>
+    <w:p>
+      <w:pPr>
+        <w:spacing w:line="276" w:lineRule="auto"/>
+      </w:pPr>
+      <w:r>
+        <w:rPr>
+          <w:rFonts w:ascii="Arial" w:hAnsi="Arial"/>
+          <w:sz w:val="28"/>
+        </w:rPr>
+        <w:t xml:space="preserve"/>
+      </w:r>
+    </w:p>
+    <w:p>
+      <w:pPr>
+        <w:spacing w:line="276" w:lineRule="auto"/>
+      </w:pPr>
+      <w:r>
+        <w:rPr>
+          <w:rFonts w:ascii="Arial" w:hAnsi="Arial"/>
+          <w:sz w:val="28"/>
+        </w:rPr>
+        <w:t xml:space="preserve">145. #116-new — Export saves the name, the app theme, the popup</w:t>
+      </w:r>
+    </w:p>
+    <w:p>
+      <w:pPr>
+        <w:spacing w:line="276" w:lineRule="auto"/>
+      </w:pPr>
+      <w:r>
+        <w:rPr>
+          <w:rFonts w:ascii="Arial" w:hAnsi="Arial"/>
+          <w:sz w:val="28"/>
+        </w:rPr>
+        <w:t xml:space="preserve">    colors, Letters, Page, and the morning, midday, and evening</w:t>
+      </w:r>
+    </w:p>
+    <w:p>
+      <w:pPr>
+        <w:spacing w:line="276" w:lineRule="auto"/>
+      </w:pPr>
+      <w:r>
+        <w:rPr>
+          <w:rFonts w:ascii="Arial" w:hAnsi="Arial"/>
+          <w:sz w:val="28"/>
+        </w:rPr>
+        <w:t xml:space="preserve">    times as one Settings list. Replace writes that list. Merge</w:t>
+      </w:r>
+    </w:p>
+    <w:p>
+      <w:pPr>
+        <w:spacing w:line="276" w:lineRule="auto"/>
+      </w:pPr>
+      <w:r>
+        <w:rPr>
+          <w:rFonts w:ascii="Arial" w:hAnsi="Arial"/>
+          <w:sz w:val="28"/>
+        </w:rPr>
+        <w:t xml:space="preserve">    does not take it. Not checked on the phone.</w:t>
+      </w:r>
+    </w:p>
+    <w:p>
+      <w:pPr>
+        <w:spacing w:line="276" w:lineRule="auto"/>
+      </w:pPr>
+      <w:r>
+        <w:rPr>
+          <w:rFonts w:ascii="Arial" w:hAnsi="Arial"/>
+          <w:sz w:val="28"/>
+        </w:rPr>
+        <w:t xml:space="preserve"/>
+      </w:r>
+    </w:p>
+    <w:p>
+      <w:pPr>
+        <w:spacing w:line="276" w:lineRule="auto"/>
+      </w:pPr>
+      <w:r>
+        <w:rPr>
+          <w:rFonts w:ascii="Arial" w:hAnsi="Arial"/>
+          <w:sz w:val="28"/>
+        </w:rPr>
         <w:t xml:space="preserve">144. #116-new — The User's Guide marks page names in Reminders that</w:t>
       </w:r>
     </w:p>
@@ -2044,31 +2584,43 @@
           <w:rFonts w:ascii="Arial" w:hAnsi="Arial"/>
           <w:sz w:val="28"/>
         </w:rPr>
-        <w:t xml:space="preserve">143. #116-new — Reminder lists no longer slide left for a back-swipe.</w:t>
-      </w:r>
-    </w:p>
-    <w:p>
-      <w:pPr>
-        <w:spacing w:line="276" w:lineRule="auto"/>
-      </w:pPr>
-      <w:r>
-        <w:rPr>
-          <w:rFonts w:ascii="Arial" w:hAnsi="Arial"/>
-          <w:sz w:val="28"/>
-        </w:rPr>
-        <w:t xml:space="preserve">    The last row has room above the bottom of the phone. Not on the</w:t>
-      </w:r>
-    </w:p>
-    <w:p>
-      <w:pPr>
-        <w:spacing w:line="276" w:lineRule="auto"/>
-      </w:pPr>
-      <w:r>
-        <w:rPr>
-          <w:rFonts w:ascii="Arial" w:hAnsi="Arial"/>
-          <w:sz w:val="28"/>
-        </w:rPr>
-        <w:t xml:space="preserve">    phone.</w:t>
+        <w:t xml:space="preserve">143. #116-new — Reminder lists: the layout switch and the list-page</w:t>
+      </w:r>
+    </w:p>
+    <w:p>
+      <w:pPr>
+        <w:spacing w:line="276" w:lineRule="auto"/>
+      </w:pPr>
+      <w:r>
+        <w:rPr>
+          <w:rFonts w:ascii="Arial" w:hAnsi="Arial"/>
+          <w:sz w:val="28"/>
+        </w:rPr>
+        <w:t xml:space="preserve">    walk did not stop the iPhone back-drag. The whole screen stack</w:t>
+      </w:r>
+    </w:p>
+    <w:p>
+      <w:pPr>
+        <w:spacing w:line="276" w:lineRule="auto"/>
+      </w:pPr>
+      <w:r>
+        <w:rPr>
+          <w:rFonts w:ascii="Arial" w:hAnsi="Arial"/>
+          <w:sz w:val="28"/>
+        </w:rPr>
+        <w:t xml:space="preserve">    now keeps that drag off. Extra room under the last row. Not</w:t>
+      </w:r>
+    </w:p>
+    <w:p>
+      <w:pPr>
+        <w:spacing w:line="276" w:lineRule="auto"/>
+      </w:pPr>
+      <w:r>
+        <w:rPr>
+          <w:rFonts w:ascii="Arial" w:hAnsi="Arial"/>
+          <w:sz w:val="28"/>
+        </w:rPr>
+        <w:t xml:space="preserve">    checked on the phone.</w:t>
       </w:r>
     </w:p>
     <w:p>

</xml_diff>

<commit_message>
118.1-new - Memory reminder Done & fire settings cleaned & total doc refresh.
</commit_message>
<xml_diff>
--- a/docs/pending.docx
+++ b/docs/pending.docx
@@ -24,7 +24,7 @@
           <w:rFonts w:ascii="Arial" w:hAnsi="Arial"/>
           <w:sz w:val="28"/>
         </w:rPr>
-        <w:t xml:space="preserve">Last updated: 2026-09-22 (#118-new)</w:t>
+        <w:t xml:space="preserve">Last updated: 2026-09-23 (#118-new)</w:t>
       </w:r>
     </w:p>
     <w:p>
@@ -325,234 +325,6 @@
           <w:rFonts w:ascii="Arial" w:hAnsi="Arial"/>
           <w:sz w:val="28"/>
         </w:rPr>
-        <w:t xml:space="preserve">1. DONE ALERT CLEANUP (#118-new). On a native load, let an alert</w:t>
-      </w:r>
-    </w:p>
-    <w:p>
-      <w:pPr>
-        <w:spacing w:line="276" w:lineRule="auto"/>
-      </w:pPr>
-      <w:r>
-        <w:rPr>
-          <w:rFonts w:ascii="Arial" w:hAnsi="Arial"/>
-          <w:sz w:val="28"/>
-        </w:rPr>
-        <w:t xml:space="preserve">   arrive and mark its item Done. Every old base, delayed, duplicate,</w:t>
-      </w:r>
-    </w:p>
-    <w:p>
-      <w:pPr>
-        <w:spacing w:line="276" w:lineRule="auto"/>
-      </w:pPr>
-      <w:r>
-        <w:rPr>
-          <w:rFonts w:ascii="Arial" w:hAnsi="Arial"/>
-          <w:sz w:val="28"/>
-        </w:rPr>
-        <w:t xml:space="preserve">   and already-delivered alert copy for that item should stay gone.</w:t>
-      </w:r>
-    </w:p>
-    <w:p>
-      <w:pPr>
-        <w:spacing w:line="276" w:lineRule="auto"/>
-      </w:pPr>
-      <w:r>
-        <w:rPr>
-          <w:rFonts w:ascii="Arial" w:hAnsi="Arial"/>
-          <w:sz w:val="28"/>
-        </w:rPr>
-        <w:t xml:space="preserve">   A repeating item's next real cycle should remain.</w:t>
-      </w:r>
-    </w:p>
-    <w:p>
-      <w:pPr>
-        <w:spacing w:line="276" w:lineRule="auto"/>
-      </w:pPr>
-      <w:r>
-        <w:rPr>
-          <w:rFonts w:ascii="Arial" w:hAnsi="Arial"/>
-          <w:sz w:val="28"/>
-        </w:rPr>
-        <w:t xml:space="preserve">2. PHONE PROOF FOR JOBS 1 AND 2. On a native build, check Job 1's</w:t>
-      </w:r>
-    </w:p>
-    <w:p>
-      <w:pPr>
-        <w:spacing w:line="276" w:lineRule="auto"/>
-      </w:pPr>
-      <w:r>
-        <w:rPr>
-          <w:rFonts w:ascii="Arial" w:hAnsi="Arial"/>
-          <w:sz w:val="28"/>
-        </w:rPr>
-        <w:t xml:space="preserve">   banner and list-popup choices. For Job 2, leave a timed Daily item</w:t>
-      </w:r>
-    </w:p>
-    <w:p>
-      <w:pPr>
-        <w:spacing w:line="276" w:lineRule="auto"/>
-      </w:pPr>
-      <w:r>
-        <w:rPr>
-          <w:rFonts w:ascii="Arial" w:hAnsi="Arial"/>
-          <w:sz w:val="28"/>
-        </w:rPr>
-        <w:t xml:space="preserve">   undone, cross the day boundary, and make the first opening a banner</w:t>
-      </w:r>
-    </w:p>
-    <w:p>
-      <w:pPr>
-        <w:spacing w:line="276" w:lineRule="auto"/>
-      </w:pPr>
-      <w:r>
-        <w:rPr>
-          <w:rFonts w:ascii="Arial" w:hAnsi="Arial"/>
-          <w:sz w:val="28"/>
-        </w:rPr>
-        <w:t xml:space="preserve">   body tap. The missed-reminder popup comes first; after OK, the</w:t>
-      </w:r>
-    </w:p>
-    <w:p>
-      <w:pPr>
-        <w:spacing w:line="276" w:lineRule="auto"/>
-      </w:pPr>
-      <w:r>
-        <w:rPr>
-          <w:rFonts w:ascii="Arial" w:hAnsi="Arial"/>
-          <w:sz w:val="28"/>
-        </w:rPr>
-        <w:t xml:space="preserve">   correct item is highlighted; a later return does not repeat it.</w:t>
-      </w:r>
-    </w:p>
-    <w:p>
-      <w:pPr>
-        <w:spacing w:line="276" w:lineRule="auto"/>
-      </w:pPr>
-      <w:r>
-        <w:rPr>
-          <w:rFonts w:ascii="Arial" w:hAnsi="Arial"/>
-          <w:sz w:val="28"/>
-        </w:rPr>
-        <w:t xml:space="preserve">3. DAY-ROLL LOCK still wants a night of all-green Daily on this</w:t>
-      </w:r>
-    </w:p>
-    <w:p>
-      <w:pPr>
-        <w:spacing w:line="276" w:lineRule="auto"/>
-      </w:pPr>
-      <w:r>
-        <w:rPr>
-          <w:rFonts w:ascii="Arial" w:hAnsi="Arial"/>
-          <w:sz w:val="28"/>
-        </w:rPr>
-        <w:t xml:space="preserve">   load, then a morning open on a new load, to confirm the pop-up</w:t>
-      </w:r>
-    </w:p>
-    <w:p>
-      <w:pPr>
-        <w:spacing w:line="276" w:lineRule="auto"/>
-      </w:pPr>
-      <w:r>
-        <w:rPr>
-          <w:rFonts w:ascii="Arial" w:hAnsi="Arial"/>
-          <w:sz w:val="28"/>
-        </w:rPr>
-        <w:t xml:space="preserve">   stays quiet.</w:t>
-      </w:r>
-    </w:p>
-    <w:p>
-      <w:pPr>
-        <w:spacing w:line="276" w:lineRule="auto"/>
-      </w:pPr>
-      <w:r>
-        <w:rPr>
-          <w:rFonts w:ascii="Arial" w:hAnsi="Arial"/>
-          <w:sz w:val="28"/>
-        </w:rPr>
-        <w:t xml:space="preserve">4. JOB 3 ON THE CURRENT NATIVE LOAD. Options by kind, Weekly Done,</w:t>
-      </w:r>
-    </w:p>
-    <w:p>
-      <w:pPr>
-        <w:spacing w:line="276" w:lineRule="auto"/>
-      </w:pPr>
-      <w:r>
-        <w:rPr>
-          <w:rFonts w:ascii="Arial" w:hAnsi="Arial"/>
-          <w:sz w:val="28"/>
-        </w:rPr>
-        <w:t xml:space="preserve">   and an export after a change have not been checked on the phone.</w:t>
-      </w:r>
-    </w:p>
-    <w:p>
-      <w:pPr>
-        <w:spacing w:line="276" w:lineRule="auto"/>
-      </w:pPr>
-      <w:r>
-        <w:rPr>
-          <w:rFonts w:ascii="Arial" w:hAnsi="Arial"/>
-          <w:sz w:val="28"/>
-        </w:rPr>
-        <w:t xml:space="preserve">5. BIRTHDAY ROW AND REMINDER (Patrick, #110-new). The row shows the</w:t>
-      </w:r>
-    </w:p>
-    <w:p>
-      <w:pPr>
-        <w:spacing w:line="276" w:lineRule="auto"/>
-      </w:pPr>
-      <w:r>
-        <w:rPr>
-          <w:rFonts w:ascii="Arial" w:hAnsi="Arial"/>
-          <w:sz w:val="28"/>
-        </w:rPr>
-        <w:t xml:space="preserve">   name and the birthdate. The reminder says the age. The next fire is</w:t>
-      </w:r>
-    </w:p>
-    <w:p>
-      <w:pPr>
-        <w:spacing w:line="276" w:lineRule="auto"/>
-      </w:pPr>
-      <w:r>
-        <w:rPr>
-          <w:rFonts w:ascii="Arial" w:hAnsi="Arial"/>
-          <w:sz w:val="28"/>
-        </w:rPr>
-        <w:t xml:space="preserve">   derived from the birthdate. Restore writes the year of birth onto</w:t>
-      </w:r>
-    </w:p>
-    <w:p>
-      <w:pPr>
-        <w:spacing w:line="276" w:lineRule="auto"/>
-      </w:pPr>
-      <w:r>
-        <w:rPr>
-          <w:rFonts w:ascii="Arial" w:hAnsi="Arial"/>
-          <w:sz w:val="28"/>
-        </w:rPr>
-        <w:t xml:space="preserve">   an older backup. It needs a phone check. Replace brings the backup</w:t>
-      </w:r>
-    </w:p>
-    <w:p>
-      <w:pPr>
-        <w:spacing w:line="276" w:lineRule="auto"/>
-      </w:pPr>
-      <w:r>
-        <w:rPr>
-          <w:rFonts w:ascii="Arial" w:hAnsi="Arial"/>
-          <w:sz w:val="28"/>
-        </w:rPr>
-        <w:t xml:space="preserve">   copy back; Merge keeps what is already in the app.</w:t>
-      </w:r>
-    </w:p>
-    <w:p>
-      <w:pPr>
-        <w:spacing w:line="276" w:lineRule="auto"/>
-      </w:pPr>
-      <w:r>
-        <w:rPr>
-          <w:rFonts w:ascii="Arial" w:hAnsi="Arial"/>
-          <w:sz w:val="28"/>
-        </w:rPr>
         <w:t xml:space="preserve"/>
       </w:r>
     </w:p>
@@ -1733,6 +1505,342 @@
           <w:sz w:val="28"/>
         </w:rPr>
         <w:t xml:space="preserve">docs/handoff-history.md.</w:t>
+      </w:r>
+    </w:p>
+    <w:p>
+      <w:pPr>
+        <w:spacing w:line="276" w:lineRule="auto"/>
+      </w:pPr>
+      <w:r>
+        <w:rPr>
+          <w:rFonts w:ascii="Arial" w:hAnsi="Arial"/>
+          <w:sz w:val="28"/>
+        </w:rPr>
+        <w:t xml:space="preserve"/>
+      </w:r>
+    </w:p>
+    <w:p>
+      <w:pPr>
+        <w:spacing w:line="276" w:lineRule="auto"/>
+      </w:pPr>
+      <w:r>
+        <w:rPr>
+          <w:rFonts w:ascii="Arial" w:hAnsi="Arial"/>
+          <w:sz w:val="28"/>
+        </w:rPr>
+        <w:t xml:space="preserve">164. #118-new — Build 97 is on the phone. App Store version 1.0 (72)</w:t>
+      </w:r>
+    </w:p>
+    <w:p>
+      <w:pPr>
+        <w:spacing w:line="276" w:lineRule="auto"/>
+      </w:pPr>
+      <w:r>
+        <w:rPr>
+          <w:rFonts w:ascii="Arial" w:hAnsi="Arial"/>
+          <w:sz w:val="28"/>
+        </w:rPr>
+        <w:t xml:space="preserve">    is Pending Developer Release, with manual release. Three stale</w:t>
+      </w:r>
+    </w:p>
+    <w:p>
+      <w:pPr>
+        <w:spacing w:line="276" w:lineRule="auto"/>
+      </w:pPr>
+      <w:r>
+        <w:rPr>
+          <w:rFonts w:ascii="Arial" w:hAnsi="Arial"/>
+          <w:sz w:val="28"/>
+        </w:rPr>
+        <w:t xml:space="preserve">    handoff lines came out: a separate clock-display job, keeping an</w:t>
+      </w:r>
+    </w:p>
+    <w:p>
+      <w:pPr>
+        <w:spacing w:line="276" w:lineRule="auto"/>
+      </w:pPr>
+      <w:r>
+        <w:rPr>
+          <w:rFonts w:ascii="Arial" w:hAnsi="Arial"/>
+          <w:sz w:val="28"/>
+        </w:rPr>
+        <w:t xml:space="preserve">    old build sheet current, and a repeating-alarm package check that</w:t>
+      </w:r>
+    </w:p>
+    <w:p>
+      <w:pPr>
+        <w:spacing w:line="276" w:lineRule="auto"/>
+      </w:pPr>
+      <w:r>
+        <w:rPr>
+          <w:rFonts w:ascii="Arial" w:hAnsi="Arial"/>
+          <w:sz w:val="28"/>
+        </w:rPr>
+        <w:t xml:space="preserve">    no longer blocks the single-moment engine.</w:t>
+      </w:r>
+    </w:p>
+    <w:p>
+      <w:pPr>
+        <w:spacing w:line="276" w:lineRule="auto"/>
+      </w:pPr>
+      <w:r>
+        <w:rPr>
+          <w:rFonts w:ascii="Arial" w:hAnsi="Arial"/>
+          <w:sz w:val="28"/>
+        </w:rPr>
+        <w:t xml:space="preserve"/>
+      </w:r>
+    </w:p>
+    <w:p>
+      <w:pPr>
+        <w:spacing w:line="276" w:lineRule="auto"/>
+      </w:pPr>
+      <w:r>
+        <w:rPr>
+          <w:rFonts w:ascii="Arial" w:hAnsi="Arial"/>
+          <w:sz w:val="28"/>
+        </w:rPr>
+        <w:t xml:space="preserve">163. #118-new — The designed-machine Jobs 1, 2, and 3 are all</w:t>
+      </w:r>
+    </w:p>
+    <w:p>
+      <w:pPr>
+        <w:spacing w:line="276" w:lineRule="auto"/>
+      </w:pPr>
+      <w:r>
+        <w:rPr>
+          <w:rFonts w:ascii="Arial" w:hAnsi="Arial"/>
+          <w:sz w:val="28"/>
+        </w:rPr>
+        <w:t xml:space="preserve">    verified on the phone: banner and list-popup choices, the</w:t>
+      </w:r>
+    </w:p>
+    <w:p>
+      <w:pPr>
+        <w:spacing w:line="276" w:lineRule="auto"/>
+      </w:pPr>
+      <w:r>
+        <w:rPr>
+          <w:rFonts w:ascii="Arial" w:hAnsi="Arial"/>
+          <w:sz w:val="28"/>
+        </w:rPr>
+        <w:t xml:space="preserve">    banner-first day-boundary opening, Options by kind, Weekly Done,</w:t>
+      </w:r>
+    </w:p>
+    <w:p>
+      <w:pPr>
+        <w:spacing w:line="276" w:lineRule="auto"/>
+      </w:pPr>
+      <w:r>
+        <w:rPr>
+          <w:rFonts w:ascii="Arial" w:hAnsi="Arial"/>
+          <w:sz w:val="28"/>
+        </w:rPr>
+        <w:t xml:space="preserve">    and export after a change. No phone proof remains open. What's</w:t>
+      </w:r>
+    </w:p>
+    <w:p>
+      <w:pPr>
+        <w:spacing w:line="276" w:lineRule="auto"/>
+      </w:pPr>
+      <w:r>
+        <w:rPr>
+          <w:rFonts w:ascii="Arial" w:hAnsi="Arial"/>
+          <w:sz w:val="28"/>
+        </w:rPr>
+        <w:t xml:space="preserve">    Next is empty.</w:t>
+      </w:r>
+    </w:p>
+    <w:p>
+      <w:pPr>
+        <w:spacing w:line="276" w:lineRule="auto"/>
+      </w:pPr>
+      <w:r>
+        <w:rPr>
+          <w:rFonts w:ascii="Arial" w:hAnsi="Arial"/>
+          <w:sz w:val="28"/>
+        </w:rPr>
+        <w:t xml:space="preserve"/>
+      </w:r>
+    </w:p>
+    <w:p>
+      <w:pPr>
+        <w:spacing w:line="276" w:lineRule="auto"/>
+      </w:pPr>
+      <w:r>
+        <w:rPr>
+          <w:rFonts w:ascii="Arial" w:hAnsi="Arial"/>
+          <w:sz w:val="28"/>
+        </w:rPr>
+        <w:t xml:space="preserve">162. #118-new — Day-roll lock, #116-new Settings backup and back-drag,</w:t>
+      </w:r>
+    </w:p>
+    <w:p>
+      <w:pPr>
+        <w:spacing w:line="276" w:lineRule="auto"/>
+      </w:pPr>
+      <w:r>
+        <w:rPr>
+          <w:rFonts w:ascii="Arial" w:hAnsi="Arial"/>
+          <w:sz w:val="28"/>
+        </w:rPr>
+        <w:t xml:space="preserve">    and the Settings Guide tile names are all verified on the phone.</w:t>
+      </w:r>
+    </w:p>
+    <w:p>
+      <w:pPr>
+        <w:spacing w:line="276" w:lineRule="auto"/>
+      </w:pPr>
+      <w:r>
+        <w:rPr>
+          <w:rFonts w:ascii="Arial" w:hAnsi="Arial"/>
+          <w:sz w:val="28"/>
+        </w:rPr>
+        <w:t xml:space="preserve">    Export, Replace, and Merge handle Settings correctly; the screen</w:t>
+      </w:r>
+    </w:p>
+    <w:p>
+      <w:pPr>
+        <w:spacing w:line="276" w:lineRule="auto"/>
+      </w:pPr>
+      <w:r>
+        <w:rPr>
+          <w:rFonts w:ascii="Arial" w:hAnsi="Arial"/>
+          <w:sz w:val="28"/>
+        </w:rPr>
+        <w:t xml:space="preserve">    stack keeps the back-drag off; the Guide names look right.</w:t>
+      </w:r>
+    </w:p>
+    <w:p>
+      <w:pPr>
+        <w:spacing w:line="276" w:lineRule="auto"/>
+      </w:pPr>
+      <w:r>
+        <w:rPr>
+          <w:rFonts w:ascii="Arial" w:hAnsi="Arial"/>
+          <w:sz w:val="28"/>
+        </w:rPr>
+        <w:t xml:space="preserve"/>
+      </w:r>
+    </w:p>
+    <w:p>
+      <w:pPr>
+        <w:spacing w:line="276" w:lineRule="auto"/>
+      </w:pPr>
+      <w:r>
+        <w:rPr>
+          <w:rFonts w:ascii="Arial" w:hAnsi="Arial"/>
+          <w:sz w:val="28"/>
+        </w:rPr>
+        <w:t xml:space="preserve">161. #118-new — Birthday and its attached backup checks are working</w:t>
+      </w:r>
+    </w:p>
+    <w:p>
+      <w:pPr>
+        <w:spacing w:line="276" w:lineRule="auto"/>
+      </w:pPr>
+      <w:r>
+        <w:rPr>
+          <w:rFonts w:ascii="Arial" w:hAnsi="Arial"/>
+          <w:sz w:val="28"/>
+        </w:rPr>
+        <w:t xml:space="preserve">    correctly on the phone. The row shows the name and birthdate, the</w:t>
+      </w:r>
+    </w:p>
+    <w:p>
+      <w:pPr>
+        <w:spacing w:line="276" w:lineRule="auto"/>
+      </w:pPr>
+      <w:r>
+        <w:rPr>
+          <w:rFonts w:ascii="Arial" w:hAnsi="Arial"/>
+          <w:sz w:val="28"/>
+        </w:rPr>
+        <w:t xml:space="preserve">    reminder says the age, and the next fire follows the birthdate.</w:t>
+      </w:r>
+    </w:p>
+    <w:p>
+      <w:pPr>
+        <w:spacing w:line="276" w:lineRule="auto"/>
+      </w:pPr>
+      <w:r>
+        <w:rPr>
+          <w:rFonts w:ascii="Arial" w:hAnsi="Arial"/>
+          <w:sz w:val="28"/>
+        </w:rPr>
+        <w:t xml:space="preserve">    Replace brings the backup copy back; Merge keeps what is already</w:t>
+      </w:r>
+    </w:p>
+    <w:p>
+      <w:pPr>
+        <w:spacing w:line="276" w:lineRule="auto"/>
+      </w:pPr>
+      <w:r>
+        <w:rPr>
+          <w:rFonts w:ascii="Arial" w:hAnsi="Arial"/>
+          <w:sz w:val="28"/>
+        </w:rPr>
+        <w:t xml:space="preserve">    in the app.</w:t>
+      </w:r>
+    </w:p>
+    <w:p>
+      <w:pPr>
+        <w:spacing w:line="276" w:lineRule="auto"/>
+      </w:pPr>
+      <w:r>
+        <w:rPr>
+          <w:rFonts w:ascii="Arial" w:hAnsi="Arial"/>
+          <w:sz w:val="28"/>
+        </w:rPr>
+        <w:t xml:space="preserve"/>
+      </w:r>
+    </w:p>
+    <w:p>
+      <w:pPr>
+        <w:spacing w:line="276" w:lineRule="auto"/>
+      </w:pPr>
+      <w:r>
+        <w:rPr>
+          <w:rFonts w:ascii="Arial" w:hAnsi="Arial"/>
+          <w:sz w:val="28"/>
+        </w:rPr>
+        <w:t xml:space="preserve">160. #118-new — After 24 hours on the new phone load, no reminder</w:t>
+      </w:r>
+    </w:p>
+    <w:p>
+      <w:pPr>
+        <w:spacing w:line="276" w:lineRule="auto"/>
+      </w:pPr>
+      <w:r>
+        <w:rPr>
+          <w:rFonts w:ascii="Arial" w:hAnsi="Arial"/>
+          <w:sz w:val="28"/>
+        </w:rPr>
+        <w:t xml:space="preserve">    already marked Done had fired again. The one reminder that did</w:t>
+      </w:r>
+    </w:p>
+    <w:p>
+      <w:pPr>
+        <w:spacing w:line="276" w:lineRule="auto"/>
+      </w:pPr>
+      <w:r>
+        <w:rPr>
+          <w:rFonts w:ascii="Arial" w:hAnsi="Arial"/>
+          <w:sz w:val="28"/>
+        </w:rPr>
+        <w:t xml:space="preserve">    arrive was for something actually missing. The app acted normally.</w:t>
+      </w:r>
+    </w:p>
+    <w:p>
+      <w:pPr>
+        <w:spacing w:line="276" w:lineRule="auto"/>
+      </w:pPr>
+      <w:r>
+        <w:rPr>
+          <w:rFonts w:ascii="Arial" w:hAnsi="Arial"/>
+          <w:sz w:val="28"/>
+        </w:rPr>
+        <w:t xml:space="preserve">    The phone goal passed.</w:t>
       </w:r>
     </w:p>
     <w:p>

</xml_diff>

<commit_message>
119-new - Memory - Reminders pushed forward for a holiday Done for next cycle. Dropped ‘Day in the same week as a Holiday’ missing field.
</commit_message>
<xml_diff>
--- a/docs/pending.docx
+++ b/docs/pending.docx
@@ -24,7 +24,7 @@
           <w:rFonts w:ascii="Arial" w:hAnsi="Arial"/>
           <w:sz w:val="28"/>
         </w:rPr>
-        <w:t xml:space="preserve">Last updated: 2026-09-23 (#118-new)</w:t>
+        <w:t xml:space="preserve">Last updated: 2026-09-24 (#119-new)</w:t>
       </w:r>
     </w:p>
     <w:p>
@@ -1528,6 +1528,210 @@
           <w:rFonts w:ascii="Arial" w:hAnsi="Arial"/>
           <w:sz w:val="28"/>
         </w:rPr>
+        <w:t xml:space="preserve">168. #119-new — Home badges make room while one is sliding. The order</w:t>
+      </w:r>
+    </w:p>
+    <w:p>
+      <w:pPr>
+        <w:spacing w:line="276" w:lineRule="auto"/>
+      </w:pPr>
+      <w:r>
+        <w:rPr>
+          <w:rFonts w:ascii="Arial" w:hAnsi="Arial"/>
+          <w:sz w:val="28"/>
+        </w:rPr>
+        <w:t xml:space="preserve">    changes then, and it is saved when you let go. Not on the phone.</w:t>
+      </w:r>
+    </w:p>
+    <w:p>
+      <w:pPr>
+        <w:spacing w:line="276" w:lineRule="auto"/>
+      </w:pPr>
+      <w:r>
+        <w:rPr>
+          <w:rFonts w:ascii="Arial" w:hAnsi="Arial"/>
+          <w:sz w:val="28"/>
+        </w:rPr>
+        <w:t xml:space="preserve"/>
+      </w:r>
+    </w:p>
+    <w:p>
+      <w:pPr>
+        <w:spacing w:line="276" w:lineRule="auto"/>
+      </w:pPr>
+      <w:r>
+        <w:rPr>
+          <w:rFonts w:ascii="Arial" w:hAnsi="Arial"/>
+          <w:sz w:val="28"/>
+        </w:rPr>
+        <w:t xml:space="preserve">167. #119-new — The same-week move is dropped. A holiday in the week no</w:t>
+      </w:r>
+    </w:p>
+    <w:p>
+      <w:pPr>
+        <w:spacing w:line="276" w:lineRule="auto"/>
+      </w:pPr>
+      <w:r>
+        <w:rPr>
+          <w:rFonts w:ascii="Arial" w:hAnsi="Arial"/>
+          <w:sz w:val="28"/>
+        </w:rPr>
+        <w:t xml:space="preserve">    longer pushes the set day onto the next day. The move that fires</w:t>
+      </w:r>
+    </w:p>
+    <w:p>
+      <w:pPr>
+        <w:spacing w:line="276" w:lineRule="auto"/>
+      </w:pPr>
+      <w:r>
+        <w:rPr>
+          <w:rFonts w:ascii="Arial" w:hAnsi="Arial"/>
+          <w:sz w:val="28"/>
+        </w:rPr>
+        <w:t xml:space="preserve">    when the reminder itself lands on the holiday stays. 428 Mac</w:t>
+      </w:r>
+    </w:p>
+    <w:p>
+      <w:pPr>
+        <w:spacing w:line="276" w:lineRule="auto"/>
+      </w:pPr>
+      <w:r>
+        <w:rPr>
+          <w:rFonts w:ascii="Arial" w:hAnsi="Arial"/>
+          <w:sz w:val="28"/>
+        </w:rPr>
+        <w:t xml:space="preserve">    checks. TypeScript clean. Not on the phone.</w:t>
+      </w:r>
+    </w:p>
+    <w:p>
+      <w:pPr>
+        <w:spacing w:line="276" w:lineRule="auto"/>
+      </w:pPr>
+      <w:r>
+        <w:rPr>
+          <w:rFonts w:ascii="Arial" w:hAnsi="Arial"/>
+          <w:sz w:val="28"/>
+        </w:rPr>
+        <w:t xml:space="preserve"/>
+      </w:r>
+    </w:p>
+    <w:p>
+      <w:pPr>
+        <w:spacing w:line="276" w:lineRule="auto"/>
+      </w:pPr>
+      <w:r>
+        <w:rPr>
+          <w:rFonts w:ascii="Arial" w:hAnsi="Arial"/>
+          <w:sz w:val="28"/>
+        </w:rPr>
+        <w:t xml:space="preserve">166. #119-new — Day after a holiday stays on that next day. A Thursday</w:t>
+      </w:r>
+    </w:p>
+    <w:p>
+      <w:pPr>
+        <w:spacing w:line="276" w:lineRule="auto"/>
+      </w:pPr>
+      <w:r>
+        <w:rPr>
+          <w:rFonts w:ascii="Arial" w:hAnsi="Arial"/>
+          <w:sz w:val="28"/>
+        </w:rPr>
+        <w:t xml:space="preserve">    that falls on Thanksgiving shows the Friday, on the calendar and</w:t>
+      </w:r>
+    </w:p>
+    <w:p>
+      <w:pPr>
+        <w:spacing w:line="276" w:lineRule="auto"/>
+      </w:pPr>
+      <w:r>
+        <w:rPr>
+          <w:rFonts w:ascii="Arial" w:hAnsi="Arial"/>
+          <w:sz w:val="28"/>
+        </w:rPr>
+        <w:t xml:space="preserve">    as the speaking time, once the Thursday time has passed. 438 Mac</w:t>
+      </w:r>
+    </w:p>
+    <w:p>
+      <w:pPr>
+        <w:spacing w:line="276" w:lineRule="auto"/>
+      </w:pPr>
+      <w:r>
+        <w:rPr>
+          <w:rFonts w:ascii="Arial" w:hAnsi="Arial"/>
+          <w:sz w:val="28"/>
+        </w:rPr>
+        <w:t xml:space="preserve">    checks. TypeScript clean. Not on the phone.</w:t>
+      </w:r>
+    </w:p>
+    <w:p>
+      <w:pPr>
+        <w:spacing w:line="276" w:lineRule="auto"/>
+      </w:pPr>
+      <w:r>
+        <w:rPr>
+          <w:rFonts w:ascii="Arial" w:hAnsi="Arial"/>
+          <w:sz w:val="28"/>
+        </w:rPr>
+        <w:t xml:space="preserve"/>
+      </w:r>
+    </w:p>
+    <w:p>
+      <w:pPr>
+        <w:spacing w:line="276" w:lineRule="auto"/>
+      </w:pPr>
+      <w:r>
+        <w:rPr>
+          <w:rFonts w:ascii="Arial" w:hAnsi="Arial"/>
+          <w:sz w:val="28"/>
+        </w:rPr>
+        <w:t xml:space="preserve">165. #119-new — Weekly Done puts the next real speaking time on the</w:t>
+      </w:r>
+    </w:p>
+    <w:p>
+      <w:pPr>
+        <w:spacing w:line="276" w:lineRule="auto"/>
+      </w:pPr>
+      <w:r>
+        <w:rPr>
+          <w:rFonts w:ascii="Arial" w:hAnsi="Arial"/>
+          <w:sz w:val="28"/>
+        </w:rPr>
+        <w:t xml:space="preserve">    phone, holiday move included, and the mark comes off when that</w:t>
+      </w:r>
+    </w:p>
+    <w:p>
+      <w:pPr>
+        <w:spacing w:line="276" w:lineRule="auto"/>
+      </w:pPr>
+      <w:r>
+        <w:rPr>
+          <w:rFonts w:ascii="Arial" w:hAnsi="Arial"/>
+          <w:sz w:val="28"/>
+        </w:rPr>
+        <w:t xml:space="preserve">    time arrives. 436 Mac checks. TypeScript clean. Not on the phone.</w:t>
+      </w:r>
+    </w:p>
+    <w:p>
+      <w:pPr>
+        <w:spacing w:line="276" w:lineRule="auto"/>
+      </w:pPr>
+      <w:r>
+        <w:rPr>
+          <w:rFonts w:ascii="Arial" w:hAnsi="Arial"/>
+          <w:sz w:val="28"/>
+        </w:rPr>
+        <w:t xml:space="preserve"/>
+      </w:r>
+    </w:p>
+    <w:p>
+      <w:pPr>
+        <w:spacing w:line="276" w:lineRule="auto"/>
+      </w:pPr>
+      <w:r>
+        <w:rPr>
+          <w:rFonts w:ascii="Arial" w:hAnsi="Arial"/>
+          <w:sz w:val="28"/>
+        </w:rPr>
         <w:t xml:space="preserve">164. #118-new — Build 97 is on the phone. App Store version 1.0 (72)</w:t>
       </w:r>
     </w:p>
@@ -9102,42 +9306,6 @@
           <w:sz w:val="28"/>
         </w:rPr>
         <w:t xml:space="preserve">1. The dark startup flash (moved here from Parked, #1-new).</w:t>
-      </w:r>
-    </w:p>
-    <w:p>
-      <w:pPr>
-        <w:spacing w:line="276" w:lineRule="auto"/>
-      </w:pPr>
-      <w:r>
-        <w:rPr>
-          <w:rFonts w:ascii="Arial" w:hAnsi="Arial"/>
-          <w:sz w:val="28"/>
-        </w:rPr>
-        <w:t xml:space="preserve">2. HOME BADGE MAKE-ROOM (Patrick, #113-new). While you slide a badge,</w:t>
-      </w:r>
-    </w:p>
-    <w:p>
-      <w:pPr>
-        <w:spacing w:line="276" w:lineRule="auto"/>
-      </w:pPr>
-      <w:r>
-        <w:rPr>
-          <w:rFonts w:ascii="Arial" w:hAnsi="Arial"/>
-          <w:sz w:val="28"/>
-        </w:rPr>
-        <w:t xml:space="preserve">   the others do not make room. They only move when you drop it. The</w:t>
-      </w:r>
-    </w:p>
-    <w:p>
-      <w:pPr>
-        <w:spacing w:line="276" w:lineRule="auto"/>
-      </w:pPr>
-      <w:r>
-        <w:rPr>
-          <w:rFonts w:ascii="Arial" w:hAnsi="Arial"/>
-          <w:sz w:val="28"/>
-        </w:rPr>
-        <w:t xml:space="preserve">   design is that they make room as you slide. To be decided.</w:t>
       </w:r>
     </w:p>
     <w:p>

</xml_diff>

<commit_message>
123 —new - Memory - PENDING 1. A PAGE, SPEC, OR FILE FOR WHAT TESTING HAS COVERED AND    WILL COVER
</commit_message>
<xml_diff>
--- a/docs/pending.docx
+++ b/docs/pending.docx
@@ -24,7 +24,7 @@
           <w:rFonts w:ascii="Arial" w:hAnsi="Arial"/>
           <w:sz w:val="28"/>
         </w:rPr>
-        <w:t xml:space="preserve">Last updated: 2026-10-01 (#121-new)</w:t>
+        <w:t xml:space="preserve">Last updated: 2026-10-02 (#23-new)</w:t>
       </w:r>
     </w:p>
     <w:p>
@@ -325,103 +325,139 @@
           <w:rFonts w:ascii="Arial" w:hAnsi="Arial"/>
           <w:sz w:val="28"/>
         </w:rPr>
-        <w:t xml:space="preserve">1. THE BOTTOM OF EVERY PAGE on your Galaxy stops short of the bottom</w:t>
-      </w:r>
-    </w:p>
-    <w:p>
-      <w:pPr>
-        <w:spacing w:line="276" w:lineRule="auto"/>
-      </w:pPr>
-      <w:r>
-        <w:rPr>
-          <w:rFonts w:ascii="Arial" w:hAnsi="Arial"/>
-          <w:sz w:val="28"/>
-        </w:rPr>
-        <w:t xml:space="preserve">   of the screen. Android uses that bottom. You will debug this in</w:t>
-      </w:r>
-    </w:p>
-    <w:p>
-      <w:pPr>
-        <w:spacing w:line="276" w:lineRule="auto"/>
-      </w:pPr>
-      <w:r>
-        <w:rPr>
-          <w:rFonts w:ascii="Arial" w:hAnsi="Arial"/>
-          <w:sz w:val="28"/>
-        </w:rPr>
-        <w:t xml:space="preserve">   the next session (2026-10-01).</w:t>
-      </w:r>
-    </w:p>
-    <w:p>
-      <w:pPr>
-        <w:spacing w:line="276" w:lineRule="auto"/>
-      </w:pPr>
-      <w:r>
-        <w:rPr>
-          <w:rFonts w:ascii="Arial" w:hAnsi="Arial"/>
-          <w:sz w:val="28"/>
-        </w:rPr>
-        <w:t xml:space="preserve">2. THE PLAY STORE BUILD. The next sitting builds the file Google Play</w:t>
-      </w:r>
-    </w:p>
-    <w:p>
-      <w:pPr>
-        <w:spacing w:line="276" w:lineRule="auto"/>
-      </w:pPr>
-      <w:r>
-        <w:rPr>
-          <w:rFonts w:ascii="Arial" w:hAnsi="Arial"/>
-          <w:sz w:val="28"/>
-        </w:rPr>
-        <w:t xml:space="preserve">   can take. The 110 MB file on this Mac is not that file. Do not</w:t>
-      </w:r>
-    </w:p>
-    <w:p>
-      <w:pPr>
-        <w:spacing w:line="276" w:lineRule="auto"/>
-      </w:pPr>
-      <w:r>
-        <w:rPr>
-          <w:rFonts w:ascii="Arial" w:hAnsi="Arial"/>
-          <w:sz w:val="28"/>
-        </w:rPr>
-        <w:t xml:space="preserve">   build another website download. You know six to nine people with</w:t>
-      </w:r>
-    </w:p>
-    <w:p>
-      <w:pPr>
-        <w:spacing w:line="276" w:lineRule="auto"/>
-      </w:pPr>
-      <w:r>
-        <w:rPr>
-          <w:rFonts w:ascii="Arial" w:hAnsi="Arial"/>
-          <w:sz w:val="28"/>
-        </w:rPr>
-        <w:t xml:space="preserve">   Android devices. You will ask other people to help make up twelve.</w:t>
-      </w:r>
-    </w:p>
-    <w:p>
-      <w:pPr>
-        <w:spacing w:line="276" w:lineRule="auto"/>
-      </w:pPr>
-      <w:r>
-        <w:rPr>
-          <w:rFonts w:ascii="Arial" w:hAnsi="Arial"/>
-          <w:sz w:val="28"/>
-        </w:rPr>
-        <w:t xml:space="preserve">   The public listing waits until twelve have stayed opted in for 14</w:t>
-      </w:r>
-    </w:p>
-    <w:p>
-      <w:pPr>
-        <w:spacing w:line="276" w:lineRule="auto"/>
-      </w:pPr>
-      <w:r>
-        <w:rPr>
-          <w:rFonts w:ascii="Arial" w:hAnsi="Arial"/>
-          <w:sz w:val="28"/>
-        </w:rPr>
-        <w:t xml:space="preserve">   days. The $25 and the ID are not issues (Patrick, 2026-10-01).</w:t>
+        <w:t xml:space="preserve">1. IOS BUILD 100 is Waiting for Review. When Apple approves, you</w:t>
+      </w:r>
+    </w:p>
+    <w:p>
+      <w:pPr>
+        <w:spacing w:line="276" w:lineRule="auto"/>
+      </w:pPr>
+      <w:r>
+        <w:rPr>
+          <w:rFonts w:ascii="Arial" w:hAnsi="Arial"/>
+          <w:sz w:val="28"/>
+        </w:rPr>
+        <w:t xml:space="preserve">   release it yourself. Release is manual (2026-10-01).</w:t>
+      </w:r>
+    </w:p>
+    <w:p>
+      <w:pPr>
+        <w:spacing w:line="276" w:lineRule="auto"/>
+      </w:pPr>
+      <w:r>
+        <w:rPr>
+          <w:rFonts w:ascii="Arial" w:hAnsi="Arial"/>
+          <w:sz w:val="28"/>
+        </w:rPr>
+        <w:t xml:space="preserve">2. THE BOTTOM OF THE GALAXY SCREEN. The phone uses about half an inch</w:t>
+      </w:r>
+    </w:p>
+    <w:p>
+      <w:pPr>
+        <w:spacing w:line="276" w:lineRule="auto"/>
+      </w:pPr>
+      <w:r>
+        <w:rPr>
+          <w:rFonts w:ascii="Arial" w:hAnsi="Arial"/>
+          <w:sz w:val="28"/>
+        </w:rPr>
+        <w:t xml:space="preserve">   at the bottom, and Android stays upright. The project keeps the page</w:t>
+      </w:r>
+    </w:p>
+    <w:p>
+      <w:pPr>
+        <w:spacing w:line="276" w:lineRule="auto"/>
+      </w:pPr>
+      <w:r>
+        <w:rPr>
+          <w:rFonts w:ascii="Arial" w:hAnsi="Arial"/>
+          <w:sz w:val="28"/>
+        </w:rPr>
+        <w:t xml:space="preserve">   body above that strip. The copy on your Galaxy is still the old</w:t>
+      </w:r>
+    </w:p>
+    <w:p>
+      <w:pPr>
+        <w:spacing w:line="276" w:lineRule="auto"/>
+      </w:pPr>
+      <w:r>
+        <w:rPr>
+          <w:rFonts w:ascii="Arial" w:hAnsi="Arial"/>
+          <w:sz w:val="28"/>
+        </w:rPr>
+        <w:t xml:space="preserve">   preview. It changes when a new install file is built (2026-10-01).</w:t>
+      </w:r>
+    </w:p>
+    <w:p>
+      <w:pPr>
+        <w:spacing w:line="276" w:lineRule="auto"/>
+      </w:pPr>
+      <w:r>
+        <w:rPr>
+          <w:rFonts w:ascii="Arial" w:hAnsi="Arial"/>
+          <w:sz w:val="28"/>
+        </w:rPr>
+        <w:t xml:space="preserve">3. THE PLAY ACCOUNT. You submitted it. Google said they would let you</w:t>
+      </w:r>
+    </w:p>
+    <w:p>
+      <w:pPr>
+        <w:spacing w:line="276" w:lineRule="auto"/>
+      </w:pPr>
+      <w:r>
+        <w:rPr>
+          <w:rFonts w:ascii="Arial" w:hAnsi="Arial"/>
+          <w:sz w:val="28"/>
+        </w:rPr>
+        <w:t xml:space="preserve">   know. The store file waits until the account can take the app. The</w:t>
+      </w:r>
+    </w:p>
+    <w:p>
+      <w:pPr>
+        <w:spacing w:line="276" w:lineRule="auto"/>
+      </w:pPr>
+      <w:r>
+        <w:rPr>
+          <w:rFonts w:ascii="Arial" w:hAnsi="Arial"/>
+          <w:sz w:val="28"/>
+        </w:rPr>
+        <w:t xml:space="preserve">   110 MB file on this Mac is not that file (2026-10-01).</w:t>
+      </w:r>
+    </w:p>
+    <w:p>
+      <w:pPr>
+        <w:spacing w:line="276" w:lineRule="auto"/>
+      </w:pPr>
+      <w:r>
+        <w:rPr>
+          <w:rFonts w:ascii="Arial" w:hAnsi="Arial"/>
+          <w:sz w:val="28"/>
+        </w:rPr>
+        <w:t xml:space="preserve">4. THE PRICE ON ANDROID. $9.99 once, no trial. The iPhone listing</w:t>
+      </w:r>
+    </w:p>
+    <w:p>
+      <w:pPr>
+        <w:spacing w:line="276" w:lineRule="auto"/>
+      </w:pPr>
+      <w:r>
+        <w:rPr>
+          <w:rFonts w:ascii="Arial" w:hAnsi="Arial"/>
+          <w:sz w:val="28"/>
+        </w:rPr>
+        <w:t xml:space="preserve">   already has that price. Android waits until the Play account can</w:t>
+      </w:r>
+    </w:p>
+    <w:p>
+      <w:pPr>
+        <w:spacing w:line="276" w:lineRule="auto"/>
+      </w:pPr>
+      <w:r>
+        <w:rPr>
+          <w:rFonts w:ascii="Arial" w:hAnsi="Arial"/>
+          <w:sz w:val="28"/>
+        </w:rPr>
+        <w:t xml:space="preserve">   take the app (#23-new).</w:t>
       </w:r>
     </w:p>
     <w:p>
@@ -1563,55 +1599,31 @@
           <w:rFonts w:ascii="Arial" w:hAnsi="Arial"/>
           <w:sz w:val="28"/>
         </w:rPr>
-        <w:t xml:space="preserve">    kind of road as the iPhone App Store. You know six to nine people</w:t>
-      </w:r>
-    </w:p>
-    <w:p>
-      <w:pPr>
-        <w:spacing w:line="276" w:lineRule="auto"/>
-      </w:pPr>
-      <w:r>
-        <w:rPr>
-          <w:rFonts w:ascii="Arial" w:hAnsi="Arial"/>
-          <w:sz w:val="28"/>
-        </w:rPr>
-        <w:t xml:space="preserve">    with Android devices. You will ask other people to help make up</w:t>
-      </w:r>
-    </w:p>
-    <w:p>
-      <w:pPr>
-        <w:spacing w:line="276" w:lineRule="auto"/>
-      </w:pPr>
-      <w:r>
-        <w:rPr>
-          <w:rFonts w:ascii="Arial" w:hAnsi="Arial"/>
-          <w:sz w:val="28"/>
-        </w:rPr>
-        <w:t xml:space="preserve">    twelve. The public listing waits until twelve have stayed opted</w:t>
-      </w:r>
-    </w:p>
-    <w:p>
-      <w:pPr>
-        <w:spacing w:line="276" w:lineRule="auto"/>
-      </w:pPr>
-      <w:r>
-        <w:rPr>
-          <w:rFonts w:ascii="Arial" w:hAnsi="Arial"/>
-          <w:sz w:val="28"/>
-        </w:rPr>
-        <w:t xml:space="preserve">    in for 14 days. The $25 and the ID are not issues. Fewer than</w:t>
-      </w:r>
-    </w:p>
-    <w:p>
-      <w:pPr>
-        <w:spacing w:line="276" w:lineRule="auto"/>
-      </w:pPr>
-      <w:r>
-        <w:rPr>
-          <w:rFonts w:ascii="Arial" w:hAnsi="Arial"/>
-          <w:sz w:val="28"/>
-        </w:rPr>
-        <w:t xml:space="preserve">    twelve can have the app. Those days do not count.</w:t>
+        <w:t xml:space="preserve">    kind of road as the iPhone App Store. The account was submitted</w:t>
+      </w:r>
+    </w:p>
+    <w:p>
+      <w:pPr>
+        <w:spacing w:line="276" w:lineRule="auto"/>
+      </w:pPr>
+      <w:r>
+        <w:rPr>
+          <w:rFonts w:ascii="Arial" w:hAnsi="Arial"/>
+          <w:sz w:val="28"/>
+        </w:rPr>
+        <w:t xml:space="preserve">    on 2026-10-01. Google said they would let you know. Do not raise</w:t>
+      </w:r>
+    </w:p>
+    <w:p>
+      <w:pPr>
+        <w:spacing w:line="276" w:lineRule="auto"/>
+      </w:pPr>
+      <w:r>
+        <w:rPr>
+          <w:rFonts w:ascii="Arial" w:hAnsi="Arial"/>
+          <w:sz w:val="28"/>
+        </w:rPr>
+        <w:t xml:space="preserve">    the closed-test count (Patrick, #122-new).</w:t>
       </w:r>
     </w:p>
     <w:p>
@@ -1635,67 +1647,19 @@
           <w:rFonts w:ascii="Arial" w:hAnsi="Arial"/>
           <w:sz w:val="28"/>
         </w:rPr>
-        <w:t xml:space="preserve">    charge. A personal Play account opened after November 13, 2023,</w:t>
-      </w:r>
-    </w:p>
-    <w:p>
-      <w:pPr>
-        <w:spacing w:line="276" w:lineRule="auto"/>
-      </w:pPr>
-      <w:r>
-        <w:rPr>
-          <w:rFonts w:ascii="Arial" w:hAnsi="Arial"/>
-          <w:sz w:val="28"/>
-        </w:rPr>
-        <w:t xml:space="preserve">    needs 12 people opted in for 14 days, then an application. Each</w:t>
-      </w:r>
-    </w:p>
-    <w:p>
-      <w:pPr>
-        <w:spacing w:line="276" w:lineRule="auto"/>
-      </w:pPr>
-      <w:r>
-        <w:rPr>
-          <w:rFonts w:ascii="Arial" w:hAnsi="Arial"/>
-          <w:sz w:val="28"/>
-        </w:rPr>
-        <w:t xml:space="preserve">    of the twelve joins through Google Play, and the app is installed</w:t>
-      </w:r>
-    </w:p>
-    <w:p>
-      <w:pPr>
-        <w:spacing w:line="276" w:lineRule="auto"/>
-      </w:pPr>
-      <w:r>
-        <w:rPr>
-          <w:rFonts w:ascii="Arial" w:hAnsi="Arial"/>
-          <w:sz w:val="28"/>
-        </w:rPr>
-        <w:t xml:space="preserve">    on an Android device. It does not have to be a phone. An iPhone</w:t>
-      </w:r>
-    </w:p>
-    <w:p>
-      <w:pPr>
-        <w:spacing w:line="276" w:lineRule="auto"/>
-      </w:pPr>
-      <w:r>
-        <w:rPr>
-          <w:rFonts w:ascii="Arial" w:hAnsi="Arial"/>
-          <w:sz w:val="28"/>
-        </w:rPr>
-        <w:t xml:space="preserve">    cannot take the test. Sellers were asking about $9 to about $40,</w:t>
-      </w:r>
-    </w:p>
-    <w:p>
-      <w:pPr>
-        <w:spacing w:line="276" w:lineRule="auto"/>
-      </w:pPr>
-      <w:r>
-        <w:rPr>
-          <w:rFonts w:ascii="Arial" w:hAnsi="Arial"/>
-          <w:sz w:val="28"/>
-        </w:rPr>
-        <w:t xml:space="preserve">    once, to supply the twelve. Asking people you know costs nothing.</w:t>
+        <w:t xml:space="preserve">    charge. The account check is what is in progress. Do not raise</w:t>
+      </w:r>
+    </w:p>
+    <w:p>
+      <w:pPr>
+        <w:spacing w:line="276" w:lineRule="auto"/>
+      </w:pPr>
+      <w:r>
+        <w:rPr>
+          <w:rFonts w:ascii="Arial" w:hAnsi="Arial"/>
+          <w:sz w:val="28"/>
+        </w:rPr>
+        <w:t xml:space="preserve">    the closed-test count (Patrick, #122-new).</w:t>
       </w:r>
     </w:p>
     <w:p>
@@ -1767,6 +1731,66 @@
           <w:rFonts w:ascii="Arial" w:hAnsi="Arial"/>
           <w:sz w:val="28"/>
         </w:rPr>
+        <w:t xml:space="preserve">23. THE APP IS $9.99 ONCE (Patrick, #23-new). The same on the iPhone</w:t>
+      </w:r>
+    </w:p>
+    <w:p>
+      <w:pPr>
+        <w:spacing w:line="276" w:lineRule="auto"/>
+      </w:pPr>
+      <w:r>
+        <w:rPr>
+          <w:rFonts w:ascii="Arial" w:hAnsi="Arial"/>
+          <w:sz w:val="28"/>
+        </w:rPr>
+        <w:t xml:space="preserve">    and on Android. There is no trial. The iPhone listing has that</w:t>
+      </w:r>
+    </w:p>
+    <w:p>
+      <w:pPr>
+        <w:spacing w:line="276" w:lineRule="auto"/>
+      </w:pPr>
+      <w:r>
+        <w:rPr>
+          <w:rFonts w:ascii="Arial" w:hAnsi="Arial"/>
+          <w:sz w:val="28"/>
+        </w:rPr>
+        <w:t xml:space="preserve">    price. The Paid Apps Agreement, the bank, and the W-9 are Active.</w:t>
+      </w:r>
+    </w:p>
+    <w:p>
+      <w:pPr>
+        <w:spacing w:line="276" w:lineRule="auto"/>
+      </w:pPr>
+      <w:r>
+        <w:rPr>
+          <w:rFonts w:ascii="Arial" w:hAnsi="Arial"/>
+          <w:sz w:val="28"/>
+        </w:rPr>
+        <w:t xml:space="preserve">24. DO NOT FILE A TRADEMARK ON THE NAME (Patrick, #23-new). Use it.</w:t>
+      </w:r>
+    </w:p>
+    <w:p>
+      <w:pPr>
+        <w:spacing w:line="276" w:lineRule="auto"/>
+      </w:pPr>
+      <w:r>
+        <w:rPr>
+          <w:rFonts w:ascii="Arial" w:hAnsi="Arial"/>
+          <w:sz w:val="28"/>
+        </w:rPr>
+        <w:t xml:space="preserve">    The copyright line is your name and the year.</w:t>
+      </w:r>
+    </w:p>
+    <w:p>
+      <w:pPr>
+        <w:spacing w:line="276" w:lineRule="auto"/>
+      </w:pPr>
+      <w:r>
+        <w:rPr>
+          <w:rFonts w:ascii="Arial" w:hAnsi="Arial"/>
+          <w:sz w:val="28"/>
+        </w:rPr>
         <w:t xml:space="preserve"/>
       </w:r>
     </w:p>
@@ -1853,6 +1877,42 @@
           <w:sz w:val="28"/>
         </w:rPr>
         <w:t xml:space="preserve">docs/handoff-history.md.</w:t>
+      </w:r>
+    </w:p>
+    <w:p>
+      <w:pPr>
+        <w:spacing w:line="276" w:lineRule="auto"/>
+      </w:pPr>
+      <w:r>
+        <w:rPr>
+          <w:rFonts w:ascii="Arial" w:hAnsi="Arial"/>
+          <w:sz w:val="28"/>
+        </w:rPr>
+        <w:t xml:space="preserve"/>
+      </w:r>
+    </w:p>
+    <w:p>
+      <w:pPr>
+        <w:spacing w:line="276" w:lineRule="auto"/>
+      </w:pPr>
+      <w:r>
+        <w:rPr>
+          <w:rFonts w:ascii="Arial" w:hAnsi="Arial"/>
+          <w:sz w:val="28"/>
+        </w:rPr>
+        <w:t xml:space="preserve">175. #23-new — The iPhone listing is $9.99. No trial. No trademark</w:t>
+      </w:r>
+    </w:p>
+    <w:p>
+      <w:pPr>
+        <w:spacing w:line="276" w:lineRule="auto"/>
+      </w:pPr>
+      <w:r>
+        <w:rPr>
+          <w:rFonts w:ascii="Arial" w:hAnsi="Arial"/>
+          <w:sz w:val="28"/>
+        </w:rPr>
+        <w:t xml:space="preserve">    filing.</w:t>
       </w:r>
     </w:p>
     <w:p>

</xml_diff>

<commit_message>
127.3 —new - Memory - UHome page arrangement backedup.
</commit_message>
<xml_diff>
--- a/docs/pending.docx
+++ b/docs/pending.docx
@@ -24,7 +24,7 @@
           <w:rFonts w:ascii="Arial" w:hAnsi="Arial"/>
           <w:sz w:val="28"/>
         </w:rPr>
-        <w:t xml:space="preserve">Last updated: 2026-10-02 (#23-new)</w:t>
+        <w:t xml:space="preserve">Last updated: 2026-10-06</w:t>
       </w:r>
     </w:p>
     <w:p>
@@ -325,7 +325,127 @@
           <w:rFonts w:ascii="Arial" w:hAnsi="Arial"/>
           <w:sz w:val="28"/>
         </w:rPr>
-        <w:t xml:space="preserve">1. IOS BUILD 100 is Waiting for Review. When Apple approves, you</w:t>
+        <w:t xml:space="preserve">1. PHONE PROOF FOR DONE'S ONE-DAY CHECK. Weekly, Monthly, Quarterly,</w:t>
+      </w:r>
+    </w:p>
+    <w:p>
+      <w:pPr>
+        <w:spacing w:line="276" w:lineRule="auto"/>
+      </w:pPr>
+      <w:r>
+        <w:rPr>
+          <w:rFonts w:ascii="Arial" w:hAnsi="Arial"/>
+          <w:sz w:val="28"/>
+        </w:rPr>
+        <w:t xml:space="preserve">   Yearly, Birthdays, and One Time should show the check that day only.</w:t>
+      </w:r>
+    </w:p>
+    <w:p>
+      <w:pPr>
+        <w:spacing w:line="276" w:lineRule="auto"/>
+      </w:pPr>
+      <w:r>
+        <w:rPr>
+          <w:rFonts w:ascii="Arial" w:hAnsi="Arial"/>
+          <w:sz w:val="28"/>
+        </w:rPr>
+        <w:t xml:space="preserve">   The next morning the row is the next time, with no check. Weekly</w:t>
+      </w:r>
+    </w:p>
+    <w:p>
+      <w:pPr>
+        <w:spacing w:line="276" w:lineRule="auto"/>
+      </w:pPr>
+      <w:r>
+        <w:rPr>
+          <w:rFonts w:ascii="Arial" w:hAnsi="Arial"/>
+          <w:sz w:val="28"/>
+        </w:rPr>
+        <w:t xml:space="preserve">   must not fire again this week. A second tap that same day still</w:t>
+      </w:r>
+    </w:p>
+    <w:p>
+      <w:pPr>
+        <w:spacing w:line="276" w:lineRule="auto"/>
+      </w:pPr>
+      <w:r>
+        <w:rPr>
+          <w:rFonts w:ascii="Arial" w:hAnsi="Arial"/>
+          <w:sz w:val="28"/>
+        </w:rPr>
+        <w:t xml:space="preserve">   takes the check off. Build 110 is already on the iPhone for the</w:t>
+      </w:r>
+    </w:p>
+    <w:p>
+      <w:pPr>
+        <w:spacing w:line="276" w:lineRule="auto"/>
+      </w:pPr>
+      <w:r>
+        <w:rPr>
+          <w:rFonts w:ascii="Arial" w:hAnsi="Arial"/>
+          <w:sz w:val="28"/>
+        </w:rPr>
+        <w:t xml:space="preserve">   Snooze minutes and list reorder. The User's Guide now matches that</w:t>
+      </w:r>
+    </w:p>
+    <w:p>
+      <w:pPr>
+        <w:spacing w:line="276" w:lineRule="auto"/>
+      </w:pPr>
+      <w:r>
+        <w:rPr>
+          <w:rFonts w:ascii="Arial" w:hAnsi="Arial"/>
+          <w:sz w:val="28"/>
+        </w:rPr>
+        <w:t xml:space="preserve">   work, including the 1-through-14 minutes on the list only. That copy</w:t>
+      </w:r>
+    </w:p>
+    <w:p>
+      <w:pPr>
+        <w:spacing w:line="276" w:lineRule="auto"/>
+      </w:pPr>
+      <w:r>
+        <w:rPr>
+          <w:rFonts w:ascii="Arial" w:hAnsi="Arial"/>
+          <w:sz w:val="28"/>
+        </w:rPr>
+        <w:t xml:space="preserve">   is not on the phone. The saved-list read warning also remains to be</w:t>
+      </w:r>
+    </w:p>
+    <w:p>
+      <w:pPr>
+        <w:spacing w:line="276" w:lineRule="auto"/>
+      </w:pPr>
+      <w:r>
+        <w:rPr>
+          <w:rFonts w:ascii="Arial" w:hAnsi="Arial"/>
+          <w:sz w:val="28"/>
+        </w:rPr>
+        <w:t xml:space="preserve">   proved, and it stays out of the Guide. The full state is in</w:t>
+      </w:r>
+    </w:p>
+    <w:p>
+      <w:pPr>
+        <w:spacing w:line="276" w:lineRule="auto"/>
+      </w:pPr>
+      <w:r>
+        <w:rPr>
+          <w:rFonts w:ascii="Arial" w:hAnsi="Arial"/>
+          <w:sz w:val="28"/>
+        </w:rPr>
+        <w:t xml:space="preserve">   docs/in-flight.md.</w:t>
+      </w:r>
+    </w:p>
+    <w:p>
+      <w:pPr>
+        <w:spacing w:line="276" w:lineRule="auto"/>
+      </w:pPr>
+      <w:r>
+        <w:rPr>
+          <w:rFonts w:ascii="Arial" w:hAnsi="Arial"/>
+          <w:sz w:val="28"/>
+        </w:rPr>
+        <w:t xml:space="preserve">2. IOS BUILD 100 is Waiting for Review. When Apple approves, you</w:t>
       </w:r>
     </w:p>
     <w:p>
@@ -349,7 +469,7 @@
           <w:rFonts w:ascii="Arial" w:hAnsi="Arial"/>
           <w:sz w:val="28"/>
         </w:rPr>
-        <w:t xml:space="preserve">2. THE BOTTOM OF THE GALAXY SCREEN. The phone uses about half an inch</w:t>
+        <w:t xml:space="preserve">3. THE BOTTOM OF THE GALAXY SCREEN. The phone uses about half an inch</w:t>
       </w:r>
     </w:p>
     <w:p>
@@ -397,43 +517,79 @@
           <w:rFonts w:ascii="Arial" w:hAnsi="Arial"/>
           <w:sz w:val="28"/>
         </w:rPr>
-        <w:t xml:space="preserve">3. THE PLAY ACCOUNT. You submitted it. Google said they would let you</w:t>
-      </w:r>
-    </w:p>
-    <w:p>
-      <w:pPr>
-        <w:spacing w:line="276" w:lineRule="auto"/>
-      </w:pPr>
-      <w:r>
-        <w:rPr>
-          <w:rFonts w:ascii="Arial" w:hAnsi="Arial"/>
-          <w:sz w:val="28"/>
-        </w:rPr>
-        <w:t xml:space="preserve">   know. The store file waits until the account can take the app. The</w:t>
-      </w:r>
-    </w:p>
-    <w:p>
-      <w:pPr>
-        <w:spacing w:line="276" w:lineRule="auto"/>
-      </w:pPr>
-      <w:r>
-        <w:rPr>
-          <w:rFonts w:ascii="Arial" w:hAnsi="Arial"/>
-          <w:sz w:val="28"/>
-        </w:rPr>
-        <w:t xml:space="preserve">   110 MB file on this Mac is not that file (2026-10-01).</w:t>
-      </w:r>
-    </w:p>
-    <w:p>
-      <w:pPr>
-        <w:spacing w:line="276" w:lineRule="auto"/>
-      </w:pPr>
-      <w:r>
-        <w:rPr>
-          <w:rFonts w:ascii="Arial" w:hAnsi="Arial"/>
-          <w:sz w:val="28"/>
-        </w:rPr>
-        <w:t xml:space="preserve">4. THE PRICE ON ANDROID. $9.99 once, no trial. The iPhone listing</w:t>
+        <w:t xml:space="preserve">4. THE PLAY ACCOUNT. You submitted it. Google has not opened it.</w:t>
+      </w:r>
+    </w:p>
+    <w:p>
+      <w:pPr>
+        <w:spacing w:line="276" w:lineRule="auto"/>
+      </w:pPr>
+      <w:r>
+        <w:rPr>
+          <w:rFonts w:ascii="Arial" w:hAnsi="Arial"/>
+          <w:sz w:val="28"/>
+        </w:rPr>
+        <w:t xml:space="preserve">   The file is Android only, and it is not sent to Play until the</w:t>
+      </w:r>
+    </w:p>
+    <w:p>
+      <w:pPr>
+        <w:spacing w:line="276" w:lineRule="auto"/>
+      </w:pPr>
+      <w:r>
+        <w:rPr>
+          <w:rFonts w:ascii="Arial" w:hAnsi="Arial"/>
+          <w:sz w:val="28"/>
+        </w:rPr>
+        <w:t xml:space="preserve">   account can take the app. The Android count on Expo went from 1</w:t>
+      </w:r>
+    </w:p>
+    <w:p>
+      <w:pPr>
+        <w:spacing w:line="276" w:lineRule="auto"/>
+      </w:pPr>
+      <w:r>
+        <w:rPr>
+          <w:rFonts w:ascii="Arial" w:hAnsi="Arial"/>
+          <w:sz w:val="28"/>
+        </w:rPr>
+        <w:t xml:space="preserve">   to 2. The build page is on expo.dev under molliedog,</w:t>
+      </w:r>
+    </w:p>
+    <w:p>
+      <w:pPr>
+        <w:spacing w:line="276" w:lineRule="auto"/>
+      </w:pPr>
+      <w:r>
+        <w:rPr>
+          <w:rFonts w:ascii="Arial" w:hAnsi="Arial"/>
+          <w:sz w:val="28"/>
+        </w:rPr>
+        <w:t xml:space="preserve">   ElderlyAssistant, build 7d816ec8 (Patrick, #124-new). The 110 MB</w:t>
+      </w:r>
+    </w:p>
+    <w:p>
+      <w:pPr>
+        <w:spacing w:line="276" w:lineRule="auto"/>
+      </w:pPr>
+      <w:r>
+        <w:rPr>
+          <w:rFonts w:ascii="Arial" w:hAnsi="Arial"/>
+          <w:sz w:val="28"/>
+        </w:rPr>
+        <w:t xml:space="preserve">   file on this Mac is not that file.</w:t>
+      </w:r>
+    </w:p>
+    <w:p>
+      <w:pPr>
+        <w:spacing w:line="276" w:lineRule="auto"/>
+      </w:pPr>
+      <w:r>
+        <w:rPr>
+          <w:rFonts w:ascii="Arial" w:hAnsi="Arial"/>
+          <w:sz w:val="28"/>
+        </w:rPr>
+        <w:t xml:space="preserve">5. THE PRICE ON ANDROID. $9.99 once, no trial. The iPhone listing</w:t>
       </w:r>
     </w:p>
     <w:p>
@@ -457,7 +613,7 @@
           <w:rFonts w:ascii="Arial" w:hAnsi="Arial"/>
           <w:sz w:val="28"/>
         </w:rPr>
-        <w:t xml:space="preserve">   take the app (#23-new).</w:t>
+        <w:t xml:space="preserve">   take the app (#123-new).</w:t>
       </w:r>
     </w:p>
     <w:p>
@@ -542,31 +698,7 @@
           <w:rFonts w:ascii="Arial" w:hAnsi="Arial"/>
           <w:sz w:val="28"/>
         </w:rPr>
-        <w:t xml:space="preserve">1. A PAGE, SPEC, OR FILE FOR WHAT TESTING HAS COVERED AND</w:t>
-      </w:r>
-    </w:p>
-    <w:p>
-      <w:pPr>
-        <w:spacing w:line="276" w:lineRule="auto"/>
-      </w:pPr>
-      <w:r>
-        <w:rPr>
-          <w:rFonts w:ascii="Arial" w:hAnsi="Arial"/>
-          <w:sz w:val="28"/>
-        </w:rPr>
-        <w:t xml:space="preserve">   WILL COVER (Patrick, #52-new). The during-build tests are</w:t>
-      </w:r>
-    </w:p>
-    <w:p>
-      <w:pPr>
-        <w:spacing w:line="276" w:lineRule="auto"/>
-      </w:pPr>
-      <w:r>
-        <w:rPr>
-          <w:rFonts w:ascii="Arial" w:hAnsi="Arial"/>
-          <w:sz w:val="28"/>
-        </w:rPr>
-        <w:t xml:space="preserve">   thrown away. The run is not kept.</w:t>
+        <w:t xml:space="preserve">Nothing is waiting under this heading.</w:t>
       </w:r>
     </w:p>
     <w:p>
@@ -1731,7 +1863,7 @@
           <w:rFonts w:ascii="Arial" w:hAnsi="Arial"/>
           <w:sz w:val="28"/>
         </w:rPr>
-        <w:t xml:space="preserve">23. THE APP IS $9.99 ONCE (Patrick, #23-new). The same on the iPhone</w:t>
+        <w:t xml:space="preserve">23. THE APP IS $9.99 ONCE (Patrick, #123-new). The same on the iPhone</w:t>
       </w:r>
     </w:p>
     <w:p>
@@ -1767,7 +1899,7 @@
           <w:rFonts w:ascii="Arial" w:hAnsi="Arial"/>
           <w:sz w:val="28"/>
         </w:rPr>
-        <w:t xml:space="preserve">24. DO NOT FILE A TRADEMARK ON THE NAME (Patrick, #23-new). Use it.</w:t>
+        <w:t xml:space="preserve">24. DO NOT FILE A TRADEMARK ON THE NAME (Patrick, #123-new). Use it.</w:t>
       </w:r>
     </w:p>
     <w:p>
@@ -1791,6 +1923,102 @@
           <w:rFonts w:ascii="Arial" w:hAnsi="Arial"/>
           <w:sz w:val="28"/>
         </w:rPr>
+        <w:t xml:space="preserve">25. DO NOT TAKE UP XCODE CLOUD (Patrick, #123-new). Stay with the Expo</w:t>
+      </w:r>
+    </w:p>
+    <w:p>
+      <w:pPr>
+        <w:spacing w:line="276" w:lineRule="auto"/>
+      </w:pPr>
+      <w:r>
+        <w:rPr>
+          <w:rFonts w:ascii="Arial" w:hAnsi="Arial"/>
+          <w:sz w:val="28"/>
+        </w:rPr>
+        <w:t xml:space="preserve">    build steps.</w:t>
+      </w:r>
+    </w:p>
+    <w:p>
+      <w:pPr>
+        <w:spacing w:line="276" w:lineRule="auto"/>
+      </w:pPr>
+      <w:r>
+        <w:rPr>
+          <w:rFonts w:ascii="Arial" w:hAnsi="Arial"/>
+          <w:sz w:val="28"/>
+        </w:rPr>
+        <w:t xml:space="preserve">26. DONE'S CHECK LASTS THAT DAY ONLY (Patrick, #127-new). Weekly,</w:t>
+      </w:r>
+    </w:p>
+    <w:p>
+      <w:pPr>
+        <w:spacing w:line="276" w:lineRule="auto"/>
+      </w:pPr>
+      <w:r>
+        <w:rPr>
+          <w:rFonts w:ascii="Arial" w:hAnsi="Arial"/>
+          <w:sz w:val="28"/>
+        </w:rPr>
+        <w:t xml:space="preserve">    Monthly, Quarterly, Yearly, Birthdays, and One Time. The morning</w:t>
+      </w:r>
+    </w:p>
+    <w:p>
+      <w:pPr>
+        <w:spacing w:line="276" w:lineRule="auto"/>
+      </w:pPr>
+      <w:r>
+        <w:rPr>
+          <w:rFonts w:ascii="Arial" w:hAnsi="Arial"/>
+          <w:sz w:val="28"/>
+        </w:rPr>
+        <w:t xml:space="preserve">    takes it off. Weekly still spends this week until the next</w:t>
+      </w:r>
+    </w:p>
+    <w:p>
+      <w:pPr>
+        <w:spacing w:line="276" w:lineRule="auto"/>
+      </w:pPr>
+      <w:r>
+        <w:rPr>
+          <w:rFonts w:ascii="Arial" w:hAnsi="Arial"/>
+          <w:sz w:val="28"/>
+        </w:rPr>
+        <w:t xml:space="preserve">    speaking time, so it does not fire again after the check is gone.</w:t>
+      </w:r>
+    </w:p>
+    <w:p>
+      <w:pPr>
+        <w:spacing w:line="276" w:lineRule="auto"/>
+      </w:pPr>
+      <w:r>
+        <w:rPr>
+          <w:rFonts w:ascii="Arial" w:hAnsi="Arial"/>
+          <w:sz w:val="28"/>
+        </w:rPr>
+        <w:t xml:space="preserve">    Appointments and Bucket List stay finished. Daily already worked</w:t>
+      </w:r>
+    </w:p>
+    <w:p>
+      <w:pPr>
+        <w:spacing w:line="276" w:lineRule="auto"/>
+      </w:pPr>
+      <w:r>
+        <w:rPr>
+          <w:rFonts w:ascii="Arial" w:hAnsi="Arial"/>
+          <w:sz w:val="28"/>
+        </w:rPr>
+        <w:t xml:space="preserve">    this way. In the machine, not a display patch.</w:t>
+      </w:r>
+    </w:p>
+    <w:p>
+      <w:pPr>
+        <w:spacing w:line="276" w:lineRule="auto"/>
+      </w:pPr>
+      <w:r>
+        <w:rPr>
+          <w:rFonts w:ascii="Arial" w:hAnsi="Arial"/>
+          <w:sz w:val="28"/>
+        </w:rPr>
         <w:t xml:space="preserve"/>
       </w:r>
     </w:p>
@@ -1900,7 +2128,739 @@
           <w:rFonts w:ascii="Arial" w:hAnsi="Arial"/>
           <w:sz w:val="28"/>
         </w:rPr>
-        <w:t xml:space="preserve">175. #23-new — The iPhone listing is $9.99. No trial. No trademark</w:t>
+        <w:t xml:space="preserve">185. 2026-10-06 — The home arrangement is the home page's own</w:t>
+      </w:r>
+    </w:p>
+    <w:p>
+      <w:pPr>
+        <w:spacing w:line="276" w:lineRule="auto"/>
+      </w:pPr>
+      <w:r>
+        <w:rPr>
+          <w:rFonts w:ascii="Arial" w:hAnsi="Arial"/>
+          <w:sz w:val="28"/>
+        </w:rPr>
+        <w:t xml:space="preserve">    order, not a Setting. Export asks the home page for it.</w:t>
+      </w:r>
+    </w:p>
+    <w:p>
+      <w:pPr>
+        <w:spacing w:line="276" w:lineRule="auto"/>
+      </w:pPr>
+      <w:r>
+        <w:rPr>
+          <w:rFonts w:ascii="Arial" w:hAnsi="Arial"/>
+          <w:sz w:val="28"/>
+        </w:rPr>
+        <w:t xml:space="preserve">    Replace writes it back. Merge leaves it. A backup made before</w:t>
+      </w:r>
+    </w:p>
+    <w:p>
+      <w:pPr>
+        <w:spacing w:line="276" w:lineRule="auto"/>
+      </w:pPr>
+      <w:r>
+        <w:rPr>
+          <w:rFonts w:ascii="Arial" w:hAnsi="Arial"/>
+          <w:sz w:val="28"/>
+        </w:rPr>
+        <w:t xml:space="preserve">    this does not contain it, and it still loads. Not on the phone.</w:t>
+      </w:r>
+    </w:p>
+    <w:p>
+      <w:pPr>
+        <w:spacing w:line="276" w:lineRule="auto"/>
+      </w:pPr>
+      <w:r>
+        <w:rPr>
+          <w:rFonts w:ascii="Arial" w:hAnsi="Arial"/>
+          <w:sz w:val="28"/>
+        </w:rPr>
+        <w:t xml:space="preserve"/>
+      </w:r>
+    </w:p>
+    <w:p>
+      <w:pPr>
+        <w:spacing w:line="276" w:lineRule="auto"/>
+      </w:pPr>
+      <w:r>
+        <w:rPr>
+          <w:rFonts w:ascii="Arial" w:hAnsi="Arial"/>
+          <w:sz w:val="28"/>
+        </w:rPr>
+        <w:t xml:space="preserve">184. #127-new — The User's Guide now has Daily's 1-through-14 minute</w:t>
+      </w:r>
+    </w:p>
+    <w:p>
+      <w:pPr>
+        <w:spacing w:line="276" w:lineRule="auto"/>
+      </w:pPr>
+      <w:r>
+        <w:rPr>
+          <w:rFonts w:ascii="Arial" w:hAnsi="Arial"/>
+          <w:sz w:val="28"/>
+        </w:rPr>
+        <w:t xml:space="preserve">    Snooze on the list only, not on the banners; One Time only on the</w:t>
+      </w:r>
+    </w:p>
+    <w:p>
+      <w:pPr>
+        <w:spacing w:line="276" w:lineRule="auto"/>
+      </w:pPr>
+      <w:r>
+        <w:rPr>
+          <w:rFonts w:ascii="Arial" w:hAnsi="Arial"/>
+          <w:sz w:val="28"/>
+        </w:rPr>
+        <w:t xml:space="preserve">    Daily row; the backup question after a new Save; and holding a row</w:t>
+      </w:r>
+    </w:p>
+    <w:p>
+      <w:pPr>
+        <w:spacing w:line="276" w:lineRule="auto"/>
+      </w:pPr>
+      <w:r>
+        <w:rPr>
+          <w:rFonts w:ascii="Arial" w:hAnsi="Arial"/>
+          <w:sz w:val="28"/>
+        </w:rPr>
+        <w:t xml:space="preserve">    to slide it. The read-failure warning stays out of the Guide. The</w:t>
+      </w:r>
+    </w:p>
+    <w:p>
+      <w:pPr>
+        <w:spacing w:line="276" w:lineRule="auto"/>
+      </w:pPr>
+      <w:r>
+        <w:rPr>
+          <w:rFonts w:ascii="Arial" w:hAnsi="Arial"/>
+          <w:sz w:val="28"/>
+        </w:rPr>
+        <w:t xml:space="preserve">    working document and the in-app copy agree. Not on the phone.</w:t>
+      </w:r>
+    </w:p>
+    <w:p>
+      <w:pPr>
+        <w:spacing w:line="276" w:lineRule="auto"/>
+      </w:pPr>
+      <w:r>
+        <w:rPr>
+          <w:rFonts w:ascii="Arial" w:hAnsi="Arial"/>
+          <w:sz w:val="28"/>
+        </w:rPr>
+        <w:t xml:space="preserve"/>
+      </w:r>
+    </w:p>
+    <w:p>
+      <w:pPr>
+        <w:spacing w:line="276" w:lineRule="auto"/>
+      </w:pPr>
+      <w:r>
+        <w:rPr>
+          <w:rFonts w:ascii="Arial" w:hAnsi="Arial"/>
+          <w:sz w:val="28"/>
+        </w:rPr>
+        <w:t xml:space="preserve">183. #127-new — The User's Guide now says the dated tick lasts that</w:t>
+      </w:r>
+    </w:p>
+    <w:p>
+      <w:pPr>
+        <w:spacing w:line="276" w:lineRule="auto"/>
+      </w:pPr>
+      <w:r>
+        <w:rPr>
+          <w:rFonts w:ascii="Arial" w:hAnsi="Arial"/>
+          <w:sz w:val="28"/>
+        </w:rPr>
+        <w:t xml:space="preserve">    day only, and that Weekly will not remind you again this week.</w:t>
+      </w:r>
+    </w:p>
+    <w:p>
+      <w:pPr>
+        <w:spacing w:line="276" w:lineRule="auto"/>
+      </w:pPr>
+      <w:r>
+        <w:rPr>
+          <w:rFonts w:ascii="Arial" w:hAnsi="Arial"/>
+          <w:sz w:val="28"/>
+        </w:rPr>
+        <w:t xml:space="preserve">    The working document and the in-app copy agree. Not on the phone.</w:t>
+      </w:r>
+    </w:p>
+    <w:p>
+      <w:pPr>
+        <w:spacing w:line="276" w:lineRule="auto"/>
+      </w:pPr>
+      <w:r>
+        <w:rPr>
+          <w:rFonts w:ascii="Arial" w:hAnsi="Arial"/>
+          <w:sz w:val="28"/>
+        </w:rPr>
+        <w:t xml:space="preserve"/>
+      </w:r>
+    </w:p>
+    <w:p>
+      <w:pPr>
+        <w:spacing w:line="276" w:lineRule="auto"/>
+      </w:pPr>
+      <w:r>
+        <w:rPr>
+          <w:rFonts w:ascii="Arial" w:hAnsi="Arial"/>
+          <w:sz w:val="28"/>
+        </w:rPr>
+        <w:t xml:space="preserve">182. #127-new — Done's check on Weekly, Monthly, Quarterly, Yearly,</w:t>
+      </w:r>
+    </w:p>
+    <w:p>
+      <w:pPr>
+        <w:spacing w:line="276" w:lineRule="auto"/>
+      </w:pPr>
+      <w:r>
+        <w:rPr>
+          <w:rFonts w:ascii="Arial" w:hAnsi="Arial"/>
+          <w:sz w:val="28"/>
+        </w:rPr>
+        <w:t xml:space="preserve">    Birthdays, and One Time lasts that day only. Weekly still spends</w:t>
+      </w:r>
+    </w:p>
+    <w:p>
+      <w:pPr>
+        <w:spacing w:line="276" w:lineRule="auto"/>
+      </w:pPr>
+      <w:r>
+        <w:rPr>
+          <w:rFonts w:ascii="Arial" w:hAnsi="Arial"/>
+          <w:sz w:val="28"/>
+        </w:rPr>
+        <w:t xml:space="preserve">    this week until the next speaking time. Appointments and Bucket</w:t>
+      </w:r>
+    </w:p>
+    <w:p>
+      <w:pPr>
+        <w:spacing w:line="276" w:lineRule="auto"/>
+      </w:pPr>
+      <w:r>
+        <w:rPr>
+          <w:rFonts w:ascii="Arial" w:hAnsi="Arial"/>
+          <w:sz w:val="28"/>
+        </w:rPr>
+        <w:t xml:space="preserve">    List stay finished. In the machine, not a display patch. Not on</w:t>
+      </w:r>
+    </w:p>
+    <w:p>
+      <w:pPr>
+        <w:spacing w:line="276" w:lineRule="auto"/>
+      </w:pPr>
+      <w:r>
+        <w:rPr>
+          <w:rFonts w:ascii="Arial" w:hAnsi="Arial"/>
+          <w:sz w:val="28"/>
+        </w:rPr>
+        <w:t xml:space="preserve">    the phone. 445 Mac checks pass and TypeScript is clean.</w:t>
+      </w:r>
+    </w:p>
+    <w:p>
+      <w:pPr>
+        <w:spacing w:line="276" w:lineRule="auto"/>
+      </w:pPr>
+      <w:r>
+        <w:rPr>
+          <w:rFonts w:ascii="Arial" w:hAnsi="Arial"/>
+          <w:sz w:val="28"/>
+        </w:rPr>
+        <w:t xml:space="preserve"/>
+      </w:r>
+    </w:p>
+    <w:p>
+      <w:pPr>
+        <w:spacing w:line="276" w:lineRule="auto"/>
+      </w:pPr>
+      <w:r>
+        <w:rPr>
+          <w:rFonts w:ascii="Arial" w:hAnsi="Arial"/>
+          <w:sz w:val="28"/>
+        </w:rPr>
+        <w:t xml:space="preserve">181. #127-new — Build 110 is on the iPhone and works. Daily Snooze</w:t>
+      </w:r>
+    </w:p>
+    <w:p>
+      <w:pPr>
+        <w:spacing w:line="276" w:lineRule="auto"/>
+      </w:pPr>
+      <w:r>
+        <w:rPr>
+          <w:rFonts w:ascii="Arial" w:hAnsi="Arial"/>
+          <w:sz w:val="28"/>
+        </w:rPr>
+        <w:t xml:space="preserve">    minutes match the other wheels. List neighbors make room while a</w:t>
+      </w:r>
+    </w:p>
+    <w:p>
+      <w:pPr>
+        <w:spacing w:line="276" w:lineRule="auto"/>
+      </w:pPr>
+      <w:r>
+        <w:rPr>
+          <w:rFonts w:ascii="Arial" w:hAnsi="Arial"/>
+          <w:sz w:val="28"/>
+        </w:rPr>
+        <w:t xml:space="preserve">    held row slides, past more than one place.</w:t>
+      </w:r>
+    </w:p>
+    <w:p>
+      <w:pPr>
+        <w:spacing w:line="276" w:lineRule="auto"/>
+      </w:pPr>
+      <w:r>
+        <w:rPr>
+          <w:rFonts w:ascii="Arial" w:hAnsi="Arial"/>
+          <w:sz w:val="28"/>
+        </w:rPr>
+        <w:t xml:space="preserve"/>
+      </w:r>
+    </w:p>
+    <w:p>
+      <w:pPr>
+        <w:spacing w:line="276" w:lineRule="auto"/>
+      </w:pPr>
+      <w:r>
+        <w:rPr>
+          <w:rFonts w:ascii="Arial" w:hAnsi="Arial"/>
+          <w:sz w:val="28"/>
+        </w:rPr>
+        <w:t xml:space="preserve">180. #127-new — Neighboring rows on a reminder list make room while a</w:t>
+      </w:r>
+    </w:p>
+    <w:p>
+      <w:pPr>
+        <w:spacing w:line="276" w:lineRule="auto"/>
+      </w:pPr>
+      <w:r>
+        <w:rPr>
+          <w:rFonts w:ascii="Arial" w:hAnsi="Arial"/>
+          <w:sz w:val="28"/>
+        </w:rPr>
+        <w:t xml:space="preserve">    held row is sliding, the same way Home badges do. The held row stays</w:t>
+      </w:r>
+    </w:p>
+    <w:p>
+      <w:pPr>
+        <w:spacing w:line="276" w:lineRule="auto"/>
+      </w:pPr>
+      <w:r>
+        <w:rPr>
+          <w:rFonts w:ascii="Arial" w:hAnsi="Arial"/>
+          <w:sz w:val="28"/>
+        </w:rPr>
+        <w:t xml:space="preserve">    in hand past more than one place; an earlier try dropped it after</w:t>
+      </w:r>
+    </w:p>
+    <w:p>
+      <w:pPr>
+        <w:spacing w:line="276" w:lineRule="auto"/>
+      </w:pPr>
+      <w:r>
+        <w:rPr>
+          <w:rFonts w:ascii="Arial" w:hAnsi="Arial"/>
+          <w:sz w:val="28"/>
+        </w:rPr>
+        <w:t xml:space="preserve">    the first. The new order is kept when you let go. On the phone at</w:t>
+      </w:r>
+    </w:p>
+    <w:p>
+      <w:pPr>
+        <w:spacing w:line="276" w:lineRule="auto"/>
+      </w:pPr>
+      <w:r>
+        <w:rPr>
+          <w:rFonts w:ascii="Arial" w:hAnsi="Arial"/>
+          <w:sz w:val="28"/>
+        </w:rPr>
+        <w:t xml:space="preserve">    build 110, and it works. TypeScript is clean.</w:t>
+      </w:r>
+    </w:p>
+    <w:p>
+      <w:pPr>
+        <w:spacing w:line="276" w:lineRule="auto"/>
+      </w:pPr>
+      <w:r>
+        <w:rPr>
+          <w:rFonts w:ascii="Arial" w:hAnsi="Arial"/>
+          <w:sz w:val="28"/>
+        </w:rPr>
+        <w:t xml:space="preserve"/>
+      </w:r>
+    </w:p>
+    <w:p>
+      <w:pPr>
+        <w:spacing w:line="276" w:lineRule="auto"/>
+      </w:pPr>
+      <w:r>
+        <w:rPr>
+          <w:rFonts w:ascii="Arial" w:hAnsi="Arial"/>
+          <w:sz w:val="28"/>
+        </w:rPr>
+        <w:t xml:space="preserve">179. #127-new — Daily Snooze minutes are now the same round up arrow,</w:t>
+      </w:r>
+    </w:p>
+    <w:p>
+      <w:pPr>
+        <w:spacing w:line="276" w:lineRule="auto"/>
+      </w:pPr>
+      <w:r>
+        <w:rPr>
+          <w:rFonts w:ascii="Arial" w:hAnsi="Arial"/>
+          <w:sz w:val="28"/>
+        </w:rPr>
+        <w:t xml:space="preserve">    number, and round down arrow as the other wheels. They still run</w:t>
+      </w:r>
+    </w:p>
+    <w:p>
+      <w:pPr>
+        <w:spacing w:line="276" w:lineRule="auto"/>
+      </w:pPr>
+      <w:r>
+        <w:rPr>
+          <w:rFonts w:ascii="Arial" w:hAnsi="Arial"/>
+          <w:sz w:val="28"/>
+        </w:rPr>
+        <w:t xml:space="preserve">    from 1 through 14, start at 5, and stop at both ends. 15, 30, and</w:t>
+      </w:r>
+    </w:p>
+    <w:p>
+      <w:pPr>
+        <w:spacing w:line="276" w:lineRule="auto"/>
+      </w:pPr>
+      <w:r>
+        <w:rPr>
+          <w:rFonts w:ascii="Arial" w:hAnsi="Arial"/>
+          <w:sz w:val="28"/>
+        </w:rPr>
+        <w:t xml:space="preserve">    60 stay stacked on the left. On the phone at build 110, and it</w:t>
+      </w:r>
+    </w:p>
+    <w:p>
+      <w:pPr>
+        <w:spacing w:line="276" w:lineRule="auto"/>
+      </w:pPr>
+      <w:r>
+        <w:rPr>
+          <w:rFonts w:ascii="Arial" w:hAnsi="Arial"/>
+          <w:sz w:val="28"/>
+        </w:rPr>
+        <w:t xml:space="preserve">    works. 442 Mac checks pass and TypeScript is clean.</w:t>
+      </w:r>
+    </w:p>
+    <w:p>
+      <w:pPr>
+        <w:spacing w:line="276" w:lineRule="auto"/>
+      </w:pPr>
+      <w:r>
+        <w:rPr>
+          <w:rFonts w:ascii="Arial" w:hAnsi="Arial"/>
+          <w:sz w:val="28"/>
+        </w:rPr>
+        <w:t xml:space="preserve"/>
+      </w:r>
+    </w:p>
+    <w:p>
+      <w:pPr>
+        <w:spacing w:line="276" w:lineRule="auto"/>
+      </w:pPr>
+      <w:r>
+        <w:rPr>
+          <w:rFonts w:ascii="Arial" w:hAnsi="Arial"/>
+          <w:sz w:val="28"/>
+        </w:rPr>
+        <w:t xml:space="preserve">178. #126-new, committed — A failed saved-list read now shows a warning</w:t>
+      </w:r>
+    </w:p>
+    <w:p>
+      <w:pPr>
+        <w:spacing w:line="276" w:lineRule="auto"/>
+      </w:pPr>
+      <w:r>
+        <w:rPr>
+          <w:rFonts w:ascii="Arial" w:hAnsi="Arial"/>
+          <w:sz w:val="28"/>
+        </w:rPr>
+        <w:t xml:space="preserve">    instead of an empty page and offers the existing Feedback popup.</w:t>
+      </w:r>
+    </w:p>
+    <w:p>
+      <w:pPr>
+        <w:spacing w:line="276" w:lineRule="auto"/>
+      </w:pPr>
+      <w:r>
+        <w:rPr>
+          <w:rFonts w:ascii="Arial" w:hAnsi="Arial"/>
+          <w:sz w:val="28"/>
+        </w:rPr>
+        <w:t xml:space="preserve">    After a successful New save, Memory asks whether to back up; Back</w:t>
+      </w:r>
+    </w:p>
+    <w:p>
+      <w:pPr>
+        <w:spacing w:line="276" w:lineRule="auto"/>
+      </w:pPr>
+      <w:r>
+        <w:rPr>
+          <w:rFonts w:ascii="Arial" w:hAnsi="Arial"/>
+          <w:sz w:val="28"/>
+        </w:rPr>
+        <w:t xml:space="preserve">    Up Now uses the existing export, while Edit and Done do not ask.</w:t>
+      </w:r>
+    </w:p>
+    <w:p>
+      <w:pPr>
+        <w:spacing w:line="276" w:lineRule="auto"/>
+      </w:pPr>
+      <w:r>
+        <w:rPr>
+          <w:rFonts w:ascii="Arial" w:hAnsi="Arial"/>
+          <w:sz w:val="28"/>
+        </w:rPr>
+        <w:t xml:space="preserve">    Daily keeps its 15, 30, and 60 minute Snooze choices and gains the</w:t>
+      </w:r>
+    </w:p>
+    <w:p>
+      <w:pPr>
+        <w:spacing w:line="276" w:lineRule="auto"/>
+      </w:pPr>
+      <w:r>
+        <w:rPr>
+          <w:rFonts w:ascii="Arial" w:hAnsi="Arial"/>
+          <w:sz w:val="28"/>
+        </w:rPr>
+        <w:t xml:space="preserve">    1-through-14 minute wheel. Its complete popup now lives apart from</w:t>
+      </w:r>
+    </w:p>
+    <w:p>
+      <w:pPr>
+        <w:spacing w:line="276" w:lineRule="auto"/>
+      </w:pPr>
+      <w:r>
+        <w:rPr>
+          <w:rFonts w:ascii="Arial" w:hAnsi="Arial"/>
+          <w:sz w:val="28"/>
+        </w:rPr>
+        <w:t xml:space="preserve">    the shared list. Build 105 proved both backup answers. Build 106</w:t>
+      </w:r>
+    </w:p>
+    <w:p>
+      <w:pPr>
+        <w:spacing w:line="276" w:lineRule="auto"/>
+      </w:pPr>
+      <w:r>
+        <w:rPr>
+          <w:rFonts w:ascii="Arial" w:hAnsi="Arial"/>
+          <w:sz w:val="28"/>
+        </w:rPr>
+        <w:t xml:space="preserve">    proved the corrected timing and that the original and later</w:t>
+      </w:r>
+    </w:p>
+    <w:p>
+      <w:pPr>
+        <w:spacing w:line="276" w:lineRule="auto"/>
+      </w:pPr>
+      <w:r>
+        <w:rPr>
+          <w:rFonts w:ascii="Arial" w:hAnsi="Arial"/>
+          <w:sz w:val="28"/>
+        </w:rPr>
+        <w:t xml:space="preserve">    follow-up both alert; keep that safety. After build 106, the wheel</w:t>
+      </w:r>
+    </w:p>
+    <w:p>
+      <w:pPr>
+        <w:spacing w:line="276" w:lineRule="auto"/>
+      </w:pPr>
+      <w:r>
+        <w:rPr>
+          <w:rFonts w:ascii="Arial" w:hAnsi="Arial"/>
+          <w:sz w:val="28"/>
+        </w:rPr>
+        <w:t xml:space="preserve">    was reversed so Up goes to higher numbers above, every opening was</w:t>
+      </w:r>
+    </w:p>
+    <w:p>
+      <w:pPr>
+        <w:spacing w:line="276" w:lineRule="auto"/>
+      </w:pPr>
+      <w:r>
+        <w:rPr>
+          <w:rFonts w:ascii="Arial" w:hAnsi="Arial"/>
+          <w:sz w:val="28"/>
+        </w:rPr>
+        <w:t xml:space="preserve">    made to reset fully to 5, and One Time rows gained a "One Time</w:t>
+      </w:r>
+    </w:p>
+    <w:p>
+      <w:pPr>
+        <w:spacing w:line="276" w:lineRule="auto"/>
+      </w:pPr>
+      <w:r>
+        <w:rPr>
+          <w:rFonts w:ascii="Arial" w:hAnsi="Arial"/>
+          <w:sz w:val="28"/>
+        </w:rPr>
+        <w:t xml:space="preserve">    only" second line. The designed implementation carries the</w:t>
+      </w:r>
+    </w:p>
+    <w:p>
+      <w:pPr>
+        <w:spacing w:line="276" w:lineRule="auto"/>
+      </w:pPr>
+      <w:r>
+        <w:rPr>
+          <w:rFonts w:ascii="Arial" w:hAnsi="Arial"/>
+          <w:sz w:val="28"/>
+        </w:rPr>
+        <w:t xml:space="preserve">    decisions. 442 Mac checks pass and TypeScript is clean. The latest</w:t>
+      </w:r>
+    </w:p>
+    <w:p>
+      <w:pPr>
+        <w:spacing w:line="276" w:lineRule="auto"/>
+      </w:pPr>
+      <w:r>
+        <w:rPr>
+          <w:rFonts w:ascii="Arial" w:hAnsi="Arial"/>
+          <w:sz w:val="28"/>
+        </w:rPr>
+        <w:t xml:space="preserve">    three display changes and read warning are not proved on the phone.</w:t>
+      </w:r>
+    </w:p>
+    <w:p>
+      <w:pPr>
+        <w:spacing w:line="276" w:lineRule="auto"/>
+      </w:pPr>
+      <w:r>
+        <w:rPr>
+          <w:rFonts w:ascii="Arial" w:hAnsi="Arial"/>
+          <w:sz w:val="28"/>
+        </w:rPr>
+        <w:t xml:space="preserve"/>
+      </w:r>
+    </w:p>
+    <w:p>
+      <w:pPr>
+        <w:spacing w:line="276" w:lineRule="auto"/>
+      </w:pPr>
+      <w:r>
+        <w:rPr>
+          <w:rFonts w:ascii="Arial" w:hAnsi="Arial"/>
+          <w:sz w:val="28"/>
+        </w:rPr>
+        <w:t xml:space="preserve">177. #125-new — Evaluations 8 judged that Memory reached your own aim:</w:t>
+      </w:r>
+    </w:p>
+    <w:p>
+      <w:pPr>
+        <w:spacing w:line="276" w:lineRule="auto"/>
+      </w:pPr>
+      <w:r>
+        <w:rPr>
+          <w:rFonts w:ascii="Arial" w:hAnsi="Arial"/>
+          <w:sz w:val="28"/>
+        </w:rPr>
+        <w:t xml:space="preserve">    rock solid and consistent first, then the best personal reminder</w:t>
+      </w:r>
+    </w:p>
+    <w:p>
+      <w:pPr>
+        <w:spacing w:line="276" w:lineRule="auto"/>
+      </w:pPr>
+      <w:r>
+        <w:rPr>
+          <w:rFonts w:ascii="Arial" w:hAnsi="Arial"/>
+          <w:sz w:val="28"/>
+        </w:rPr>
+        <w:t xml:space="preserve">    for you while remaining relatively easy. 428 checks passed and</w:t>
+      </w:r>
+    </w:p>
+    <w:p>
+      <w:pPr>
+        <w:spacing w:line="276" w:lineRule="auto"/>
+      </w:pPr>
+      <w:r>
+        <w:rPr>
+          <w:rFonts w:ascii="Arial" w:hAnsi="Arial"/>
+          <w:sz w:val="28"/>
+        </w:rPr>
+        <w:t xml:space="preserve">    TypeScript was clean. No app code changed.</w:t>
+      </w:r>
+    </w:p>
+    <w:p>
+      <w:pPr>
+        <w:spacing w:line="276" w:lineRule="auto"/>
+      </w:pPr>
+      <w:r>
+        <w:rPr>
+          <w:rFonts w:ascii="Arial" w:hAnsi="Arial"/>
+          <w:sz w:val="28"/>
+        </w:rPr>
+        <w:t xml:space="preserve"/>
+      </w:r>
+    </w:p>
+    <w:p>
+      <w:pPr>
+        <w:spacing w:line="276" w:lineRule="auto"/>
+      </w:pPr>
+      <w:r>
+        <w:rPr>
+          <w:rFonts w:ascii="Arial" w:hAnsi="Arial"/>
+          <w:sz w:val="28"/>
+        </w:rPr>
+        <w:t xml:space="preserve">176. #124-new — The testing record and its Word copy were written.</w:t>
+      </w:r>
+    </w:p>
+    <w:p>
+      <w:pPr>
+        <w:spacing w:line="276" w:lineRule="auto"/>
+      </w:pPr>
+      <w:r>
+        <w:rPr>
+          <w:rFonts w:ascii="Arial" w:hAnsi="Arial"/>
+          <w:sz w:val="28"/>
+        </w:rPr>
+        <w:t xml:space="preserve">    The Android-only Play build was started while Google was still</w:t>
+      </w:r>
+    </w:p>
+    <w:p>
+      <w:pPr>
+        <w:spacing w:line="276" w:lineRule="auto"/>
+      </w:pPr>
+      <w:r>
+        <w:rPr>
+          <w:rFonts w:ascii="Arial" w:hAnsi="Arial"/>
+          <w:sz w:val="28"/>
+        </w:rPr>
+        <w:t xml:space="preserve">    considering the account.</w:t>
+      </w:r>
+    </w:p>
+    <w:p>
+      <w:pPr>
+        <w:spacing w:line="276" w:lineRule="auto"/>
+      </w:pPr>
+      <w:r>
+        <w:rPr>
+          <w:rFonts w:ascii="Arial" w:hAnsi="Arial"/>
+          <w:sz w:val="28"/>
+        </w:rPr>
+        <w:t xml:space="preserve"/>
+      </w:r>
+    </w:p>
+    <w:p>
+      <w:pPr>
+        <w:spacing w:line="276" w:lineRule="auto"/>
+      </w:pPr>
+      <w:r>
+        <w:rPr>
+          <w:rFonts w:ascii="Arial" w:hAnsi="Arial"/>
+          <w:sz w:val="28"/>
+        </w:rPr>
+        <w:t xml:space="preserve">175. #123-new — The iPhone listing is $9.99. No trial. No trademark</w:t>
       </w:r>
     </w:p>
     <w:p>

</xml_diff>

<commit_message>
127.3 —new - Memory - Home page arrangement backedup.
</commit_message>
<xml_diff>
--- a/docs/pending.docx
+++ b/docs/pending.docx
@@ -421,19 +421,43 @@
           <w:rFonts w:ascii="Arial" w:hAnsi="Arial"/>
           <w:sz w:val="28"/>
         </w:rPr>
-        <w:t xml:space="preserve">   proved, and it stays out of the Guide. The full state is in</w:t>
-      </w:r>
-    </w:p>
-    <w:p>
-      <w:pPr>
-        <w:spacing w:line="276" w:lineRule="auto"/>
-      </w:pPr>
-      <w:r>
-        <w:rPr>
-          <w:rFonts w:ascii="Arial" w:hAnsi="Arial"/>
-          <w:sz w:val="28"/>
-        </w:rPr>
-        <w:t xml:space="preserve">   docs/in-flight.md.</w:t>
+        <w:t xml:space="preserve">   proved, and it stays out of the Guide. The home arrangement</w:t>
+      </w:r>
+    </w:p>
+    <w:p>
+      <w:pPr>
+        <w:spacing w:line="276" w:lineRule="auto"/>
+      </w:pPr>
+      <w:r>
+        <w:rPr>
+          <w:rFonts w:ascii="Arial" w:hAnsi="Arial"/>
+          <w:sz w:val="28"/>
+        </w:rPr>
+        <w:t xml:space="preserve">   restore is in the project and not on the phone. The Daily 15, 30,</w:t>
+      </w:r>
+    </w:p>
+    <w:p>
+      <w:pPr>
+        <w:spacing w:line="276" w:lineRule="auto"/>
+      </w:pPr>
+      <w:r>
+        <w:rPr>
+          <w:rFonts w:ascii="Arial" w:hAnsi="Arial"/>
+          <w:sz w:val="28"/>
+        </w:rPr>
+        <w:t xml:space="preserve">   and 60 minute buttons are half as wide, and that is not on the</w:t>
+      </w:r>
+    </w:p>
+    <w:p>
+      <w:pPr>
+        <w:spacing w:line="276" w:lineRule="auto"/>
+      </w:pPr>
+      <w:r>
+        <w:rPr>
+          <w:rFonts w:ascii="Arial" w:hAnsi="Arial"/>
+          <w:sz w:val="28"/>
+        </w:rPr>
+        <w:t xml:space="preserve">   phone either. The full state is in docs/in-flight.md.</w:t>
       </w:r>
     </w:p>
     <w:p>
@@ -2128,7 +2152,55 @@
           <w:rFonts w:ascii="Arial" w:hAnsi="Arial"/>
           <w:sz w:val="28"/>
         </w:rPr>
-        <w:t xml:space="preserve">185. 2026-10-06 — The home arrangement is the home page's own</w:t>
+        <w:t xml:space="preserve">186. #127-new — The 15, 30, and 60 minute buttons on the Daily</w:t>
+      </w:r>
+    </w:p>
+    <w:p>
+      <w:pPr>
+        <w:spacing w:line="276" w:lineRule="auto"/>
+      </w:pPr>
+      <w:r>
+        <w:rPr>
+          <w:rFonts w:ascii="Arial" w:hAnsi="Arial"/>
+          <w:sz w:val="28"/>
+        </w:rPr>
+        <w:t xml:space="preserve">    snooze modal are half as wide as they were. The height is</w:t>
+      </w:r>
+    </w:p>
+    <w:p>
+      <w:pPr>
+        <w:spacing w:line="276" w:lineRule="auto"/>
+      </w:pPr>
+      <w:r>
+        <w:rPr>
+          <w:rFonts w:ascii="Arial" w:hAnsi="Arial"/>
+          <w:sz w:val="28"/>
+        </w:rPr>
+        <w:t xml:space="preserve">    unchanged. Not on the phone.</w:t>
+      </w:r>
+    </w:p>
+    <w:p>
+      <w:pPr>
+        <w:spacing w:line="276" w:lineRule="auto"/>
+      </w:pPr>
+      <w:r>
+        <w:rPr>
+          <w:rFonts w:ascii="Arial" w:hAnsi="Arial"/>
+          <w:sz w:val="28"/>
+        </w:rPr>
+        <w:t xml:space="preserve"/>
+      </w:r>
+    </w:p>
+    <w:p>
+      <w:pPr>
+        <w:spacing w:line="276" w:lineRule="auto"/>
+      </w:pPr>
+      <w:r>
+        <w:rPr>
+          <w:rFonts w:ascii="Arial" w:hAnsi="Arial"/>
+          <w:sz w:val="28"/>
+        </w:rPr>
+        <w:t xml:space="preserve">185. #127-new — The home arrangement is the home page's own</w:t>
       </w:r>
     </w:p>
     <w:p>

</xml_diff>

<commit_message>
FACTS THAT APPLY TO THE ONGOING WORK
</commit_message>
<xml_diff>
--- a/docs/pending.docx
+++ b/docs/pending.docx
@@ -96,7 +96,7 @@
           <w:rFonts w:ascii="Arial" w:hAnsi="Arial"/>
           <w:sz w:val="28"/>
         </w:rPr>
-        <w:t xml:space="preserve">"Pending 4", "Facts 9" — and both of us know which you mean. The</w:t>
+        <w:t xml:space="preserve">"What's Next 1", "Done 186" — and both of us know which you mean. The</w:t>
       </w:r>
     </w:p>
     <w:p>
@@ -120,7 +120,7 @@
           <w:rFonts w:ascii="Arial" w:hAnsi="Arial"/>
           <w:sz w:val="28"/>
         </w:rPr>
-        <w:t xml:space="preserve">each one. Live headings (What's Next, Pending, Facts) shift as</w:t>
+        <w:t xml:space="preserve">each one. Live headings (What's Next, Pending) shift as</w:t>
       </w:r>
     </w:p>
     <w:p>
@@ -325,7 +325,91 @@
           <w:rFonts w:ascii="Arial" w:hAnsi="Arial"/>
           <w:sz w:val="28"/>
         </w:rPr>
-        <w:t xml:space="preserve">1. PHONE PROOF FOR DONE'S ONE-DAY CHECK. Weekly, Monthly, Quarterly,</w:t>
+        <w:t xml:space="preserve">1. PHONE TEXT SIZE ON A FRESH OPEN. You set the phone's text larger</w:t>
+      </w:r>
+    </w:p>
+    <w:p>
+      <w:pPr>
+        <w:spacing w:line="276" w:lineRule="auto"/>
+      </w:pPr>
+      <w:r>
+        <w:rPr>
+          <w:rFonts w:ascii="Arial" w:hAnsi="Arial"/>
+          <w:sz w:val="28"/>
+        </w:rPr>
+        <w:t xml:space="preserve">   so you can read it. After a restore, or a download and a restore,</w:t>
+      </w:r>
+    </w:p>
+    <w:p>
+      <w:pPr>
+        <w:spacing w:line="276" w:lineRule="auto"/>
+      </w:pPr>
+      <w:r>
+        <w:rPr>
+          <w:rFonts w:ascii="Arial" w:hAnsi="Arial"/>
+          <w:sz w:val="28"/>
+        </w:rPr>
+        <w:t xml:space="preserve">   Memory's writing was the small size again while the rest of the</w:t>
+      </w:r>
+    </w:p>
+    <w:p>
+      <w:pPr>
+        <w:spacing w:line="276" w:lineRule="auto"/>
+      </w:pPr>
+      <w:r>
+        <w:rPr>
+          <w:rFonts w:ascii="Arial" w:hAnsi="Arial"/>
+          <w:sz w:val="28"/>
+        </w:rPr>
+        <w:t xml:space="preserve">   phone stayed large. The initial load now waits until the app is</w:t>
+      </w:r>
+    </w:p>
+    <w:p>
+      <w:pPr>
+        <w:spacing w:line="276" w:lineRule="auto"/>
+      </w:pPr>
+      <w:r>
+        <w:rPr>
+          <w:rFonts w:ascii="Arial" w:hAnsi="Arial"/>
+          <w:sz w:val="28"/>
+        </w:rPr>
+        <w:t xml:space="preserve">   active, then reads the phone's text size, and the first writing</w:t>
+      </w:r>
+    </w:p>
+    <w:p>
+      <w:pPr>
+        <w:spacing w:line="276" w:lineRule="auto"/>
+      </w:pPr>
+      <w:r>
+        <w:rPr>
+          <w:rFonts w:ascii="Arial" w:hAnsi="Arial"/>
+          <w:sz w:val="28"/>
+        </w:rPr>
+        <w:t xml:space="preserve">   uses that size. The pages and the backup are unchanged. This is</w:t>
+      </w:r>
+    </w:p>
+    <w:p>
+      <w:pPr>
+        <w:spacing w:line="276" w:lineRule="auto"/>
+      </w:pPr>
+      <w:r>
+        <w:rPr>
+          <w:rFonts w:ascii="Arial" w:hAnsi="Arial"/>
+          <w:sz w:val="28"/>
+        </w:rPr>
+        <w:t xml:space="preserve">   not on the phone yet (#128-new).</w:t>
+      </w:r>
+    </w:p>
+    <w:p>
+      <w:pPr>
+        <w:spacing w:line="276" w:lineRule="auto"/>
+      </w:pPr>
+      <w:r>
+        <w:rPr>
+          <w:rFonts w:ascii="Arial" w:hAnsi="Arial"/>
+          <w:sz w:val="28"/>
+        </w:rPr>
+        <w:t xml:space="preserve">2. PHONE PROOF FOR DONE'S ONE-DAY CHECK. Weekly, Monthly, Quarterly,</w:t>
       </w:r>
     </w:p>
     <w:p>
@@ -469,7 +553,7 @@
           <w:rFonts w:ascii="Arial" w:hAnsi="Arial"/>
           <w:sz w:val="28"/>
         </w:rPr>
-        <w:t xml:space="preserve">2. IOS BUILD 100 is Waiting for Review. When Apple approves, you</w:t>
+        <w:t xml:space="preserve">3. IOS BUILD 100 is Waiting for Review. When Apple approves, you</w:t>
       </w:r>
     </w:p>
     <w:p>
@@ -493,7 +577,7 @@
           <w:rFonts w:ascii="Arial" w:hAnsi="Arial"/>
           <w:sz w:val="28"/>
         </w:rPr>
-        <w:t xml:space="preserve">3. THE BOTTOM OF THE GALAXY SCREEN. The phone uses about half an inch</w:t>
+        <w:t xml:space="preserve">4. THE BOTTOM OF THE GALAXY SCREEN. The phone uses about half an inch</w:t>
       </w:r>
     </w:p>
     <w:p>
@@ -541,7 +625,7 @@
           <w:rFonts w:ascii="Arial" w:hAnsi="Arial"/>
           <w:sz w:val="28"/>
         </w:rPr>
-        <w:t xml:space="preserve">4. THE PLAY ACCOUNT. You submitted it. Google has not opened it.</w:t>
+        <w:t xml:space="preserve">5. THE PLAY ACCOUNT. You submitted it. Google has not opened it.</w:t>
       </w:r>
     </w:p>
     <w:p>
@@ -613,7 +697,7 @@
           <w:rFonts w:ascii="Arial" w:hAnsi="Arial"/>
           <w:sz w:val="28"/>
         </w:rPr>
-        <w:t xml:space="preserve">5. THE PRICE ON ANDROID. $9.99 once, no trial. The iPhone listing</w:t>
+        <w:t xml:space="preserve">6. THE PRICE ON ANDROID. $9.99 once, no trial. The iPhone listing</w:t>
       </w:r>
     </w:p>
     <w:p>
@@ -723,1315 +807,6 @@
           <w:sz w:val="28"/>
         </w:rPr>
         <w:t xml:space="preserve">Nothing is waiting under this heading.</w:t>
-      </w:r>
-    </w:p>
-    <w:p>
-      <w:pPr>
-        <w:spacing w:line="276" w:lineRule="auto"/>
-      </w:pPr>
-      <w:r>
-        <w:rPr>
-          <w:rFonts w:ascii="Arial" w:hAnsi="Arial"/>
-          <w:sz w:val="28"/>
-        </w:rPr>
-        <w:t xml:space="preserve"/>
-      </w:r>
-    </w:p>
-    <w:p>
-      <w:pPr>
-        <w:spacing w:line="276" w:lineRule="auto"/>
-      </w:pPr>
-      <w:r>
-        <w:rPr>
-          <w:rFonts w:ascii="Arial" w:hAnsi="Arial"/>
-          <w:sz w:val="28"/>
-        </w:rPr>
-        <w:t xml:space="preserve"/>
-      </w:r>
-    </w:p>
-    <w:p>
-      <w:pPr>
-        <w:spacing w:line="276" w:lineRule="auto"/>
-      </w:pPr>
-      <w:r>
-        <w:rPr>
-          <w:rFonts w:ascii="Arial" w:hAnsi="Arial"/>
-          <w:b/>
-          <w:sz w:val="28"/>
-        </w:rPr>
-        <w:t xml:space="preserve">FACTS THAT APPLY TO THE ONGOING WORK</w:t>
-      </w:r>
-    </w:p>
-    <w:p>
-      <w:pPr>
-        <w:spacing w:line="276" w:lineRule="auto"/>
-      </w:pPr>
-      <w:r>
-        <w:rPr>
-          <w:rFonts w:ascii="Arial" w:hAnsi="Arial"/>
-          <w:sz w:val="28"/>
-        </w:rPr>
-        <w:t xml:space="preserve">------------------------------------------------------------------</w:t>
-      </w:r>
-    </w:p>
-    <w:p>
-      <w:pPr>
-        <w:spacing w:line="276" w:lineRule="auto"/>
-      </w:pPr>
-      <w:r>
-        <w:rPr>
-          <w:rFonts w:ascii="Arial" w:hAnsi="Arial"/>
-          <w:sz w:val="28"/>
-        </w:rPr>
-        <w:t xml:space="preserve">Settled things worth having in front of you while the pages are</w:t>
-      </w:r>
-    </w:p>
-    <w:p>
-      <w:pPr>
-        <w:spacing w:line="276" w:lineRule="auto"/>
-      </w:pPr>
-      <w:r>
-        <w:rPr>
-          <w:rFonts w:ascii="Arial" w:hAnsi="Arial"/>
-          <w:sz w:val="28"/>
-        </w:rPr>
-        <w:t xml:space="preserve">built. None of these is a job to do.</w:t>
-      </w:r>
-    </w:p>
-    <w:p>
-      <w:pPr>
-        <w:spacing w:line="276" w:lineRule="auto"/>
-      </w:pPr>
-      <w:r>
-        <w:rPr>
-          <w:rFonts w:ascii="Arial" w:hAnsi="Arial"/>
-          <w:sz w:val="28"/>
-        </w:rPr>
-        <w:t xml:space="preserve"/>
-      </w:r>
-    </w:p>
-    <w:p>
-      <w:pPr>
-        <w:spacing w:line="276" w:lineRule="auto"/>
-      </w:pPr>
-      <w:r>
-        <w:rPr>
-          <w:rFonts w:ascii="Arial" w:hAnsi="Arial"/>
-          <w:sz w:val="28"/>
-        </w:rPr>
-        <w:t xml:space="preserve">1. + ADD ON A PAGE GOES TO THAT PAGE'S OWN NEW. Where does it</w:t>
-      </w:r>
-    </w:p>
-    <w:p>
-      <w:pPr>
-        <w:spacing w:line="276" w:lineRule="auto"/>
-      </w:pPr>
-      <w:r>
-        <w:rPr>
-          <w:rFonts w:ascii="Arial" w:hAnsi="Arial"/>
-          <w:sz w:val="28"/>
-        </w:rPr>
-        <w:t xml:space="preserve">   belong? is only on Options, from + Screen. You do not set</w:t>
-      </w:r>
-    </w:p>
-    <w:p>
-      <w:pPr>
-        <w:spacing w:line="276" w:lineRule="auto"/>
-      </w:pPr>
-      <w:r>
-        <w:rPr>
-          <w:rFonts w:ascii="Arial" w:hAnsi="Arial"/>
-          <w:sz w:val="28"/>
-        </w:rPr>
-        <w:t xml:space="preserve">   another page from a different page (#36-new).</w:t>
-      </w:r>
-    </w:p>
-    <w:p>
-      <w:pPr>
-        <w:spacing w:line="276" w:lineRule="auto"/>
-      </w:pPr>
-      <w:r>
-        <w:rPr>
-          <w:rFonts w:ascii="Arial" w:hAnsi="Arial"/>
-          <w:sz w:val="28"/>
-        </w:rPr>
-        <w:t xml:space="preserve">2. DAILY'S OWN ADD IS ONLY ABOUT TODAY. Two kinds: an every-day</w:t>
-      </w:r>
-    </w:p>
-    <w:p>
-      <w:pPr>
-        <w:spacing w:line="276" w:lineRule="auto"/>
-      </w:pPr>
-      <w:r>
-        <w:rPr>
-          <w:rFonts w:ascii="Arial" w:hAnsi="Arial"/>
-          <w:sz w:val="28"/>
-        </w:rPr>
-        <w:t xml:space="preserve">   item, or a One Time for today. On One Time for today the</w:t>
-      </w:r>
-    </w:p>
-    <w:p>
-      <w:pPr>
-        <w:spacing w:line="276" w:lineRule="auto"/>
-      </w:pPr>
-      <w:r>
-        <w:rPr>
-          <w:rFonts w:ascii="Arial" w:hAnsi="Arial"/>
-          <w:sz w:val="28"/>
-        </w:rPr>
-        <w:t xml:space="preserve">   Reminders before chips are only 30 min., 1 hour, 2 hours, and</w:t>
-      </w:r>
-    </w:p>
-    <w:p>
-      <w:pPr>
-        <w:spacing w:line="276" w:lineRule="auto"/>
-      </w:pPr>
-      <w:r>
-        <w:rPr>
-          <w:rFonts w:ascii="Arial" w:hAnsi="Arial"/>
-          <w:sz w:val="28"/>
-        </w:rPr>
-        <w:t xml:space="preserve">   Time of (the item's own time). Save on that kind comes back on</w:t>
-      </w:r>
-    </w:p>
-    <w:p>
-      <w:pPr>
-        <w:spacing w:line="276" w:lineRule="auto"/>
-      </w:pPr>
-      <w:r>
-        <w:rPr>
-          <w:rFonts w:ascii="Arial" w:hAnsi="Arial"/>
-          <w:sz w:val="28"/>
-        </w:rPr>
-        <w:t xml:space="preserve">   Daily. It is Daily's own one-shot, not an Appointment. An</w:t>
-      </w:r>
-    </w:p>
-    <w:p>
-      <w:pPr>
-        <w:spacing w:line="276" w:lineRule="auto"/>
-      </w:pPr>
-      <w:r>
-        <w:rPr>
-          <w:rFonts w:ascii="Arial" w:hAnsi="Arial"/>
-          <w:sz w:val="28"/>
-        </w:rPr>
-        <w:t xml:space="preserve">   Appointment that falls today still shows on Daily as from</w:t>
-      </w:r>
-    </w:p>
-    <w:p>
-      <w:pPr>
-        <w:spacing w:line="276" w:lineRule="auto"/>
-      </w:pPr>
-      <w:r>
-        <w:rPr>
-          <w:rFonts w:ascii="Arial" w:hAnsi="Arial"/>
-          <w:sz w:val="28"/>
-        </w:rPr>
-        <w:t xml:space="preserve">   Appointments, and still lives on Appointments. The other pages keep their</w:t>
-      </w:r>
-    </w:p>
-    <w:p>
-      <w:pPr>
-        <w:spacing w:line="276" w:lineRule="auto"/>
-      </w:pPr>
-      <w:r>
-        <w:rPr>
-          <w:rFonts w:ascii="Arial" w:hAnsi="Arial"/>
-          <w:sz w:val="28"/>
-        </w:rPr>
-        <w:t xml:space="preserve">   own adds, because on those the page is the whole meaning of Repeat.</w:t>
-      </w:r>
-    </w:p>
-    <w:p>
-      <w:pPr>
-        <w:spacing w:line="276" w:lineRule="auto"/>
-      </w:pPr>
-      <w:r>
-        <w:rPr>
-          <w:rFonts w:ascii="Arial" w:hAnsi="Arial"/>
-          <w:sz w:val="28"/>
-        </w:rPr>
-        <w:t xml:space="preserve">   (#78-new)</w:t>
-      </w:r>
-    </w:p>
-    <w:p>
-      <w:pPr>
-        <w:spacing w:line="276" w:lineRule="auto"/>
-      </w:pPr>
-      <w:r>
-        <w:rPr>
-          <w:rFonts w:ascii="Arial" w:hAnsi="Arial"/>
-          <w:sz w:val="28"/>
-        </w:rPr>
-        <w:t xml:space="preserve">3. ONE REMINDER PER ITEM, NOT TWO, and the app puts itself right</w:t>
-      </w:r>
-    </w:p>
-    <w:p>
-      <w:pPr>
-        <w:spacing w:line="276" w:lineRule="auto"/>
-      </w:pPr>
-      <w:r>
-        <w:rPr>
-          <w:rFonts w:ascii="Arial" w:hAnsi="Arial"/>
-          <w:sz w:val="28"/>
-        </w:rPr>
-        <w:t xml:space="preserve">   when you open it: it tells you what you missed, then sets the</w:t>
-      </w:r>
-    </w:p>
-    <w:p>
-      <w:pPr>
-        <w:spacing w:line="276" w:lineRule="auto"/>
-      </w:pPr>
-      <w:r>
-        <w:rPr>
-          <w:rFonts w:ascii="Arial" w:hAnsi="Arial"/>
-          <w:sz w:val="28"/>
-        </w:rPr>
-        <w:t xml:space="preserve">   reminders again. That is your own reasoning and it replaced the</w:t>
-      </w:r>
-    </w:p>
-    <w:p>
-      <w:pPr>
-        <w:spacing w:line="276" w:lineRule="auto"/>
-      </w:pPr>
-      <w:r>
-        <w:rPr>
-          <w:rFonts w:ascii="Arial" w:hAnsi="Arial"/>
-          <w:sz w:val="28"/>
-        </w:rPr>
-        <w:t xml:space="preserve">   old two-days-ahead rule. A Daily item still arms for tomorrow</w:t>
-      </w:r>
-    </w:p>
-    <w:p>
-      <w:pPr>
-        <w:spacing w:line="276" w:lineRule="auto"/>
-      </w:pPr>
-      <w:r>
-        <w:rPr>
-          <w:rFonts w:ascii="Arial" w:hAnsi="Arial"/>
-          <w:sz w:val="28"/>
-        </w:rPr>
-        <w:t xml:space="preserve">   after Done; that is still one reminder, not two (Patrick, #44-new).</w:t>
-      </w:r>
-    </w:p>
-    <w:p>
-      <w:pPr>
-        <w:spacing w:line="276" w:lineRule="auto"/>
-      </w:pPr>
-      <w:r>
-        <w:rPr>
-          <w:rFonts w:ascii="Arial" w:hAnsi="Arial"/>
-          <w:sz w:val="28"/>
-        </w:rPr>
-        <w:t xml:space="preserve">4. ROCK SOLID IS THE TOP GOAL BUT NOT THE ONLY ONE. Consistency</w:t>
-      </w:r>
-    </w:p>
-    <w:p>
-      <w:pPr>
-        <w:spacing w:line="276" w:lineRule="auto"/>
-      </w:pPr>
-      <w:r>
-        <w:rPr>
-          <w:rFonts w:ascii="Arial" w:hAnsi="Arial"/>
-          <w:sz w:val="28"/>
-        </w:rPr>
-        <w:t xml:space="preserve">   stands beside it. That correction is yours, from #17-new.</w:t>
-      </w:r>
-    </w:p>
-    <w:p>
-      <w:pPr>
-        <w:spacing w:line="276" w:lineRule="auto"/>
-      </w:pPr>
-      <w:r>
-        <w:rPr>
-          <w:rFonts w:ascii="Arial" w:hAnsi="Arial"/>
-          <w:sz w:val="28"/>
-        </w:rPr>
-        <w:t xml:space="preserve">5. ROCK SOLID IS FOR WHEN YOU USE IT. An app that is not being</w:t>
-      </w:r>
-    </w:p>
-    <w:p>
-      <w:pPr>
-        <w:spacing w:line="276" w:lineRule="auto"/>
-      </w:pPr>
-      <w:r>
-        <w:rPr>
-          <w:rFonts w:ascii="Arial" w:hAnsi="Arial"/>
-          <w:sz w:val="28"/>
-        </w:rPr>
-        <w:t xml:space="preserve">   opened is not being used, and what the old second copy protected</w:t>
-      </w:r>
-    </w:p>
-    <w:p>
-      <w:pPr>
-        <w:spacing w:line="276" w:lineRule="auto"/>
-      </w:pPr>
-      <w:r>
-        <w:rPr>
-          <w:rFonts w:ascii="Arial" w:hAnsi="Arial"/>
-          <w:sz w:val="28"/>
-        </w:rPr>
-        <w:t xml:space="preserve">   was one day and no more.</w:t>
-      </w:r>
-    </w:p>
-    <w:p>
-      <w:pPr>
-        <w:spacing w:line="276" w:lineRule="auto"/>
-      </w:pPr>
-      <w:r>
-        <w:rPr>
-          <w:rFonts w:ascii="Arial" w:hAnsi="Arial"/>
-          <w:sz w:val="28"/>
-        </w:rPr>
-        <w:t xml:space="preserve">6. TASKS SAVED BEFORE THE DATE FIX carry a date they were given</w:t>
-      </w:r>
-    </w:p>
-    <w:p>
-      <w:pPr>
-        <w:spacing w:line="276" w:lineRule="auto"/>
-      </w:pPr>
-      <w:r>
-        <w:rPr>
-          <w:rFonts w:ascii="Arial" w:hAnsi="Arial"/>
-          <w:sz w:val="28"/>
-        </w:rPr>
-        <w:t xml:space="preserve">    rather than one you chose.</w:t>
-      </w:r>
-    </w:p>
-    <w:p>
-      <w:pPr>
-        <w:spacing w:line="276" w:lineRule="auto"/>
-      </w:pPr>
-      <w:r>
-        <w:rPr>
-          <w:rFonts w:ascii="Arial" w:hAnsi="Arial"/>
-          <w:sz w:val="28"/>
-        </w:rPr>
-        <w:t xml:space="preserve">7. A BIG PIECE GETS A BUILD SHEET FIRST — self-contained, carrying</w:t>
-      </w:r>
-    </w:p>
-    <w:p>
-      <w:pPr>
-        <w:spacing w:line="276" w:lineRule="auto"/>
-      </w:pPr>
-      <w:r>
-        <w:rPr>
-          <w:rFonts w:ascii="Arial" w:hAnsi="Arial"/>
-          <w:sz w:val="28"/>
-        </w:rPr>
-        <w:t xml:space="preserve">    every answer, so whoever builds it never has to ask you a</w:t>
-      </w:r>
-    </w:p>
-    <w:p>
-      <w:pPr>
-        <w:spacing w:line="276" w:lineRule="auto"/>
-      </w:pPr>
-      <w:r>
-        <w:rPr>
-          <w:rFonts w:ascii="Arial" w:hAnsi="Arial"/>
-          <w:sz w:val="28"/>
-        </w:rPr>
-        <w:t xml:space="preserve">    design question.</w:t>
-      </w:r>
-    </w:p>
-    <w:p>
-      <w:pPr>
-        <w:spacing w:line="276" w:lineRule="auto"/>
-      </w:pPr>
-      <w:r>
-        <w:rPr>
-          <w:rFonts w:ascii="Arial" w:hAnsi="Arial"/>
-          <w:sz w:val="28"/>
-        </w:rPr>
-        <w:t xml:space="preserve">8. BARE SESSION NUMBERS mean the old shared chain. This project's</w:t>
-      </w:r>
-    </w:p>
-    <w:p>
-      <w:pPr>
-        <w:spacing w:line="276" w:lineRule="auto"/>
-      </w:pPr>
-      <w:r>
-        <w:rPr>
-          <w:rFonts w:ascii="Arial" w:hAnsi="Arial"/>
-          <w:sz w:val="28"/>
-        </w:rPr>
-        <w:t xml:space="preserve">    own chain is written #1-new, #2-new, and so on.</w:t>
-      </w:r>
-    </w:p>
-    <w:p>
-      <w:pPr>
-        <w:spacing w:line="276" w:lineRule="auto"/>
-      </w:pPr>
-      <w:r>
-        <w:rPr>
-          <w:rFonts w:ascii="Arial" w:hAnsi="Arial"/>
-          <w:sz w:val="28"/>
-        </w:rPr>
-        <w:t xml:space="preserve">9. WORKING DOCUMENTS LIVE IN docs. History lives in docs-ref, and</w:t>
-      </w:r>
-    </w:p>
-    <w:p>
-      <w:pPr>
-        <w:spacing w:line="276" w:lineRule="auto"/>
-      </w:pPr>
-      <w:r>
-        <w:rPr>
-          <w:rFonts w:ascii="Arial" w:hAnsi="Arial"/>
-          <w:sz w:val="28"/>
-        </w:rPr>
-        <w:t xml:space="preserve">    the build sheets are in docs-ref/build-sheets. The index</w:t>
-      </w:r>
-    </w:p>
-    <w:p>
-      <w:pPr>
-        <w:spacing w:line="276" w:lineRule="auto"/>
-      </w:pPr>
-      <w:r>
-        <w:rPr>
-          <w:rFonts w:ascii="Arial" w:hAnsi="Arial"/>
-          <w:sz w:val="28"/>
-        </w:rPr>
-        <w:t xml:space="preserve">    says which file is the home. You call them working documents;</w:t>
-      </w:r>
-    </w:p>
-    <w:p>
-      <w:pPr>
-        <w:spacing w:line="276" w:lineRule="auto"/>
-      </w:pPr>
-      <w:r>
-        <w:rPr>
-          <w:rFonts w:ascii="Arial" w:hAnsi="Arial"/>
-          <w:sz w:val="28"/>
-        </w:rPr>
-        <w:t xml:space="preserve">    live desk means the same thing. (App-Docs, 2026-08-31)</w:t>
-      </w:r>
-    </w:p>
-    <w:p>
-      <w:pPr>
-        <w:spacing w:line="276" w:lineRule="auto"/>
-      </w:pPr>
-      <w:r>
-        <w:rPr>
-          <w:rFonts w:ascii="Arial" w:hAnsi="Arial"/>
-          <w:sz w:val="28"/>
-        </w:rPr>
-        <w:t xml:space="preserve">10. THE CALENDAR PAGE SHOWS DATED ITEMS. No every-day Daily items,</w:t>
-      </w:r>
-    </w:p>
-    <w:p>
-      <w:pPr>
-        <w:spacing w:line="276" w:lineRule="auto"/>
-      </w:pPr>
-      <w:r>
-        <w:rPr>
-          <w:rFonts w:ascii="Arial" w:hAnsi="Arial"/>
-          <w:sz w:val="28"/>
-        </w:rPr>
-        <w:t xml:space="preserve">    no Bucket List. No Done or Snooze on the month or the day’s list.</w:t>
-      </w:r>
-    </w:p>
-    <w:p>
-      <w:pPr>
-        <w:spacing w:line="276" w:lineRule="auto"/>
-      </w:pPr>
-      <w:r>
-        <w:rPr>
-          <w:rFonts w:ascii="Arial" w:hAnsi="Arial"/>
-          <w:sz w:val="28"/>
-        </w:rPr>
-        <w:t xml:space="preserve">    Names in a day box are one line and scroll vertically.</w:t>
-      </w:r>
-    </w:p>
-    <w:p>
-      <w:pPr>
-        <w:spacing w:line="276" w:lineRule="auto"/>
-      </w:pPr>
-      <w:r>
-        <w:rPr>
-          <w:rFonts w:ascii="Arial" w:hAnsi="Arial"/>
-          <w:sz w:val="28"/>
-        </w:rPr>
-        <w:t xml:space="preserve">    Landscape is an optional view: 0°, 90° counter-clockwise, and</w:t>
-      </w:r>
-    </w:p>
-    <w:p>
-      <w:pPr>
-        <w:spacing w:line="276" w:lineRule="auto"/>
-      </w:pPr>
-      <w:r>
-        <w:rPr>
-          <w:rFonts w:ascii="Arial" w:hAnsi="Arial"/>
-          <w:sz w:val="28"/>
-        </w:rPr>
-        <w:t xml:space="preserve">    270° counter-clockwise; 180° upside-down is out. Headers stay</w:t>
-      </w:r>
-    </w:p>
-    <w:p>
-      <w:pPr>
-        <w:spacing w:line="276" w:lineRule="auto"/>
-      </w:pPr>
-      <w:r>
-        <w:rPr>
-          <w:rFonts w:ascii="Arial" w:hAnsi="Arial"/>
-          <w:sz w:val="28"/>
-        </w:rPr>
-        <w:t xml:space="preserve">    at the physical top of the phone, all pages. The calendar month</w:t>
-      </w:r>
-    </w:p>
-    <w:p>
-      <w:pPr>
-        <w:spacing w:line="276" w:lineRule="auto"/>
-      </w:pPr>
-      <w:r>
-        <w:rPr>
-          <w:rFonts w:ascii="Arial" w:hAnsi="Arial"/>
-          <w:sz w:val="28"/>
-        </w:rPr>
-        <w:t xml:space="preserve">    grid was not rebuilt.</w:t>
-      </w:r>
-    </w:p>
-    <w:p>
-      <w:pPr>
-        <w:spacing w:line="276" w:lineRule="auto"/>
-      </w:pPr>
-      <w:r>
-        <w:rPr>
-          <w:rFonts w:ascii="Arial" w:hAnsi="Arial"/>
-          <w:sz w:val="28"/>
-        </w:rPr>
-        <w:t xml:space="preserve">11. HAVING A GOOD IDEA LEADS TO OVERREACHING (Patrick, #52-new).</w:t>
-      </w:r>
-    </w:p>
-    <w:p>
-      <w:pPr>
-        <w:spacing w:line="276" w:lineRule="auto"/>
-      </w:pPr>
-      <w:r>
-        <w:rPr>
-          <w:rFonts w:ascii="Arial" w:hAnsi="Arial"/>
-          <w:sz w:val="28"/>
-        </w:rPr>
-        <w:t xml:space="preserve">    The feedback you need is the trim: what part is worth it,</w:t>
-      </w:r>
-    </w:p>
-    <w:p>
-      <w:pPr>
-        <w:spacing w:line="276" w:lineRule="auto"/>
-      </w:pPr>
-      <w:r>
-        <w:rPr>
-          <w:rFonts w:ascii="Arial" w:hAnsi="Arial"/>
-          <w:sz w:val="28"/>
-        </w:rPr>
-        <w:t xml:space="preserve">    and what is more than is there.</w:t>
-      </w:r>
-    </w:p>
-    <w:p>
-      <w:pPr>
-        <w:spacing w:line="276" w:lineRule="auto"/>
-      </w:pPr>
-      <w:r>
-        <w:rPr>
-          <w:rFonts w:ascii="Arial" w:hAnsi="Arial"/>
-          <w:sz w:val="28"/>
-        </w:rPr>
-        <w:t xml:space="preserve">12. THE DESIGN DESCRIPTION IS THE DESIGNED IMPLEMENTATION</w:t>
-      </w:r>
-    </w:p>
-    <w:p>
-      <w:pPr>
-        <w:spacing w:line="276" w:lineRule="auto"/>
-      </w:pPr>
-      <w:r>
-        <w:rPr>
-          <w:rFonts w:ascii="Arial" w:hAnsi="Arial"/>
-          <w:sz w:val="28"/>
-        </w:rPr>
-        <w:t xml:space="preserve">    (Patrick, #84-new). It is the guide for the whole app. A sitting</w:t>
-      </w:r>
-    </w:p>
-    <w:p>
-      <w:pPr>
-        <w:spacing w:line="276" w:lineRule="auto"/>
-      </w:pPr>
-      <w:r>
-        <w:rPr>
-          <w:rFonts w:ascii="Arial" w:hAnsi="Arial"/>
-          <w:sz w:val="28"/>
-        </w:rPr>
-        <w:t xml:space="preserve">    builds from docs/designed-implementation.md and does not ask</w:t>
-      </w:r>
-    </w:p>
-    <w:p>
-      <w:pPr>
-        <w:spacing w:line="276" w:lineRule="auto"/>
-      </w:pPr>
-      <w:r>
-        <w:rPr>
-          <w:rFonts w:ascii="Arial" w:hAnsi="Arial"/>
-          <w:sz w:val="28"/>
-        </w:rPr>
-        <w:t xml:space="preserve">    Patrick a design question. Home, Helper, Calendar, Settings, Backup,</w:t>
-      </w:r>
-    </w:p>
-    <w:p>
-      <w:pPr>
-        <w:spacing w:line="276" w:lineRule="auto"/>
-      </w:pPr>
-      <w:r>
-        <w:rPr>
-          <w:rFonts w:ascii="Arial" w:hAnsi="Arial"/>
-          <w:sz w:val="28"/>
-        </w:rPr>
-        <w:t xml:space="preserve">    Scheduled Reminders, Options, and Log are in that file.</w:t>
-      </w:r>
-    </w:p>
-    <w:p>
-      <w:pPr>
-        <w:spacing w:line="276" w:lineRule="auto"/>
-      </w:pPr>
-      <w:r>
-        <w:rPr>
-          <w:rFonts w:ascii="Arial" w:hAnsi="Arial"/>
-          <w:sz w:val="28"/>
-        </w:rPr>
-        <w:t xml:space="preserve">13. DATED ITEMS WAIT ABOUT A MONTH (Patrick, 2026-09-09). That wait is</w:t>
-      </w:r>
-    </w:p>
-    <w:p>
-      <w:pPr>
-        <w:spacing w:line="276" w:lineRule="auto"/>
-      </w:pPr>
-      <w:r>
-        <w:rPr>
-          <w:rFonts w:ascii="Arial" w:hAnsi="Arial"/>
-          <w:sz w:val="28"/>
-        </w:rPr>
-        <w:t xml:space="preserve">    a bit on the table. Monthly, Quarterly, Yearly, and Birthdays have</w:t>
-      </w:r>
-    </w:p>
-    <w:p>
-      <w:pPr>
-        <w:spacing w:line="276" w:lineRule="auto"/>
-      </w:pPr>
-      <w:r>
-        <w:rPr>
-          <w:rFonts w:ascii="Arial" w:hAnsi="Arial"/>
-          <w:sz w:val="28"/>
-        </w:rPr>
-        <w:t xml:space="preserve">    it on. Daily, Weekly, Appointments, and the rest have it off. The</w:t>
-      </w:r>
-    </w:p>
-    <w:p>
-      <w:pPr>
-        <w:spacing w:line="276" w:lineRule="auto"/>
-      </w:pPr>
-      <w:r>
-        <w:rPr>
-          <w:rFonts w:ascii="Arial" w:hAnsi="Arial"/>
-          <w:sz w:val="28"/>
-        </w:rPr>
-        <w:t xml:space="preserve">    join reads the bit. Depth stays one. Opening the app arms a waiting</w:t>
-      </w:r>
-    </w:p>
-    <w:p>
-      <w:pPr>
-        <w:spacing w:line="276" w:lineRule="auto"/>
-      </w:pPr>
-      <w:r>
-        <w:rPr>
-          <w:rFonts w:ascii="Arial" w:hAnsi="Arial"/>
-          <w:sz w:val="28"/>
-        </w:rPr>
-        <w:t xml:space="preserve">    item when it has come close enough. Several lead times on one item</w:t>
-      </w:r>
-    </w:p>
-    <w:p>
-      <w:pPr>
-        <w:spacing w:line="276" w:lineRule="auto"/>
-      </w:pPr>
-      <w:r>
-        <w:rPr>
-          <w:rFonts w:ascii="Arial" w:hAnsi="Arial"/>
-          <w:sz w:val="28"/>
-        </w:rPr>
-        <w:t xml:space="preserve">    also use that depth: only the soonest still ahead is armed. When it</w:t>
-      </w:r>
-    </w:p>
-    <w:p>
-      <w:pPr>
-        <w:spacing w:line="276" w:lineRule="auto"/>
-      </w:pPr>
-      <w:r>
-        <w:rPr>
-          <w:rFonts w:ascii="Arial" w:hAnsi="Arial"/>
-          <w:sz w:val="28"/>
-        </w:rPr>
-        <w:t xml:space="preserve">    has fired, the next run arms the next.</w:t>
-      </w:r>
-    </w:p>
-    <w:p>
-      <w:pPr>
-        <w:spacing w:line="276" w:lineRule="auto"/>
-      </w:pPr>
-      <w:r>
-        <w:rPr>
-          <w:rFonts w:ascii="Arial" w:hAnsi="Arial"/>
-          <w:sz w:val="28"/>
-        </w:rPr>
-        <w:t xml:space="preserve">14. EACH CLOSED-APP NOTICE HAS ITS OWN THREAD NAME (Patrick, #105-new).</w:t>
-      </w:r>
-    </w:p>
-    <w:p>
-      <w:pPr>
-        <w:spacing w:line="276" w:lineRule="auto"/>
-      </w:pPr>
-      <w:r>
-        <w:rPr>
-          <w:rFonts w:ascii="Arial" w:hAnsi="Arial"/>
-          <w:sz w:val="28"/>
-        </w:rPr>
-        <w:t xml:space="preserve">    The name is the reminder's key. This Expo does not yet hand that</w:t>
-      </w:r>
-    </w:p>
-    <w:p>
-      <w:pPr>
-        <w:spacing w:line="276" w:lineRule="auto"/>
-      </w:pPr>
-      <w:r>
-        <w:rPr>
-          <w:rFonts w:ascii="Arial" w:hAnsi="Arial"/>
-          <w:sz w:val="28"/>
-        </w:rPr>
-        <w:t xml:space="preserve">    name to the phone, so the listing-down-the-page will wait until</w:t>
-      </w:r>
-    </w:p>
-    <w:p>
-      <w:pPr>
-        <w:spacing w:line="276" w:lineRule="auto"/>
-      </w:pPr>
-      <w:r>
-        <w:rPr>
-          <w:rFonts w:ascii="Arial" w:hAnsi="Arial"/>
-          <w:sz w:val="28"/>
-        </w:rPr>
-        <w:t xml:space="preserve">    Expo is upgraded. The notification library was not poked.</w:t>
-      </w:r>
-    </w:p>
-    <w:p>
-      <w:pPr>
-        <w:spacing w:line="276" w:lineRule="auto"/>
-      </w:pPr>
-      <w:r>
-        <w:rPr>
-          <w:rFonts w:ascii="Arial" w:hAnsi="Arial"/>
-          <w:sz w:val="28"/>
-        </w:rPr>
-        <w:t xml:space="preserve">15. ONE TIME DOES NOT SKIP (Patrick, #107-new; built #108-new). It has</w:t>
-      </w:r>
-    </w:p>
-    <w:p>
-      <w:pPr>
-        <w:spacing w:line="276" w:lineRule="auto"/>
-      </w:pPr>
-      <w:r>
-        <w:rPr>
-          <w:rFonts w:ascii="Arial" w:hAnsi="Arial"/>
-          <w:sz w:val="28"/>
-        </w:rPr>
-        <w:t xml:space="preserve">    no next cycle. Its own banner set has Done, OK, and Delay 15 / 30 /</w:t>
-      </w:r>
-    </w:p>
-    <w:p>
-      <w:pPr>
-        <w:spacing w:line="276" w:lineRule="auto"/>
-      </w:pPr>
-      <w:r>
-        <w:rPr>
-          <w:rFonts w:ascii="Arial" w:hAnsi="Arial"/>
-          <w:sz w:val="28"/>
-        </w:rPr>
-        <w:t xml:space="preserve">    60 min. A delay has its own source and reaches the phone road.</w:t>
-      </w:r>
-    </w:p>
-    <w:p>
-      <w:pPr>
-        <w:spacing w:line="276" w:lineRule="auto"/>
-      </w:pPr>
-      <w:r>
-        <w:rPr>
-          <w:rFonts w:ascii="Arial" w:hAnsi="Arial"/>
-          <w:sz w:val="28"/>
-        </w:rPr>
-        <w:t xml:space="preserve">16. OPENING THROUGH A BANNER IS STILL AN OPENING (#107-new; built</w:t>
-      </w:r>
-    </w:p>
-    <w:p>
-      <w:pPr>
-        <w:spacing w:line="276" w:lineRule="auto"/>
-      </w:pPr>
-      <w:r>
-        <w:rPr>
-          <w:rFonts w:ascii="Arial" w:hAnsi="Arial"/>
-          <w:sz w:val="28"/>
-        </w:rPr>
-        <w:t xml:space="preserve">    #108-new). The day roll, scheduling, and missed-reminder telling</w:t>
-      </w:r>
-    </w:p>
-    <w:p>
-      <w:pPr>
-        <w:spacing w:line="276" w:lineRule="auto"/>
-      </w:pPr>
-      <w:r>
-        <w:rPr>
-          <w:rFonts w:ascii="Arial" w:hAnsi="Arial"/>
-          <w:sz w:val="28"/>
-        </w:rPr>
-        <w:t xml:space="preserve">    finish before the item's page is handed over.</w:t>
-      </w:r>
-    </w:p>
-    <w:p>
-      <w:pPr>
-        <w:spacing w:line="276" w:lineRule="auto"/>
-      </w:pPr>
-      <w:r>
-        <w:rPr>
-          <w:rFonts w:ascii="Arial" w:hAnsi="Arial"/>
-          <w:sz w:val="28"/>
-        </w:rPr>
-        <w:t xml:space="preserve">17. DONE'S SAVED STATE STOPS ITS OLD ALERT COPIES (#118-new). The</w:t>
-      </w:r>
-    </w:p>
-    <w:p>
-      <w:pPr>
-        <w:spacing w:line="276" w:lineRule="auto"/>
-      </w:pPr>
-      <w:r>
-        <w:rPr>
-          <w:rFonts w:ascii="Arial" w:hAnsi="Arial"/>
-          <w:sz w:val="28"/>
-        </w:rPr>
-        <w:t xml:space="preserve">    engine removes every queued base, delay, duplicate, or</w:t>
-      </w:r>
-    </w:p>
-    <w:p>
-      <w:pPr>
-        <w:spacing w:line="276" w:lineRule="auto"/>
-      </w:pPr>
-      <w:r>
-        <w:rPr>
-          <w:rFonts w:ascii="Arial" w:hAnsi="Arial"/>
-          <w:sz w:val="28"/>
-        </w:rPr>
-        <w:t xml:space="preserve">    retired-source copy carrying that item id, and dismisses banners</w:t>
-      </w:r>
-    </w:p>
-    <w:p>
-      <w:pPr>
-        <w:spacing w:line="276" w:lineRule="auto"/>
-      </w:pPr>
-      <w:r>
-        <w:rPr>
-          <w:rFonts w:ascii="Arial" w:hAnsi="Arial"/>
-          <w:sz w:val="28"/>
-        </w:rPr>
-        <w:t xml:space="preserve">    already delivered. It keeps the next legitimate cycle. The phone</w:t>
-      </w:r>
-    </w:p>
-    <w:p>
-      <w:pPr>
-        <w:spacing w:line="276" w:lineRule="auto"/>
-      </w:pPr>
-      <w:r>
-        <w:rPr>
-          <w:rFonts w:ascii="Arial" w:hAnsi="Arial"/>
-          <w:sz w:val="28"/>
-        </w:rPr>
-        <w:t xml:space="preserve">    is read back and a failed removal speaks instead of disappearing</w:t>
-      </w:r>
-    </w:p>
-    <w:p>
-      <w:pPr>
-        <w:spacing w:line="276" w:lineRule="auto"/>
-      </w:pPr>
-      <w:r>
-        <w:rPr>
-          <w:rFonts w:ascii="Arial" w:hAnsi="Arial"/>
-          <w:sz w:val="28"/>
-        </w:rPr>
-        <w:t xml:space="preserve">    silently.</w:t>
-      </w:r>
-    </w:p>
-    <w:p>
-      <w:pPr>
-        <w:spacing w:line="276" w:lineRule="auto"/>
-      </w:pPr>
-      <w:r>
-        <w:rPr>
-          <w:rFonts w:ascii="Arial" w:hAnsi="Arial"/>
-          <w:sz w:val="28"/>
-        </w:rPr>
-        <w:t xml:space="preserve">18. MEMORY'S OWN DOCUMENTS ARE THE LIVE ENGINE DESIGN. The separate</w:t>
-      </w:r>
-    </w:p>
-    <w:p>
-      <w:pPr>
-        <w:spacing w:line="276" w:lineRule="auto"/>
-      </w:pPr>
-      <w:r>
-        <w:rPr>
-          <w:rFonts w:ascii="Arial" w:hAnsi="Arial"/>
-          <w:sz w:val="28"/>
-        </w:rPr>
-        <w:t xml:space="preserve">    Reminder Engine folder remains the historical shared baseline at</w:t>
-      </w:r>
-    </w:p>
-    <w:p>
-      <w:pPr>
-        <w:spacing w:line="276" w:lineRule="auto"/>
-      </w:pPr>
-      <w:r>
-        <w:rPr>
-          <w:rFonts w:ascii="Arial" w:hAnsi="Arial"/>
-          <w:sz w:val="28"/>
-        </w:rPr>
-        <w:t xml:space="preserve">    Reminder Engine 4. Students-Assistant is going away, so that folder</w:t>
-      </w:r>
-    </w:p>
-    <w:p>
-      <w:pPr>
-        <w:spacing w:line="276" w:lineRule="auto"/>
-      </w:pPr>
-      <w:r>
-        <w:rPr>
-          <w:rFonts w:ascii="Arial" w:hAnsi="Arial"/>
-          <w:sz w:val="28"/>
-        </w:rPr>
-        <w:t xml:space="preserve">    is not brought current as a second copy (#118-new).</w:t>
-      </w:r>
-    </w:p>
-    <w:p>
-      <w:pPr>
-        <w:spacing w:line="276" w:lineRule="auto"/>
-      </w:pPr>
-      <w:r>
-        <w:rPr>
-          <w:rFonts w:ascii="Arial" w:hAnsi="Arial"/>
-          <w:sz w:val="28"/>
-        </w:rPr>
-        <w:t xml:space="preserve">19. THE ANDROID NAME IS com.molliedog.ElderlyAssistant (Patrick,</w:t>
-      </w:r>
-    </w:p>
-    <w:p>
-      <w:pPr>
-        <w:spacing w:line="276" w:lineRule="auto"/>
-      </w:pPr>
-      <w:r>
-        <w:rPr>
-          <w:rFonts w:ascii="Arial" w:hAnsi="Arial"/>
-          <w:sz w:val="28"/>
-        </w:rPr>
-        <w:t xml:space="preserve">    #121-new). The same id as the iPhone.</w:t>
-      </w:r>
-    </w:p>
-    <w:p>
-      <w:pPr>
-        <w:spacing w:line="276" w:lineRule="auto"/>
-      </w:pPr>
-      <w:r>
-        <w:rPr>
-          <w:rFonts w:ascii="Arial" w:hAnsi="Arial"/>
-          <w:sz w:val="28"/>
-        </w:rPr>
-        <w:t xml:space="preserve">20. THE ANDROID PATH IS GOOGLE PLAY (Patrick, 2026-10-01). The same</w:t>
-      </w:r>
-    </w:p>
-    <w:p>
-      <w:pPr>
-        <w:spacing w:line="276" w:lineRule="auto"/>
-      </w:pPr>
-      <w:r>
-        <w:rPr>
-          <w:rFonts w:ascii="Arial" w:hAnsi="Arial"/>
-          <w:sz w:val="28"/>
-        </w:rPr>
-        <w:t xml:space="preserve">    kind of road as the iPhone App Store. The account was submitted</w:t>
-      </w:r>
-    </w:p>
-    <w:p>
-      <w:pPr>
-        <w:spacing w:line="276" w:lineRule="auto"/>
-      </w:pPr>
-      <w:r>
-        <w:rPr>
-          <w:rFonts w:ascii="Arial" w:hAnsi="Arial"/>
-          <w:sz w:val="28"/>
-        </w:rPr>
-        <w:t xml:space="preserve">    on 2026-10-01. Google said they would let you know. Do not raise</w:t>
-      </w:r>
-    </w:p>
-    <w:p>
-      <w:pPr>
-        <w:spacing w:line="276" w:lineRule="auto"/>
-      </w:pPr>
-      <w:r>
-        <w:rPr>
-          <w:rFonts w:ascii="Arial" w:hAnsi="Arial"/>
-          <w:sz w:val="28"/>
-        </w:rPr>
-        <w:t xml:space="preserve">    the closed-test count (Patrick, #122-new).</w:t>
-      </w:r>
-    </w:p>
-    <w:p>
-      <w:pPr>
-        <w:spacing w:line="276" w:lineRule="auto"/>
-      </w:pPr>
-      <w:r>
-        <w:rPr>
-          <w:rFonts w:ascii="Arial" w:hAnsi="Arial"/>
-          <w:sz w:val="28"/>
-        </w:rPr>
-        <w:t xml:space="preserve">21. GOOGLE, LOOKED UP 2026-09-30. Play is US$25 once, with no yearly</w:t>
-      </w:r>
-    </w:p>
-    <w:p>
-      <w:pPr>
-        <w:spacing w:line="276" w:lineRule="auto"/>
-      </w:pPr>
-      <w:r>
-        <w:rPr>
-          <w:rFonts w:ascii="Arial" w:hAnsi="Arial"/>
-          <w:sz w:val="28"/>
-        </w:rPr>
-        <w:t xml:space="preserve">    charge. The account check is what is in progress. Do not raise</w:t>
-      </w:r>
-    </w:p>
-    <w:p>
-      <w:pPr>
-        <w:spacing w:line="276" w:lineRule="auto"/>
-      </w:pPr>
-      <w:r>
-        <w:rPr>
-          <w:rFonts w:ascii="Arial" w:hAnsi="Arial"/>
-          <w:sz w:val="28"/>
-        </w:rPr>
-        <w:t xml:space="preserve">    the closed-test count (Patrick, #122-new).</w:t>
-      </w:r>
-    </w:p>
-    <w:p>
-      <w:pPr>
-        <w:spacing w:line="276" w:lineRule="auto"/>
-      </w:pPr>
-      <w:r>
-        <w:rPr>
-          <w:rFonts w:ascii="Arial" w:hAnsi="Arial"/>
-          <w:sz w:val="28"/>
-        </w:rPr>
-        <w:t xml:space="preserve">22. THE WEBSITE INSTALL FILE IS 110 MB (2026-09-30). It is on this</w:t>
-      </w:r>
-    </w:p>
-    <w:p>
-      <w:pPr>
-        <w:spacing w:line="276" w:lineRule="auto"/>
-      </w:pPr>
-      <w:r>
-        <w:rPr>
-          <w:rFonts w:ascii="Arial" w:hAnsi="Arial"/>
-          <w:sz w:val="28"/>
-        </w:rPr>
-        <w:t xml:space="preserve">    Mac at dist/Memory-1.0.0-preview.apk. A file added through the</w:t>
-      </w:r>
-    </w:p>
-    <w:p>
-      <w:pPr>
-        <w:spacing w:line="276" w:lineRule="auto"/>
-      </w:pPr>
-      <w:r>
-        <w:rPr>
-          <w:rFonts w:ascii="Arial" w:hAnsi="Arial"/>
-          <w:sz w:val="28"/>
-        </w:rPr>
-        <w:t xml:space="preserve">    GitHub website can be no larger than 25 MB. A file sent by git</w:t>
-      </w:r>
-    </w:p>
-    <w:p>
-      <w:pPr>
-        <w:spacing w:line="276" w:lineRule="auto"/>
-      </w:pPr>
-      <w:r>
-        <w:rPr>
-          <w:rFonts w:ascii="Arial" w:hAnsi="Arial"/>
-          <w:sz w:val="28"/>
-        </w:rPr>
-        <w:t xml:space="preserve">    is blocked over 100 MB. That file is not how Memory goes on</w:t>
-      </w:r>
-    </w:p>
-    <w:p>
-      <w:pPr>
-        <w:spacing w:line="276" w:lineRule="auto"/>
-      </w:pPr>
-      <w:r>
-        <w:rPr>
-          <w:rFonts w:ascii="Arial" w:hAnsi="Arial"/>
-          <w:sz w:val="28"/>
-        </w:rPr>
-        <w:t xml:space="preserve">    Android.</w:t>
-      </w:r>
-    </w:p>
-    <w:p>
-      <w:pPr>
-        <w:spacing w:line="276" w:lineRule="auto"/>
-      </w:pPr>
-      <w:r>
-        <w:rPr>
-          <w:rFonts w:ascii="Arial" w:hAnsi="Arial"/>
-          <w:sz w:val="28"/>
-        </w:rPr>
-        <w:t xml:space="preserve">23. THE APP IS $9.99 ONCE (Patrick, #123-new). The same on the iPhone</w:t>
-      </w:r>
-    </w:p>
-    <w:p>
-      <w:pPr>
-        <w:spacing w:line="276" w:lineRule="auto"/>
-      </w:pPr>
-      <w:r>
-        <w:rPr>
-          <w:rFonts w:ascii="Arial" w:hAnsi="Arial"/>
-          <w:sz w:val="28"/>
-        </w:rPr>
-        <w:t xml:space="preserve">    and on Android. There is no trial. The iPhone listing has that</w:t>
-      </w:r>
-    </w:p>
-    <w:p>
-      <w:pPr>
-        <w:spacing w:line="276" w:lineRule="auto"/>
-      </w:pPr>
-      <w:r>
-        <w:rPr>
-          <w:rFonts w:ascii="Arial" w:hAnsi="Arial"/>
-          <w:sz w:val="28"/>
-        </w:rPr>
-        <w:t xml:space="preserve">    price. The Paid Apps Agreement, the bank, and the W-9 are Active.</w:t>
-      </w:r>
-    </w:p>
-    <w:p>
-      <w:pPr>
-        <w:spacing w:line="276" w:lineRule="auto"/>
-      </w:pPr>
-      <w:r>
-        <w:rPr>
-          <w:rFonts w:ascii="Arial" w:hAnsi="Arial"/>
-          <w:sz w:val="28"/>
-        </w:rPr>
-        <w:t xml:space="preserve">24. DO NOT FILE A TRADEMARK ON THE NAME (Patrick, #123-new). Use it.</w:t>
-      </w:r>
-    </w:p>
-    <w:p>
-      <w:pPr>
-        <w:spacing w:line="276" w:lineRule="auto"/>
-      </w:pPr>
-      <w:r>
-        <w:rPr>
-          <w:rFonts w:ascii="Arial" w:hAnsi="Arial"/>
-          <w:sz w:val="28"/>
-        </w:rPr>
-        <w:t xml:space="preserve">    The copyright line is your name and the year.</w:t>
-      </w:r>
-    </w:p>
-    <w:p>
-      <w:pPr>
-        <w:spacing w:line="276" w:lineRule="auto"/>
-      </w:pPr>
-      <w:r>
-        <w:rPr>
-          <w:rFonts w:ascii="Arial" w:hAnsi="Arial"/>
-          <w:sz w:val="28"/>
-        </w:rPr>
-        <w:t xml:space="preserve">25. DO NOT TAKE UP XCODE CLOUD (Patrick, #123-new). Stay with the Expo</w:t>
-      </w:r>
-    </w:p>
-    <w:p>
-      <w:pPr>
-        <w:spacing w:line="276" w:lineRule="auto"/>
-      </w:pPr>
-      <w:r>
-        <w:rPr>
-          <w:rFonts w:ascii="Arial" w:hAnsi="Arial"/>
-          <w:sz w:val="28"/>
-        </w:rPr>
-        <w:t xml:space="preserve">    build steps.</w:t>
-      </w:r>
-    </w:p>
-    <w:p>
-      <w:pPr>
-        <w:spacing w:line="276" w:lineRule="auto"/>
-      </w:pPr>
-      <w:r>
-        <w:rPr>
-          <w:rFonts w:ascii="Arial" w:hAnsi="Arial"/>
-          <w:sz w:val="28"/>
-        </w:rPr>
-        <w:t xml:space="preserve">26. DONE'S CHECK LASTS THAT DAY ONLY (Patrick, #127-new). Weekly,</w:t>
-      </w:r>
-    </w:p>
-    <w:p>
-      <w:pPr>
-        <w:spacing w:line="276" w:lineRule="auto"/>
-      </w:pPr>
-      <w:r>
-        <w:rPr>
-          <w:rFonts w:ascii="Arial" w:hAnsi="Arial"/>
-          <w:sz w:val="28"/>
-        </w:rPr>
-        <w:t xml:space="preserve">    Monthly, Quarterly, Yearly, Birthdays, and One Time. The morning</w:t>
-      </w:r>
-    </w:p>
-    <w:p>
-      <w:pPr>
-        <w:spacing w:line="276" w:lineRule="auto"/>
-      </w:pPr>
-      <w:r>
-        <w:rPr>
-          <w:rFonts w:ascii="Arial" w:hAnsi="Arial"/>
-          <w:sz w:val="28"/>
-        </w:rPr>
-        <w:t xml:space="preserve">    takes it off. Weekly still spends this week until the next</w:t>
-      </w:r>
-    </w:p>
-    <w:p>
-      <w:pPr>
-        <w:spacing w:line="276" w:lineRule="auto"/>
-      </w:pPr>
-      <w:r>
-        <w:rPr>
-          <w:rFonts w:ascii="Arial" w:hAnsi="Arial"/>
-          <w:sz w:val="28"/>
-        </w:rPr>
-        <w:t xml:space="preserve">    speaking time, so it does not fire again after the check is gone.</w:t>
-      </w:r>
-    </w:p>
-    <w:p>
-      <w:pPr>
-        <w:spacing w:line="276" w:lineRule="auto"/>
-      </w:pPr>
-      <w:r>
-        <w:rPr>
-          <w:rFonts w:ascii="Arial" w:hAnsi="Arial"/>
-          <w:sz w:val="28"/>
-        </w:rPr>
-        <w:t xml:space="preserve">    Appointments and Bucket List stay finished. Daily already worked</w:t>
-      </w:r>
-    </w:p>
-    <w:p>
-      <w:pPr>
-        <w:spacing w:line="276" w:lineRule="auto"/>
-      </w:pPr>
-      <w:r>
-        <w:rPr>
-          <w:rFonts w:ascii="Arial" w:hAnsi="Arial"/>
-          <w:sz w:val="28"/>
-        </w:rPr>
-        <w:t xml:space="preserve">    this way. In the machine, not a display patch.</w:t>
       </w:r>
     </w:p>
     <w:p>

</xml_diff>

<commit_message>
132—new - Memory - Fix Items with Options set Date.
</commit_message>
<xml_diff>
--- a/docs/pending.docx
+++ b/docs/pending.docx
@@ -24,7 +24,7 @@
           <w:rFonts w:ascii="Arial" w:hAnsi="Arial"/>
           <w:sz w:val="28"/>
         </w:rPr>
-        <w:t xml:space="preserve">Last updated: 2026-10-06</w:t>
+        <w:t xml:space="preserve">Last updated: 2026-10-09</w:t>
       </w:r>
     </w:p>
     <w:p>
@@ -325,7 +325,55 @@
           <w:rFonts w:ascii="Arial" w:hAnsi="Arial"/>
           <w:sz w:val="28"/>
         </w:rPr>
-        <w:t xml:space="preserve">1. PHONE TEXT SIZE ON A FRESH OPEN. You set the phone's text larger</w:t>
+        <w:t xml:space="preserve">1. ANDROID INTERNAL TEST. You approved the next Android build. That</w:t>
+      </w:r>
+    </w:p>
+    <w:p>
+      <w:pPr>
+        <w:spacing w:line="276" w:lineRule="auto"/>
+      </w:pPr>
+      <w:r>
+        <w:rPr>
+          <w:rFonts w:ascii="Arial" w:hAnsi="Arial"/>
+          <w:sz w:val="28"/>
+        </w:rPr>
+        <w:t xml:space="preserve">   work is committed. It goes to the internal test the Galaxy</w:t>
+      </w:r>
+    </w:p>
+    <w:p>
+      <w:pPr>
+        <w:spacing w:line="276" w:lineRule="auto"/>
+      </w:pPr>
+      <w:r>
+        <w:rPr>
+          <w:rFonts w:ascii="Arial" w:hAnsi="Arial"/>
+          <w:sz w:val="28"/>
+        </w:rPr>
+        <w:t xml:space="preserve">   already uses. The Galaxy still has build 3 until that load arrives.</w:t>
+      </w:r>
+    </w:p>
+    <w:p>
+      <w:pPr>
+        <w:spacing w:line="276" w:lineRule="auto"/>
+      </w:pPr>
+      <w:r>
+        <w:rPr>
+          <w:rFonts w:ascii="Arial" w:hAnsi="Arial"/>
+          <w:sz w:val="28"/>
+        </w:rPr>
+        <w:t xml:space="preserve">   The public listing still waits.</w:t>
+      </w:r>
+    </w:p>
+    <w:p>
+      <w:pPr>
+        <w:spacing w:line="276" w:lineRule="auto"/>
+      </w:pPr>
+      <w:r>
+        <w:rPr>
+          <w:rFonts w:ascii="Arial" w:hAnsi="Arial"/>
+          <w:sz w:val="28"/>
+        </w:rPr>
+        <w:t xml:space="preserve">2. PHONE TEXT SIZE ON A FRESH OPEN. You set the phone's text larger</w:t>
       </w:r>
     </w:p>
     <w:p>
@@ -409,7 +457,67 @@
           <w:rFonts w:ascii="Arial" w:hAnsi="Arial"/>
           <w:sz w:val="28"/>
         </w:rPr>
-        <w:t xml:space="preserve">2. PHONE PROOF FOR DONE'S ONE-DAY CHECK. Weekly, Monthly, Quarterly,</w:t>
+        <w:t xml:space="preserve">3. LONG LIST REORDER. A long reminder list keeps each row's place in</w:t>
+      </w:r>
+    </w:p>
+    <w:p>
+      <w:pPr>
+        <w:spacing w:line="276" w:lineRule="auto"/>
+      </w:pPr>
+      <w:r>
+        <w:rPr>
+          <w:rFonts w:ascii="Arial" w:hAnsi="Arial"/>
+          <w:sz w:val="28"/>
+        </w:rPr>
+        <w:t xml:space="preserve">   the list, and how far the list has been scrolled. The row under</w:t>
+      </w:r>
+    </w:p>
+    <w:p>
+      <w:pPr>
+        <w:spacing w:line="276" w:lineRule="auto"/>
+      </w:pPr>
+      <w:r>
+        <w:rPr>
+          <w:rFonts w:ascii="Arial" w:hAnsi="Arial"/>
+          <w:sz w:val="28"/>
+        </w:rPr>
+        <w:t xml:space="preserve">   your finger is that place, shifted by the scroll. A short move</w:t>
+      </w:r>
+    </w:p>
+    <w:p>
+      <w:pPr>
+        <w:spacing w:line="276" w:lineRule="auto"/>
+      </w:pPr>
+      <w:r>
+        <w:rPr>
+          <w:rFonts w:ascii="Arial" w:hAnsi="Arial"/>
+          <w:sz w:val="28"/>
+        </w:rPr>
+        <w:t xml:space="preserve">   lands a short distance away. The neighbors still make room. This</w:t>
+      </w:r>
+    </w:p>
+    <w:p>
+      <w:pPr>
+        <w:spacing w:line="276" w:lineRule="auto"/>
+      </w:pPr>
+      <w:r>
+        <w:rPr>
+          <w:rFonts w:ascii="Arial" w:hAnsi="Arial"/>
+          <w:sz w:val="28"/>
+        </w:rPr>
+        <w:t xml:space="preserve">   is in the project and not on the phone (#130-new).</w:t>
+      </w:r>
+    </w:p>
+    <w:p>
+      <w:pPr>
+        <w:spacing w:line="276" w:lineRule="auto"/>
+      </w:pPr>
+      <w:r>
+        <w:rPr>
+          <w:rFonts w:ascii="Arial" w:hAnsi="Arial"/>
+          <w:sz w:val="28"/>
+        </w:rPr>
+        <w:t xml:space="preserve">4. PHONE PROOF FOR DONE'S ONE-DAY CHECK. Weekly, Monthly, Quarterly,</w:t>
       </w:r>
     </w:p>
     <w:p>
@@ -457,7 +565,7 @@
           <w:rFonts w:ascii="Arial" w:hAnsi="Arial"/>
           <w:sz w:val="28"/>
         </w:rPr>
-        <w:t xml:space="preserve">   takes the check off. Build 110 is already on the iPhone for the</w:t>
+        <w:t xml:space="preserve">   takes the check off. Build 114 is already on the iPhone for the</w:t>
       </w:r>
     </w:p>
     <w:p>
@@ -517,19 +625,19 @@
           <w:rFonts w:ascii="Arial" w:hAnsi="Arial"/>
           <w:sz w:val="28"/>
         </w:rPr>
-        <w:t xml:space="preserve">   restore is in the project and not on the phone. The Daily 15, 30,</w:t>
-      </w:r>
-    </w:p>
-    <w:p>
-      <w:pPr>
-        <w:spacing w:line="276" w:lineRule="auto"/>
-      </w:pPr>
-      <w:r>
-        <w:rPr>
-          <w:rFonts w:ascii="Arial" w:hAnsi="Arial"/>
-          <w:sz w:val="28"/>
-        </w:rPr>
-        <w:t xml:space="preserve">   and 60 minute buttons are half as wide, and that is not on the</w:t>
+        <w:t xml:space="preserve">   restore is in the project and not on the phone. The Daily Snooze</w:t>
+      </w:r>
+    </w:p>
+    <w:p>
+      <w:pPr>
+        <w:spacing w:line="276" w:lineRule="auto"/>
+      </w:pPr>
+      <w:r>
+        <w:rPr>
+          <w:rFonts w:ascii="Arial" w:hAnsi="Arial"/>
+          <w:sz w:val="28"/>
+        </w:rPr>
+        <w:t xml:space="preserve">   modal shares its row in three even parts, and that is not on the</w:t>
       </w:r>
     </w:p>
     <w:p>
@@ -553,7 +661,7 @@
           <w:rFonts w:ascii="Arial" w:hAnsi="Arial"/>
           <w:sz w:val="28"/>
         </w:rPr>
-        <w:t xml:space="preserve">3. IOS BUILD 100 is Waiting for Review. When Apple approves, you</w:t>
+        <w:t xml:space="preserve">5. IOS BUILD 100 is Waiting for Review. When Apple approves, you</w:t>
       </w:r>
     </w:p>
     <w:p>
@@ -577,126 +685,6 @@
           <w:rFonts w:ascii="Arial" w:hAnsi="Arial"/>
           <w:sz w:val="28"/>
         </w:rPr>
-        <w:t xml:space="preserve">4. THE BOTTOM OF THE GALAXY SCREEN. The phone uses about half an inch</w:t>
-      </w:r>
-    </w:p>
-    <w:p>
-      <w:pPr>
-        <w:spacing w:line="276" w:lineRule="auto"/>
-      </w:pPr>
-      <w:r>
-        <w:rPr>
-          <w:rFonts w:ascii="Arial" w:hAnsi="Arial"/>
-          <w:sz w:val="28"/>
-        </w:rPr>
-        <w:t xml:space="preserve">   at the bottom, and Android stays upright. The project keeps the page</w:t>
-      </w:r>
-    </w:p>
-    <w:p>
-      <w:pPr>
-        <w:spacing w:line="276" w:lineRule="auto"/>
-      </w:pPr>
-      <w:r>
-        <w:rPr>
-          <w:rFonts w:ascii="Arial" w:hAnsi="Arial"/>
-          <w:sz w:val="28"/>
-        </w:rPr>
-        <w:t xml:space="preserve">   body above that strip. The copy on your Galaxy is still the old</w:t>
-      </w:r>
-    </w:p>
-    <w:p>
-      <w:pPr>
-        <w:spacing w:line="276" w:lineRule="auto"/>
-      </w:pPr>
-      <w:r>
-        <w:rPr>
-          <w:rFonts w:ascii="Arial" w:hAnsi="Arial"/>
-          <w:sz w:val="28"/>
-        </w:rPr>
-        <w:t xml:space="preserve">   preview. It changes when a new install file is built (2026-10-01).</w:t>
-      </w:r>
-    </w:p>
-    <w:p>
-      <w:pPr>
-        <w:spacing w:line="276" w:lineRule="auto"/>
-      </w:pPr>
-      <w:r>
-        <w:rPr>
-          <w:rFonts w:ascii="Arial" w:hAnsi="Arial"/>
-          <w:sz w:val="28"/>
-        </w:rPr>
-        <w:t xml:space="preserve">5. THE PLAY ACCOUNT. You submitted it. Google has not opened it.</w:t>
-      </w:r>
-    </w:p>
-    <w:p>
-      <w:pPr>
-        <w:spacing w:line="276" w:lineRule="auto"/>
-      </w:pPr>
-      <w:r>
-        <w:rPr>
-          <w:rFonts w:ascii="Arial" w:hAnsi="Arial"/>
-          <w:sz w:val="28"/>
-        </w:rPr>
-        <w:t xml:space="preserve">   The file is Android only, and it is not sent to Play until the</w:t>
-      </w:r>
-    </w:p>
-    <w:p>
-      <w:pPr>
-        <w:spacing w:line="276" w:lineRule="auto"/>
-      </w:pPr>
-      <w:r>
-        <w:rPr>
-          <w:rFonts w:ascii="Arial" w:hAnsi="Arial"/>
-          <w:sz w:val="28"/>
-        </w:rPr>
-        <w:t xml:space="preserve">   account can take the app. The Android count on Expo went from 1</w:t>
-      </w:r>
-    </w:p>
-    <w:p>
-      <w:pPr>
-        <w:spacing w:line="276" w:lineRule="auto"/>
-      </w:pPr>
-      <w:r>
-        <w:rPr>
-          <w:rFonts w:ascii="Arial" w:hAnsi="Arial"/>
-          <w:sz w:val="28"/>
-        </w:rPr>
-        <w:t xml:space="preserve">   to 2. The build page is on expo.dev under molliedog,</w:t>
-      </w:r>
-    </w:p>
-    <w:p>
-      <w:pPr>
-        <w:spacing w:line="276" w:lineRule="auto"/>
-      </w:pPr>
-      <w:r>
-        <w:rPr>
-          <w:rFonts w:ascii="Arial" w:hAnsi="Arial"/>
-          <w:sz w:val="28"/>
-        </w:rPr>
-        <w:t xml:space="preserve">   ElderlyAssistant, build 7d816ec8 (Patrick, #124-new). The 110 MB</w:t>
-      </w:r>
-    </w:p>
-    <w:p>
-      <w:pPr>
-        <w:spacing w:line="276" w:lineRule="auto"/>
-      </w:pPr>
-      <w:r>
-        <w:rPr>
-          <w:rFonts w:ascii="Arial" w:hAnsi="Arial"/>
-          <w:sz w:val="28"/>
-        </w:rPr>
-        <w:t xml:space="preserve">   file on this Mac is not that file.</w:t>
-      </w:r>
-    </w:p>
-    <w:p>
-      <w:pPr>
-        <w:spacing w:line="276" w:lineRule="auto"/>
-      </w:pPr>
-      <w:r>
-        <w:rPr>
-          <w:rFonts w:ascii="Arial" w:hAnsi="Arial"/>
-          <w:sz w:val="28"/>
-        </w:rPr>
         <w:t xml:space="preserve">6. THE PRICE ON ANDROID. $9.99 once, no trial. The iPhone listing</w:t>
       </w:r>
     </w:p>
@@ -709,19 +697,163 @@
           <w:rFonts w:ascii="Arial" w:hAnsi="Arial"/>
           <w:sz w:val="28"/>
         </w:rPr>
-        <w:t xml:space="preserve">   already has that price. Android waits until the Play account can</w:t>
-      </w:r>
-    </w:p>
-    <w:p>
-      <w:pPr>
-        <w:spacing w:line="276" w:lineRule="auto"/>
-      </w:pPr>
-      <w:r>
-        <w:rPr>
-          <w:rFonts w:ascii="Arial" w:hAnsi="Arial"/>
-          <w:sz w:val="28"/>
-        </w:rPr>
-        <w:t xml:space="preserve">   take the app (#123-new).</w:t>
+        <w:t xml:space="preserve">   already has that price. The Play account is open, and build 3 is</w:t>
+      </w:r>
+    </w:p>
+    <w:p>
+      <w:pPr>
+        <w:spacing w:line="276" w:lineRule="auto"/>
+      </w:pPr>
+      <w:r>
+        <w:rPr>
+          <w:rFonts w:ascii="Arial" w:hAnsi="Arial"/>
+          <w:sz w:val="28"/>
+        </w:rPr>
+        <w:t xml:space="preserve">   the internal test on your Galaxy (#128-new). The public Android</w:t>
+      </w:r>
+    </w:p>
+    <w:p>
+      <w:pPr>
+        <w:spacing w:line="276" w:lineRule="auto"/>
+      </w:pPr>
+      <w:r>
+        <w:rPr>
+          <w:rFonts w:ascii="Arial" w:hAnsi="Arial"/>
+          <w:sz w:val="28"/>
+        </w:rPr>
+        <w:t xml:space="preserve">   listing still waits (#123-new).</w:t>
+      </w:r>
+    </w:p>
+    <w:p>
+      <w:pPr>
+        <w:spacing w:line="276" w:lineRule="auto"/>
+      </w:pPr>
+      <w:r>
+        <w:rPr>
+          <w:rFonts w:ascii="Arial" w:hAnsi="Arial"/>
+          <w:sz w:val="28"/>
+        </w:rPr>
+        <w:t xml:space="preserve">7. ANDROID BACKUP FOLDER. Export on Android asks you to choose a</w:t>
+      </w:r>
+    </w:p>
+    <w:p>
+      <w:pPr>
+        <w:spacing w:line="276" w:lineRule="auto"/>
+      </w:pPr>
+      <w:r>
+        <w:rPr>
+          <w:rFonts w:ascii="Arial" w:hAnsi="Arial"/>
+          <w:sz w:val="28"/>
+        </w:rPr>
+        <w:t xml:space="preserve">   folder on the phone and saves the backup there. The iPhone keeps</w:t>
+      </w:r>
+    </w:p>
+    <w:p>
+      <w:pPr>
+        <w:spacing w:line="276" w:lineRule="auto"/>
+      </w:pPr>
+      <w:r>
+        <w:rPr>
+          <w:rFonts w:ascii="Arial" w:hAnsi="Arial"/>
+          <w:sz w:val="28"/>
+        </w:rPr>
+        <w:t xml:space="preserve">   the share screen. Not on the phone (#130-new). On the Galaxy, in</w:t>
+      </w:r>
+    </w:p>
+    <w:p>
+      <w:pPr>
+        <w:spacing w:line="276" w:lineRule="auto"/>
+      </w:pPr>
+      <w:r>
+        <w:rPr>
+          <w:rFonts w:ascii="Arial" w:hAnsi="Arial"/>
+          <w:sz w:val="28"/>
+        </w:rPr>
+        <w:t xml:space="preserve">   128, Restore only opened a backup that had already been downloaded</w:t>
+      </w:r>
+    </w:p>
+    <w:p>
+      <w:pPr>
+        <w:spacing w:line="276" w:lineRule="auto"/>
+      </w:pPr>
+      <w:r>
+        <w:rPr>
+          <w:rFonts w:ascii="Arial" w:hAnsi="Arial"/>
+          <w:sz w:val="28"/>
+        </w:rPr>
+        <w:t xml:space="preserve">   onto the phone. Export would not save a file on the phone.</w:t>
+      </w:r>
+    </w:p>
+    <w:p>
+      <w:pPr>
+        <w:spacing w:line="276" w:lineRule="auto"/>
+      </w:pPr>
+      <w:r>
+        <w:rPr>
+          <w:rFonts w:ascii="Arial" w:hAnsi="Arial"/>
+          <w:sz w:val="28"/>
+        </w:rPr>
+        <w:t xml:space="preserve">8. DAILY MINUTES. Ask for 5, 10, and the rest, with no wheel. For</w:t>
+      </w:r>
+    </w:p>
+    <w:p>
+      <w:pPr>
+        <w:spacing w:line="276" w:lineRule="auto"/>
+      </w:pPr>
+      <w:r>
+        <w:rPr>
+          <w:rFonts w:ascii="Arial" w:hAnsi="Arial"/>
+          <w:sz w:val="28"/>
+        </w:rPr>
+        <w:t xml:space="preserve">   the next session (#132-new).</w:t>
+      </w:r>
+    </w:p>
+    <w:p>
+      <w:pPr>
+        <w:spacing w:line="276" w:lineRule="auto"/>
+      </w:pPr>
+      <w:r>
+        <w:rPr>
+          <w:rFonts w:ascii="Arial" w:hAnsi="Arial"/>
+          <w:sz w:val="28"/>
+        </w:rPr>
+        <w:t xml:space="preserve">9. MONTHLY HOLIDAYS. Ask whether the reminder should move for</w:t>
+      </w:r>
+    </w:p>
+    <w:p>
+      <w:pPr>
+        <w:spacing w:line="276" w:lineRule="auto"/>
+      </w:pPr>
+      <w:r>
+        <w:rPr>
+          <w:rFonts w:ascii="Arial" w:hAnsi="Arial"/>
+          <w:sz w:val="28"/>
+        </w:rPr>
+        <w:t xml:space="preserve">   holidays. A display change. For the next session (#132-new).</w:t>
+      </w:r>
+    </w:p>
+    <w:p>
+      <w:pPr>
+        <w:spacing w:line="276" w:lineRule="auto"/>
+      </w:pPr>
+      <w:r>
+        <w:rPr>
+          <w:rFonts w:ascii="Arial" w:hAnsi="Arial"/>
+          <w:sz w:val="28"/>
+        </w:rPr>
+        <w:t xml:space="preserve">10. ANDROID BACKUP AND RESTORE. The fix from before. A display</w:t>
+      </w:r>
+    </w:p>
+    <w:p>
+      <w:pPr>
+        <w:spacing w:line="276" w:lineRule="auto"/>
+      </w:pPr>
+      <w:r>
+        <w:rPr>
+          <w:rFonts w:ascii="Arial" w:hAnsi="Arial"/>
+          <w:sz w:val="28"/>
+        </w:rPr>
+        <w:t xml:space="preserve">    change. For the next session (#132-new).</w:t>
       </w:r>
     </w:p>
     <w:p>
@@ -904,6 +1036,474 @@
           <w:sz w:val="28"/>
         </w:rPr>
         <w:t xml:space="preserve">docs/handoff-history.md.</w:t>
+      </w:r>
+    </w:p>
+    <w:p>
+      <w:pPr>
+        <w:spacing w:line="276" w:lineRule="auto"/>
+      </w:pPr>
+      <w:r>
+        <w:rPr>
+          <w:rFonts w:ascii="Arial" w:hAnsi="Arial"/>
+          <w:sz w:val="28"/>
+        </w:rPr>
+        <w:t xml:space="preserve"/>
+      </w:r>
+    </w:p>
+    <w:p>
+      <w:pPr>
+        <w:spacing w:line="276" w:lineRule="auto"/>
+      </w:pPr>
+      <w:r>
+        <w:rPr>
+          <w:rFonts w:ascii="Arial" w:hAnsi="Arial"/>
+          <w:sz w:val="28"/>
+        </w:rPr>
+        <w:t xml:space="preserve">196. #132-new — The two Monthly options are named Same Day Nth Week</w:t>
+      </w:r>
+    </w:p>
+    <w:p>
+      <w:pPr>
+        <w:spacing w:line="276" w:lineRule="auto"/>
+      </w:pPr>
+      <w:r>
+        <w:rPr>
+          <w:rFonts w:ascii="Arial" w:hAnsi="Arial"/>
+          <w:sz w:val="28"/>
+        </w:rPr>
+        <w:t xml:space="preserve">    and Day of First Full Week. Not on the phone.</w:t>
+      </w:r>
+    </w:p>
+    <w:p>
+      <w:pPr>
+        <w:spacing w:line="276" w:lineRule="auto"/>
+      </w:pPr>
+      <w:r>
+        <w:rPr>
+          <w:rFonts w:ascii="Arial" w:hAnsi="Arial"/>
+          <w:sz w:val="28"/>
+        </w:rPr>
+        <w:t xml:space="preserve"/>
+      </w:r>
+    </w:p>
+    <w:p>
+      <w:pPr>
+        <w:spacing w:line="276" w:lineRule="auto"/>
+      </w:pPr>
+      <w:r>
+        <w:rPr>
+          <w:rFonts w:ascii="Arial" w:hAnsi="Arial"/>
+          <w:sz w:val="28"/>
+        </w:rPr>
+        <w:t xml:space="preserve">195. #132-new — A second Thursday and a Wednesday after the 6th are</w:t>
+      </w:r>
+    </w:p>
+    <w:p>
+      <w:pPr>
+        <w:spacing w:line="276" w:lineRule="auto"/>
+      </w:pPr>
+      <w:r>
+        <w:rPr>
+          <w:rFonts w:ascii="Arial" w:hAnsi="Arial"/>
+          <w:sz w:val="28"/>
+        </w:rPr>
+        <w:t xml:space="preserve">    on Monthly only. Quarterly and Yearly have Time zone and Holidays.</w:t>
+      </w:r>
+    </w:p>
+    <w:p>
+      <w:pPr>
+        <w:spacing w:line="276" w:lineRule="auto"/>
+      </w:pPr>
+      <w:r>
+        <w:rPr>
+          <w:rFonts w:ascii="Arial" w:hAnsi="Arial"/>
+          <w:sz w:val="28"/>
+        </w:rPr>
+        <w:t xml:space="preserve">    One already set on Quarterly or Yearly is no longer used. Not on</w:t>
+      </w:r>
+    </w:p>
+    <w:p>
+      <w:pPr>
+        <w:spacing w:line="276" w:lineRule="auto"/>
+      </w:pPr>
+      <w:r>
+        <w:rPr>
+          <w:rFonts w:ascii="Arial" w:hAnsi="Arial"/>
+          <w:sz w:val="28"/>
+        </w:rPr>
+        <w:t xml:space="preserve">    the phone.</w:t>
+      </w:r>
+    </w:p>
+    <w:p>
+      <w:pPr>
+        <w:spacing w:line="276" w:lineRule="auto"/>
+      </w:pPr>
+      <w:r>
+        <w:rPr>
+          <w:rFonts w:ascii="Arial" w:hAnsi="Arial"/>
+          <w:sz w:val="28"/>
+        </w:rPr>
+        <w:t xml:space="preserve"/>
+      </w:r>
+    </w:p>
+    <w:p>
+      <w:pPr>
+        <w:spacing w:line="276" w:lineRule="auto"/>
+      </w:pPr>
+      <w:r>
+        <w:rPr>
+          <w:rFonts w:ascii="Arial" w:hAnsi="Arial"/>
+          <w:sz w:val="28"/>
+        </w:rPr>
+        <w:t xml:space="preserve">194. #132-new — Daily shows a repeating reminder on the day it occurs.</w:t>
+      </w:r>
+    </w:p>
+    <w:p>
+      <w:pPr>
+        <w:spacing w:line="276" w:lineRule="auto"/>
+      </w:pPr>
+      <w:r>
+        <w:rPr>
+          <w:rFonts w:ascii="Arial" w:hAnsi="Arial"/>
+          <w:sz w:val="28"/>
+        </w:rPr>
+        <w:t xml:space="preserve">    The saved date does not also put it on Daily. The clock time is</w:t>
+      </w:r>
+    </w:p>
+    <w:p>
+      <w:pPr>
+        <w:spacing w:line="276" w:lineRule="auto"/>
+      </w:pPr>
+      <w:r>
+        <w:rPr>
+          <w:rFonts w:ascii="Arial" w:hAnsi="Arial"/>
+          <w:sz w:val="28"/>
+        </w:rPr>
+        <w:t xml:space="preserve">    unchanged. Not on the phone.</w:t>
+      </w:r>
+    </w:p>
+    <w:p>
+      <w:pPr>
+        <w:spacing w:line="276" w:lineRule="auto"/>
+      </w:pPr>
+      <w:r>
+        <w:rPr>
+          <w:rFonts w:ascii="Arial" w:hAnsi="Arial"/>
+          <w:sz w:val="28"/>
+        </w:rPr>
+        <w:t xml:space="preserve"/>
+      </w:r>
+    </w:p>
+    <w:p>
+      <w:pPr>
+        <w:spacing w:line="276" w:lineRule="auto"/>
+      </w:pPr>
+      <w:r>
+        <w:rPr>
+          <w:rFonts w:ascii="Arial" w:hAnsi="Arial"/>
+          <w:sz w:val="28"/>
+        </w:rPr>
+        <w:t xml:space="preserve">193. #130-new — You make the iPhone builds. Android builds are started</w:t>
+      </w:r>
+    </w:p>
+    <w:p>
+      <w:pPr>
+        <w:spacing w:line="276" w:lineRule="auto"/>
+      </w:pPr>
+      <w:r>
+        <w:rPr>
+          <w:rFonts w:ascii="Arial" w:hAnsi="Arial"/>
+          <w:sz w:val="28"/>
+        </w:rPr>
+        <w:t xml:space="preserve">    from the sitting. You do not start them.</w:t>
+      </w:r>
+    </w:p>
+    <w:p>
+      <w:pPr>
+        <w:spacing w:line="276" w:lineRule="auto"/>
+      </w:pPr>
+      <w:r>
+        <w:rPr>
+          <w:rFonts w:ascii="Arial" w:hAnsi="Arial"/>
+          <w:sz w:val="28"/>
+        </w:rPr>
+        <w:t xml:space="preserve"/>
+      </w:r>
+    </w:p>
+    <w:p>
+      <w:pPr>
+        <w:spacing w:line="276" w:lineRule="auto"/>
+      </w:pPr>
+      <w:r>
+        <w:rPr>
+          <w:rFonts w:ascii="Arial" w:hAnsi="Arial"/>
+          <w:sz w:val="28"/>
+        </w:rPr>
+        <w:t xml:space="preserve">192. #128-new — The live handoff and this list were trimmed. Finished</w:t>
+      </w:r>
+    </w:p>
+    <w:p>
+      <w:pPr>
+        <w:spacing w:line="276" w:lineRule="auto"/>
+      </w:pPr>
+      <w:r>
+        <w:rPr>
+          <w:rFonts w:ascii="Arial" w:hAnsi="Arial"/>
+          <w:sz w:val="28"/>
+        </w:rPr>
+        <w:t xml:space="preserve">    sittings already in the history came out of the handoff. The facts</w:t>
+      </w:r>
+    </w:p>
+    <w:p>
+      <w:pPr>
+        <w:spacing w:line="276" w:lineRule="auto"/>
+      </w:pPr>
+      <w:r>
+        <w:rPr>
+          <w:rFonts w:ascii="Arial" w:hAnsi="Arial"/>
+          <w:sz w:val="28"/>
+        </w:rPr>
+        <w:t xml:space="preserve">    heading that repeated the other files came out of this list.</w:t>
+      </w:r>
+    </w:p>
+    <w:p>
+      <w:pPr>
+        <w:spacing w:line="276" w:lineRule="auto"/>
+      </w:pPr>
+      <w:r>
+        <w:rPr>
+          <w:rFonts w:ascii="Arial" w:hAnsi="Arial"/>
+          <w:sz w:val="28"/>
+        </w:rPr>
+        <w:t xml:space="preserve"/>
+      </w:r>
+    </w:p>
+    <w:p>
+      <w:pPr>
+        <w:spacing w:line="276" w:lineRule="auto"/>
+      </w:pPr>
+      <w:r>
+        <w:rPr>
+          <w:rFonts w:ascii="Arial" w:hAnsi="Arial"/>
+          <w:sz w:val="28"/>
+        </w:rPr>
+        <w:t xml:space="preserve">191. #128-new — The Play account is open. Build 3 (1.0.0) is the</w:t>
+      </w:r>
+    </w:p>
+    <w:p>
+      <w:pPr>
+        <w:spacing w:line="276" w:lineRule="auto"/>
+      </w:pPr>
+      <w:r>
+        <w:rPr>
+          <w:rFonts w:ascii="Arial" w:hAnsi="Arial"/>
+          <w:sz w:val="28"/>
+        </w:rPr>
+        <w:t xml:space="preserve">    internal test on your Galaxy. Restore only opened a backup that</w:t>
+      </w:r>
+    </w:p>
+    <w:p>
+      <w:pPr>
+        <w:spacing w:line="276" w:lineRule="auto"/>
+      </w:pPr>
+      <w:r>
+        <w:rPr>
+          <w:rFonts w:ascii="Arial" w:hAnsi="Arial"/>
+          <w:sz w:val="28"/>
+        </w:rPr>
+        <w:t xml:space="preserve">    had already been downloaded onto the phone. Export would not save</w:t>
+      </w:r>
+    </w:p>
+    <w:p>
+      <w:pPr>
+        <w:spacing w:line="276" w:lineRule="auto"/>
+      </w:pPr>
+      <w:r>
+        <w:rPr>
+          <w:rFonts w:ascii="Arial" w:hAnsi="Arial"/>
+          <w:sz w:val="28"/>
+        </w:rPr>
+        <w:t xml:space="preserve">    a file on the phone.</w:t>
+      </w:r>
+    </w:p>
+    <w:p>
+      <w:pPr>
+        <w:spacing w:line="276" w:lineRule="auto"/>
+      </w:pPr>
+      <w:r>
+        <w:rPr>
+          <w:rFonts w:ascii="Arial" w:hAnsi="Arial"/>
+          <w:sz w:val="28"/>
+        </w:rPr>
+        <w:t xml:space="preserve"/>
+      </w:r>
+    </w:p>
+    <w:p>
+      <w:pPr>
+        <w:spacing w:line="276" w:lineRule="auto"/>
+      </w:pPr>
+      <w:r>
+        <w:rPr>
+          <w:rFonts w:ascii="Arial" w:hAnsi="Arial"/>
+          <w:sz w:val="28"/>
+        </w:rPr>
+        <w:t xml:space="preserve">190. #130-new — Export on Android asks you to choose a folder on the</w:t>
+      </w:r>
+    </w:p>
+    <w:p>
+      <w:pPr>
+        <w:spacing w:line="276" w:lineRule="auto"/>
+      </w:pPr>
+      <w:r>
+        <w:rPr>
+          <w:rFonts w:ascii="Arial" w:hAnsi="Arial"/>
+          <w:sz w:val="28"/>
+        </w:rPr>
+        <w:t xml:space="preserve">    phone and saves the backup there. The iPhone keeps the share</w:t>
+      </w:r>
+    </w:p>
+    <w:p>
+      <w:pPr>
+        <w:spacing w:line="276" w:lineRule="auto"/>
+      </w:pPr>
+      <w:r>
+        <w:rPr>
+          <w:rFonts w:ascii="Arial" w:hAnsi="Arial"/>
+          <w:sz w:val="28"/>
+        </w:rPr>
+        <w:t xml:space="preserve">    screen. Not on the phone.</w:t>
+      </w:r>
+    </w:p>
+    <w:p>
+      <w:pPr>
+        <w:spacing w:line="276" w:lineRule="auto"/>
+      </w:pPr>
+      <w:r>
+        <w:rPr>
+          <w:rFonts w:ascii="Arial" w:hAnsi="Arial"/>
+          <w:sz w:val="28"/>
+        </w:rPr>
+        <w:t xml:space="preserve"/>
+      </w:r>
+    </w:p>
+    <w:p>
+      <w:pPr>
+        <w:spacing w:line="276" w:lineRule="auto"/>
+      </w:pPr>
+      <w:r>
+        <w:rPr>
+          <w:rFonts w:ascii="Arial" w:hAnsi="Arial"/>
+          <w:sz w:val="28"/>
+        </w:rPr>
+        <w:t xml:space="preserve">189. #130-new — The Daily Snooze modal shares its row in three even</w:t>
+      </w:r>
+    </w:p>
+    <w:p>
+      <w:pPr>
+        <w:spacing w:line="276" w:lineRule="auto"/>
+      </w:pPr>
+      <w:r>
+        <w:rPr>
+          <w:rFonts w:ascii="Arial" w:hAnsi="Arial"/>
+          <w:sz w:val="28"/>
+        </w:rPr>
+        <w:t xml:space="preserve">    parts: the 15, 30, and 60 minute buttons, the wheel, and Snooze.</w:t>
+      </w:r>
+    </w:p>
+    <w:p>
+      <w:pPr>
+        <w:spacing w:line="276" w:lineRule="auto"/>
+      </w:pPr>
+      <w:r>
+        <w:rPr>
+          <w:rFonts w:ascii="Arial" w:hAnsi="Arial"/>
+          <w:sz w:val="28"/>
+        </w:rPr>
+        <w:t xml:space="preserve">    Each sits in the middle of its part. Not on the phone.</w:t>
+      </w:r>
+    </w:p>
+    <w:p>
+      <w:pPr>
+        <w:spacing w:line="276" w:lineRule="auto"/>
+      </w:pPr>
+      <w:r>
+        <w:rPr>
+          <w:rFonts w:ascii="Arial" w:hAnsi="Arial"/>
+          <w:sz w:val="28"/>
+        </w:rPr>
+        <w:t xml:space="preserve"/>
+      </w:r>
+    </w:p>
+    <w:p>
+      <w:pPr>
+        <w:spacing w:line="276" w:lineRule="auto"/>
+      </w:pPr>
+      <w:r>
+        <w:rPr>
+          <w:rFonts w:ascii="Arial" w:hAnsi="Arial"/>
+          <w:sz w:val="28"/>
+        </w:rPr>
+        <w:t xml:space="preserve">188. #130-new — A long reminder list keeps each row's place in the list</w:t>
+      </w:r>
+    </w:p>
+    <w:p>
+      <w:pPr>
+        <w:spacing w:line="276" w:lineRule="auto"/>
+      </w:pPr>
+      <w:r>
+        <w:rPr>
+          <w:rFonts w:ascii="Arial" w:hAnsi="Arial"/>
+          <w:sz w:val="28"/>
+        </w:rPr>
+        <w:t xml:space="preserve">    and how far the list has been scrolled. A short move lands a short</w:t>
+      </w:r>
+    </w:p>
+    <w:p>
+      <w:pPr>
+        <w:spacing w:line="276" w:lineRule="auto"/>
+      </w:pPr>
+      <w:r>
+        <w:rPr>
+          <w:rFonts w:ascii="Arial" w:hAnsi="Arial"/>
+          <w:sz w:val="28"/>
+        </w:rPr>
+        <w:t xml:space="preserve">    distance away. The neighbors still make room. Not on the phone.</w:t>
+      </w:r>
+    </w:p>
+    <w:p>
+      <w:pPr>
+        <w:spacing w:line="276" w:lineRule="auto"/>
+      </w:pPr>
+      <w:r>
+        <w:rPr>
+          <w:rFonts w:ascii="Arial" w:hAnsi="Arial"/>
+          <w:sz w:val="28"/>
+        </w:rPr>
+        <w:t xml:space="preserve"/>
+      </w:r>
+    </w:p>
+    <w:p>
+      <w:pPr>
+        <w:spacing w:line="276" w:lineRule="auto"/>
+      </w:pPr>
+      <w:r>
+        <w:rPr>
+          <w:rFonts w:ascii="Arial" w:hAnsi="Arial"/>
+          <w:sz w:val="28"/>
+        </w:rPr>
+        <w:t xml:space="preserve">187. The bottom of the Galaxy screen is fixed. Android does not turn.</w:t>
+      </w:r>
+    </w:p>
+    <w:p>
+      <w:pPr>
+        <w:spacing w:line="276" w:lineRule="auto"/>
+      </w:pPr>
+      <w:r>
+        <w:rPr>
+          <w:rFonts w:ascii="Arial" w:hAnsi="Arial"/>
+          <w:sz w:val="28"/>
+        </w:rPr>
+        <w:t xml:space="preserve">    Both are verified on build 3.</w:t>
       </w:r>
     </w:p>
     <w:p>

</xml_diff>

<commit_message>
134.1 -new- Memory - Live Desk update.
</commit_message>
<xml_diff>
--- a/docs/pending.docx
+++ b/docs/pending.docx
@@ -24,7 +24,7 @@
           <w:rFonts w:ascii="Arial" w:hAnsi="Arial"/>
           <w:sz w:val="28"/>
         </w:rPr>
-        <w:t xml:space="preserve">Last updated: 2026-10-09</w:t>
+        <w:t xml:space="preserve">Last updated: 2026-10-10</w:t>
       </w:r>
     </w:p>
     <w:p>
@@ -325,343 +325,7 @@
           <w:rFonts w:ascii="Arial" w:hAnsi="Arial"/>
           <w:sz w:val="28"/>
         </w:rPr>
-        <w:t xml:space="preserve">1. ANDROID INTERNAL TEST. You approved the next Android build. That</w:t>
-      </w:r>
-    </w:p>
-    <w:p>
-      <w:pPr>
-        <w:spacing w:line="276" w:lineRule="auto"/>
-      </w:pPr>
-      <w:r>
-        <w:rPr>
-          <w:rFonts w:ascii="Arial" w:hAnsi="Arial"/>
-          <w:sz w:val="28"/>
-        </w:rPr>
-        <w:t xml:space="preserve">   work is committed. It goes to the internal test the Galaxy</w:t>
-      </w:r>
-    </w:p>
-    <w:p>
-      <w:pPr>
-        <w:spacing w:line="276" w:lineRule="auto"/>
-      </w:pPr>
-      <w:r>
-        <w:rPr>
-          <w:rFonts w:ascii="Arial" w:hAnsi="Arial"/>
-          <w:sz w:val="28"/>
-        </w:rPr>
-        <w:t xml:space="preserve">   already uses. The Galaxy still has build 3 until that load arrives.</w:t>
-      </w:r>
-    </w:p>
-    <w:p>
-      <w:pPr>
-        <w:spacing w:line="276" w:lineRule="auto"/>
-      </w:pPr>
-      <w:r>
-        <w:rPr>
-          <w:rFonts w:ascii="Arial" w:hAnsi="Arial"/>
-          <w:sz w:val="28"/>
-        </w:rPr>
-        <w:t xml:space="preserve">   The public listing still waits.</w:t>
-      </w:r>
-    </w:p>
-    <w:p>
-      <w:pPr>
-        <w:spacing w:line="276" w:lineRule="auto"/>
-      </w:pPr>
-      <w:r>
-        <w:rPr>
-          <w:rFonts w:ascii="Arial" w:hAnsi="Arial"/>
-          <w:sz w:val="28"/>
-        </w:rPr>
-        <w:t xml:space="preserve">2. PHONE TEXT SIZE ON A FRESH OPEN. You set the phone's text larger</w:t>
-      </w:r>
-    </w:p>
-    <w:p>
-      <w:pPr>
-        <w:spacing w:line="276" w:lineRule="auto"/>
-      </w:pPr>
-      <w:r>
-        <w:rPr>
-          <w:rFonts w:ascii="Arial" w:hAnsi="Arial"/>
-          <w:sz w:val="28"/>
-        </w:rPr>
-        <w:t xml:space="preserve">   so you can read it. After a restore, or a download and a restore,</w:t>
-      </w:r>
-    </w:p>
-    <w:p>
-      <w:pPr>
-        <w:spacing w:line="276" w:lineRule="auto"/>
-      </w:pPr>
-      <w:r>
-        <w:rPr>
-          <w:rFonts w:ascii="Arial" w:hAnsi="Arial"/>
-          <w:sz w:val="28"/>
-        </w:rPr>
-        <w:t xml:space="preserve">   Memory's writing was the small size again while the rest of the</w:t>
-      </w:r>
-    </w:p>
-    <w:p>
-      <w:pPr>
-        <w:spacing w:line="276" w:lineRule="auto"/>
-      </w:pPr>
-      <w:r>
-        <w:rPr>
-          <w:rFonts w:ascii="Arial" w:hAnsi="Arial"/>
-          <w:sz w:val="28"/>
-        </w:rPr>
-        <w:t xml:space="preserve">   phone stayed large. The initial load now waits until the app is</w:t>
-      </w:r>
-    </w:p>
-    <w:p>
-      <w:pPr>
-        <w:spacing w:line="276" w:lineRule="auto"/>
-      </w:pPr>
-      <w:r>
-        <w:rPr>
-          <w:rFonts w:ascii="Arial" w:hAnsi="Arial"/>
-          <w:sz w:val="28"/>
-        </w:rPr>
-        <w:t xml:space="preserve">   active, then reads the phone's text size, and the first writing</w:t>
-      </w:r>
-    </w:p>
-    <w:p>
-      <w:pPr>
-        <w:spacing w:line="276" w:lineRule="auto"/>
-      </w:pPr>
-      <w:r>
-        <w:rPr>
-          <w:rFonts w:ascii="Arial" w:hAnsi="Arial"/>
-          <w:sz w:val="28"/>
-        </w:rPr>
-        <w:t xml:space="preserve">   uses that size. The pages and the backup are unchanged. This is</w:t>
-      </w:r>
-    </w:p>
-    <w:p>
-      <w:pPr>
-        <w:spacing w:line="276" w:lineRule="auto"/>
-      </w:pPr>
-      <w:r>
-        <w:rPr>
-          <w:rFonts w:ascii="Arial" w:hAnsi="Arial"/>
-          <w:sz w:val="28"/>
-        </w:rPr>
-        <w:t xml:space="preserve">   not on the phone yet (#128-new).</w:t>
-      </w:r>
-    </w:p>
-    <w:p>
-      <w:pPr>
-        <w:spacing w:line="276" w:lineRule="auto"/>
-      </w:pPr>
-      <w:r>
-        <w:rPr>
-          <w:rFonts w:ascii="Arial" w:hAnsi="Arial"/>
-          <w:sz w:val="28"/>
-        </w:rPr>
-        <w:t xml:space="preserve">3. LONG LIST REORDER. A long reminder list keeps each row's place in</w:t>
-      </w:r>
-    </w:p>
-    <w:p>
-      <w:pPr>
-        <w:spacing w:line="276" w:lineRule="auto"/>
-      </w:pPr>
-      <w:r>
-        <w:rPr>
-          <w:rFonts w:ascii="Arial" w:hAnsi="Arial"/>
-          <w:sz w:val="28"/>
-        </w:rPr>
-        <w:t xml:space="preserve">   the list, and how far the list has been scrolled. The row under</w:t>
-      </w:r>
-    </w:p>
-    <w:p>
-      <w:pPr>
-        <w:spacing w:line="276" w:lineRule="auto"/>
-      </w:pPr>
-      <w:r>
-        <w:rPr>
-          <w:rFonts w:ascii="Arial" w:hAnsi="Arial"/>
-          <w:sz w:val="28"/>
-        </w:rPr>
-        <w:t xml:space="preserve">   your finger is that place, shifted by the scroll. A short move</w:t>
-      </w:r>
-    </w:p>
-    <w:p>
-      <w:pPr>
-        <w:spacing w:line="276" w:lineRule="auto"/>
-      </w:pPr>
-      <w:r>
-        <w:rPr>
-          <w:rFonts w:ascii="Arial" w:hAnsi="Arial"/>
-          <w:sz w:val="28"/>
-        </w:rPr>
-        <w:t xml:space="preserve">   lands a short distance away. The neighbors still make room. This</w:t>
-      </w:r>
-    </w:p>
-    <w:p>
-      <w:pPr>
-        <w:spacing w:line="276" w:lineRule="auto"/>
-      </w:pPr>
-      <w:r>
-        <w:rPr>
-          <w:rFonts w:ascii="Arial" w:hAnsi="Arial"/>
-          <w:sz w:val="28"/>
-        </w:rPr>
-        <w:t xml:space="preserve">   is in the project and not on the phone (#130-new).</w:t>
-      </w:r>
-    </w:p>
-    <w:p>
-      <w:pPr>
-        <w:spacing w:line="276" w:lineRule="auto"/>
-      </w:pPr>
-      <w:r>
-        <w:rPr>
-          <w:rFonts w:ascii="Arial" w:hAnsi="Arial"/>
-          <w:sz w:val="28"/>
-        </w:rPr>
-        <w:t xml:space="preserve">4. PHONE PROOF FOR DONE'S ONE-DAY CHECK. Weekly, Monthly, Quarterly,</w:t>
-      </w:r>
-    </w:p>
-    <w:p>
-      <w:pPr>
-        <w:spacing w:line="276" w:lineRule="auto"/>
-      </w:pPr>
-      <w:r>
-        <w:rPr>
-          <w:rFonts w:ascii="Arial" w:hAnsi="Arial"/>
-          <w:sz w:val="28"/>
-        </w:rPr>
-        <w:t xml:space="preserve">   Yearly, Birthdays, and One Time should show the check that day only.</w:t>
-      </w:r>
-    </w:p>
-    <w:p>
-      <w:pPr>
-        <w:spacing w:line="276" w:lineRule="auto"/>
-      </w:pPr>
-      <w:r>
-        <w:rPr>
-          <w:rFonts w:ascii="Arial" w:hAnsi="Arial"/>
-          <w:sz w:val="28"/>
-        </w:rPr>
-        <w:t xml:space="preserve">   The next morning the row is the next time, with no check. Weekly</w:t>
-      </w:r>
-    </w:p>
-    <w:p>
-      <w:pPr>
-        <w:spacing w:line="276" w:lineRule="auto"/>
-      </w:pPr>
-      <w:r>
-        <w:rPr>
-          <w:rFonts w:ascii="Arial" w:hAnsi="Arial"/>
-          <w:sz w:val="28"/>
-        </w:rPr>
-        <w:t xml:space="preserve">   must not fire again this week. A second tap that same day still</w:t>
-      </w:r>
-    </w:p>
-    <w:p>
-      <w:pPr>
-        <w:spacing w:line="276" w:lineRule="auto"/>
-      </w:pPr>
-      <w:r>
-        <w:rPr>
-          <w:rFonts w:ascii="Arial" w:hAnsi="Arial"/>
-          <w:sz w:val="28"/>
-        </w:rPr>
-        <w:t xml:space="preserve">   takes the check off. Build 114 is already on the iPhone for the</w:t>
-      </w:r>
-    </w:p>
-    <w:p>
-      <w:pPr>
-        <w:spacing w:line="276" w:lineRule="auto"/>
-      </w:pPr>
-      <w:r>
-        <w:rPr>
-          <w:rFonts w:ascii="Arial" w:hAnsi="Arial"/>
-          <w:sz w:val="28"/>
-        </w:rPr>
-        <w:t xml:space="preserve">   Snooze minutes and list reorder. The User's Guide now matches that</w:t>
-      </w:r>
-    </w:p>
-    <w:p>
-      <w:pPr>
-        <w:spacing w:line="276" w:lineRule="auto"/>
-      </w:pPr>
-      <w:r>
-        <w:rPr>
-          <w:rFonts w:ascii="Arial" w:hAnsi="Arial"/>
-          <w:sz w:val="28"/>
-        </w:rPr>
-        <w:t xml:space="preserve">   work, including the 1-through-14 minutes on the list only. That copy</w:t>
-      </w:r>
-    </w:p>
-    <w:p>
-      <w:pPr>
-        <w:spacing w:line="276" w:lineRule="auto"/>
-      </w:pPr>
-      <w:r>
-        <w:rPr>
-          <w:rFonts w:ascii="Arial" w:hAnsi="Arial"/>
-          <w:sz w:val="28"/>
-        </w:rPr>
-        <w:t xml:space="preserve">   is not on the phone. The saved-list read warning also remains to be</w:t>
-      </w:r>
-    </w:p>
-    <w:p>
-      <w:pPr>
-        <w:spacing w:line="276" w:lineRule="auto"/>
-      </w:pPr>
-      <w:r>
-        <w:rPr>
-          <w:rFonts w:ascii="Arial" w:hAnsi="Arial"/>
-          <w:sz w:val="28"/>
-        </w:rPr>
-        <w:t xml:space="preserve">   proved, and it stays out of the Guide. The home arrangement</w:t>
-      </w:r>
-    </w:p>
-    <w:p>
-      <w:pPr>
-        <w:spacing w:line="276" w:lineRule="auto"/>
-      </w:pPr>
-      <w:r>
-        <w:rPr>
-          <w:rFonts w:ascii="Arial" w:hAnsi="Arial"/>
-          <w:sz w:val="28"/>
-        </w:rPr>
-        <w:t xml:space="preserve">   restore is in the project and not on the phone. The Daily Snooze</w:t>
-      </w:r>
-    </w:p>
-    <w:p>
-      <w:pPr>
-        <w:spacing w:line="276" w:lineRule="auto"/>
-      </w:pPr>
-      <w:r>
-        <w:rPr>
-          <w:rFonts w:ascii="Arial" w:hAnsi="Arial"/>
-          <w:sz w:val="28"/>
-        </w:rPr>
-        <w:t xml:space="preserve">   modal shares its row in three even parts, and that is not on the</w:t>
-      </w:r>
-    </w:p>
-    <w:p>
-      <w:pPr>
-        <w:spacing w:line="276" w:lineRule="auto"/>
-      </w:pPr>
-      <w:r>
-        <w:rPr>
-          <w:rFonts w:ascii="Arial" w:hAnsi="Arial"/>
-          <w:sz w:val="28"/>
-        </w:rPr>
-        <w:t xml:space="preserve">   phone either. The full state is in docs/in-flight.md.</w:t>
-      </w:r>
-    </w:p>
-    <w:p>
-      <w:pPr>
-        <w:spacing w:line="276" w:lineRule="auto"/>
-      </w:pPr>
-      <w:r>
-        <w:rPr>
-          <w:rFonts w:ascii="Arial" w:hAnsi="Arial"/>
-          <w:sz w:val="28"/>
-        </w:rPr>
-        <w:t xml:space="preserve">5. IOS BUILD 100 is Waiting for Review. When Apple approves, you</w:t>
+        <w:t xml:space="preserve">1. IOS BUILD 100 is Waiting for Review. When Apple approves, you</w:t>
       </w:r>
     </w:p>
     <w:p>
@@ -685,175 +349,43 @@
           <w:rFonts w:ascii="Arial" w:hAnsi="Arial"/>
           <w:sz w:val="28"/>
         </w:rPr>
-        <w:t xml:space="preserve">6. THE PRICE ON ANDROID. $9.99 once, no trial. The iPhone listing</w:t>
-      </w:r>
-    </w:p>
-    <w:p>
-      <w:pPr>
-        <w:spacing w:line="276" w:lineRule="auto"/>
-      </w:pPr>
-      <w:r>
-        <w:rPr>
-          <w:rFonts w:ascii="Arial" w:hAnsi="Arial"/>
-          <w:sz w:val="28"/>
-        </w:rPr>
-        <w:t xml:space="preserve">   already has that price. The Play account is open, and build 3 is</w:t>
-      </w:r>
-    </w:p>
-    <w:p>
-      <w:pPr>
-        <w:spacing w:line="276" w:lineRule="auto"/>
-      </w:pPr>
-      <w:r>
-        <w:rPr>
-          <w:rFonts w:ascii="Arial" w:hAnsi="Arial"/>
-          <w:sz w:val="28"/>
-        </w:rPr>
-        <w:t xml:space="preserve">   the internal test on your Galaxy (#128-new). The public Android</w:t>
-      </w:r>
-    </w:p>
-    <w:p>
-      <w:pPr>
-        <w:spacing w:line="276" w:lineRule="auto"/>
-      </w:pPr>
-      <w:r>
-        <w:rPr>
-          <w:rFonts w:ascii="Arial" w:hAnsi="Arial"/>
-          <w:sz w:val="28"/>
-        </w:rPr>
-        <w:t xml:space="preserve">   listing still waits (#123-new).</w:t>
-      </w:r>
-    </w:p>
-    <w:p>
-      <w:pPr>
-        <w:spacing w:line="276" w:lineRule="auto"/>
-      </w:pPr>
-      <w:r>
-        <w:rPr>
-          <w:rFonts w:ascii="Arial" w:hAnsi="Arial"/>
-          <w:sz w:val="28"/>
-        </w:rPr>
-        <w:t xml:space="preserve">7. ANDROID BACKUP FOLDER. Export on Android asks you to choose a</w:t>
-      </w:r>
-    </w:p>
-    <w:p>
-      <w:pPr>
-        <w:spacing w:line="276" w:lineRule="auto"/>
-      </w:pPr>
-      <w:r>
-        <w:rPr>
-          <w:rFonts w:ascii="Arial" w:hAnsi="Arial"/>
-          <w:sz w:val="28"/>
-        </w:rPr>
-        <w:t xml:space="preserve">   folder on the phone and saves the backup there. The iPhone keeps</w:t>
-      </w:r>
-    </w:p>
-    <w:p>
-      <w:pPr>
-        <w:spacing w:line="276" w:lineRule="auto"/>
-      </w:pPr>
-      <w:r>
-        <w:rPr>
-          <w:rFonts w:ascii="Arial" w:hAnsi="Arial"/>
-          <w:sz w:val="28"/>
-        </w:rPr>
-        <w:t xml:space="preserve">   the share screen. Not on the phone (#130-new). On the Galaxy, in</w:t>
-      </w:r>
-    </w:p>
-    <w:p>
-      <w:pPr>
-        <w:spacing w:line="276" w:lineRule="auto"/>
-      </w:pPr>
-      <w:r>
-        <w:rPr>
-          <w:rFonts w:ascii="Arial" w:hAnsi="Arial"/>
-          <w:sz w:val="28"/>
-        </w:rPr>
-        <w:t xml:space="preserve">   128, Restore only opened a backup that had already been downloaded</w:t>
-      </w:r>
-    </w:p>
-    <w:p>
-      <w:pPr>
-        <w:spacing w:line="276" w:lineRule="auto"/>
-      </w:pPr>
-      <w:r>
-        <w:rPr>
-          <w:rFonts w:ascii="Arial" w:hAnsi="Arial"/>
-          <w:sz w:val="28"/>
-        </w:rPr>
-        <w:t xml:space="preserve">   onto the phone. Export would not save a file on the phone.</w:t>
-      </w:r>
-    </w:p>
-    <w:p>
-      <w:pPr>
-        <w:spacing w:line="276" w:lineRule="auto"/>
-      </w:pPr>
-      <w:r>
-        <w:rPr>
-          <w:rFonts w:ascii="Arial" w:hAnsi="Arial"/>
-          <w:sz w:val="28"/>
-        </w:rPr>
-        <w:t xml:space="preserve">8. DAILY MINUTES. Ask for 5, 10, and the rest, with no wheel. For</w:t>
-      </w:r>
-    </w:p>
-    <w:p>
-      <w:pPr>
-        <w:spacing w:line="276" w:lineRule="auto"/>
-      </w:pPr>
-      <w:r>
-        <w:rPr>
-          <w:rFonts w:ascii="Arial" w:hAnsi="Arial"/>
-          <w:sz w:val="28"/>
-        </w:rPr>
-        <w:t xml:space="preserve">   the next session (#132-new).</w:t>
-      </w:r>
-    </w:p>
-    <w:p>
-      <w:pPr>
-        <w:spacing w:line="276" w:lineRule="auto"/>
-      </w:pPr>
-      <w:r>
-        <w:rPr>
-          <w:rFonts w:ascii="Arial" w:hAnsi="Arial"/>
-          <w:sz w:val="28"/>
-        </w:rPr>
-        <w:t xml:space="preserve">9. MONTHLY HOLIDAYS. Ask whether the reminder should move for</w:t>
-      </w:r>
-    </w:p>
-    <w:p>
-      <w:pPr>
-        <w:spacing w:line="276" w:lineRule="auto"/>
-      </w:pPr>
-      <w:r>
-        <w:rPr>
-          <w:rFonts w:ascii="Arial" w:hAnsi="Arial"/>
-          <w:sz w:val="28"/>
-        </w:rPr>
-        <w:t xml:space="preserve">   holidays. A display change. For the next session (#132-new).</w:t>
-      </w:r>
-    </w:p>
-    <w:p>
-      <w:pPr>
-        <w:spacing w:line="276" w:lineRule="auto"/>
-      </w:pPr>
-      <w:r>
-        <w:rPr>
-          <w:rFonts w:ascii="Arial" w:hAnsi="Arial"/>
-          <w:sz w:val="28"/>
-        </w:rPr>
-        <w:t xml:space="preserve">10. ANDROID BACKUP AND RESTORE. The fix from before. A display</w:t>
-      </w:r>
-    </w:p>
-    <w:p>
-      <w:pPr>
-        <w:spacing w:line="276" w:lineRule="auto"/>
-      </w:pPr>
-      <w:r>
-        <w:rPr>
-          <w:rFonts w:ascii="Arial" w:hAnsi="Arial"/>
-          <w:sz w:val="28"/>
-        </w:rPr>
-        <w:t xml:space="preserve">    change. For the next session (#132-new).</w:t>
+        <w:t xml:space="preserve">2. THE PRICE ON ANDROID. $9.99 once, no trial. The iPhone listing</w:t>
+      </w:r>
+    </w:p>
+    <w:p>
+      <w:pPr>
+        <w:spacing w:line="276" w:lineRule="auto"/>
+      </w:pPr>
+      <w:r>
+        <w:rPr>
+          <w:rFonts w:ascii="Arial" w:hAnsi="Arial"/>
+          <w:sz w:val="28"/>
+        </w:rPr>
+        <w:t xml:space="preserve">   already has that price. The Play account is open, and Android</w:t>
+      </w:r>
+    </w:p>
+    <w:p>
+      <w:pPr>
+        <w:spacing w:line="276" w:lineRule="auto"/>
+      </w:pPr>
+      <w:r>
+        <w:rPr>
+          <w:rFonts w:ascii="Arial" w:hAnsi="Arial"/>
+          <w:sz w:val="28"/>
+        </w:rPr>
+        <w:t xml:space="preserve">   number 5 is the internal test on your Galaxy (#134-new). The public</w:t>
+      </w:r>
+    </w:p>
+    <w:p>
+      <w:pPr>
+        <w:spacing w:line="276" w:lineRule="auto"/>
+      </w:pPr>
+      <w:r>
+        <w:rPr>
+          <w:rFonts w:ascii="Arial" w:hAnsi="Arial"/>
+          <w:sz w:val="28"/>
+        </w:rPr>
+        <w:t xml:space="preserve">   Android listing still waits (#123-new).</w:t>
       </w:r>
     </w:p>
     <w:p>
@@ -938,7 +470,31 @@
           <w:rFonts w:ascii="Arial" w:hAnsi="Arial"/>
           <w:sz w:val="28"/>
         </w:rPr>
-        <w:t xml:space="preserve">Nothing is waiting under this heading.</w:t>
+        <w:t xml:space="preserve">1. A one-time load that shows the saved-list read warning, without</w:t>
+      </w:r>
+    </w:p>
+    <w:p>
+      <w:pPr>
+        <w:spacing w:line="276" w:lineRule="auto"/>
+      </w:pPr>
+      <w:r>
+        <w:rPr>
+          <w:rFonts w:ascii="Arial" w:hAnsi="Arial"/>
+          <w:sz w:val="28"/>
+        </w:rPr>
+        <w:t xml:space="preserve">   changing the saved reminders. Not now. Your Expo build usage is</w:t>
+      </w:r>
+    </w:p>
+    <w:p>
+      <w:pPr>
+        <w:spacing w:line="276" w:lineRule="auto"/>
+      </w:pPr>
+      <w:r>
+        <w:rPr>
+          <w:rFonts w:ascii="Arial" w:hAnsi="Arial"/>
+          <w:sz w:val="28"/>
+        </w:rPr>
+        <w:t xml:space="preserve">   high enough.</w:t>
       </w:r>
     </w:p>
     <w:p>
@@ -1036,6 +592,522 @@
           <w:sz w:val="28"/>
         </w:rPr>
         <w:t xml:space="preserve">docs/handoff-history.md.</w:t>
+      </w:r>
+    </w:p>
+    <w:p>
+      <w:pPr>
+        <w:spacing w:line="276" w:lineRule="auto"/>
+      </w:pPr>
+      <w:r>
+        <w:rPr>
+          <w:rFonts w:ascii="Arial" w:hAnsi="Arial"/>
+          <w:sz w:val="28"/>
+        </w:rPr>
+        <w:t xml:space="preserve"/>
+      </w:r>
+    </w:p>
+    <w:p>
+      <w:pPr>
+        <w:spacing w:line="276" w:lineRule="auto"/>
+      </w:pPr>
+      <w:r>
+        <w:rPr>
+          <w:rFonts w:ascii="Arial" w:hAnsi="Arial"/>
+          <w:sz w:val="28"/>
+        </w:rPr>
+        <w:t xml:space="preserve">211. #134-new — The saved-list read warning is on the iPhone and the</w:t>
+      </w:r>
+    </w:p>
+    <w:p>
+      <w:pPr>
+        <w:spacing w:line="276" w:lineRule="auto"/>
+      </w:pPr>
+      <w:r>
+        <w:rPr>
+          <w:rFonts w:ascii="Arial" w:hAnsi="Arial"/>
+          <w:sz w:val="28"/>
+        </w:rPr>
+        <w:t xml:space="preserve">    Galaxy. It stays out of the Guide.</w:t>
+      </w:r>
+    </w:p>
+    <w:p>
+      <w:pPr>
+        <w:spacing w:line="276" w:lineRule="auto"/>
+      </w:pPr>
+      <w:r>
+        <w:rPr>
+          <w:rFonts w:ascii="Arial" w:hAnsi="Arial"/>
+          <w:sz w:val="28"/>
+        </w:rPr>
+        <w:t xml:space="preserve"/>
+      </w:r>
+    </w:p>
+    <w:p>
+      <w:pPr>
+        <w:spacing w:line="276" w:lineRule="auto"/>
+      </w:pPr>
+      <w:r>
+        <w:rPr>
+          <w:rFonts w:ascii="Arial" w:hAnsi="Arial"/>
+          <w:sz w:val="28"/>
+        </w:rPr>
+        <w:t xml:space="preserve">210. #134-new — The home arrangement in a backup is on the iPhone and</w:t>
+      </w:r>
+    </w:p>
+    <w:p>
+      <w:pPr>
+        <w:spacing w:line="276" w:lineRule="auto"/>
+      </w:pPr>
+      <w:r>
+        <w:rPr>
+          <w:rFonts w:ascii="Arial" w:hAnsi="Arial"/>
+          <w:sz w:val="28"/>
+        </w:rPr>
+        <w:t xml:space="preserve">    the Galaxy.</w:t>
+      </w:r>
+    </w:p>
+    <w:p>
+      <w:pPr>
+        <w:spacing w:line="276" w:lineRule="auto"/>
+      </w:pPr>
+      <w:r>
+        <w:rPr>
+          <w:rFonts w:ascii="Arial" w:hAnsi="Arial"/>
+          <w:sz w:val="28"/>
+        </w:rPr>
+        <w:t xml:space="preserve"/>
+      </w:r>
+    </w:p>
+    <w:p>
+      <w:pPr>
+        <w:spacing w:line="276" w:lineRule="auto"/>
+      </w:pPr>
+      <w:r>
+        <w:rPr>
+          <w:rFonts w:ascii="Arial" w:hAnsi="Arial"/>
+          <w:sz w:val="28"/>
+        </w:rPr>
+        <w:t xml:space="preserve">209. #134-new — Daily shows a repeating reminder on the day it occurs.</w:t>
+      </w:r>
+    </w:p>
+    <w:p>
+      <w:pPr>
+        <w:spacing w:line="276" w:lineRule="auto"/>
+      </w:pPr>
+      <w:r>
+        <w:rPr>
+          <w:rFonts w:ascii="Arial" w:hAnsi="Arial"/>
+          <w:sz w:val="28"/>
+        </w:rPr>
+        <w:t xml:space="preserve">    The saved date does not also put it there. On both phones.</w:t>
+      </w:r>
+    </w:p>
+    <w:p>
+      <w:pPr>
+        <w:spacing w:line="276" w:lineRule="auto"/>
+      </w:pPr>
+      <w:r>
+        <w:rPr>
+          <w:rFonts w:ascii="Arial" w:hAnsi="Arial"/>
+          <w:sz w:val="28"/>
+        </w:rPr>
+        <w:t xml:space="preserve"/>
+      </w:r>
+    </w:p>
+    <w:p>
+      <w:pPr>
+        <w:spacing w:line="276" w:lineRule="auto"/>
+      </w:pPr>
+      <w:r>
+        <w:rPr>
+          <w:rFonts w:ascii="Arial" w:hAnsi="Arial"/>
+          <w:sz w:val="28"/>
+        </w:rPr>
+        <w:t xml:space="preserve">208. #134-new — On New, the choices for that reminder are listed on</w:t>
+      </w:r>
+    </w:p>
+    <w:p>
+      <w:pPr>
+        <w:spacing w:line="276" w:lineRule="auto"/>
+      </w:pPr>
+      <w:r>
+        <w:rPr>
+          <w:rFonts w:ascii="Arial" w:hAnsi="Arial"/>
+          <w:sz w:val="28"/>
+        </w:rPr>
+        <w:t xml:space="preserve">    the form, each with a short description. On both phones.</w:t>
+      </w:r>
+    </w:p>
+    <w:p>
+      <w:pPr>
+        <w:spacing w:line="276" w:lineRule="auto"/>
+      </w:pPr>
+      <w:r>
+        <w:rPr>
+          <w:rFonts w:ascii="Arial" w:hAnsi="Arial"/>
+          <w:sz w:val="28"/>
+        </w:rPr>
+        <w:t xml:space="preserve"/>
+      </w:r>
+    </w:p>
+    <w:p>
+      <w:pPr>
+        <w:spacing w:line="276" w:lineRule="auto"/>
+      </w:pPr>
+      <w:r>
+        <w:rPr>
+          <w:rFonts w:ascii="Arial" w:hAnsi="Arial"/>
+          <w:sz w:val="28"/>
+        </w:rPr>
+        <w:t xml:space="preserve">207. #134-new — Same Day Nth Week and Day of First Full Week are on</w:t>
+      </w:r>
+    </w:p>
+    <w:p>
+      <w:pPr>
+        <w:spacing w:line="276" w:lineRule="auto"/>
+      </w:pPr>
+      <w:r>
+        <w:rPr>
+          <w:rFonts w:ascii="Arial" w:hAnsi="Arial"/>
+          <w:sz w:val="28"/>
+        </w:rPr>
+        <w:t xml:space="preserve">    Monthly only. On both phones.</w:t>
+      </w:r>
+    </w:p>
+    <w:p>
+      <w:pPr>
+        <w:spacing w:line="276" w:lineRule="auto"/>
+      </w:pPr>
+      <w:r>
+        <w:rPr>
+          <w:rFonts w:ascii="Arial" w:hAnsi="Arial"/>
+          <w:sz w:val="28"/>
+        </w:rPr>
+        <w:t xml:space="preserve"/>
+      </w:r>
+    </w:p>
+    <w:p>
+      <w:pPr>
+        <w:spacing w:line="276" w:lineRule="auto"/>
+      </w:pPr>
+      <w:r>
+        <w:rPr>
+          <w:rFonts w:ascii="Arial" w:hAnsi="Arial"/>
+          <w:sz w:val="28"/>
+        </w:rPr>
+        <w:t xml:space="preserve">206. #134-new — The Android backup and restore display is done.</w:t>
+      </w:r>
+    </w:p>
+    <w:p>
+      <w:pPr>
+        <w:spacing w:line="276" w:lineRule="auto"/>
+      </w:pPr>
+      <w:r>
+        <w:rPr>
+          <w:rFonts w:ascii="Arial" w:hAnsi="Arial"/>
+          <w:sz w:val="28"/>
+        </w:rPr>
+        <w:t xml:space="preserve"/>
+      </w:r>
+    </w:p>
+    <w:p>
+      <w:pPr>
+        <w:spacing w:line="276" w:lineRule="auto"/>
+      </w:pPr>
+      <w:r>
+        <w:rPr>
+          <w:rFonts w:ascii="Arial" w:hAnsi="Arial"/>
+          <w:sz w:val="28"/>
+        </w:rPr>
+        <w:t xml:space="preserve">205. #134-new — Done's one-day check is proved.</w:t>
+      </w:r>
+    </w:p>
+    <w:p>
+      <w:pPr>
+        <w:spacing w:line="276" w:lineRule="auto"/>
+      </w:pPr>
+      <w:r>
+        <w:rPr>
+          <w:rFonts w:ascii="Arial" w:hAnsi="Arial"/>
+          <w:sz w:val="28"/>
+        </w:rPr>
+        <w:t xml:space="preserve"/>
+      </w:r>
+    </w:p>
+    <w:p>
+      <w:pPr>
+        <w:spacing w:line="276" w:lineRule="auto"/>
+      </w:pPr>
+      <w:r>
+        <w:rPr>
+          <w:rFonts w:ascii="Arial" w:hAnsi="Arial"/>
+          <w:sz w:val="28"/>
+        </w:rPr>
+        <w:t xml:space="preserve">204. #134-new — Phone text size on a fresh open is done.</w:t>
+      </w:r>
+    </w:p>
+    <w:p>
+      <w:pPr>
+        <w:spacing w:line="276" w:lineRule="auto"/>
+      </w:pPr>
+      <w:r>
+        <w:rPr>
+          <w:rFonts w:ascii="Arial" w:hAnsi="Arial"/>
+          <w:sz w:val="28"/>
+        </w:rPr>
+        <w:t xml:space="preserve"/>
+      </w:r>
+    </w:p>
+    <w:p>
+      <w:pPr>
+        <w:spacing w:line="276" w:lineRule="auto"/>
+      </w:pPr>
+      <w:r>
+        <w:rPr>
+          <w:rFonts w:ascii="Arial" w:hAnsi="Arial"/>
+          <w:sz w:val="28"/>
+        </w:rPr>
+        <w:t xml:space="preserve">203. #134-new — Daily Snooze works on the iPhone and on the Galaxy.</w:t>
+      </w:r>
+    </w:p>
+    <w:p>
+      <w:pPr>
+        <w:spacing w:line="276" w:lineRule="auto"/>
+      </w:pPr>
+      <w:r>
+        <w:rPr>
+          <w:rFonts w:ascii="Arial" w:hAnsi="Arial"/>
+          <w:sz w:val="28"/>
+        </w:rPr>
+        <w:t xml:space="preserve"/>
+      </w:r>
+    </w:p>
+    <w:p>
+      <w:pPr>
+        <w:spacing w:line="276" w:lineRule="auto"/>
+      </w:pPr>
+      <w:r>
+        <w:rPr>
+          <w:rFonts w:ascii="Arial" w:hAnsi="Arial"/>
+          <w:sz w:val="28"/>
+        </w:rPr>
+        <w:t xml:space="preserve">202. #134-new — Backup works on the iPhone and on the Galaxy.</w:t>
+      </w:r>
+    </w:p>
+    <w:p>
+      <w:pPr>
+        <w:spacing w:line="276" w:lineRule="auto"/>
+      </w:pPr>
+      <w:r>
+        <w:rPr>
+          <w:rFonts w:ascii="Arial" w:hAnsi="Arial"/>
+          <w:sz w:val="28"/>
+        </w:rPr>
+        <w:t xml:space="preserve"/>
+      </w:r>
+    </w:p>
+    <w:p>
+      <w:pPr>
+        <w:spacing w:line="276" w:lineRule="auto"/>
+      </w:pPr>
+      <w:r>
+        <w:rPr>
+          <w:rFonts w:ascii="Arial" w:hAnsi="Arial"/>
+          <w:sz w:val="28"/>
+        </w:rPr>
+        <w:t xml:space="preserve">201. #134-new — Birthday list reorder works on the iPhone and on the</w:t>
+      </w:r>
+    </w:p>
+    <w:p>
+      <w:pPr>
+        <w:spacing w:line="276" w:lineRule="auto"/>
+      </w:pPr>
+      <w:r>
+        <w:rPr>
+          <w:rFonts w:ascii="Arial" w:hAnsi="Arial"/>
+          <w:sz w:val="28"/>
+        </w:rPr>
+        <w:t xml:space="preserve">    Galaxy.</w:t>
+      </w:r>
+    </w:p>
+    <w:p>
+      <w:pPr>
+        <w:spacing w:line="276" w:lineRule="auto"/>
+      </w:pPr>
+      <w:r>
+        <w:rPr>
+          <w:rFonts w:ascii="Arial" w:hAnsi="Arial"/>
+          <w:sz w:val="28"/>
+        </w:rPr>
+        <w:t xml:space="preserve"/>
+      </w:r>
+    </w:p>
+    <w:p>
+      <w:pPr>
+        <w:spacing w:line="276" w:lineRule="auto"/>
+      </w:pPr>
+      <w:r>
+        <w:rPr>
+          <w:rFonts w:ascii="Arial" w:hAnsi="Arial"/>
+          <w:sz w:val="28"/>
+        </w:rPr>
+        <w:t xml:space="preserve">200. #134-new — Android number 5 (1.0.0) is the internal test on the</w:t>
+      </w:r>
+    </w:p>
+    <w:p>
+      <w:pPr>
+        <w:spacing w:line="276" w:lineRule="auto"/>
+      </w:pPr>
+      <w:r>
+        <w:rPr>
+          <w:rFonts w:ascii="Arial" w:hAnsi="Arial"/>
+          <w:sz w:val="28"/>
+        </w:rPr>
+        <w:t xml:space="preserve">    Galaxy and it is working. Build 3 is no longer that load. Play</w:t>
+      </w:r>
+    </w:p>
+    <w:p>
+      <w:pPr>
+        <w:spacing w:line="276" w:lineRule="auto"/>
+      </w:pPr>
+      <w:r>
+        <w:rPr>
+          <w:rFonts w:ascii="Arial" w:hAnsi="Arial"/>
+          <w:sz w:val="28"/>
+        </w:rPr>
+        <w:t xml:space="preserve">    Console on the Mac is the Comcast account. The phone's Play Store</w:t>
+      </w:r>
+    </w:p>
+    <w:p>
+      <w:pPr>
+        <w:spacing w:line="276" w:lineRule="auto"/>
+      </w:pPr>
+      <w:r>
+        <w:rPr>
+          <w:rFonts w:ascii="Arial" w:hAnsi="Arial"/>
+          <w:sz w:val="28"/>
+        </w:rPr>
+        <w:t xml:space="preserve">    is the iCloud account.</w:t>
+      </w:r>
+    </w:p>
+    <w:p>
+      <w:pPr>
+        <w:spacing w:line="276" w:lineRule="auto"/>
+      </w:pPr>
+      <w:r>
+        <w:rPr>
+          <w:rFonts w:ascii="Arial" w:hAnsi="Arial"/>
+          <w:sz w:val="28"/>
+        </w:rPr>
+        <w:t xml:space="preserve"/>
+      </w:r>
+    </w:p>
+    <w:p>
+      <w:pPr>
+        <w:spacing w:line="276" w:lineRule="auto"/>
+      </w:pPr>
+      <w:r>
+        <w:rPr>
+          <w:rFonts w:ascii="Arial" w:hAnsi="Arial"/>
+          <w:sz w:val="28"/>
+        </w:rPr>
+        <w:t xml:space="preserve">199. #134-new — Daily and One Time ask for 1, 5, 10, 15, 30, or 60</w:t>
+      </w:r>
+    </w:p>
+    <w:p>
+      <w:pPr>
+        <w:spacing w:line="276" w:lineRule="auto"/>
+      </w:pPr>
+      <w:r>
+        <w:rPr>
+          <w:rFonts w:ascii="Arial" w:hAnsi="Arial"/>
+          <w:sz w:val="28"/>
+        </w:rPr>
+        <w:t xml:space="preserve">    minutes, on two rows of the same buttons as the other snooze</w:t>
+      </w:r>
+    </w:p>
+    <w:p>
+      <w:pPr>
+        <w:spacing w:line="276" w:lineRule="auto"/>
+      </w:pPr>
+      <w:r>
+        <w:rPr>
+          <w:rFonts w:ascii="Arial" w:hAnsi="Arial"/>
+          <w:sz w:val="28"/>
+        </w:rPr>
+        <w:t xml:space="preserve">    modals. The banners stay at 15, 30, and 60. Not on the phone.</w:t>
+      </w:r>
+    </w:p>
+    <w:p>
+      <w:pPr>
+        <w:spacing w:line="276" w:lineRule="auto"/>
+      </w:pPr>
+      <w:r>
+        <w:rPr>
+          <w:rFonts w:ascii="Arial" w:hAnsi="Arial"/>
+          <w:sz w:val="28"/>
+        </w:rPr>
+        <w:t xml:space="preserve"/>
+      </w:r>
+    </w:p>
+    <w:p>
+      <w:pPr>
+        <w:spacing w:line="276" w:lineRule="auto"/>
+      </w:pPr>
+      <w:r>
+        <w:rPr>
+          <w:rFonts w:ascii="Arial" w:hAnsi="Arial"/>
+          <w:sz w:val="28"/>
+        </w:rPr>
+        <w:t xml:space="preserve">198. #133-new — On New, the choices for that reminder are listed on</w:t>
+      </w:r>
+    </w:p>
+    <w:p>
+      <w:pPr>
+        <w:spacing w:line="276" w:lineRule="auto"/>
+      </w:pPr>
+      <w:r>
+        <w:rPr>
+          <w:rFonts w:ascii="Arial" w:hAnsi="Arial"/>
+          <w:sz w:val="28"/>
+        </w:rPr>
+        <w:t xml:space="preserve">    the form, each with a short description. Not on the phone.</w:t>
+      </w:r>
+    </w:p>
+    <w:p>
+      <w:pPr>
+        <w:spacing w:line="276" w:lineRule="auto"/>
+      </w:pPr>
+      <w:r>
+        <w:rPr>
+          <w:rFonts w:ascii="Arial" w:hAnsi="Arial"/>
+          <w:sz w:val="28"/>
+        </w:rPr>
+        <w:t xml:space="preserve"/>
+      </w:r>
+    </w:p>
+    <w:p>
+      <w:pPr>
+        <w:spacing w:line="276" w:lineRule="auto"/>
+      </w:pPr>
+      <w:r>
+        <w:rPr>
+          <w:rFonts w:ascii="Arial" w:hAnsi="Arial"/>
+          <w:sz w:val="28"/>
+        </w:rPr>
+        <w:t xml:space="preserve">197. #133-new — Daily asks for 5, 10, 15, 30, or 60 minutes, with no</w:t>
+      </w:r>
+    </w:p>
+    <w:p>
+      <w:pPr>
+        <w:spacing w:line="276" w:lineRule="auto"/>
+      </w:pPr>
+      <w:r>
+        <w:rPr>
+          <w:rFonts w:ascii="Arial" w:hAnsi="Arial"/>
+          <w:sz w:val="28"/>
+        </w:rPr>
+        <w:t xml:space="preserve">    wheel. Not on the phone.</w:t>
       </w:r>
     </w:p>
     <w:p>

</xml_diff>

<commit_message>
138.6-new- Real build, new name DONE.
</commit_message>
<xml_diff>
--- a/docs/pending.docx
+++ b/docs/pending.docx
@@ -12,19 +12,19 @@
           <w:b/>
           <w:sz w:val="28"/>
         </w:rPr>
-        <w:t xml:space="preserve">A PLACE TO REMEMBER (badge: Memory) — PENDING WORK, plain-language list</w:t>
-      </w:r>
-    </w:p>
-    <w:p>
-      <w:pPr>
-        <w:spacing w:line="276" w:lineRule="auto"/>
-      </w:pPr>
-      <w:r>
-        <w:rPr>
-          <w:rFonts w:ascii="Arial" w:hAnsi="Arial"/>
-          <w:sz w:val="28"/>
-        </w:rPr>
-        <w:t xml:space="preserve">Last updated: 2026-10-10</w:t>
+        <w:t xml:space="preserve">MY REMINDERS — PENDING WORK, plain-language list</w:t>
+      </w:r>
+    </w:p>
+    <w:p>
+      <w:pPr>
+        <w:spacing w:line="276" w:lineRule="auto"/>
+      </w:pPr>
+      <w:r>
+        <w:rPr>
+          <w:rFonts w:ascii="Arial" w:hAnsi="Arial"/>
+          <w:sz w:val="28"/>
+        </w:rPr>
+        <w:t xml:space="preserve">Last updated: 2026-10-15</w:t>
       </w:r>
     </w:p>
     <w:p>
@@ -325,67 +325,451 @@
           <w:rFonts w:ascii="Arial" w:hAnsi="Arial"/>
           <w:sz w:val="28"/>
         </w:rPr>
-        <w:t xml:space="preserve">1. IOS BUILD 100 is Waiting for Review. When Apple approves, you</w:t>
-      </w:r>
-    </w:p>
-    <w:p>
-      <w:pPr>
-        <w:spacing w:line="276" w:lineRule="auto"/>
-      </w:pPr>
-      <w:r>
-        <w:rPr>
-          <w:rFonts w:ascii="Arial" w:hAnsi="Arial"/>
-          <w:sz w:val="28"/>
-        </w:rPr>
-        <w:t xml:space="preserve">   release it yourself. Release is manual (2026-10-01).</w:t>
-      </w:r>
-    </w:p>
-    <w:p>
-      <w:pPr>
-        <w:spacing w:line="276" w:lineRule="auto"/>
-      </w:pPr>
-      <w:r>
-        <w:rPr>
-          <w:rFonts w:ascii="Arial" w:hAnsi="Arial"/>
-          <w:sz w:val="28"/>
-        </w:rPr>
-        <w:t xml:space="preserve">2. THE PRICE ON ANDROID. $9.99 once, no trial. The iPhone listing</w:t>
-      </w:r>
-    </w:p>
-    <w:p>
-      <w:pPr>
-        <w:spacing w:line="276" w:lineRule="auto"/>
-      </w:pPr>
-      <w:r>
-        <w:rPr>
-          <w:rFonts w:ascii="Arial" w:hAnsi="Arial"/>
-          <w:sz w:val="28"/>
-        </w:rPr>
-        <w:t xml:space="preserve">   already has that price. The Play account is open, and Android</w:t>
-      </w:r>
-    </w:p>
-    <w:p>
-      <w:pPr>
-        <w:spacing w:line="276" w:lineRule="auto"/>
-      </w:pPr>
-      <w:r>
-        <w:rPr>
-          <w:rFonts w:ascii="Arial" w:hAnsi="Arial"/>
-          <w:sz w:val="28"/>
-        </w:rPr>
-        <w:t xml:space="preserve">   number 5 is the internal test on your Galaxy (#134-new). The public</w:t>
-      </w:r>
-    </w:p>
-    <w:p>
-      <w:pPr>
-        <w:spacing w:line="276" w:lineRule="auto"/>
-      </w:pPr>
-      <w:r>
-        <w:rPr>
-          <w:rFonts w:ascii="Arial" w:hAnsi="Arial"/>
-          <w:sz w:val="28"/>
-        </w:rPr>
-        <w:t xml:space="preserve">   Android listing still waits (#123-new).</w:t>
+        <w:t xml:space="preserve">1. IOS BUILD 100 is Waiting for Review. Take it off review before</w:t>
+      </w:r>
+    </w:p>
+    <w:p>
+      <w:pPr>
+        <w:spacing w:line="276" w:lineRule="auto"/>
+      </w:pPr>
+      <w:r>
+        <w:rPr>
+          <w:rFonts w:ascii="Arial" w:hAnsi="Arial"/>
+          <w:sz w:val="28"/>
+        </w:rPr>
+        <w:t xml:space="preserve">   you change the name or the screenshots. On the version page, the</w:t>
+      </w:r>
+    </w:p>
+    <w:p>
+      <w:pPr>
+        <w:spacing w:line="276" w:lineRule="auto"/>
+      </w:pPr>
+      <w:r>
+        <w:rPr>
+          <w:rFonts w:ascii="Arial" w:hAnsi="Arial"/>
+          <w:sz w:val="28"/>
+        </w:rPr>
+        <w:t xml:space="preserve">   message at the top says remove this version from review. Build 120</w:t>
+      </w:r>
+    </w:p>
+    <w:p>
+      <w:pPr>
+        <w:spacing w:line="276" w:lineRule="auto"/>
+      </w:pPr>
+      <w:r>
+        <w:rPr>
+          <w:rFonts w:ascii="Arial" w:hAnsi="Arial"/>
+          <w:sz w:val="28"/>
+        </w:rPr>
+        <w:t xml:space="preserve">   is on your iPhone. It is the one for the store. You can add and</w:t>
+      </w:r>
+    </w:p>
+    <w:p>
+      <w:pPr>
+        <w:spacing w:line="276" w:lineRule="auto"/>
+      </w:pPr>
+      <w:r>
+        <w:rPr>
+          <w:rFonts w:ascii="Arial" w:hAnsi="Arial"/>
+          <w:sz w:val="28"/>
+        </w:rPr>
+        <w:t xml:space="preserve">   change on that copy. That is expected. Do not send an older</w:t>
+      </w:r>
+    </w:p>
+    <w:p>
+      <w:pPr>
+        <w:spacing w:line="276" w:lineRule="auto"/>
+      </w:pPr>
+      <w:r>
+        <w:rPr>
+          <w:rFonts w:ascii="Arial" w:hAnsi="Arial"/>
+          <w:sz w:val="28"/>
+        </w:rPr>
+        <w:t xml:space="preserve">   picture build. The store name on this same app becomes My</w:t>
+      </w:r>
+    </w:p>
+    <w:p>
+      <w:pPr>
+        <w:spacing w:line="276" w:lineRule="auto"/>
+      </w:pPr>
+      <w:r>
+        <w:rPr>
+          <w:rFonts w:ascii="Arial" w:hAnsi="Arial"/>
+          <w:sz w:val="28"/>
+        </w:rPr>
+        <w:t xml:space="preserve">   Reminders. This is not a new app. The purchase display name and</w:t>
+      </w:r>
+    </w:p>
+    <w:p>
+      <w:pPr>
+        <w:spacing w:line="276" w:lineRule="auto"/>
+      </w:pPr>
+      <w:r>
+        <w:rPr>
+          <w:rFonts w:ascii="Arial" w:hAnsi="Arial"/>
+          <w:sz w:val="28"/>
+        </w:rPr>
+        <w:t xml:space="preserve">   reference name become My Reminders. Add the saved notice under</w:t>
+      </w:r>
+    </w:p>
+    <w:p>
+      <w:pPr>
+        <w:spacing w:line="276" w:lineRule="auto"/>
+      </w:pPr>
+      <w:r>
+        <w:rPr>
+          <w:rFonts w:ascii="Arial" w:hAnsi="Arial"/>
+          <w:sz w:val="28"/>
+        </w:rPr>
+        <w:t xml:space="preserve">   Review Information on the purchase. Use the picture that says My</w:t>
+      </w:r>
+    </w:p>
+    <w:p>
+      <w:pPr>
+        <w:spacing w:line="276" w:lineRule="auto"/>
+      </w:pPr>
+      <w:r>
+        <w:rPr>
+          <w:rFonts w:ascii="Arial" w:hAnsi="Arial"/>
+          <w:sz w:val="28"/>
+        </w:rPr>
+        <w:t xml:space="preserve">   Reminders. Pictures that say A Place To Remember do not go on.</w:t>
+      </w:r>
+    </w:p>
+    <w:p>
+      <w:pPr>
+        <w:spacing w:line="276" w:lineRule="auto"/>
+      </w:pPr>
+      <w:r>
+        <w:rPr>
+          <w:rFonts w:ascii="Arial" w:hAnsi="Arial"/>
+          <w:sz w:val="28"/>
+        </w:rPr>
+        <w:t xml:space="preserve">   Add the light-theme pictures of the pages on the version page.</w:t>
+      </w:r>
+    </w:p>
+    <w:p>
+      <w:pPr>
+        <w:spacing w:line="276" w:lineRule="auto"/>
+      </w:pPr>
+      <w:r>
+        <w:rPr>
+          <w:rFonts w:ascii="Arial" w:hAnsi="Arial"/>
+          <w:sz w:val="28"/>
+        </w:rPr>
+        <w:t xml:space="preserve">   The build on that page is 120. The purchase goes in that same</w:t>
+      </w:r>
+    </w:p>
+    <w:p>
+      <w:pPr>
+        <w:spacing w:line="276" w:lineRule="auto"/>
+      </w:pPr>
+      <w:r>
+        <w:rPr>
+          <w:rFonts w:ascii="Arial" w:hAnsi="Arial"/>
+          <w:sz w:val="28"/>
+        </w:rPr>
+        <w:t xml:space="preserve">   submission. When Apple approves, you release it yourself. Release</w:t>
+      </w:r>
+    </w:p>
+    <w:p>
+      <w:pPr>
+        <w:spacing w:line="276" w:lineRule="auto"/>
+      </w:pPr>
+      <w:r>
+        <w:rPr>
+          <w:rFonts w:ascii="Arial" w:hAnsi="Arial"/>
+          <w:sz w:val="28"/>
+        </w:rPr>
+        <w:t xml:space="preserve">   is manual. The Galaxy free trial is not in that build.</w:t>
+      </w:r>
+    </w:p>
+    <w:p>
+      <w:pPr>
+        <w:spacing w:line="276" w:lineRule="auto"/>
+      </w:pPr>
+      <w:r>
+        <w:rPr>
+          <w:rFonts w:ascii="Arial" w:hAnsi="Arial"/>
+          <w:sz w:val="28"/>
+        </w:rPr>
+        <w:t xml:space="preserve">2. THE PRICE. On the iPhone the download is free. The App Store page</w:t>
+      </w:r>
+    </w:p>
+    <w:p>
+      <w:pPr>
+        <w:spacing w:line="276" w:lineRule="auto"/>
+      </w:pPr>
+      <w:r>
+        <w:rPr>
+          <w:rFonts w:ascii="Arial" w:hAnsi="Arial"/>
+          <w:sz w:val="28"/>
+        </w:rPr>
+        <w:t xml:space="preserve">   says it before the download. It is a free one month trial period.</w:t>
+      </w:r>
+    </w:p>
+    <w:p>
+      <w:pPr>
+        <w:spacing w:line="276" w:lineRule="auto"/>
+      </w:pPr>
+      <w:r>
+        <w:rPr>
+          <w:rFonts w:ascii="Arial" w:hAnsi="Arial"/>
+          <w:sz w:val="28"/>
+        </w:rPr>
+        <w:t xml:space="preserve">   Then it is $9.99 once, here in My Reminders. The buyer is not surprised</w:t>
+      </w:r>
+    </w:p>
+    <w:p>
+      <w:pPr>
+        <w:spacing w:line="276" w:lineRule="auto"/>
+      </w:pPr>
+      <w:r>
+        <w:rPr>
+          <w:rFonts w:ascii="Arial" w:hAnsi="Arial"/>
+          <w:sz w:val="28"/>
+        </w:rPr>
+        <w:t xml:space="preserve">   with that later. Those words have not been typed onto the store</w:t>
+      </w:r>
+    </w:p>
+    <w:p>
+      <w:pPr>
+        <w:spacing w:line="276" w:lineRule="auto"/>
+      </w:pPr>
+      <w:r>
+        <w:rPr>
+          <w:rFonts w:ascii="Arial" w:hAnsi="Arial"/>
+          <w:sz w:val="28"/>
+        </w:rPr>
+        <w:t xml:space="preserve">   page yet. The purchase is in the code. Build 120 is on the iPhone,</w:t>
+      </w:r>
+    </w:p>
+    <w:p>
+      <w:pPr>
+        <w:spacing w:line="276" w:lineRule="auto"/>
+      </w:pPr>
+      <w:r>
+        <w:rPr>
+          <w:rFonts w:ascii="Arial" w:hAnsi="Arial"/>
+          <w:sz w:val="28"/>
+        </w:rPr>
+        <w:t xml:space="preserve">   and you can add and change on that copy. The purchase is created in App Store</w:t>
+      </w:r>
+    </w:p>
+    <w:p>
+      <w:pPr>
+        <w:spacing w:line="276" w:lineRule="auto"/>
+      </w:pPr>
+      <w:r>
+        <w:rPr>
+          <w:rFonts w:ascii="Arial" w:hAnsi="Arial"/>
+          <w:sz w:val="28"/>
+        </w:rPr>
+        <w:t xml:space="preserve">   Connect and is waiting. It has not been sent for review. Its name</w:t>
+      </w:r>
+    </w:p>
+    <w:p>
+      <w:pPr>
+        <w:spacing w:line="276" w:lineRule="auto"/>
+      </w:pPr>
+      <w:r>
+        <w:rPr>
+          <w:rFonts w:ascii="Arial" w:hAnsi="Arial"/>
+          <w:sz w:val="28"/>
+        </w:rPr>
+        <w:t xml:space="preserve">   is com.molliedog.ElderlyAssistant.full and the price is $9.99. The</w:t>
+      </w:r>
+    </w:p>
+    <w:p>
+      <w:pPr>
+        <w:spacing w:line="276" w:lineRule="auto"/>
+      </w:pPr>
+      <w:r>
+        <w:rPr>
+          <w:rFonts w:ascii="Arial" w:hAnsi="Arial"/>
+          <w:sz w:val="28"/>
+        </w:rPr>
+        <w:t xml:space="preserve">   app counts one month from the day Apple says you first downloaded</w:t>
+      </w:r>
+    </w:p>
+    <w:p>
+      <w:pPr>
+        <w:spacing w:line="276" w:lineRule="auto"/>
+      </w:pPr>
+      <w:r>
+        <w:rPr>
+          <w:rFonts w:ascii="Arial" w:hAnsi="Arial"/>
+          <w:sz w:val="28"/>
+        </w:rPr>
+        <w:t xml:space="preserve">   it. If Apple gives no day, the notice stays hidden and adding still</w:t>
+      </w:r>
+    </w:p>
+    <w:p>
+      <w:pPr>
+        <w:spacing w:line="276" w:lineRule="auto"/>
+      </w:pPr>
+      <w:r>
+        <w:rPr>
+          <w:rFonts w:ascii="Arial" w:hAnsi="Arial"/>
+          <w:sz w:val="28"/>
+        </w:rPr>
+        <w:t xml:space="preserve">   works. That is what the phone did. When the month ends and you have not</w:t>
+      </w:r>
+    </w:p>
+    <w:p>
+      <w:pPr>
+        <w:spacing w:line="276" w:lineRule="auto"/>
+      </w:pPr>
+      <w:r>
+        <w:rPr>
+          <w:rFonts w:ascii="Arial" w:hAnsi="Arial"/>
+          <w:sz w:val="28"/>
+        </w:rPr>
+        <w:t xml:space="preserve">   paid, you meet the payment when you try to add or change. Reminders</w:t>
+      </w:r>
+    </w:p>
+    <w:p>
+      <w:pPr>
+        <w:spacing w:line="276" w:lineRule="auto"/>
+      </w:pPr>
+      <w:r>
+        <w:rPr>
+          <w:rFonts w:ascii="Arial" w:hAnsi="Arial"/>
+          <w:sz w:val="28"/>
+        </w:rPr>
+        <w:t xml:space="preserve">   already set keep firing, and adding and changing waits. Your lists</w:t>
+      </w:r>
+    </w:p>
+    <w:p>
+      <w:pPr>
+        <w:spacing w:line="276" w:lineRule="auto"/>
+      </w:pPr>
+      <w:r>
+        <w:rPr>
+          <w:rFonts w:ascii="Arial" w:hAnsi="Arial"/>
+          <w:sz w:val="28"/>
+        </w:rPr>
+        <w:t xml:space="preserve">   stay on this phone. You can back up what you already have, and</w:t>
+      </w:r>
+    </w:p>
+    <w:p>
+      <w:pPr>
+        <w:spacing w:line="276" w:lineRule="auto"/>
+      </w:pPr>
+      <w:r>
+        <w:rPr>
+          <w:rFonts w:ascii="Arial" w:hAnsi="Arial"/>
+          <w:sz w:val="28"/>
+        </w:rPr>
+        <w:t xml:space="preserve">   restore those lists on another iPhone after the purchase is there.</w:t>
+      </w:r>
+    </w:p>
+    <w:p>
+      <w:pPr>
+        <w:spacing w:line="276" w:lineRule="auto"/>
+      </w:pPr>
+      <w:r>
+        <w:rPr>
+          <w:rFonts w:ascii="Arial" w:hAnsi="Arial"/>
+          <w:sz w:val="28"/>
+        </w:rPr>
+        <w:t xml:space="preserve">   The Galaxy free trial waits until the iPhone is in the App Store</w:t>
+      </w:r>
+    </w:p>
+    <w:p>
+      <w:pPr>
+        <w:spacing w:line="276" w:lineRule="auto"/>
+      </w:pPr>
+      <w:r>
+        <w:rPr>
+          <w:rFonts w:ascii="Arial" w:hAnsi="Arial"/>
+          <w:sz w:val="28"/>
+        </w:rPr>
+        <w:t xml:space="preserve">   and entered in the Expo competition. Whether the Galaxy gets a free</w:t>
+      </w:r>
+    </w:p>
+    <w:p>
+      <w:pPr>
+        <w:spacing w:line="276" w:lineRule="auto"/>
+      </w:pPr>
+      <w:r>
+        <w:rPr>
+          <w:rFonts w:ascii="Arial" w:hAnsi="Arial"/>
+          <w:sz w:val="28"/>
+        </w:rPr>
+        <w:t xml:space="preserve">   trial is still open. The Play account is open, and Android number 5</w:t>
+      </w:r>
+    </w:p>
+    <w:p>
+      <w:pPr>
+        <w:spacing w:line="276" w:lineRule="auto"/>
+      </w:pPr>
+      <w:r>
+        <w:rPr>
+          <w:rFonts w:ascii="Arial" w:hAnsi="Arial"/>
+          <w:sz w:val="28"/>
+        </w:rPr>
+        <w:t xml:space="preserve">   is the internal test on your Galaxy. The public Android listing</w:t>
+      </w:r>
+    </w:p>
+    <w:p>
+      <w:pPr>
+        <w:spacing w:line="276" w:lineRule="auto"/>
+      </w:pPr>
+      <w:r>
+        <w:rPr>
+          <w:rFonts w:ascii="Arial" w:hAnsi="Arial"/>
+          <w:sz w:val="28"/>
+        </w:rPr>
+        <w:t xml:space="preserve">   still waits.</w:t>
+      </w:r>
+    </w:p>
+    <w:p>
+      <w:pPr>
+        <w:spacing w:line="276" w:lineRule="auto"/>
+      </w:pPr>
+      <w:r>
+        <w:rPr>
+          <w:rFonts w:ascii="Arial" w:hAnsi="Arial"/>
+          <w:sz w:val="28"/>
+        </w:rPr>
+        <w:t xml:space="preserve">3. THE EXPO APP AWARDS. The record is docs/expo-awards.md. The entry</w:t>
+      </w:r>
+    </w:p>
+    <w:p>
+      <w:pPr>
+        <w:spacing w:line="276" w:lineRule="auto"/>
+      </w:pPr>
+      <w:r>
+        <w:rPr>
+          <w:rFonts w:ascii="Arial" w:hAnsi="Arial"/>
+          <w:sz w:val="28"/>
+        </w:rPr>
+        <w:t xml:space="preserve">   waits on a public iPhone page, and the form closes October 31.</w:t>
+      </w:r>
+    </w:p>
+    <w:p>
+      <w:pPr>
+        <w:spacing w:line="276" w:lineRule="auto"/>
+      </w:pPr>
+      <w:r>
+        <w:rPr>
+          <w:rFonts w:ascii="Arial" w:hAnsi="Arial"/>
+          <w:sz w:val="28"/>
+        </w:rPr>
+        <w:t xml:space="preserve">   Android is not that page. The payments profile is not set up, and</w:t>
+      </w:r>
+    </w:p>
+    <w:p>
+      <w:pPr>
+        <w:spacing w:line="276" w:lineRule="auto"/>
+      </w:pPr>
+      <w:r>
+        <w:rPr>
+          <w:rFonts w:ascii="Arial" w:hAnsi="Arial"/>
+          <w:sz w:val="28"/>
+        </w:rPr>
+        <w:t xml:space="preserve">   the Android release waits on 12 testers, which you do not have.</w:t>
       </w:r>
     </w:p>
     <w:p>
@@ -470,31 +854,43 @@
           <w:rFonts w:ascii="Arial" w:hAnsi="Arial"/>
           <w:sz w:val="28"/>
         </w:rPr>
-        <w:t xml:space="preserve">1. A one-time load that shows the saved-list read warning, without</w:t>
-      </w:r>
-    </w:p>
-    <w:p>
-      <w:pPr>
-        <w:spacing w:line="276" w:lineRule="auto"/>
-      </w:pPr>
-      <w:r>
-        <w:rPr>
-          <w:rFonts w:ascii="Arial" w:hAnsi="Arial"/>
-          <w:sz w:val="28"/>
-        </w:rPr>
-        <w:t xml:space="preserve">   changing the saved reminders. Not now. Your Expo build usage is</w:t>
-      </w:r>
-    </w:p>
-    <w:p>
-      <w:pPr>
-        <w:spacing w:line="276" w:lineRule="auto"/>
-      </w:pPr>
-      <w:r>
-        <w:rPr>
-          <w:rFonts w:ascii="Arial" w:hAnsi="Arial"/>
-          <w:sz w:val="28"/>
-        </w:rPr>
-        <w:t xml:space="preserve">   high enough.</w:t>
+        <w:t xml:space="preserve">1. The tester gets the copy already on Play. Send the join link.</w:t>
+      </w:r>
+    </w:p>
+    <w:p>
+      <w:pPr>
+        <w:spacing w:line="276" w:lineRule="auto"/>
+      </w:pPr>
+      <w:r>
+        <w:rPr>
+          <w:rFonts w:ascii="Arial" w:hAnsi="Arial"/>
+          <w:sz w:val="28"/>
+        </w:rPr>
+        <w:t xml:space="preserve">   A text is fine. They open it on the Android phone and install</w:t>
+      </w:r>
+    </w:p>
+    <w:p>
+      <w:pPr>
+        <w:spacing w:line="276" w:lineRule="auto"/>
+      </w:pPr>
+      <w:r>
+        <w:rPr>
+          <w:rFonts w:ascii="Arial" w:hAnsi="Arial"/>
+          <w:sz w:val="28"/>
+        </w:rPr>
+        <w:t xml:space="preserve">   from the Play Store. Do not build a separate file to email.</w:t>
+      </w:r>
+    </w:p>
+    <w:p>
+      <w:pPr>
+        <w:spacing w:line="276" w:lineRule="auto"/>
+      </w:pPr>
+      <w:r>
+        <w:rPr>
+          <w:rFonts w:ascii="Arial" w:hAnsi="Arial"/>
+          <w:sz w:val="28"/>
+        </w:rPr>
+        <w:t xml:space="preserve">   (#135-new)</w:t>
       </w:r>
     </w:p>
     <w:p>
@@ -592,6 +988,54 @@
           <w:sz w:val="28"/>
         </w:rPr>
         <w:t xml:space="preserve">docs/handoff-history.md.</w:t>
+      </w:r>
+    </w:p>
+    <w:p>
+      <w:pPr>
+        <w:spacing w:line="276" w:lineRule="auto"/>
+      </w:pPr>
+      <w:r>
+        <w:rPr>
+          <w:rFonts w:ascii="Arial" w:hAnsi="Arial"/>
+          <w:sz w:val="28"/>
+        </w:rPr>
+        <w:t xml:space="preserve"/>
+      </w:r>
+    </w:p>
+    <w:p>
+      <w:pPr>
+        <w:spacing w:line="276" w:lineRule="auto"/>
+      </w:pPr>
+      <w:r>
+        <w:rPr>
+          <w:rFonts w:ascii="Arial" w:hAnsi="Arial"/>
+          <w:sz w:val="28"/>
+        </w:rPr>
+        <w:t xml:space="preserve">212. #138.3-new — The name is My Reminders. Build 120 is on the</w:t>
+      </w:r>
+    </w:p>
+    <w:p>
+      <w:pPr>
+        <w:spacing w:line="276" w:lineRule="auto"/>
+      </w:pPr>
+      <w:r>
+        <w:rPr>
+          <w:rFonts w:ascii="Arial" w:hAnsi="Arial"/>
+          <w:sz w:val="28"/>
+        </w:rPr>
+        <w:t xml:space="preserve">    iPhone and is the build for the store. The pay screen was saved</w:t>
+      </w:r>
+    </w:p>
+    <w:p>
+      <w:pPr>
+        <w:spacing w:line="276" w:lineRule="auto"/>
+      </w:pPr>
+      <w:r>
+        <w:rPr>
+          <w:rFonts w:ascii="Arial" w:hAnsi="Arial"/>
+          <w:sz w:val="28"/>
+        </w:rPr>
+        <w:t xml:space="preserve">    from the picture build. Build 100 is still Waiting for Review.</w:t>
       </w:r>
     </w:p>
     <w:p>

</xml_diff>

<commit_message>
139.2 -new- Done w/ App Store w/ new name & price. Waiting for Apple.
</commit_message>
<xml_diff>
--- a/docs/pending.docx
+++ b/docs/pending.docx
@@ -9,262 +9,430 @@
       <w:r>
         <w:rPr>
           <w:rFonts w:ascii="Arial" w:hAnsi="Arial"/>
+          <w:sz w:val="28"/>
+        </w:rPr>
+        <w:t xml:space="preserve">DAILY REMINDERS — PENDING WORK, plain-language list</w:t>
+      </w:r>
+    </w:p>
+    <w:p>
+      <w:pPr>
+        <w:spacing w:line="276" w:lineRule="auto"/>
+      </w:pPr>
+      <w:r>
+        <w:rPr>
+          <w:rFonts w:ascii="Arial" w:hAnsi="Arial"/>
+          <w:sz w:val="28"/>
+        </w:rPr>
+        <w:t xml:space="preserve">Last updated: 2026-10-15</w:t>
+      </w:r>
+    </w:p>
+    <w:p>
+      <w:pPr>
+        <w:spacing w:line="276" w:lineRule="auto"/>
+      </w:pPr>
+      <w:r>
+        <w:rPr>
+          <w:rFonts w:ascii="Arial" w:hAnsi="Arial"/>
+          <w:sz w:val="28"/>
+        </w:rPr>
+        <w:t xml:space="preserve"/>
+      </w:r>
+    </w:p>
+    <w:p>
+      <w:pPr>
+        <w:spacing w:line="276" w:lineRule="auto"/>
+      </w:pPr>
+      <w:r>
+        <w:rPr>
+          <w:rFonts w:ascii="Arial" w:hAnsi="Arial"/>
+          <w:sz w:val="28"/>
+        </w:rPr>
+        <w:t xml:space="preserve">This is the "what's still left" list in everyday words. Nothing here</w:t>
+      </w:r>
+    </w:p>
+    <w:p>
+      <w:pPr>
+        <w:spacing w:line="276" w:lineRule="auto"/>
+      </w:pPr>
+      <w:r>
+        <w:rPr>
+          <w:rFonts w:ascii="Arial" w:hAnsi="Arial"/>
+          <w:sz w:val="28"/>
+        </w:rPr>
+        <w:t xml:space="preserve">is urgent. You are the only reader, so this list says you.</w:t>
+      </w:r>
+    </w:p>
+    <w:p>
+      <w:pPr>
+        <w:spacing w:line="276" w:lineRule="auto"/>
+      </w:pPr>
+      <w:r>
+        <w:rPr>
+          <w:rFonts w:ascii="Arial" w:hAnsi="Arial"/>
+          <w:sz w:val="28"/>
+        </w:rPr>
+        <w:t xml:space="preserve"/>
+      </w:r>
+    </w:p>
+    <w:p>
+      <w:pPr>
+        <w:spacing w:line="276" w:lineRule="auto"/>
+      </w:pPr>
+      <w:r>
+        <w:rPr>
+          <w:rFonts w:ascii="Arial" w:hAnsi="Arial"/>
+          <w:sz w:val="28"/>
+        </w:rPr>
+        <w:t xml:space="preserve">The items under each heading are numbered so you can point at one —</w:t>
+      </w:r>
+    </w:p>
+    <w:p>
+      <w:pPr>
+        <w:spacing w:line="276" w:lineRule="auto"/>
+      </w:pPr>
+      <w:r>
+        <w:rPr>
+          <w:rFonts w:ascii="Arial" w:hAnsi="Arial"/>
+          <w:sz w:val="28"/>
+        </w:rPr>
+        <w:t xml:space="preserve">"What's Next 1", "Done 186" — and both of us know which you mean. The</w:t>
+      </w:r>
+    </w:p>
+    <w:p>
+      <w:pPr>
+        <w:spacing w:line="276" w:lineRule="auto"/>
+      </w:pPr>
+      <w:r>
+        <w:rPr>
+          <w:rFonts w:ascii="Arial" w:hAnsi="Arial"/>
+          <w:sz w:val="28"/>
+        </w:rPr>
+        <w:t xml:space="preserve">numbers belong to the heading above them and start again at 1 under</w:t>
+      </w:r>
+    </w:p>
+    <w:p>
+      <w:pPr>
+        <w:spacing w:line="276" w:lineRule="auto"/>
+      </w:pPr>
+      <w:r>
+        <w:rPr>
+          <w:rFonts w:ascii="Arial" w:hAnsi="Arial"/>
+          <w:sz w:val="28"/>
+        </w:rPr>
+        <w:t xml:space="preserve">each one. Live headings (What's Next, Pending) shift as</w:t>
+      </w:r>
+    </w:p>
+    <w:p>
+      <w:pPr>
+        <w:spacing w:line="276" w:lineRule="auto"/>
+      </w:pPr>
+      <w:r>
+        <w:rPr>
+          <w:rFonts w:ascii="Arial" w:hAnsi="Arial"/>
+          <w:sz w:val="28"/>
+        </w:rPr>
+        <w:t xml:space="preserve">things are added and finished. **Done does not:** newest at the</w:t>
+      </w:r>
+    </w:p>
+    <w:p>
+      <w:pPr>
+        <w:spacing w:line="276" w:lineRule="auto"/>
+      </w:pPr>
+      <w:r>
+        <w:rPr>
+          <w:rFonts w:ascii="Arial" w:hAnsi="Arial"/>
+          <w:sz w:val="28"/>
+        </w:rPr>
+        <w:t xml:space="preserve">top, number 1 on the oldest line at the bottom, so a new sitting</w:t>
+      </w:r>
+    </w:p>
+    <w:p>
+      <w:pPr>
+        <w:spacing w:line="276" w:lineRule="auto"/>
+      </w:pPr>
+      <w:r>
+        <w:rPr>
+          <w:rFonts w:ascii="Arial" w:hAnsi="Arial"/>
+          <w:sz w:val="28"/>
+        </w:rPr>
+        <w:t xml:space="preserve">is the next number and nothing else is renumbered.</w:t>
+      </w:r>
+    </w:p>
+    <w:p>
+      <w:pPr>
+        <w:spacing w:line="276" w:lineRule="auto"/>
+      </w:pPr>
+      <w:r>
+        <w:rPr>
+          <w:rFonts w:ascii="Arial" w:hAnsi="Arial"/>
+          <w:sz w:val="28"/>
+        </w:rPr>
+        <w:t xml:space="preserve"/>
+      </w:r>
+    </w:p>
+    <w:p>
+      <w:pPr>
+        <w:spacing w:line="276" w:lineRule="auto"/>
+      </w:pPr>
+      <w:r>
+        <w:rPr>
+          <w:rFonts w:ascii="Arial" w:hAnsi="Arial"/>
+          <w:sz w:val="28"/>
+        </w:rPr>
+        <w:t xml:space="preserve">The session-by-session story is not kept here any more. It lives in</w:t>
+      </w:r>
+    </w:p>
+    <w:p>
+      <w:pPr>
+        <w:spacing w:line="276" w:lineRule="auto"/>
+      </w:pPr>
+      <w:r>
+        <w:rPr>
+          <w:rFonts w:ascii="Arial" w:hAnsi="Arial"/>
+          <w:sz w:val="28"/>
+        </w:rPr>
+        <w:t xml:space="preserve">docs/handoff-history.md, which is the archive to look at when you want</w:t>
+      </w:r>
+    </w:p>
+    <w:p>
+      <w:pPr>
+        <w:spacing w:line="276" w:lineRule="auto"/>
+      </w:pPr>
+      <w:r>
+        <w:rPr>
+          <w:rFonts w:ascii="Arial" w:hAnsi="Arial"/>
+          <w:sz w:val="28"/>
+        </w:rPr>
+        <w:t xml:space="preserve">to know why something was done the way it was.</w:t>
+      </w:r>
+    </w:p>
+    <w:p>
+      <w:pPr>
+        <w:spacing w:line="276" w:lineRule="auto"/>
+      </w:pPr>
+      <w:r>
+        <w:rPr>
+          <w:rFonts w:ascii="Arial" w:hAnsi="Arial"/>
+          <w:sz w:val="28"/>
+        </w:rPr>
+        <w:t xml:space="preserve"/>
+      </w:r>
+    </w:p>
+    <w:p>
+      <w:pPr>
+        <w:spacing w:line="276" w:lineRule="auto"/>
+      </w:pPr>
+      <w:r>
+        <w:rPr>
+          <w:rFonts w:ascii="Arial" w:hAnsi="Arial"/>
+          <w:sz w:val="28"/>
+        </w:rPr>
+        <w:t xml:space="preserve">Timer Alerts, Vault, Shopping List, and Memory Test left Memory at</w:t>
+      </w:r>
+    </w:p>
+    <w:p>
+      <w:pPr>
+        <w:spacing w:line="276" w:lineRule="auto"/>
+      </w:pPr>
+      <w:r>
+        <w:rPr>
+          <w:rFonts w:ascii="Arial" w:hAnsi="Arial"/>
+          <w:sz w:val="28"/>
+        </w:rPr>
+        <w:t xml:space="preserve">#76-new. Copies stay in Projects/stray apps. Do not raise them as</w:t>
+      </w:r>
+    </w:p>
+    <w:p>
+      <w:pPr>
+        <w:spacing w:line="276" w:lineRule="auto"/>
+      </w:pPr>
+      <w:r>
+        <w:rPr>
+          <w:rFonts w:ascii="Arial" w:hAnsi="Arial"/>
+          <w:sz w:val="28"/>
+        </w:rPr>
+        <w:t xml:space="preserve">engine work. The shopping list is wanted later, with a backup of its</w:t>
+      </w:r>
+    </w:p>
+    <w:p>
+      <w:pPr>
+        <w:spacing w:line="276" w:lineRule="auto"/>
+      </w:pPr>
+      <w:r>
+        <w:rPr>
+          <w:rFonts w:ascii="Arial" w:hAnsi="Arial"/>
+          <w:sz w:val="28"/>
+        </w:rPr>
+        <w:t xml:space="preserve">own.</w:t>
+      </w:r>
+    </w:p>
+    <w:p>
+      <w:pPr>
+        <w:spacing w:line="276" w:lineRule="auto"/>
+      </w:pPr>
+      <w:r>
+        <w:rPr>
+          <w:rFonts w:ascii="Arial" w:hAnsi="Arial"/>
+          <w:sz w:val="28"/>
+        </w:rPr>
+        <w:t xml:space="preserve"/>
+      </w:r>
+    </w:p>
+    <w:p>
+      <w:pPr>
+        <w:spacing w:line="276" w:lineRule="auto"/>
+      </w:pPr>
+      <w:r>
+        <w:rPr>
+          <w:rFonts w:ascii="Arial" w:hAnsi="Arial"/>
+          <w:sz w:val="28"/>
+        </w:rPr>
+        <w:t xml:space="preserve"/>
+      </w:r>
+    </w:p>
+    <w:p>
+      <w:pPr>
+        <w:spacing w:line="276" w:lineRule="auto"/>
+      </w:pPr>
+      <w:r>
+        <w:rPr>
+          <w:rFonts w:ascii="Arial" w:hAnsi="Arial"/>
           <w:b/>
           <w:sz w:val="28"/>
         </w:rPr>
-        <w:t xml:space="preserve">MY REMINDERS — PENDING WORK, plain-language list</w:t>
-      </w:r>
-    </w:p>
-    <w:p>
-      <w:pPr>
-        <w:spacing w:line="276" w:lineRule="auto"/>
-      </w:pPr>
-      <w:r>
-        <w:rPr>
-          <w:rFonts w:ascii="Arial" w:hAnsi="Arial"/>
-          <w:sz w:val="28"/>
-        </w:rPr>
-        <w:t xml:space="preserve">Last updated: 2026-10-15</w:t>
-      </w:r>
-    </w:p>
-    <w:p>
-      <w:pPr>
-        <w:spacing w:line="276" w:lineRule="auto"/>
-      </w:pPr>
-      <w:r>
-        <w:rPr>
-          <w:rFonts w:ascii="Arial" w:hAnsi="Arial"/>
-          <w:sz w:val="28"/>
-        </w:rPr>
-        <w:t xml:space="preserve"/>
-      </w:r>
-    </w:p>
-    <w:p>
-      <w:pPr>
-        <w:spacing w:line="276" w:lineRule="auto"/>
-      </w:pPr>
-      <w:r>
-        <w:rPr>
-          <w:rFonts w:ascii="Arial" w:hAnsi="Arial"/>
-          <w:sz w:val="28"/>
-        </w:rPr>
-        <w:t xml:space="preserve">This is the "what's still left" list in everyday words. Nothing here</w:t>
-      </w:r>
-    </w:p>
-    <w:p>
-      <w:pPr>
-        <w:spacing w:line="276" w:lineRule="auto"/>
-      </w:pPr>
-      <w:r>
-        <w:rPr>
-          <w:rFonts w:ascii="Arial" w:hAnsi="Arial"/>
-          <w:sz w:val="28"/>
-        </w:rPr>
-        <w:t xml:space="preserve">is urgent. You are the only reader, so this list says you.</w:t>
-      </w:r>
-    </w:p>
-    <w:p>
-      <w:pPr>
-        <w:spacing w:line="276" w:lineRule="auto"/>
-      </w:pPr>
-      <w:r>
-        <w:rPr>
-          <w:rFonts w:ascii="Arial" w:hAnsi="Arial"/>
-          <w:sz w:val="28"/>
-        </w:rPr>
-        <w:t xml:space="preserve"/>
-      </w:r>
-    </w:p>
-    <w:p>
-      <w:pPr>
-        <w:spacing w:line="276" w:lineRule="auto"/>
-      </w:pPr>
-      <w:r>
-        <w:rPr>
-          <w:rFonts w:ascii="Arial" w:hAnsi="Arial"/>
-          <w:sz w:val="28"/>
-        </w:rPr>
-        <w:t xml:space="preserve">The items under each heading are numbered so you can point at one —</w:t>
-      </w:r>
-    </w:p>
-    <w:p>
-      <w:pPr>
-        <w:spacing w:line="276" w:lineRule="auto"/>
-      </w:pPr>
-      <w:r>
-        <w:rPr>
-          <w:rFonts w:ascii="Arial" w:hAnsi="Arial"/>
-          <w:sz w:val="28"/>
-        </w:rPr>
-        <w:t xml:space="preserve">"What's Next 1", "Done 186" — and both of us know which you mean. The</w:t>
-      </w:r>
-    </w:p>
-    <w:p>
-      <w:pPr>
-        <w:spacing w:line="276" w:lineRule="auto"/>
-      </w:pPr>
-      <w:r>
-        <w:rPr>
-          <w:rFonts w:ascii="Arial" w:hAnsi="Arial"/>
-          <w:sz w:val="28"/>
-        </w:rPr>
-        <w:t xml:space="preserve">numbers belong to the heading above them and start again at 1 under</w:t>
-      </w:r>
-    </w:p>
-    <w:p>
-      <w:pPr>
-        <w:spacing w:line="276" w:lineRule="auto"/>
-      </w:pPr>
-      <w:r>
-        <w:rPr>
-          <w:rFonts w:ascii="Arial" w:hAnsi="Arial"/>
-          <w:sz w:val="28"/>
-        </w:rPr>
-        <w:t xml:space="preserve">each one. Live headings (What's Next, Pending) shift as</w:t>
-      </w:r>
-    </w:p>
-    <w:p>
-      <w:pPr>
-        <w:spacing w:line="276" w:lineRule="auto"/>
-      </w:pPr>
-      <w:r>
-        <w:rPr>
-          <w:rFonts w:ascii="Arial" w:hAnsi="Arial"/>
-          <w:sz w:val="28"/>
-        </w:rPr>
-        <w:t xml:space="preserve">things are added and finished. **Done does not:** newest at the</w:t>
-      </w:r>
-    </w:p>
-    <w:p>
-      <w:pPr>
-        <w:spacing w:line="276" w:lineRule="auto"/>
-      </w:pPr>
-      <w:r>
-        <w:rPr>
-          <w:rFonts w:ascii="Arial" w:hAnsi="Arial"/>
-          <w:sz w:val="28"/>
-        </w:rPr>
-        <w:t xml:space="preserve">top, number 1 on the oldest line at the bottom, so a new sitting</w:t>
-      </w:r>
-    </w:p>
-    <w:p>
-      <w:pPr>
-        <w:spacing w:line="276" w:lineRule="auto"/>
-      </w:pPr>
-      <w:r>
-        <w:rPr>
-          <w:rFonts w:ascii="Arial" w:hAnsi="Arial"/>
-          <w:sz w:val="28"/>
-        </w:rPr>
-        <w:t xml:space="preserve">is the next number and nothing else is renumbered.</w:t>
-      </w:r>
-    </w:p>
-    <w:p>
-      <w:pPr>
-        <w:spacing w:line="276" w:lineRule="auto"/>
-      </w:pPr>
-      <w:r>
-        <w:rPr>
-          <w:rFonts w:ascii="Arial" w:hAnsi="Arial"/>
-          <w:sz w:val="28"/>
-        </w:rPr>
-        <w:t xml:space="preserve"/>
-      </w:r>
-    </w:p>
-    <w:p>
-      <w:pPr>
-        <w:spacing w:line="276" w:lineRule="auto"/>
-      </w:pPr>
-      <w:r>
-        <w:rPr>
-          <w:rFonts w:ascii="Arial" w:hAnsi="Arial"/>
-          <w:sz w:val="28"/>
-        </w:rPr>
-        <w:t xml:space="preserve">The session-by-session story is not kept here any more. It lives in</w:t>
-      </w:r>
-    </w:p>
-    <w:p>
-      <w:pPr>
-        <w:spacing w:line="276" w:lineRule="auto"/>
-      </w:pPr>
-      <w:r>
-        <w:rPr>
-          <w:rFonts w:ascii="Arial" w:hAnsi="Arial"/>
-          <w:sz w:val="28"/>
-        </w:rPr>
-        <w:t xml:space="preserve">docs/handoff-history.md, which is the archive to look at when you want</w:t>
-      </w:r>
-    </w:p>
-    <w:p>
-      <w:pPr>
-        <w:spacing w:line="276" w:lineRule="auto"/>
-      </w:pPr>
-      <w:r>
-        <w:rPr>
-          <w:rFonts w:ascii="Arial" w:hAnsi="Arial"/>
-          <w:sz w:val="28"/>
-        </w:rPr>
-        <w:t xml:space="preserve">to know why something was done the way it was.</w:t>
-      </w:r>
-    </w:p>
-    <w:p>
-      <w:pPr>
-        <w:spacing w:line="276" w:lineRule="auto"/>
-      </w:pPr>
-      <w:r>
-        <w:rPr>
-          <w:rFonts w:ascii="Arial" w:hAnsi="Arial"/>
-          <w:sz w:val="28"/>
-        </w:rPr>
-        <w:t xml:space="preserve"/>
-      </w:r>
-    </w:p>
-    <w:p>
-      <w:pPr>
-        <w:spacing w:line="276" w:lineRule="auto"/>
-      </w:pPr>
-      <w:r>
-        <w:rPr>
-          <w:rFonts w:ascii="Arial" w:hAnsi="Arial"/>
-          <w:sz w:val="28"/>
-        </w:rPr>
-        <w:t xml:space="preserve">Timer Alerts, Vault, Shopping List, and Memory Test left Memory at</w:t>
-      </w:r>
-    </w:p>
-    <w:p>
-      <w:pPr>
-        <w:spacing w:line="276" w:lineRule="auto"/>
-      </w:pPr>
-      <w:r>
-        <w:rPr>
-          <w:rFonts w:ascii="Arial" w:hAnsi="Arial"/>
-          <w:sz w:val="28"/>
-        </w:rPr>
-        <w:t xml:space="preserve">#76-new. Copies stay in Projects/stray apps. Do not raise them as</w:t>
-      </w:r>
-    </w:p>
-    <w:p>
-      <w:pPr>
-        <w:spacing w:line="276" w:lineRule="auto"/>
-      </w:pPr>
-      <w:r>
-        <w:rPr>
-          <w:rFonts w:ascii="Arial" w:hAnsi="Arial"/>
-          <w:sz w:val="28"/>
-        </w:rPr>
-        <w:t xml:space="preserve">engine work. The shopping list is wanted later, with a backup of its</w:t>
-      </w:r>
-    </w:p>
-    <w:p>
-      <w:pPr>
-        <w:spacing w:line="276" w:lineRule="auto"/>
-      </w:pPr>
-      <w:r>
-        <w:rPr>
-          <w:rFonts w:ascii="Arial" w:hAnsi="Arial"/>
-          <w:sz w:val="28"/>
-        </w:rPr>
-        <w:t xml:space="preserve">own.</w:t>
+        <w:t xml:space="preserve">WHAT'S NEXT</w:t>
+      </w:r>
+    </w:p>
+    <w:p>
+      <w:pPr>
+        <w:spacing w:line="276" w:lineRule="auto"/>
+      </w:pPr>
+      <w:r>
+        <w:rPr>
+          <w:rFonts w:ascii="Arial" w:hAnsi="Arial"/>
+          <w:sz w:val="28"/>
+        </w:rPr>
+        <w:t xml:space="preserve">------------------------------------------------------------------</w:t>
+      </w:r>
+    </w:p>
+    <w:p>
+      <w:pPr>
+        <w:spacing w:line="276" w:lineRule="auto"/>
+      </w:pPr>
+      <w:r>
+        <w:rPr>
+          <w:rFonts w:ascii="Arial" w:hAnsi="Arial"/>
+          <w:sz w:val="28"/>
+        </w:rPr>
+        <w:t xml:space="preserve">1. THE EXPO APP AWARDS. After Apple approves and you release Daily</w:t>
+      </w:r>
+    </w:p>
+    <w:p>
+      <w:pPr>
+        <w:spacing w:line="276" w:lineRule="auto"/>
+      </w:pPr>
+      <w:r>
+        <w:rPr>
+          <w:rFonts w:ascii="Arial" w:hAnsi="Arial"/>
+          <w:sz w:val="28"/>
+        </w:rPr>
+        <w:t xml:space="preserve">   Reminders by hand, enter the Expo App Awards. The record is</w:t>
+      </w:r>
+    </w:p>
+    <w:p>
+      <w:pPr>
+        <w:spacing w:line="276" w:lineRule="auto"/>
+      </w:pPr>
+      <w:r>
+        <w:rPr>
+          <w:rFonts w:ascii="Arial" w:hAnsi="Arial"/>
+          <w:sz w:val="28"/>
+        </w:rPr>
+        <w:t xml:space="preserve">   docs/expo-awards.md. The form closes October 31. Android is not</w:t>
+      </w:r>
+    </w:p>
+    <w:p>
+      <w:pPr>
+        <w:spacing w:line="276" w:lineRule="auto"/>
+      </w:pPr>
+      <w:r>
+        <w:rPr>
+          <w:rFonts w:ascii="Arial" w:hAnsi="Arial"/>
+          <w:sz w:val="28"/>
+        </w:rPr>
+        <w:t xml:space="preserve">   that page.</w:t>
+      </w:r>
+    </w:p>
+    <w:p>
+      <w:pPr>
+        <w:spacing w:line="276" w:lineRule="auto"/>
+      </w:pPr>
+      <w:r>
+        <w:rPr>
+          <w:rFonts w:ascii="Arial" w:hAnsi="Arial"/>
+          <w:sz w:val="28"/>
+        </w:rPr>
+        <w:t xml:space="preserve">2. THE GALAXY FREE TRIAL, AND THE PUBLIC ANDROID LISTING. The Galaxy</w:t>
+      </w:r>
+    </w:p>
+    <w:p>
+      <w:pPr>
+        <w:spacing w:line="276" w:lineRule="auto"/>
+      </w:pPr>
+      <w:r>
+        <w:rPr>
+          <w:rFonts w:ascii="Arial" w:hAnsi="Arial"/>
+          <w:sz w:val="28"/>
+        </w:rPr>
+        <w:t xml:space="preserve">   free trial waits until the iPhone is in the App Store and entered</w:t>
+      </w:r>
+    </w:p>
+    <w:p>
+      <w:pPr>
+        <w:spacing w:line="276" w:lineRule="auto"/>
+      </w:pPr>
+      <w:r>
+        <w:rPr>
+          <w:rFonts w:ascii="Arial" w:hAnsi="Arial"/>
+          <w:sz w:val="28"/>
+        </w:rPr>
+        <w:t xml:space="preserve">   in the Expo competition. Whether the Galaxy gets a free trial is</w:t>
+      </w:r>
+    </w:p>
+    <w:p>
+      <w:pPr>
+        <w:spacing w:line="276" w:lineRule="auto"/>
+      </w:pPr>
+      <w:r>
+        <w:rPr>
+          <w:rFonts w:ascii="Arial" w:hAnsi="Arial"/>
+          <w:sz w:val="28"/>
+        </w:rPr>
+        <w:t xml:space="preserve">   still open. The Play account is open, and Android number 5 is the</w:t>
+      </w:r>
+    </w:p>
+    <w:p>
+      <w:pPr>
+        <w:spacing w:line="276" w:lineRule="auto"/>
+      </w:pPr>
+      <w:r>
+        <w:rPr>
+          <w:rFonts w:ascii="Arial" w:hAnsi="Arial"/>
+          <w:sz w:val="28"/>
+        </w:rPr>
+        <w:t xml:space="preserve">   internal test on your Galaxy. The public Android listing still</w:t>
+      </w:r>
+    </w:p>
+    <w:p>
+      <w:pPr>
+        <w:spacing w:line="276" w:lineRule="auto"/>
+      </w:pPr>
+      <w:r>
+        <w:rPr>
+          <w:rFonts w:ascii="Arial" w:hAnsi="Arial"/>
+          <w:sz w:val="28"/>
+        </w:rPr>
+        <w:t xml:space="preserve">   waits.</w:t>
       </w:r>
     </w:p>
     <w:p>
@@ -301,7 +469,7 @@
           <w:b/>
           <w:sz w:val="28"/>
         </w:rPr>
-        <w:t xml:space="preserve">WHAT'S NEXT</w:t>
+        <w:t xml:space="preserve">PENDING</w:t>
       </w:r>
     </w:p>
     <w:p>
@@ -325,451 +493,67 @@
           <w:rFonts w:ascii="Arial" w:hAnsi="Arial"/>
           <w:sz w:val="28"/>
         </w:rPr>
-        <w:t xml:space="preserve">1. IOS BUILD 100 is Waiting for Review. Take it off review before</w:t>
-      </w:r>
-    </w:p>
-    <w:p>
-      <w:pPr>
-        <w:spacing w:line="276" w:lineRule="auto"/>
-      </w:pPr>
-      <w:r>
-        <w:rPr>
-          <w:rFonts w:ascii="Arial" w:hAnsi="Arial"/>
-          <w:sz w:val="28"/>
-        </w:rPr>
-        <w:t xml:space="preserve">   you change the name or the screenshots. On the version page, the</w:t>
-      </w:r>
-    </w:p>
-    <w:p>
-      <w:pPr>
-        <w:spacing w:line="276" w:lineRule="auto"/>
-      </w:pPr>
-      <w:r>
-        <w:rPr>
-          <w:rFonts w:ascii="Arial" w:hAnsi="Arial"/>
-          <w:sz w:val="28"/>
-        </w:rPr>
-        <w:t xml:space="preserve">   message at the top says remove this version from review. Build 120</w:t>
-      </w:r>
-    </w:p>
-    <w:p>
-      <w:pPr>
-        <w:spacing w:line="276" w:lineRule="auto"/>
-      </w:pPr>
-      <w:r>
-        <w:rPr>
-          <w:rFonts w:ascii="Arial" w:hAnsi="Arial"/>
-          <w:sz w:val="28"/>
-        </w:rPr>
-        <w:t xml:space="preserve">   is on your iPhone. It is the one for the store. You can add and</w:t>
-      </w:r>
-    </w:p>
-    <w:p>
-      <w:pPr>
-        <w:spacing w:line="276" w:lineRule="auto"/>
-      </w:pPr>
-      <w:r>
-        <w:rPr>
-          <w:rFonts w:ascii="Arial" w:hAnsi="Arial"/>
-          <w:sz w:val="28"/>
-        </w:rPr>
-        <w:t xml:space="preserve">   change on that copy. That is expected. Do not send an older</w:t>
-      </w:r>
-    </w:p>
-    <w:p>
-      <w:pPr>
-        <w:spacing w:line="276" w:lineRule="auto"/>
-      </w:pPr>
-      <w:r>
-        <w:rPr>
-          <w:rFonts w:ascii="Arial" w:hAnsi="Arial"/>
-          <w:sz w:val="28"/>
-        </w:rPr>
-        <w:t xml:space="preserve">   picture build. The store name on this same app becomes My</w:t>
-      </w:r>
-    </w:p>
-    <w:p>
-      <w:pPr>
-        <w:spacing w:line="276" w:lineRule="auto"/>
-      </w:pPr>
-      <w:r>
-        <w:rPr>
-          <w:rFonts w:ascii="Arial" w:hAnsi="Arial"/>
-          <w:sz w:val="28"/>
-        </w:rPr>
-        <w:t xml:space="preserve">   Reminders. This is not a new app. The purchase display name and</w:t>
-      </w:r>
-    </w:p>
-    <w:p>
-      <w:pPr>
-        <w:spacing w:line="276" w:lineRule="auto"/>
-      </w:pPr>
-      <w:r>
-        <w:rPr>
-          <w:rFonts w:ascii="Arial" w:hAnsi="Arial"/>
-          <w:sz w:val="28"/>
-        </w:rPr>
-        <w:t xml:space="preserve">   reference name become My Reminders. Add the saved notice under</w:t>
-      </w:r>
-    </w:p>
-    <w:p>
-      <w:pPr>
-        <w:spacing w:line="276" w:lineRule="auto"/>
-      </w:pPr>
-      <w:r>
-        <w:rPr>
-          <w:rFonts w:ascii="Arial" w:hAnsi="Arial"/>
-          <w:sz w:val="28"/>
-        </w:rPr>
-        <w:t xml:space="preserve">   Review Information on the purchase. Use the picture that says My</w:t>
-      </w:r>
-    </w:p>
-    <w:p>
-      <w:pPr>
-        <w:spacing w:line="276" w:lineRule="auto"/>
-      </w:pPr>
-      <w:r>
-        <w:rPr>
-          <w:rFonts w:ascii="Arial" w:hAnsi="Arial"/>
-          <w:sz w:val="28"/>
-        </w:rPr>
-        <w:t xml:space="preserve">   Reminders. Pictures that say A Place To Remember do not go on.</w:t>
-      </w:r>
-    </w:p>
-    <w:p>
-      <w:pPr>
-        <w:spacing w:line="276" w:lineRule="auto"/>
-      </w:pPr>
-      <w:r>
-        <w:rPr>
-          <w:rFonts w:ascii="Arial" w:hAnsi="Arial"/>
-          <w:sz w:val="28"/>
-        </w:rPr>
-        <w:t xml:space="preserve">   Add the light-theme pictures of the pages on the version page.</w:t>
-      </w:r>
-    </w:p>
-    <w:p>
-      <w:pPr>
-        <w:spacing w:line="276" w:lineRule="auto"/>
-      </w:pPr>
-      <w:r>
-        <w:rPr>
-          <w:rFonts w:ascii="Arial" w:hAnsi="Arial"/>
-          <w:sz w:val="28"/>
-        </w:rPr>
-        <w:t xml:space="preserve">   The build on that page is 120. The purchase goes in that same</w:t>
-      </w:r>
-    </w:p>
-    <w:p>
-      <w:pPr>
-        <w:spacing w:line="276" w:lineRule="auto"/>
-      </w:pPr>
-      <w:r>
-        <w:rPr>
-          <w:rFonts w:ascii="Arial" w:hAnsi="Arial"/>
-          <w:sz w:val="28"/>
-        </w:rPr>
-        <w:t xml:space="preserve">   submission. When Apple approves, you release it yourself. Release</w:t>
-      </w:r>
-    </w:p>
-    <w:p>
-      <w:pPr>
-        <w:spacing w:line="276" w:lineRule="auto"/>
-      </w:pPr>
-      <w:r>
-        <w:rPr>
-          <w:rFonts w:ascii="Arial" w:hAnsi="Arial"/>
-          <w:sz w:val="28"/>
-        </w:rPr>
-        <w:t xml:space="preserve">   is manual. The Galaxy free trial is not in that build.</w:t>
-      </w:r>
-    </w:p>
-    <w:p>
-      <w:pPr>
-        <w:spacing w:line="276" w:lineRule="auto"/>
-      </w:pPr>
-      <w:r>
-        <w:rPr>
-          <w:rFonts w:ascii="Arial" w:hAnsi="Arial"/>
-          <w:sz w:val="28"/>
-        </w:rPr>
-        <w:t xml:space="preserve">2. THE PRICE. On the iPhone the download is free. The App Store page</w:t>
-      </w:r>
-    </w:p>
-    <w:p>
-      <w:pPr>
-        <w:spacing w:line="276" w:lineRule="auto"/>
-      </w:pPr>
-      <w:r>
-        <w:rPr>
-          <w:rFonts w:ascii="Arial" w:hAnsi="Arial"/>
-          <w:sz w:val="28"/>
-        </w:rPr>
-        <w:t xml:space="preserve">   says it before the download. It is a free one month trial period.</w:t>
-      </w:r>
-    </w:p>
-    <w:p>
-      <w:pPr>
-        <w:spacing w:line="276" w:lineRule="auto"/>
-      </w:pPr>
-      <w:r>
-        <w:rPr>
-          <w:rFonts w:ascii="Arial" w:hAnsi="Arial"/>
-          <w:sz w:val="28"/>
-        </w:rPr>
-        <w:t xml:space="preserve">   Then it is $9.99 once, here in My Reminders. The buyer is not surprised</w:t>
-      </w:r>
-    </w:p>
-    <w:p>
-      <w:pPr>
-        <w:spacing w:line="276" w:lineRule="auto"/>
-      </w:pPr>
-      <w:r>
-        <w:rPr>
-          <w:rFonts w:ascii="Arial" w:hAnsi="Arial"/>
-          <w:sz w:val="28"/>
-        </w:rPr>
-        <w:t xml:space="preserve">   with that later. Those words have not been typed onto the store</w:t>
-      </w:r>
-    </w:p>
-    <w:p>
-      <w:pPr>
-        <w:spacing w:line="276" w:lineRule="auto"/>
-      </w:pPr>
-      <w:r>
-        <w:rPr>
-          <w:rFonts w:ascii="Arial" w:hAnsi="Arial"/>
-          <w:sz w:val="28"/>
-        </w:rPr>
-        <w:t xml:space="preserve">   page yet. The purchase is in the code. Build 120 is on the iPhone,</w:t>
-      </w:r>
-    </w:p>
-    <w:p>
-      <w:pPr>
-        <w:spacing w:line="276" w:lineRule="auto"/>
-      </w:pPr>
-      <w:r>
-        <w:rPr>
-          <w:rFonts w:ascii="Arial" w:hAnsi="Arial"/>
-          <w:sz w:val="28"/>
-        </w:rPr>
-        <w:t xml:space="preserve">   and you can add and change on that copy. The purchase is created in App Store</w:t>
-      </w:r>
-    </w:p>
-    <w:p>
-      <w:pPr>
-        <w:spacing w:line="276" w:lineRule="auto"/>
-      </w:pPr>
-      <w:r>
-        <w:rPr>
-          <w:rFonts w:ascii="Arial" w:hAnsi="Arial"/>
-          <w:sz w:val="28"/>
-        </w:rPr>
-        <w:t xml:space="preserve">   Connect and is waiting. It has not been sent for review. Its name</w:t>
-      </w:r>
-    </w:p>
-    <w:p>
-      <w:pPr>
-        <w:spacing w:line="276" w:lineRule="auto"/>
-      </w:pPr>
-      <w:r>
-        <w:rPr>
-          <w:rFonts w:ascii="Arial" w:hAnsi="Arial"/>
-          <w:sz w:val="28"/>
-        </w:rPr>
-        <w:t xml:space="preserve">   is com.molliedog.ElderlyAssistant.full and the price is $9.99. The</w:t>
-      </w:r>
-    </w:p>
-    <w:p>
-      <w:pPr>
-        <w:spacing w:line="276" w:lineRule="auto"/>
-      </w:pPr>
-      <w:r>
-        <w:rPr>
-          <w:rFonts w:ascii="Arial" w:hAnsi="Arial"/>
-          <w:sz w:val="28"/>
-        </w:rPr>
-        <w:t xml:space="preserve">   app counts one month from the day Apple says you first downloaded</w:t>
-      </w:r>
-    </w:p>
-    <w:p>
-      <w:pPr>
-        <w:spacing w:line="276" w:lineRule="auto"/>
-      </w:pPr>
-      <w:r>
-        <w:rPr>
-          <w:rFonts w:ascii="Arial" w:hAnsi="Arial"/>
-          <w:sz w:val="28"/>
-        </w:rPr>
-        <w:t xml:space="preserve">   it. If Apple gives no day, the notice stays hidden and adding still</w:t>
-      </w:r>
-    </w:p>
-    <w:p>
-      <w:pPr>
-        <w:spacing w:line="276" w:lineRule="auto"/>
-      </w:pPr>
-      <w:r>
-        <w:rPr>
-          <w:rFonts w:ascii="Arial" w:hAnsi="Arial"/>
-          <w:sz w:val="28"/>
-        </w:rPr>
-        <w:t xml:space="preserve">   works. That is what the phone did. When the month ends and you have not</w:t>
-      </w:r>
-    </w:p>
-    <w:p>
-      <w:pPr>
-        <w:spacing w:line="276" w:lineRule="auto"/>
-      </w:pPr>
-      <w:r>
-        <w:rPr>
-          <w:rFonts w:ascii="Arial" w:hAnsi="Arial"/>
-          <w:sz w:val="28"/>
-        </w:rPr>
-        <w:t xml:space="preserve">   paid, you meet the payment when you try to add or change. Reminders</w:t>
-      </w:r>
-    </w:p>
-    <w:p>
-      <w:pPr>
-        <w:spacing w:line="276" w:lineRule="auto"/>
-      </w:pPr>
-      <w:r>
-        <w:rPr>
-          <w:rFonts w:ascii="Arial" w:hAnsi="Arial"/>
-          <w:sz w:val="28"/>
-        </w:rPr>
-        <w:t xml:space="preserve">   already set keep firing, and adding and changing waits. Your lists</w:t>
-      </w:r>
-    </w:p>
-    <w:p>
-      <w:pPr>
-        <w:spacing w:line="276" w:lineRule="auto"/>
-      </w:pPr>
-      <w:r>
-        <w:rPr>
-          <w:rFonts w:ascii="Arial" w:hAnsi="Arial"/>
-          <w:sz w:val="28"/>
-        </w:rPr>
-        <w:t xml:space="preserve">   stay on this phone. You can back up what you already have, and</w:t>
-      </w:r>
-    </w:p>
-    <w:p>
-      <w:pPr>
-        <w:spacing w:line="276" w:lineRule="auto"/>
-      </w:pPr>
-      <w:r>
-        <w:rPr>
-          <w:rFonts w:ascii="Arial" w:hAnsi="Arial"/>
-          <w:sz w:val="28"/>
-        </w:rPr>
-        <w:t xml:space="preserve">   restore those lists on another iPhone after the purchase is there.</w:t>
-      </w:r>
-    </w:p>
-    <w:p>
-      <w:pPr>
-        <w:spacing w:line="276" w:lineRule="auto"/>
-      </w:pPr>
-      <w:r>
-        <w:rPr>
-          <w:rFonts w:ascii="Arial" w:hAnsi="Arial"/>
-          <w:sz w:val="28"/>
-        </w:rPr>
-        <w:t xml:space="preserve">   The Galaxy free trial waits until the iPhone is in the App Store</w:t>
-      </w:r>
-    </w:p>
-    <w:p>
-      <w:pPr>
-        <w:spacing w:line="276" w:lineRule="auto"/>
-      </w:pPr>
-      <w:r>
-        <w:rPr>
-          <w:rFonts w:ascii="Arial" w:hAnsi="Arial"/>
-          <w:sz w:val="28"/>
-        </w:rPr>
-        <w:t xml:space="preserve">   and entered in the Expo competition. Whether the Galaxy gets a free</w:t>
-      </w:r>
-    </w:p>
-    <w:p>
-      <w:pPr>
-        <w:spacing w:line="276" w:lineRule="auto"/>
-      </w:pPr>
-      <w:r>
-        <w:rPr>
-          <w:rFonts w:ascii="Arial" w:hAnsi="Arial"/>
-          <w:sz w:val="28"/>
-        </w:rPr>
-        <w:t xml:space="preserve">   trial is still open. The Play account is open, and Android number 5</w:t>
-      </w:r>
-    </w:p>
-    <w:p>
-      <w:pPr>
-        <w:spacing w:line="276" w:lineRule="auto"/>
-      </w:pPr>
-      <w:r>
-        <w:rPr>
-          <w:rFonts w:ascii="Arial" w:hAnsi="Arial"/>
-          <w:sz w:val="28"/>
-        </w:rPr>
-        <w:t xml:space="preserve">   is the internal test on your Galaxy. The public Android listing</w:t>
-      </w:r>
-    </w:p>
-    <w:p>
-      <w:pPr>
-        <w:spacing w:line="276" w:lineRule="auto"/>
-      </w:pPr>
-      <w:r>
-        <w:rPr>
-          <w:rFonts w:ascii="Arial" w:hAnsi="Arial"/>
-          <w:sz w:val="28"/>
-        </w:rPr>
-        <w:t xml:space="preserve">   still waits.</w:t>
-      </w:r>
-    </w:p>
-    <w:p>
-      <w:pPr>
-        <w:spacing w:line="276" w:lineRule="auto"/>
-      </w:pPr>
-      <w:r>
-        <w:rPr>
-          <w:rFonts w:ascii="Arial" w:hAnsi="Arial"/>
-          <w:sz w:val="28"/>
-        </w:rPr>
-        <w:t xml:space="preserve">3. THE EXPO APP AWARDS. The record is docs/expo-awards.md. The entry</w:t>
-      </w:r>
-    </w:p>
-    <w:p>
-      <w:pPr>
-        <w:spacing w:line="276" w:lineRule="auto"/>
-      </w:pPr>
-      <w:r>
-        <w:rPr>
-          <w:rFonts w:ascii="Arial" w:hAnsi="Arial"/>
-          <w:sz w:val="28"/>
-        </w:rPr>
-        <w:t xml:space="preserve">   waits on a public iPhone page, and the form closes October 31.</w:t>
-      </w:r>
-    </w:p>
-    <w:p>
-      <w:pPr>
-        <w:spacing w:line="276" w:lineRule="auto"/>
-      </w:pPr>
-      <w:r>
-        <w:rPr>
-          <w:rFonts w:ascii="Arial" w:hAnsi="Arial"/>
-          <w:sz w:val="28"/>
-        </w:rPr>
-        <w:t xml:space="preserve">   Android is not that page. The payments profile is not set up, and</w:t>
-      </w:r>
-    </w:p>
-    <w:p>
-      <w:pPr>
-        <w:spacing w:line="276" w:lineRule="auto"/>
-      </w:pPr>
-      <w:r>
-        <w:rPr>
-          <w:rFonts w:ascii="Arial" w:hAnsi="Arial"/>
-          <w:sz w:val="28"/>
-        </w:rPr>
-        <w:t xml:space="preserve">   the Android release waits on 12 testers, which you do not have.</w:t>
+        <w:t xml:space="preserve">Things waiting on something — mostly on a build.</w:t>
+      </w:r>
+    </w:p>
+    <w:p>
+      <w:pPr>
+        <w:spacing w:line="276" w:lineRule="auto"/>
+      </w:pPr>
+      <w:r>
+        <w:rPr>
+          <w:rFonts w:ascii="Arial" w:hAnsi="Arial"/>
+          <w:sz w:val="28"/>
+        </w:rPr>
+        <w:t xml:space="preserve"/>
+      </w:r>
+    </w:p>
+    <w:p>
+      <w:pPr>
+        <w:spacing w:line="276" w:lineRule="auto"/>
+      </w:pPr>
+      <w:r>
+        <w:rPr>
+          <w:rFonts w:ascii="Arial" w:hAnsi="Arial"/>
+          <w:sz w:val="28"/>
+        </w:rPr>
+        <w:t xml:space="preserve">1. The tester gets the copy already on Play. Send the join link.</w:t>
+      </w:r>
+    </w:p>
+    <w:p>
+      <w:pPr>
+        <w:spacing w:line="276" w:lineRule="auto"/>
+      </w:pPr>
+      <w:r>
+        <w:rPr>
+          <w:rFonts w:ascii="Arial" w:hAnsi="Arial"/>
+          <w:sz w:val="28"/>
+        </w:rPr>
+        <w:t xml:space="preserve">   A text is fine. They open it on the Android phone and install</w:t>
+      </w:r>
+    </w:p>
+    <w:p>
+      <w:pPr>
+        <w:spacing w:line="276" w:lineRule="auto"/>
+      </w:pPr>
+      <w:r>
+        <w:rPr>
+          <w:rFonts w:ascii="Arial" w:hAnsi="Arial"/>
+          <w:sz w:val="28"/>
+        </w:rPr>
+        <w:t xml:space="preserve">   from the Play Store. Do not build a separate file to email.</w:t>
+      </w:r>
+    </w:p>
+    <w:p>
+      <w:pPr>
+        <w:spacing w:line="276" w:lineRule="auto"/>
+      </w:pPr>
+      <w:r>
+        <w:rPr>
+          <w:rFonts w:ascii="Arial" w:hAnsi="Arial"/>
+          <w:sz w:val="28"/>
+        </w:rPr>
+        <w:t xml:space="preserve">   (#135-new)</w:t>
       </w:r>
     </w:p>
     <w:p>
@@ -806,7 +590,7 @@
           <w:b/>
           <w:sz w:val="28"/>
         </w:rPr>
-        <w:t xml:space="preserve">PENDING</w:t>
+        <w:t xml:space="preserve">WHAT IS DONE, NEWEST FIRST</w:t>
       </w:r>
     </w:p>
     <w:p>
@@ -830,127 +614,6 @@
           <w:rFonts w:ascii="Arial" w:hAnsi="Arial"/>
           <w:sz w:val="28"/>
         </w:rPr>
-        <w:t xml:space="preserve">Things waiting on something — mostly on a build.</w:t>
-      </w:r>
-    </w:p>
-    <w:p>
-      <w:pPr>
-        <w:spacing w:line="276" w:lineRule="auto"/>
-      </w:pPr>
-      <w:r>
-        <w:rPr>
-          <w:rFonts w:ascii="Arial" w:hAnsi="Arial"/>
-          <w:sz w:val="28"/>
-        </w:rPr>
-        <w:t xml:space="preserve"/>
-      </w:r>
-    </w:p>
-    <w:p>
-      <w:pPr>
-        <w:spacing w:line="276" w:lineRule="auto"/>
-      </w:pPr>
-      <w:r>
-        <w:rPr>
-          <w:rFonts w:ascii="Arial" w:hAnsi="Arial"/>
-          <w:sz w:val="28"/>
-        </w:rPr>
-        <w:t xml:space="preserve">1. The tester gets the copy already on Play. Send the join link.</w:t>
-      </w:r>
-    </w:p>
-    <w:p>
-      <w:pPr>
-        <w:spacing w:line="276" w:lineRule="auto"/>
-      </w:pPr>
-      <w:r>
-        <w:rPr>
-          <w:rFonts w:ascii="Arial" w:hAnsi="Arial"/>
-          <w:sz w:val="28"/>
-        </w:rPr>
-        <w:t xml:space="preserve">   A text is fine. They open it on the Android phone and install</w:t>
-      </w:r>
-    </w:p>
-    <w:p>
-      <w:pPr>
-        <w:spacing w:line="276" w:lineRule="auto"/>
-      </w:pPr>
-      <w:r>
-        <w:rPr>
-          <w:rFonts w:ascii="Arial" w:hAnsi="Arial"/>
-          <w:sz w:val="28"/>
-        </w:rPr>
-        <w:t xml:space="preserve">   from the Play Store. Do not build a separate file to email.</w:t>
-      </w:r>
-    </w:p>
-    <w:p>
-      <w:pPr>
-        <w:spacing w:line="276" w:lineRule="auto"/>
-      </w:pPr>
-      <w:r>
-        <w:rPr>
-          <w:rFonts w:ascii="Arial" w:hAnsi="Arial"/>
-          <w:sz w:val="28"/>
-        </w:rPr>
-        <w:t xml:space="preserve">   (#135-new)</w:t>
-      </w:r>
-    </w:p>
-    <w:p>
-      <w:pPr>
-        <w:spacing w:line="276" w:lineRule="auto"/>
-      </w:pPr>
-      <w:r>
-        <w:rPr>
-          <w:rFonts w:ascii="Arial" w:hAnsi="Arial"/>
-          <w:sz w:val="28"/>
-        </w:rPr>
-        <w:t xml:space="preserve"/>
-      </w:r>
-    </w:p>
-    <w:p>
-      <w:pPr>
-        <w:spacing w:line="276" w:lineRule="auto"/>
-      </w:pPr>
-      <w:r>
-        <w:rPr>
-          <w:rFonts w:ascii="Arial" w:hAnsi="Arial"/>
-          <w:sz w:val="28"/>
-        </w:rPr>
-        <w:t xml:space="preserve"/>
-      </w:r>
-    </w:p>
-    <w:p>
-      <w:pPr>
-        <w:spacing w:line="276" w:lineRule="auto"/>
-      </w:pPr>
-      <w:r>
-        <w:rPr>
-          <w:rFonts w:ascii="Arial" w:hAnsi="Arial"/>
-          <w:b/>
-          <w:sz w:val="28"/>
-        </w:rPr>
-        <w:t xml:space="preserve">WHAT IS DONE, NEWEST FIRST</w:t>
-      </w:r>
-    </w:p>
-    <w:p>
-      <w:pPr>
-        <w:spacing w:line="276" w:lineRule="auto"/>
-      </w:pPr>
-      <w:r>
-        <w:rPr>
-          <w:rFonts w:ascii="Arial" w:hAnsi="Arial"/>
-          <w:sz w:val="28"/>
-        </w:rPr>
-        <w:t xml:space="preserve">------------------------------------------------------------------</w:t>
-      </w:r>
-    </w:p>
-    <w:p>
-      <w:pPr>
-        <w:spacing w:line="276" w:lineRule="auto"/>
-      </w:pPr>
-      <w:r>
-        <w:rPr>
-          <w:rFonts w:ascii="Arial" w:hAnsi="Arial"/>
-          <w:sz w:val="28"/>
-        </w:rPr>
         <w:t xml:space="preserve">Newest at the top. Number 1 is the oldest line, at the bottom.</w:t>
       </w:r>
     </w:p>
@@ -988,6 +651,102 @@
           <w:sz w:val="28"/>
         </w:rPr>
         <w:t xml:space="preserve">docs/handoff-history.md.</w:t>
+      </w:r>
+    </w:p>
+    <w:p>
+      <w:pPr>
+        <w:spacing w:line="276" w:lineRule="auto"/>
+      </w:pPr>
+      <w:r>
+        <w:rPr>
+          <w:rFonts w:ascii="Arial" w:hAnsi="Arial"/>
+          <w:sz w:val="28"/>
+        </w:rPr>
+        <w:t xml:space="preserve"/>
+      </w:r>
+    </w:p>
+    <w:p>
+      <w:pPr>
+        <w:spacing w:line="276" w:lineRule="auto"/>
+      </w:pPr>
+      <w:r>
+        <w:rPr>
+          <w:rFonts w:ascii="Arial" w:hAnsi="Arial"/>
+          <w:sz w:val="28"/>
+        </w:rPr>
+        <w:t xml:space="preserve">214. #139-new — The store name is Daily Reminders. Build 125 and the</w:t>
+      </w:r>
+    </w:p>
+    <w:p>
+      <w:pPr>
+        <w:spacing w:line="276" w:lineRule="auto"/>
+      </w:pPr>
+      <w:r>
+        <w:rPr>
+          <w:rFonts w:ascii="Arial" w:hAnsi="Arial"/>
+          <w:sz w:val="28"/>
+        </w:rPr>
+        <w:t xml:space="preserve">    purchase are submitted for App Store review. Release is manual.</w:t>
+      </w:r>
+    </w:p>
+    <w:p>
+      <w:pPr>
+        <w:spacing w:line="276" w:lineRule="auto"/>
+      </w:pPr>
+      <w:r>
+        <w:rPr>
+          <w:rFonts w:ascii="Arial" w:hAnsi="Arial"/>
+          <w:sz w:val="28"/>
+        </w:rPr>
+        <w:t xml:space="preserve">    Promotional Text says free one month, then $9.99 once. Next is</w:t>
+      </w:r>
+    </w:p>
+    <w:p>
+      <w:pPr>
+        <w:spacing w:line="276" w:lineRule="auto"/>
+      </w:pPr>
+      <w:r>
+        <w:rPr>
+          <w:rFonts w:ascii="Arial" w:hAnsi="Arial"/>
+          <w:sz w:val="28"/>
+        </w:rPr>
+        <w:t xml:space="preserve">    the Expo awards after the app is public.</w:t>
+      </w:r>
+    </w:p>
+    <w:p>
+      <w:pPr>
+        <w:spacing w:line="276" w:lineRule="auto"/>
+      </w:pPr>
+      <w:r>
+        <w:rPr>
+          <w:rFonts w:ascii="Arial" w:hAnsi="Arial"/>
+          <w:sz w:val="28"/>
+        </w:rPr>
+        <w:t xml:space="preserve"/>
+      </w:r>
+    </w:p>
+    <w:p>
+      <w:pPr>
+        <w:spacing w:line="276" w:lineRule="auto"/>
+      </w:pPr>
+      <w:r>
+        <w:rPr>
+          <w:rFonts w:ascii="Arial" w:hAnsi="Arial"/>
+          <w:sz w:val="28"/>
+        </w:rPr>
+        <w:t xml:space="preserve">213. #139-new — Apple would not take My Reminders. The name in the</w:t>
+      </w:r>
+    </w:p>
+    <w:p>
+      <w:pPr>
+        <w:spacing w:line="276" w:lineRule="auto"/>
+      </w:pPr>
+      <w:r>
+        <w:rPr>
+          <w:rFonts w:ascii="Arial" w:hAnsi="Arial"/>
+          <w:sz w:val="28"/>
+        </w:rPr>
+        <w:t xml:space="preserve">    app and on the store became Daily Reminders.</w:t>
       </w:r>
     </w:p>
     <w:p>

</xml_diff>

<commit_message>
142-new-  Bring reminder-shape, handoff and pending.docx up to date.
</commit_message>
<xml_diff>
--- a/docs/pending.docx
+++ b/docs/pending.docx
@@ -23,7 +23,7 @@
           <w:rFonts w:ascii="Arial" w:hAnsi="Arial"/>
           <w:sz w:val="28"/>
         </w:rPr>
-        <w:t xml:space="preserve">Last updated: 2026-10-15</w:t>
+        <w:t xml:space="preserve">Last updated: 2026-10-16</w:t>
       </w:r>
     </w:p>
     <w:p>
@@ -336,31 +336,43 @@
           <w:rFonts w:ascii="Arial" w:hAnsi="Arial"/>
           <w:sz w:val="28"/>
         </w:rPr>
-        <w:t xml:space="preserve">   Reminders by hand, enter the Expo App Awards. The record is</w:t>
-      </w:r>
-    </w:p>
-    <w:p>
-      <w:pPr>
-        <w:spacing w:line="276" w:lineRule="auto"/>
-      </w:pPr>
-      <w:r>
-        <w:rPr>
-          <w:rFonts w:ascii="Arial" w:hAnsi="Arial"/>
-          <w:sz w:val="28"/>
-        </w:rPr>
-        <w:t xml:space="preserve">   docs/expo-awards.md. The form closes October 31. Android is not</w:t>
-      </w:r>
-    </w:p>
-    <w:p>
-      <w:pPr>
-        <w:spacing w:line="276" w:lineRule="auto"/>
-      </w:pPr>
-      <w:r>
-        <w:rPr>
-          <w:rFonts w:ascii="Arial" w:hAnsi="Arial"/>
-          <w:sz w:val="28"/>
-        </w:rPr>
-        <w:t xml:space="preserve">   that page.</w:t>
+        <w:t xml:space="preserve">   Reminders by hand, paste the entry from the ready-to-paste block</w:t>
+      </w:r>
+    </w:p>
+    <w:p>
+      <w:pPr>
+        <w:spacing w:line="276" w:lineRule="auto"/>
+      </w:pPr>
+      <w:r>
+        <w:rPr>
+          <w:rFonts w:ascii="Arial" w:hAnsi="Arial"/>
+          <w:sz w:val="28"/>
+        </w:rPr>
+        <w:t xml:space="preserve">   in docs/expo-awards.md. Copy developer name and the store link</w:t>
+      </w:r>
+    </w:p>
+    <w:p>
+      <w:pPr>
+        <w:spacing w:line="276" w:lineRule="auto"/>
+      </w:pPr>
+      <w:r>
+        <w:rPr>
+          <w:rFonts w:ascii="Arial" w:hAnsi="Arial"/>
+          <w:sz w:val="28"/>
+        </w:rPr>
+        <w:t xml:space="preserve">   from the public listing. The form closes October 31. Android is</w:t>
+      </w:r>
+    </w:p>
+    <w:p>
+      <w:pPr>
+        <w:spacing w:line="276" w:lineRule="auto"/>
+      </w:pPr>
+      <w:r>
+        <w:rPr>
+          <w:rFonts w:ascii="Arial" w:hAnsi="Arial"/>
+          <w:sz w:val="28"/>
+        </w:rPr>
+        <w:t xml:space="preserve">   not that page.</w:t>
       </w:r>
     </w:p>
     <w:p>
@@ -565,6 +577,66 @@
           <w:rFonts w:ascii="Arial" w:hAnsi="Arial"/>
           <w:sz w:val="28"/>
         </w:rPr>
+        <w:t xml:space="preserve">2. A weekly item is set aside (#140-new). Yesterday it was on Daily.</w:t>
+      </w:r>
+    </w:p>
+    <w:p>
+      <w:pPr>
+        <w:spacing w:line="276" w:lineRule="auto"/>
+      </w:pPr>
+      <w:r>
+        <w:rPr>
+          <w:rFonts w:ascii="Arial" w:hAnsi="Arial"/>
+          <w:sz w:val="28"/>
+        </w:rPr>
+        <w:t xml:space="preserve">   You snoozed it one day. It left Daily, and it was on Weekly with</w:t>
+      </w:r>
+    </w:p>
+    <w:p>
+      <w:pPr>
+        <w:spacing w:line="276" w:lineRule="auto"/>
+      </w:pPr>
+      <w:r>
+        <w:rPr>
+          <w:rFonts w:ascii="Arial" w:hAnsi="Arial"/>
+          <w:sz w:val="28"/>
+        </w:rPr>
+        <w:t xml:space="preserve">   the snooze note. Today it was not on Daily. The hanging notice</w:t>
+      </w:r>
+    </w:p>
+    <w:p>
+      <w:pPr>
+        <w:spacing w:line="276" w:lineRule="auto"/>
+      </w:pPr>
+      <w:r>
+        <w:rPr>
+          <w:rFonts w:ascii="Arial" w:hAnsi="Arial"/>
+          <w:sz w:val="28"/>
+        </w:rPr>
+        <w:t xml:space="preserve">   named it from yesterday. A new weekly item snoozed today stayed</w:t>
+      </w:r>
+    </w:p>
+    <w:p>
+      <w:pPr>
+        <w:spacing w:line="276" w:lineRule="auto"/>
+      </w:pPr>
+      <w:r>
+        <w:rPr>
+          <w:rFonts w:ascii="Arial" w:hAnsi="Arial"/>
+          <w:sz w:val="28"/>
+        </w:rPr>
+        <w:t xml:space="preserve">   on Daily. It was not a mistaken Done tap. Not solved.</w:t>
+      </w:r>
+    </w:p>
+    <w:p>
+      <w:pPr>
+        <w:spacing w:line="276" w:lineRule="auto"/>
+      </w:pPr>
+      <w:r>
+        <w:rPr>
+          <w:rFonts w:ascii="Arial" w:hAnsi="Arial"/>
+          <w:sz w:val="28"/>
+        </w:rPr>
         <w:t xml:space="preserve"/>
       </w:r>
     </w:p>
@@ -651,6 +723,114 @@
           <w:sz w:val="28"/>
         </w:rPr>
         <w:t xml:space="preserve">docs/handoff-history.md.</w:t>
+      </w:r>
+    </w:p>
+    <w:p>
+      <w:pPr>
+        <w:spacing w:line="276" w:lineRule="auto"/>
+      </w:pPr>
+      <w:r>
+        <w:rPr>
+          <w:rFonts w:ascii="Arial" w:hAnsi="Arial"/>
+          <w:sz w:val="28"/>
+        </w:rPr>
+        <w:t xml:space="preserve"/>
+      </w:r>
+    </w:p>
+    <w:p>
+      <w:pPr>
+        <w:spacing w:line="276" w:lineRule="auto"/>
+      </w:pPr>
+      <w:r>
+        <w:rPr>
+          <w:rFonts w:ascii="Arial" w:hAnsi="Arial"/>
+          <w:sz w:val="28"/>
+        </w:rPr>
+        <w:t xml:space="preserve">216. #142-new — reminder-shape is the live engine again. If no</w:t>
+      </w:r>
+    </w:p>
+    <w:p>
+      <w:pPr>
+        <w:spacing w:line="276" w:lineRule="auto"/>
+      </w:pPr>
+      <w:r>
+        <w:rPr>
+          <w:rFonts w:ascii="Arial" w:hAnsi="Arial"/>
+          <w:sz w:val="28"/>
+        </w:rPr>
+        <w:t xml:space="preserve">    time is entered on an Appointment or a Birthday, 12:00 pm is</w:t>
+      </w:r>
+    </w:p>
+    <w:p>
+      <w:pPr>
+        <w:spacing w:line="276" w:lineRule="auto"/>
+      </w:pPr>
+      <w:r>
+        <w:rPr>
+          <w:rFonts w:ascii="Arial" w:hAnsi="Arial"/>
+          <w:sz w:val="28"/>
+        </w:rPr>
+        <w:t xml:space="preserve">    the default.</w:t>
+      </w:r>
+    </w:p>
+    <w:p>
+      <w:pPr>
+        <w:spacing w:line="276" w:lineRule="auto"/>
+      </w:pPr>
+      <w:r>
+        <w:rPr>
+          <w:rFonts w:ascii="Arial" w:hAnsi="Arial"/>
+          <w:sz w:val="28"/>
+        </w:rPr>
+        <w:t xml:space="preserve"/>
+      </w:r>
+    </w:p>
+    <w:p>
+      <w:pPr>
+        <w:spacing w:line="276" w:lineRule="auto"/>
+      </w:pPr>
+      <w:r>
+        <w:rPr>
+          <w:rFonts w:ascii="Arial" w:hAnsi="Arial"/>
+          <w:sz w:val="28"/>
+        </w:rPr>
+        <w:t xml:space="preserve">215. #141-new — Expo App Awards description settled, and a</w:t>
+      </w:r>
+    </w:p>
+    <w:p>
+      <w:pPr>
+        <w:spacing w:line="276" w:lineRule="auto"/>
+      </w:pPr>
+      <w:r>
+        <w:rPr>
+          <w:rFonts w:ascii="Arial" w:hAnsi="Arial"/>
+          <w:sz w:val="28"/>
+        </w:rPr>
+        <w:t xml:space="preserve">    ready-to-paste block is in docs/expo-awards.md. You fill the</w:t>
+      </w:r>
+    </w:p>
+    <w:p>
+      <w:pPr>
+        <w:spacing w:line="276" w:lineRule="auto"/>
+      </w:pPr>
+      <w:r>
+        <w:rPr>
+          <w:rFonts w:ascii="Arial" w:hAnsi="Arial"/>
+          <w:sz w:val="28"/>
+        </w:rPr>
+        <w:t xml:space="preserve">    live form after the App Store page is public. Form closes</w:t>
+      </w:r>
+    </w:p>
+    <w:p>
+      <w:pPr>
+        <w:spacing w:line="276" w:lineRule="auto"/>
+      </w:pPr>
+      <w:r>
+        <w:rPr>
+          <w:rFonts w:ascii="Arial" w:hAnsi="Arial"/>
+          <w:sz w:val="28"/>
+        </w:rPr>
+        <w:t xml:space="preserve">    October 31.</w:t>
       </w:r>
     </w:p>
     <w:p>

</xml_diff>

<commit_message>
142.1 -new-  Bring Apple agreements up to date & join Small Business plan.
</commit_message>
<xml_diff>
--- a/docs/pending.docx
+++ b/docs/pending.docx
@@ -23,7 +23,7 @@
           <w:rFonts w:ascii="Arial" w:hAnsi="Arial"/>
           <w:sz w:val="28"/>
         </w:rPr>
-        <w:t xml:space="preserve">Last updated: 2026-10-16</w:t>
+        <w:t xml:space="preserve">Last updated: 2026-10-17</w:t>
       </w:r>
     </w:p>
     <w:p>
@@ -723,6 +723,66 @@
           <w:sz w:val="28"/>
         </w:rPr>
         <w:t xml:space="preserve">docs/handoff-history.md.</w:t>
+      </w:r>
+    </w:p>
+    <w:p>
+      <w:pPr>
+        <w:spacing w:line="276" w:lineRule="auto"/>
+      </w:pPr>
+      <w:r>
+        <w:rPr>
+          <w:rFonts w:ascii="Arial" w:hAnsi="Arial"/>
+          <w:sz w:val="28"/>
+        </w:rPr>
+        <w:t xml:space="preserve"/>
+      </w:r>
+    </w:p>
+    <w:p>
+      <w:pPr>
+        <w:spacing w:line="276" w:lineRule="auto"/>
+      </w:pPr>
+      <w:r>
+        <w:rPr>
+          <w:rFonts w:ascii="Arial" w:hAnsi="Arial"/>
+          <w:sz w:val="28"/>
+        </w:rPr>
+        <w:t xml:space="preserve">217. #142-new — You accepted the updated Paid Applications</w:t>
+      </w:r>
+    </w:p>
+    <w:p>
+      <w:pPr>
+        <w:spacing w:line="276" w:lineRule="auto"/>
+      </w:pPr>
+      <w:r>
+        <w:rPr>
+          <w:rFonts w:ascii="Arial" w:hAnsi="Arial"/>
+          <w:sz w:val="28"/>
+        </w:rPr>
+        <w:t xml:space="preserve">    Schedule. You submitted the Small Business Program. Apple has</w:t>
+      </w:r>
+    </w:p>
+    <w:p>
+      <w:pPr>
+        <w:spacing w:line="276" w:lineRule="auto"/>
+      </w:pPr>
+      <w:r>
+        <w:rPr>
+          <w:rFonts w:ascii="Arial" w:hAnsi="Arial"/>
+          <w:sz w:val="28"/>
+        </w:rPr>
+        <w:t xml:space="preserve">    not approved it yet. The lower rate starts after they do. The</w:t>
+      </w:r>
+    </w:p>
+    <w:p>
+      <w:pPr>
+        <w:spacing w:line="276" w:lineRule="auto"/>
+      </w:pPr>
+      <w:r>
+        <w:rPr>
+          <w:rFonts w:ascii="Arial" w:hAnsi="Arial"/>
+          <w:sz w:val="28"/>
+        </w:rPr>
+        <w:t xml:space="preserve">    price stays $9.99.</w:t>
       </w:r>
     </w:p>
     <w:p>

</xml_diff>